<commit_message>
Impressão: PDFs e Word do RH regerados com POP-01 v1.1 e novo e-mail da TI
Co-Authored-By: Claude Opus 5.5 <noreply@anthropic.com>
</commit_message>
<xml_diff>
--- a/impressao/POPs-RH-revisao.docx
+++ b/impressao/POPs-RH-revisao.docx
@@ -26,7 +26,7 @@
         <w:t xml:space="preserve">Versão:</w:t>
       </w:r>
       <w:r>
-        <w:t xml:space="preserve"> 1.0 · </w:t>
+        <w:t xml:space="preserve"> 1.1 · </w:t>
       </w:r>
       <w:r>
         <w:rPr>
@@ -36,7 +36,7 @@
         <w:t xml:space="preserve">Data:</w:t>
       </w:r>
       <w:r>
-        <w:t xml:space="preserve"> 15/10/2026 · </w:t>
+        <w:t xml:space="preserve"> 16/10/2026 · </w:t>
       </w:r>
       <w:r>
         <w:rPr>
@@ -91,6 +91,34 @@
       </w:r>
       <w:r>
         <w:t xml:space="preserve">, todos registrados e com termo assinado.</w:t>
+      </w:r>
+    </w:p>
+    <w:p>
+      <w:pPr>
+        <w:spacing w:after="120"/>
+      </w:pPr>
+      <w:r>
+        <w:t xml:space="preserve">Funcionários dos </w:t>
+      </w:r>
+      <w:r>
+        <w:rPr>
+          <w:b/>
+          <w:bCs/>
+        </w:rPr>
+        <w:t xml:space="preserve">postos</w:t>
+      </w:r>
+      <w:r>
+        <w:t xml:space="preserve"> (frentista, caixa, chefe de pista, lubrificador) </w:t>
+      </w:r>
+      <w:r>
+        <w:rPr>
+          <w:b/>
+          <w:bCs/>
+        </w:rPr>
+        <w:t xml:space="preserve">não fazem parte</w:t>
+      </w:r>
+      <w:r>
+        <w:t xml:space="preserve"> deste POP.</w:t>
       </w:r>
     </w:p>
     <w:p>
@@ -336,736 +364,25 @@
         <w:pStyle w:val="Heading2"/>
       </w:pPr>
       <w:r>
-        <w:t xml:space="preserve">3. Quando</w:t>
-      </w:r>
-    </w:p>
-    <w:p>
-      <w:pPr>
-        <w:pStyle w:val="ListParagraph"/>
-        <w:numPr>
-          <w:ilvl w:val="0"/>
-          <w:numId w:val="2"/>
-        </w:numPr>
-      </w:pPr>
-      <w:r>
-        <w:t xml:space="preserve">RH envia a solicitação </w:t>
-      </w:r>
-      <w:r>
-        <w:rPr>
-          <w:b/>
-          <w:bCs/>
-        </w:rPr>
-        <w:t xml:space="preserve">no mínimo 3 dias úteis antes</w:t>
-      </w:r>
-      <w:r>
-        <w:t xml:space="preserve"> da data de início.</w:t>
-      </w:r>
-    </w:p>
-    <w:p>
-      <w:pPr>
-        <w:pStyle w:val="ListParagraph"/>
-        <w:numPr>
-          <w:ilvl w:val="0"/>
-          <w:numId w:val="2"/>
-        </w:numPr>
-      </w:pPr>
-      <w:r>
-        <w:t xml:space="preserve">Tudo pronto </w:t>
-      </w:r>
-      <w:r>
-        <w:rPr>
-          <w:b/>
-          <w:bCs/>
-        </w:rPr>
-        <w:t xml:space="preserve">até o dia anterior</w:t>
-      </w:r>
-      <w:r>
-        <w:t xml:space="preserve"> ao início.</w:t>
-      </w:r>
-    </w:p>
-    <w:p>
-      <w:pPr>
-        <w:pStyle w:val="Heading2"/>
-      </w:pPr>
-      <w:r>
-        <w:t xml:space="preserve">4. Passo a passo</w:t>
-      </w:r>
-    </w:p>
-    <w:p>
-      <w:pPr>
-        <w:pStyle w:val="Heading3"/>
-      </w:pPr>
-      <w:r>
-        <w:t xml:space="preserve">4.1 Solicitação (RH)</w:t>
-      </w:r>
-    </w:p>
-    <w:p>
-      <w:pPr>
-        <w:tabs>
-          <w:tab w:val="left" w:pos="720"/>
-        </w:tabs>
-        <w:ind w:left="720" w:hanging="400"/>
-      </w:pPr>
-      <w:r>
-        <w:t xml:space="preserve">1.	</w:t>
-      </w:r>
-      <w:r>
-        <w:t xml:space="preserve">Abrir no GLPI o chamado </w:t>
-      </w:r>
-      <w:r>
-        <w:rPr>
-          <w:b/>
-          <w:bCs/>
-        </w:rPr>
-        <w:t xml:space="preserve">Solicitação de TI</w:t>
-      </w:r>
-      <w:r>
-        <w:t xml:space="preserve"> (Formulário A) com tipo </w:t>
-      </w:r>
-      <w:r>
-        <w:rPr>
-          <w:b/>
-          <w:bCs/>
-        </w:rPr>
-        <w:t xml:space="preserve">Entrada</w:t>
-      </w:r>
-      <w:r>
-        <w:t xml:space="preserve">: nome completo, empresa do grupo, cargo, setor, posto/unidade, gestor, data de início.</w:t>
-      </w:r>
-    </w:p>
-    <w:p>
-      <w:pPr>
-        <w:tabs>
-          <w:tab w:val="left" w:pos="720"/>
-        </w:tabs>
-        <w:ind w:left="720" w:hanging="400"/>
-      </w:pPr>
-      <w:r>
-        <w:t xml:space="preserve">2.	</w:t>
-      </w:r>
-      <w:r>
-        <w:t xml:space="preserve">Incluir o gestor no chamado para aprovação.</w:t>
-      </w:r>
-    </w:p>
-    <w:p>
-      <w:pPr>
-        <w:pStyle w:val="ListParagraph"/>
-        <w:numPr>
-          <w:ilvl w:val="1"/>
-          <w:numId w:val="2"/>
-        </w:numPr>
-      </w:pPr>
-      <w:r>
-        <w:rPr>
-          <w:b/>
-          <w:bCs/>
-        </w:rPr>
-        <w:t xml:space="preserve">Foto:</w:t>
-      </w:r>
-      <w:r>
-        <w:t xml:space="preserve"> pedir ao funcionário a foto no padrão de </w:t>
-      </w:r>
-      <w:r>
-        <w:t xml:space="preserve">anexos/padrao-email.md</w:t>
-      </w:r>
-      <w:r>
-        <w:t xml:space="preserve"> §4 (ou tirar na admissão). O RH edita, monta a imagem de rodapé e anexa as duas ao chamado para a TI.</w:t>
-      </w:r>
-    </w:p>
-    <w:p>
-      <w:pPr>
-        <w:pStyle w:val="Heading3"/>
-      </w:pPr>
-      <w:r>
-        <w:t xml:space="preserve">4.2 Aprovação (gestor)</w:t>
-      </w:r>
-    </w:p>
-    <w:p>
-      <w:pPr>
-        <w:tabs>
-          <w:tab w:val="left" w:pos="720"/>
-        </w:tabs>
-        <w:ind w:left="720" w:hanging="400"/>
-      </w:pPr>
-      <w:r>
-        <w:t xml:space="preserve">3.	</w:t>
-      </w:r>
-      <w:r>
-        <w:t xml:space="preserve">Marcar no chamado os acessos e equipamentos necessários (lista na seção 5).</w:t>
-      </w:r>
-    </w:p>
-    <w:p>
-      <w:pPr>
-        <w:tabs>
-          <w:tab w:val="left" w:pos="720"/>
-        </w:tabs>
-        <w:ind w:left="720" w:hanging="400"/>
-      </w:pPr>
-      <w:r>
-        <w:t xml:space="preserve">4.	</w:t>
-      </w:r>
-      <w:r>
-        <w:t xml:space="preserve">Para o </w:t>
-      </w:r>
-      <w:r>
-        <w:rPr>
-          <w:b/>
-          <w:bCs/>
-        </w:rPr>
-        <w:t xml:space="preserve">Sistema VS</w:t>
-      </w:r>
-      <w:r>
-        <w:t xml:space="preserve">, informar o </w:t>
-      </w:r>
-      <w:r>
-        <w:rPr>
-          <w:b/>
-          <w:bCs/>
-        </w:rPr>
-        <w:t xml:space="preserve">perfil</w:t>
-      </w:r>
-      <w:r>
-        <w:t xml:space="preserve"> e </w:t>
-      </w:r>
-      <w:r>
-        <w:rPr>
-          <w:b/>
-          <w:bCs/>
-        </w:rPr>
-        <w:t xml:space="preserve">quais postos/unidades</w:t>
-      </w:r>
-      <w:r>
-        <w:t xml:space="preserve"> a pessoa pode ver. Na dúvida, o mínimo: gerente de posto vê só o próprio posto.</w:t>
-      </w:r>
-    </w:p>
-    <w:p>
-      <w:pPr>
-        <w:tabs>
-          <w:tab w:val="left" w:pos="720"/>
-        </w:tabs>
-        <w:ind w:left="720" w:hanging="400"/>
-      </w:pPr>
-      <w:r>
-        <w:t xml:space="preserve">5.	</w:t>
-      </w:r>
-      <w:r>
-        <w:rPr>
-          <w:b/>
-          <w:bCs/>
-        </w:rPr>
-        <w:t xml:space="preserve">Aprovar o chamado</w:t>
-      </w:r>
-      <w:r>
-        <w:t xml:space="preserve"> no GLPI.</w:t>
-      </w:r>
-    </w:p>
-    <w:p>
-      <w:pPr>
-        <w:pStyle w:val="Heading3"/>
-      </w:pPr>
-      <w:r>
-        <w:t xml:space="preserve">4.3 Preparação (TI)</w:t>
-      </w:r>
-    </w:p>
-    <w:p>
-      <w:pPr>
-        <w:tabs>
-          <w:tab w:val="left" w:pos="720"/>
-        </w:tabs>
-        <w:ind w:left="720" w:hanging="400"/>
-      </w:pPr>
-      <w:r>
-        <w:t xml:space="preserve">6.	</w:t>
-      </w:r>
-      <w:r>
-        <w:rPr>
-          <w:b/>
-          <w:bCs/>
-        </w:rPr>
-        <w:t xml:space="preserve">E-mail:</w:t>
-      </w:r>
-      <w:r>
-        <w:t xml:space="preserve"> criar a conta no padrão de </w:t>
-      </w:r>
-      <w:r>
-        <w:t xml:space="preserve">anexos/padrao-email.md</w:t>
-      </w:r>
-      <w:r>
-        <w:t xml:space="preserve"> (</w:t>
-      </w:r>
-      <w:r>
-        <w:rPr>
-          <w:rFonts w:ascii="Consolas" w:cs="Consolas" w:eastAsia="Consolas" w:hAnsi="Consolas"/>
-          <w:sz w:val="19"/>
-          <w:szCs w:val="19"/>
-        </w:rPr>
-        <w:t xml:space="preserve">nome.sobrenome@&lt;domínio-da-empresa&gt;</w:t>
-      </w:r>
-      <w:r>
-        <w:t xml:space="preserve">), no painel da hospedagem da empresa correta. Senha forte gerada pelo Vaultwarden.</w:t>
-      </w:r>
-    </w:p>
-    <w:p>
-      <w:pPr>
-        <w:tabs>
-          <w:tab w:val="left" w:pos="720"/>
-        </w:tabs>
-        <w:ind w:left="720" w:hanging="400"/>
-      </w:pPr>
-      <w:r>
-        <w:t xml:space="preserve">7.	</w:t>
-      </w:r>
-      <w:r>
-        <w:rPr>
-          <w:b/>
-          <w:bCs/>
-        </w:rPr>
-        <w:t xml:space="preserve">Assinatura de e-mail:</w:t>
-      </w:r>
-      <w:r>
-        <w:t xml:space="preserve"> receber do RH a </w:t>
-      </w:r>
-      <w:r>
-        <w:rPr>
-          <w:b/>
-          <w:bCs/>
-        </w:rPr>
-        <w:t xml:space="preserve">imagem de rodapé</w:t>
-      </w:r>
-      <w:r>
-        <w:t xml:space="preserve"> (</w:t>
-      </w:r>
-      <w:r>
-        <w:rPr>
-          <w:rFonts w:ascii="Consolas" w:cs="Consolas" w:eastAsia="Consolas" w:hAnsi="Consolas"/>
-          <w:sz w:val="19"/>
-          <w:szCs w:val="19"/>
-        </w:rPr>
-        <w:t xml:space="preserve">rodape-nome.sobrenome.png</w:t>
-      </w:r>
-      <w:r>
-        <w:t xml:space="preserve">) e a foto editada (passo 2).</w:t>
-      </w:r>
-    </w:p>
-    <w:p>
-      <w:pPr>
-        <w:tabs>
-          <w:tab w:val="left" w:pos="720"/>
-        </w:tabs>
-        <w:ind w:left="720" w:hanging="400"/>
-      </w:pPr>
-      <w:r>
-        <w:t xml:space="preserve">8.	</w:t>
-      </w:r>
-      <w:r>
-        <w:rPr>
-          <w:b/>
-          <w:bCs/>
-        </w:rPr>
-        <w:t xml:space="preserve">Sistema VS:</w:t>
-      </w:r>
-      <w:r>
-        <w:t xml:space="preserve"> criar o usuário com o perfil e os postos aprovados. Conferir logando com o usuário que ele </w:t>
-      </w:r>
-      <w:r>
-        <w:rPr>
-          <w:b/>
-          <w:bCs/>
-        </w:rPr>
-        <w:t xml:space="preserve">não</w:t>
-      </w:r>
-      <w:r>
-        <w:t xml:space="preserve"> enxerga posto ou tela fora do aprovado.</w:t>
-      </w:r>
-    </w:p>
-    <w:p>
-      <w:pPr>
-        <w:tabs>
-          <w:tab w:val="left" w:pos="720"/>
-        </w:tabs>
-        <w:ind w:left="720" w:hanging="400"/>
-      </w:pPr>
-      <w:r>
-        <w:t xml:space="preserve">9.	</w:t>
-      </w:r>
-      <w:r>
-        <w:rPr>
-          <w:b/>
-          <w:bCs/>
-        </w:rPr>
-        <w:t xml:space="preserve">ERP / Petroshow / Infinitum:</w:t>
-      </w:r>
-      <w:r>
-        <w:t xml:space="preserve"> criar os usuários aprovados, com o perfil da função (nunca copiar o perfil de outra pessoa sem conferir).</w:t>
-      </w:r>
-    </w:p>
-    <w:p>
-      <w:pPr>
-        <w:tabs>
-          <w:tab w:val="left" w:pos="720"/>
-        </w:tabs>
-        <w:ind w:left="720" w:hanging="400"/>
-      </w:pPr>
-      <w:r>
-        <w:t xml:space="preserve">10.	</w:t>
-      </w:r>
-      <w:r>
-        <w:rPr>
-          <w:b/>
-          <w:bCs/>
-        </w:rPr>
-        <w:t xml:space="preserve">Computador</w:t>
-      </w:r>
-      <w:r>
-        <w:t xml:space="preserve"> (se aprovado):</w:t>
-      </w:r>
-    </w:p>
-    <w:p>
-      <w:pPr>
-        <w:pStyle w:val="ListParagraph"/>
-        <w:numPr>
-          <w:ilvl w:val="1"/>
-          <w:numId w:val="2"/>
-        </w:numPr>
-      </w:pPr>
-      <w:r>
-        <w:t xml:space="preserve">Preparar pela instalação padrão (POP-04 Linux ou POP-05 Windows).</w:t>
-      </w:r>
-    </w:p>
-    <w:p>
-      <w:pPr>
-        <w:pStyle w:val="ListParagraph"/>
-        <w:numPr>
-          <w:ilvl w:val="1"/>
-          <w:numId w:val="2"/>
-        </w:numPr>
-      </w:pPr>
-      <w:r>
-        <w:t xml:space="preserve">Criar o usuário local da pessoa, </w:t>
-      </w:r>
-      <w:r>
-        <w:rPr>
-          <w:b/>
-          <w:bCs/>
-        </w:rPr>
-        <w:t xml:space="preserve">sem permissão de administrador</w:t>
-      </w:r>
-      <w:r>
-        <w:t xml:space="preserve">.</w:t>
-      </w:r>
-    </w:p>
-    <w:p>
-      <w:pPr>
-        <w:pStyle w:val="ListParagraph"/>
-        <w:numPr>
-          <w:ilvl w:val="1"/>
-          <w:numId w:val="2"/>
-        </w:numPr>
-      </w:pPr>
-      <w:r>
-        <w:t xml:space="preserve">Registrar no </w:t>
-      </w:r>
-      <w:r>
-        <w:rPr>
-          <w:b/>
-          <w:bCs/>
-        </w:rPr>
-        <w:t xml:space="preserve">GLPI</w:t>
-      </w:r>
-      <w:r>
-        <w:t xml:space="preserve">: patrimônio, número de série, quem recebe.</w:t>
-      </w:r>
-    </w:p>
-    <w:p>
-      <w:pPr>
-        <w:tabs>
-          <w:tab w:val="left" w:pos="720"/>
-        </w:tabs>
-        <w:ind w:left="720" w:hanging="400"/>
-      </w:pPr>
-      <w:r>
-        <w:t xml:space="preserve">11.	</w:t>
-      </w:r>
-      <w:r>
-        <w:rPr>
-          <w:b/>
-          <w:bCs/>
-        </w:rPr>
-        <w:t xml:space="preserve">Celular</w:t>
-      </w:r>
-      <w:r>
-        <w:t xml:space="preserve"> (se aprovado):</w:t>
-      </w:r>
-    </w:p>
-    <w:p>
-      <w:pPr>
-        <w:pStyle w:val="ListParagraph"/>
-        <w:numPr>
-          <w:ilvl w:val="1"/>
-          <w:numId w:val="2"/>
-        </w:numPr>
-      </w:pPr>
-      <w:r>
-        <w:t xml:space="preserve">Registrar o aparelho no </w:t>
-      </w:r>
-      <w:r>
-        <w:rPr>
-          <w:b/>
-          <w:bCs/>
-        </w:rPr>
-        <w:t xml:space="preserve">Headwind MDM</w:t>
-      </w:r>
-      <w:r>
-        <w:t xml:space="preserve"> (Android Enterprise).</w:t>
-      </w:r>
-    </w:p>
-    <w:p>
-      <w:pPr>
-        <w:pStyle w:val="ListParagraph"/>
-        <w:numPr>
-          <w:ilvl w:val="1"/>
-          <w:numId w:val="2"/>
-        </w:numPr>
-      </w:pPr>
-      <w:r>
-        <w:t xml:space="preserve">Entrar com o </w:t>
-      </w:r>
-      <w:r>
-        <w:rPr>
-          <w:b/>
-          <w:bCs/>
-        </w:rPr>
-        <w:t xml:space="preserve">Gmail da empresa daquele aparelho</w:t>
-      </w:r>
-      <w:r>
-        <w:t xml:space="preserve"> (</w:t>
-      </w:r>
-      <w:r>
-        <w:rPr>
-          <w:rFonts w:ascii="Consolas" w:cs="Consolas" w:eastAsia="Consolas" w:hAnsi="Consolas"/>
-          <w:sz w:val="19"/>
-          <w:szCs w:val="19"/>
-        </w:rPr>
-        <w:t xml:space="preserve">celularNN.&lt;empresa&gt;@gmail.com</w:t>
-      </w:r>
-      <w:r>
-        <w:t xml:space="preserve">, senha no Vaultwarden). Se o aparelho é novo, a TI cria a conta antes, com e-mail de recuperação </w:t>
-      </w:r>
-      <w:r>
-        <w:rPr>
-          <w:rFonts w:ascii="Consolas" w:cs="Consolas" w:eastAsia="Consolas" w:hAnsi="Consolas"/>
-          <w:sz w:val="19"/>
-          <w:szCs w:val="19"/>
-        </w:rPr>
-        <w:t xml:space="preserve">lui.grosz@trrvaledaserra.com.br</w:t>
-      </w:r>
-      <w:r>
-        <w:t xml:space="preserve"> e telefone de recuperação do celular corporativo do Lui Grosz (POP-TI §4.1). O funcionário não usa Gmail pessoal no aparelho.</w:t>
-      </w:r>
-    </w:p>
-    <w:p>
-      <w:pPr>
-        <w:pStyle w:val="ListParagraph"/>
-        <w:numPr>
-          <w:ilvl w:val="1"/>
-          <w:numId w:val="2"/>
-        </w:numPr>
-      </w:pPr>
-      <w:r>
-        <w:t xml:space="preserve">Conferir que o aparelho recebeu os </w:t>
-      </w:r>
-      <w:r>
-        <w:rPr>
-          <w:b/>
-          <w:bCs/>
-        </w:rPr>
-        <w:t xml:space="preserve">apps padrão</w:t>
-      </w:r>
-      <w:r>
-        <w:t xml:space="preserve"> e todas as políticas do POP-TI §4.2 (bloqueio de apps, PIN, bloqueio de reset, bloqueio e wipe remotos, Wi-Fi, localização desativada).</w:t>
-      </w:r>
-    </w:p>
-    <w:p>
-      <w:pPr>
-        <w:tabs>
-          <w:tab w:val="left" w:pos="720"/>
-        </w:tabs>
-        <w:ind w:left="720" w:hanging="400"/>
-      </w:pPr>
-      <w:r>
-        <w:t xml:space="preserve">12.	</w:t>
-      </w:r>
-      <w:r>
-        <w:rPr>
-          <w:b/>
-          <w:bCs/>
-        </w:rPr>
-        <w:t xml:space="preserve">WhatsApp corporativo</w:t>
-      </w:r>
-      <w:r>
-        <w:t xml:space="preserve"> (se aprovado): número da empresa no celular corporativo, nome no padrão da empresa e </w:t>
-      </w:r>
-      <w:r>
-        <w:rPr>
-          <w:b/>
-          <w:bCs/>
-        </w:rPr>
-        <w:t xml:space="preserve">foto de perfil</w:t>
-      </w:r>
-      <w:r>
-        <w:t xml:space="preserve"> = a foto editada pelo RH, incluir nos grupos de trabalho aprovados. Configurar o </w:t>
-      </w:r>
-      <w:r>
-        <w:rPr>
-          <w:b/>
-          <w:bCs/>
-        </w:rPr>
-        <w:t xml:space="preserve">backup diário</w:t>
-      </w:r>
-      <w:r>
-        <w:t xml:space="preserve"> no Gmail da empresa, sem vídeos e com criptografia (POP-TI §4.3).</w:t>
-      </w:r>
-    </w:p>
-    <w:p>
-      <w:pPr>
-        <w:tabs>
-          <w:tab w:val="left" w:pos="720"/>
-        </w:tabs>
-        <w:ind w:left="720" w:hanging="400"/>
-      </w:pPr>
-      <w:r>
-        <w:t xml:space="preserve">13.	</w:t>
-      </w:r>
-      <w:r>
-        <w:t xml:space="preserve">Preencher no GLPI a ficha </w:t>
-      </w:r>
-      <w:r>
-        <w:rPr>
-          <w:b/>
-          <w:bCs/>
-        </w:rPr>
-        <w:t xml:space="preserve">Formulário B: Checklist de acessos</w:t>
-      </w:r>
-      <w:r>
-        <w:t xml:space="preserve"> com cada conta criada (sistema, usuário, data, quem criou) e salvar cada senha no </w:t>
-      </w:r>
-      <w:r>
-        <w:rPr>
-          <w:b/>
-          <w:bCs/>
-        </w:rPr>
-        <w:t xml:space="preserve">Vaultwarden</w:t>
-      </w:r>
-      <w:r>
-        <w:t xml:space="preserve">, na pasta do funcionário.</w:t>
-      </w:r>
-    </w:p>
-    <w:p>
-      <w:pPr>
-        <w:pStyle w:val="Heading3"/>
-      </w:pPr>
-      <w:r>
-        <w:t xml:space="preserve">4.4 Primeiro dia (TI + funcionário)</w:t>
-      </w:r>
-    </w:p>
-    <w:p>
-      <w:pPr>
-        <w:tabs>
-          <w:tab w:val="left" w:pos="720"/>
-        </w:tabs>
-        <w:ind w:left="720" w:hanging="400"/>
-      </w:pPr>
-      <w:r>
-        <w:t xml:space="preserve">14.	</w:t>
-      </w:r>
-      <w:r>
-        <w:t xml:space="preserve">Entregar os equipamentos e o </w:t>
-      </w:r>
-      <w:r>
-        <w:rPr>
-          <w:b/>
-          <w:bCs/>
-        </w:rPr>
-        <w:t xml:space="preserve">Formulário C: Termo de responsabilidade</w:t>
-      </w:r>
-      <w:r>
-        <w:t xml:space="preserve"> para assinatura (1 via com o funcionário, 1 na pasta do RH).</w:t>
-      </w:r>
-    </w:p>
-    <w:p>
-      <w:pPr>
-        <w:tabs>
-          <w:tab w:val="left" w:pos="720"/>
-        </w:tabs>
-        <w:ind w:left="720" w:hanging="400"/>
-      </w:pPr>
-      <w:r>
-        <w:t xml:space="preserve">15.	</w:t>
-      </w:r>
-      <w:r>
-        <w:t xml:space="preserve">Entregar as senhas ao funcionário pessoalmente e acompanhar o primeiro login em cada sistema. </w:t>
-      </w:r>
-      <w:r>
-        <w:rPr>
-          <w:b/>
-          <w:bCs/>
-        </w:rPr>
-        <w:t xml:space="preserve">Todas as senhas da pessoa ficam no Vaultwarden</w:t>
-      </w:r>
-      <w:r>
-        <w:t xml:space="preserve"> (pasta do funcionário). O funcionário </w:t>
-      </w:r>
-      <w:r>
-        <w:rPr>
-          <w:b/>
-          <w:bCs/>
-        </w:rPr>
-        <w:t xml:space="preserve">não troca</w:t>
-      </w:r>
-      <w:r>
-        <w:t xml:space="preserve"> as senhas: se precisar trocar, pede à TI, que troca e atualiza o cofre.</w:t>
-      </w:r>
-    </w:p>
-    <w:p>
-      <w:pPr>
-        <w:tabs>
-          <w:tab w:val="left" w:pos="720"/>
-        </w:tabs>
-        <w:ind w:left="720" w:hanging="400"/>
-      </w:pPr>
-      <w:r>
-        <w:t xml:space="preserve">16.	</w:t>
-      </w:r>
-      <w:r>
-        <w:t xml:space="preserve">Instalar a imagem de rodapé como assinatura no Outlook/webmail e colocar a foto de perfil no e-mail, se o programa permitir (passo a passo em </w:t>
-      </w:r>
-      <w:r>
-        <w:t xml:space="preserve">anexos/padrao-email.md</w:t>
-      </w:r>
-      <w:r>
-        <w:t xml:space="preserve">).</w:t>
-      </w:r>
-    </w:p>
-    <w:p>
-      <w:pPr>
-        <w:tabs>
-          <w:tab w:val="left" w:pos="720"/>
-        </w:tabs>
-        <w:ind w:left="720" w:hanging="400"/>
-      </w:pPr>
-      <w:r>
-        <w:t xml:space="preserve">17.	</w:t>
-      </w:r>
-      <w:r>
-        <w:t xml:space="preserve">Explicar as regras básicas: senha não se compartilha com colegas, não se troca sem a TI, aparelho perdido avisa a TI na hora (POP-03), app novo só via solicitação (POP-08).</w:t>
-      </w:r>
-    </w:p>
-    <w:p>
-      <w:pPr>
-        <w:pStyle w:val="Heading2"/>
-      </w:pPr>
-      <w:r>
-        <w:t xml:space="preserve">5. Lista de acessos e equipamentos possíveis</w:t>
+        <w:t xml:space="preserve">3. Perfis de entrada e prazos</w:t>
+      </w:r>
+    </w:p>
+    <w:p>
+      <w:pPr>
+        <w:spacing w:after="120"/>
+      </w:pPr>
+      <w:r>
+        <w:t xml:space="preserve">O </w:t>
+      </w:r>
+      <w:r>
+        <w:rPr>
+          <w:b/>
+          <w:bCs/>
+        </w:rPr>
+        <w:t xml:space="preserve">cargo</w:t>
+      </w:r>
+      <w:r>
+        <w:t xml:space="preserve"> define o perfil. O perfil define o pacote padrão e com quanta antecedência o RH abre o chamado.</w:t>
       </w:r>
     </w:p>
     <w:tbl>
@@ -1081,8 +398,10 @@
         </w:tblBorders>
       </w:tblPr>
       <w:tblGrid>
-        <w:gridCol w:w="3122"/>
-        <w:gridCol w:w="6516"/>
+        <w:gridCol w:w="1135"/>
+        <w:gridCol w:w="2510"/>
+        <w:gridCol w:w="3541"/>
+        <w:gridCol w:w="2452"/>
       </w:tblGrid>
       <w:tr>
         <w:trPr>
@@ -1090,7 +409,1251 @@
         </w:trPr>
         <w:tc>
           <w:tcPr>
-            <w:tcW w:type="dxa" w:w="3122"/>
+            <w:tcW w:type="dxa" w:w="1135"/>
+            <w:shd w:fill="EEEEEE" w:color="auto" w:val="clear"/>
+            <w:tcMar>
+              <w:top w:type="dxa" w:w="60"/>
+              <w:left w:type="dxa" w:w="100"/>
+              <w:bottom w:type="dxa" w:w="60"/>
+              <w:right w:type="dxa" w:w="100"/>
+            </w:tcMar>
+          </w:tcPr>
+          <w:p>
+            <w:r>
+              <w:rPr>
+                <w:b/>
+                <w:bCs/>
+              </w:rPr>
+              <w:t xml:space="preserve">Perfil</w:t>
+            </w:r>
+          </w:p>
+        </w:tc>
+        <w:tc>
+          <w:tcPr>
+            <w:tcW w:type="dxa" w:w="2510"/>
+            <w:shd w:fill="EEEEEE" w:color="auto" w:val="clear"/>
+            <w:tcMar>
+              <w:top w:type="dxa" w:w="60"/>
+              <w:left w:type="dxa" w:w="100"/>
+              <w:bottom w:type="dxa" w:w="60"/>
+              <w:right w:type="dxa" w:w="100"/>
+            </w:tcMar>
+          </w:tcPr>
+          <w:p>
+            <w:r>
+              <w:rPr>
+                <w:b/>
+                <w:bCs/>
+              </w:rPr>
+              <w:t xml:space="preserve">Cargos</w:t>
+            </w:r>
+          </w:p>
+        </w:tc>
+        <w:tc>
+          <w:tcPr>
+            <w:tcW w:type="dxa" w:w="3541"/>
+            <w:shd w:fill="EEEEEE" w:color="auto" w:val="clear"/>
+            <w:tcMar>
+              <w:top w:type="dxa" w:w="60"/>
+              <w:left w:type="dxa" w:w="100"/>
+              <w:bottom w:type="dxa" w:w="60"/>
+              <w:right w:type="dxa" w:w="100"/>
+            </w:tcMar>
+          </w:tcPr>
+          <w:p>
+            <w:r>
+              <w:rPr>
+                <w:b/>
+                <w:bCs/>
+              </w:rPr>
+              <w:t xml:space="preserve">O que a TI entrega</w:t>
+            </w:r>
+          </w:p>
+        </w:tc>
+        <w:tc>
+          <w:tcPr>
+            <w:tcW w:type="dxa" w:w="2452"/>
+            <w:shd w:fill="EEEEEE" w:color="auto" w:val="clear"/>
+            <w:tcMar>
+              <w:top w:type="dxa" w:w="60"/>
+              <w:left w:type="dxa" w:w="100"/>
+              <w:bottom w:type="dxa" w:w="60"/>
+              <w:right w:type="dxa" w:w="100"/>
+            </w:tcMar>
+          </w:tcPr>
+          <w:p>
+            <w:r>
+              <w:rPr>
+                <w:b/>
+                <w:bCs/>
+              </w:rPr>
+              <w:t xml:space="preserve">RH abre o chamado</w:t>
+            </w:r>
+          </w:p>
+        </w:tc>
+      </w:tr>
+      <w:tr>
+        <w:tc>
+          <w:tcPr>
+            <w:tcW w:type="dxa" w:w="1135"/>
+            <w:tcMar>
+              <w:top w:type="dxa" w:w="60"/>
+              <w:left w:type="dxa" w:w="100"/>
+              <w:bottom w:type="dxa" w:w="60"/>
+              <w:right w:type="dxa" w:w="100"/>
+            </w:tcMar>
+          </w:tcPr>
+          <w:p>
+            <w:r>
+              <w:rPr>
+                <w:b/>
+                <w:bCs/>
+              </w:rPr>
+              <w:t xml:space="preserve">A: Sem acesso de TI</w:t>
+            </w:r>
+          </w:p>
+        </w:tc>
+        <w:tc>
+          <w:tcPr>
+            <w:tcW w:type="dxa" w:w="2510"/>
+            <w:tcMar>
+              <w:top w:type="dxa" w:w="60"/>
+              <w:left w:type="dxa" w:w="100"/>
+              <w:bottom w:type="dxa" w:w="60"/>
+              <w:right w:type="dxa" w:w="100"/>
+            </w:tcMar>
+          </w:tcPr>
+          <w:p>
+            <w:r>
+              <w:t xml:space="preserve">Motorista, zelador, auxiliar de limpeza, mecânico, borracheiro</w:t>
+            </w:r>
+          </w:p>
+        </w:tc>
+        <w:tc>
+          <w:tcPr>
+            <w:tcW w:type="dxa" w:w="3541"/>
+            <w:tcMar>
+              <w:top w:type="dxa" w:w="60"/>
+              <w:left w:type="dxa" w:w="100"/>
+              <w:bottom w:type="dxa" w:w="60"/>
+              <w:right w:type="dxa" w:w="100"/>
+            </w:tcMar>
+          </w:tcPr>
+          <w:p>
+            <w:r>
+              <w:t xml:space="preserve">Nada. O chamado serve só para registrar a pessoa</w:t>
+            </w:r>
+          </w:p>
+        </w:tc>
+        <w:tc>
+          <w:tcPr>
+            <w:tcW w:type="dxa" w:w="2452"/>
+            <w:tcMar>
+              <w:top w:type="dxa" w:w="60"/>
+              <w:left w:type="dxa" w:w="100"/>
+              <w:bottom w:type="dxa" w:w="60"/>
+              <w:right w:type="dxa" w:w="100"/>
+            </w:tcMar>
+          </w:tcPr>
+          <w:p>
+            <w:r>
+              <w:t xml:space="preserve">Até o </w:t>
+            </w:r>
+            <w:r>
+              <w:rPr>
+                <w:b/>
+                <w:bCs/>
+              </w:rPr>
+              <w:t xml:space="preserve">dia do início</w:t>
+            </w:r>
+            <w:r>
+              <w:t xml:space="preserve"> (pode começar no mesmo dia)</w:t>
+            </w:r>
+          </w:p>
+        </w:tc>
+      </w:tr>
+      <w:tr>
+        <w:tc>
+          <w:tcPr>
+            <w:tcW w:type="dxa" w:w="1135"/>
+            <w:tcMar>
+              <w:top w:type="dxa" w:w="60"/>
+              <w:left w:type="dxa" w:w="100"/>
+              <w:bottom w:type="dxa" w:w="60"/>
+              <w:right w:type="dxa" w:w="100"/>
+            </w:tcMar>
+          </w:tcPr>
+          <w:p>
+            <w:r>
+              <w:rPr>
+                <w:b/>
+                <w:bCs/>
+              </w:rPr>
+              <w:t xml:space="preserve">B: Estoquista</w:t>
+            </w:r>
+          </w:p>
+        </w:tc>
+        <w:tc>
+          <w:tcPr>
+            <w:tcW w:type="dxa" w:w="2510"/>
+            <w:tcMar>
+              <w:top w:type="dxa" w:w="60"/>
+              <w:left w:type="dxa" w:w="100"/>
+              <w:bottom w:type="dxa" w:w="60"/>
+              <w:right w:type="dxa" w:w="100"/>
+            </w:tcMar>
+          </w:tcPr>
+          <w:p>
+            <w:r>
+              <w:t xml:space="preserve">Estoquista</w:t>
+            </w:r>
+          </w:p>
+        </w:tc>
+        <w:tc>
+          <w:tcPr>
+            <w:tcW w:type="dxa" w:w="3541"/>
+            <w:tcMar>
+              <w:top w:type="dxa" w:w="60"/>
+              <w:left w:type="dxa" w:w="100"/>
+              <w:bottom w:type="dxa" w:w="60"/>
+              <w:right w:type="dxa" w:w="100"/>
+            </w:tcMar>
+          </w:tcPr>
+          <w:p>
+            <w:r>
+              <w:t xml:space="preserve">Celular corporativo, Petroshow, Sigest, Infinitum e Sistema VS</w:t>
+            </w:r>
+          </w:p>
+        </w:tc>
+        <w:tc>
+          <w:tcPr>
+            <w:tcW w:type="dxa" w:w="2452"/>
+            <w:tcMar>
+              <w:top w:type="dxa" w:w="60"/>
+              <w:left w:type="dxa" w:w="100"/>
+              <w:bottom w:type="dxa" w:w="60"/>
+              <w:right w:type="dxa" w:w="100"/>
+            </w:tcMar>
+          </w:tcPr>
+          <w:p>
+            <w:r>
+              <w:rPr>
+                <w:b/>
+                <w:bCs/>
+              </w:rPr>
+              <w:t xml:space="preserve">2 dias úteis antes</w:t>
+            </w:r>
+            <w:r>
+              <w:t xml:space="preserve"> do início</w:t>
+            </w:r>
+          </w:p>
+        </w:tc>
+      </w:tr>
+      <w:tr>
+        <w:tc>
+          <w:tcPr>
+            <w:tcW w:type="dxa" w:w="1135"/>
+            <w:tcMar>
+              <w:top w:type="dxa" w:w="60"/>
+              <w:left w:type="dxa" w:w="100"/>
+              <w:bottom w:type="dxa" w:w="60"/>
+              <w:right w:type="dxa" w:w="100"/>
+            </w:tcMar>
+          </w:tcPr>
+          <w:p>
+            <w:r>
+              <w:rPr>
+                <w:b/>
+                <w:bCs/>
+              </w:rPr>
+              <w:t xml:space="preserve">C: Escritório</w:t>
+            </w:r>
+          </w:p>
+        </w:tc>
+        <w:tc>
+          <w:tcPr>
+            <w:tcW w:type="dxa" w:w="2510"/>
+            <w:tcMar>
+              <w:top w:type="dxa" w:w="60"/>
+              <w:left w:type="dxa" w:w="100"/>
+              <w:bottom w:type="dxa" w:w="60"/>
+              <w:right w:type="dxa" w:w="100"/>
+            </w:tcMar>
+          </w:tcPr>
+          <w:p>
+            <w:r>
+              <w:t xml:space="preserve">Administrativo, financeiro, comercial, RH/DP, documentação, compras</w:t>
+            </w:r>
+          </w:p>
+        </w:tc>
+        <w:tc>
+          <w:tcPr>
+            <w:tcW w:type="dxa" w:w="3541"/>
+            <w:tcMar>
+              <w:top w:type="dxa" w:w="60"/>
+              <w:left w:type="dxa" w:w="100"/>
+              <w:bottom w:type="dxa" w:w="60"/>
+              <w:right w:type="dxa" w:w="100"/>
+            </w:tcMar>
+          </w:tcPr>
+          <w:p>
+            <w:r>
+              <w:t xml:space="preserve">E-mail corporativo, Sistema VS, ERP e computador</w:t>
+            </w:r>
+          </w:p>
+        </w:tc>
+        <w:tc>
+          <w:tcPr>
+            <w:tcW w:type="dxa" w:w="2452"/>
+            <w:tcMar>
+              <w:top w:type="dxa" w:w="60"/>
+              <w:left w:type="dxa" w:w="100"/>
+              <w:bottom w:type="dxa" w:w="60"/>
+              <w:right w:type="dxa" w:w="100"/>
+            </w:tcMar>
+          </w:tcPr>
+          <w:p>
+            <w:r>
+              <w:rPr>
+                <w:b/>
+                <w:bCs/>
+              </w:rPr>
+              <w:t xml:space="preserve">3 dias úteis antes</w:t>
+            </w:r>
+            <w:r>
+              <w:t xml:space="preserve"> do início</w:t>
+            </w:r>
+          </w:p>
+        </w:tc>
+      </w:tr>
+      <w:tr>
+        <w:tc>
+          <w:tcPr>
+            <w:tcW w:type="dxa" w:w="1135"/>
+            <w:tcMar>
+              <w:top w:type="dxa" w:w="60"/>
+              <w:left w:type="dxa" w:w="100"/>
+              <w:bottom w:type="dxa" w:w="60"/>
+              <w:right w:type="dxa" w:w="100"/>
+            </w:tcMar>
+          </w:tcPr>
+          <w:p>
+            <w:r>
+              <w:rPr>
+                <w:b/>
+                <w:bCs/>
+              </w:rPr>
+              <w:t xml:space="preserve">D: Gestão</w:t>
+            </w:r>
+          </w:p>
+        </w:tc>
+        <w:tc>
+          <w:tcPr>
+            <w:tcW w:type="dxa" w:w="2510"/>
+            <w:tcMar>
+              <w:top w:type="dxa" w:w="60"/>
+              <w:left w:type="dxa" w:w="100"/>
+              <w:bottom w:type="dxa" w:w="60"/>
+              <w:right w:type="dxa" w:w="100"/>
+            </w:tcMar>
+          </w:tcPr>
+          <w:p>
+            <w:r>
+              <w:t xml:space="preserve">Gerentes e supervisores</w:t>
+            </w:r>
+          </w:p>
+        </w:tc>
+        <w:tc>
+          <w:tcPr>
+            <w:tcW w:type="dxa" w:w="3541"/>
+            <w:tcMar>
+              <w:top w:type="dxa" w:w="60"/>
+              <w:left w:type="dxa" w:w="100"/>
+              <w:bottom w:type="dxa" w:w="60"/>
+              <w:right w:type="dxa" w:w="100"/>
+            </w:tcMar>
+          </w:tcPr>
+          <w:p>
+            <w:r>
+              <w:t xml:space="preserve">Tudo do perfil C + celular corporativo e WhatsApp corporativo</w:t>
+            </w:r>
+          </w:p>
+        </w:tc>
+        <w:tc>
+          <w:tcPr>
+            <w:tcW w:type="dxa" w:w="2452"/>
+            <w:tcMar>
+              <w:top w:type="dxa" w:w="60"/>
+              <w:left w:type="dxa" w:w="100"/>
+              <w:bottom w:type="dxa" w:w="60"/>
+              <w:right w:type="dxa" w:w="100"/>
+            </w:tcMar>
+          </w:tcPr>
+          <w:p>
+            <w:r>
+              <w:rPr>
+                <w:b/>
+                <w:bCs/>
+              </w:rPr>
+              <w:t xml:space="preserve">3 dias úteis antes</w:t>
+            </w:r>
+            <w:r>
+              <w:t xml:space="preserve"> do início</w:t>
+            </w:r>
+          </w:p>
+        </w:tc>
+      </w:tr>
+    </w:tbl>
+    <w:p/>
+    <w:p>
+      <w:pPr>
+        <w:spacing w:after="120"/>
+      </w:pPr>
+      <w:r>
+        <w:t xml:space="preserve">Regras:</w:t>
+      </w:r>
+    </w:p>
+    <w:p>
+      <w:pPr>
+        <w:pStyle w:val="ListParagraph"/>
+        <w:numPr>
+          <w:ilvl w:val="0"/>
+          <w:numId w:val="2"/>
+        </w:numPr>
+      </w:pPr>
+      <w:r>
+        <w:rPr>
+          <w:b/>
+          <w:bCs/>
+        </w:rPr>
+        <w:t xml:space="preserve">Todo funcionário tem chamado, inclusive o perfil A.</w:t>
+      </w:r>
+      <w:r>
+        <w:t xml:space="preserve"> Sem ele a pessoa não fica registrada no GLPI, e a saída (POP-02) e as mudanças (POP-11) não têm de onde partir.</w:t>
+      </w:r>
+    </w:p>
+    <w:p>
+      <w:pPr>
+        <w:pStyle w:val="ListParagraph"/>
+        <w:numPr>
+          <w:ilvl w:val="0"/>
+          <w:numId w:val="2"/>
+        </w:numPr>
+      </w:pPr>
+      <w:r>
+        <w:rPr>
+          <w:b/>
+          <w:bCs/>
+        </w:rPr>
+        <w:t xml:space="preserve">O gestor pode pedir mais que o pacote</w:t>
+      </w:r>
+      <w:r>
+        <w:t xml:space="preserve"> do perfil (ex.: celular para um motorista). Vale o prazo do perfil que tem aquele item.</w:t>
+      </w:r>
+    </w:p>
+    <w:p>
+      <w:pPr>
+        <w:pStyle w:val="ListParagraph"/>
+        <w:numPr>
+          <w:ilvl w:val="0"/>
+          <w:numId w:val="2"/>
+        </w:numPr>
+      </w:pPr>
+      <w:r>
+        <w:t xml:space="preserve">Perfis B, C e D: tudo pronto </w:t>
+      </w:r>
+      <w:r>
+        <w:rPr>
+          <w:b/>
+          <w:bCs/>
+        </w:rPr>
+        <w:t xml:space="preserve">até o dia anterior</w:t>
+      </w:r>
+      <w:r>
+        <w:t xml:space="preserve"> ao início. Se for preciso </w:t>
+      </w:r>
+      <w:r>
+        <w:rPr>
+          <w:b/>
+          <w:bCs/>
+        </w:rPr>
+        <w:t xml:space="preserve">comprar</w:t>
+      </w:r>
+      <w:r>
+        <w:t xml:space="preserve"> computador ou celular, o prazo da compra não está incluído: a TI informa no chamado a data em que o equipamento fica pronto.</w:t>
+      </w:r>
+    </w:p>
+    <w:p>
+      <w:pPr>
+        <w:pStyle w:val="ListParagraph"/>
+        <w:numPr>
+          <w:ilvl w:val="0"/>
+          <w:numId w:val="2"/>
+        </w:numPr>
+      </w:pPr>
+      <w:r>
+        <w:t xml:space="preserve">Se a pessoa começar antes dos acessos ficarem prontos, ela </w:t>
+      </w:r>
+      <w:r>
+        <w:rPr>
+          <w:b/>
+          <w:bCs/>
+        </w:rPr>
+        <w:t xml:space="preserve">espera o acesso: nunca usa o login de um colega</w:t>
+      </w:r>
+      <w:r>
+        <w:t xml:space="preserve">.</w:t>
+      </w:r>
+    </w:p>
+    <w:p>
+      <w:pPr>
+        <w:pStyle w:val="ListParagraph"/>
+        <w:numPr>
+          <w:ilvl w:val="0"/>
+          <w:numId w:val="2"/>
+        </w:numPr>
+      </w:pPr>
+      <w:r>
+        <w:t xml:space="preserve">Cargo que não está na tabela: o gestor indica o perfil mais próximo no chamado e a TI confirma.</w:t>
+      </w:r>
+    </w:p>
+    <w:p>
+      <w:pPr>
+        <w:pStyle w:val="Heading2"/>
+      </w:pPr>
+      <w:r>
+        <w:t xml:space="preserve">4. Passo a passo</w:t>
+      </w:r>
+    </w:p>
+    <w:p>
+      <w:pPr>
+        <w:pStyle w:val="Heading3"/>
+      </w:pPr>
+      <w:r>
+        <w:t xml:space="preserve">4.1 Solicitação (RH)</w:t>
+      </w:r>
+    </w:p>
+    <w:p>
+      <w:pPr>
+        <w:tabs>
+          <w:tab w:val="left" w:pos="720"/>
+        </w:tabs>
+        <w:ind w:left="720" w:hanging="400"/>
+      </w:pPr>
+      <w:r>
+        <w:t xml:space="preserve">1.	</w:t>
+      </w:r>
+      <w:r>
+        <w:t xml:space="preserve">Abrir no GLPI o chamado </w:t>
+      </w:r>
+      <w:r>
+        <w:rPr>
+          <w:b/>
+          <w:bCs/>
+        </w:rPr>
+        <w:t xml:space="preserve">Solicitação de TI</w:t>
+      </w:r>
+      <w:r>
+        <w:t xml:space="preserve"> (Formulário A) com tipo </w:t>
+      </w:r>
+      <w:r>
+        <w:rPr>
+          <w:b/>
+          <w:bCs/>
+        </w:rPr>
+        <w:t xml:space="preserve">Entrada</w:t>
+      </w:r>
+      <w:r>
+        <w:t xml:space="preserve">: nome completo, empresa do grupo, cargo, setor, posto/unidade, gestor, data de início e </w:t>
+      </w:r>
+      <w:r>
+        <w:rPr>
+          <w:b/>
+          <w:bCs/>
+        </w:rPr>
+        <w:t xml:space="preserve">perfil de entrada</w:t>
+      </w:r>
+      <w:r>
+        <w:t xml:space="preserve"> (seção 3), respeitando o prazo do perfil.</w:t>
+      </w:r>
+    </w:p>
+    <w:p>
+      <w:pPr>
+        <w:tabs>
+          <w:tab w:val="left" w:pos="720"/>
+        </w:tabs>
+        <w:ind w:left="720" w:hanging="400"/>
+      </w:pPr>
+      <w:r>
+        <w:t xml:space="preserve">2.	</w:t>
+      </w:r>
+      <w:r>
+        <w:t xml:space="preserve">Incluir o gestor no chamado para aprovação.</w:t>
+      </w:r>
+    </w:p>
+    <w:p>
+      <w:pPr>
+        <w:pStyle w:val="ListParagraph"/>
+        <w:numPr>
+          <w:ilvl w:val="1"/>
+          <w:numId w:val="2"/>
+        </w:numPr>
+      </w:pPr>
+      <w:r>
+        <w:rPr>
+          <w:b/>
+          <w:bCs/>
+        </w:rPr>
+        <w:t xml:space="preserve">Foto:</w:t>
+      </w:r>
+      <w:r>
+        <w:t xml:space="preserve"> pedir ao funcionário a foto no padrão de </w:t>
+      </w:r>
+      <w:r>
+        <w:t xml:space="preserve">anexos/padrao-email.md</w:t>
+      </w:r>
+      <w:r>
+        <w:t xml:space="preserve"> §4 (ou tirar na admissão). O RH edita, monta a imagem de rodapé e anexa as duas ao chamado para a TI.</w:t>
+      </w:r>
+    </w:p>
+    <w:p>
+      <w:pPr>
+        <w:pStyle w:val="Heading3"/>
+      </w:pPr>
+      <w:r>
+        <w:t xml:space="preserve">4.2 Aprovação (gestor)</w:t>
+      </w:r>
+    </w:p>
+    <w:p>
+      <w:pPr>
+        <w:tabs>
+          <w:tab w:val="left" w:pos="720"/>
+        </w:tabs>
+        <w:ind w:left="720" w:hanging="400"/>
+      </w:pPr>
+      <w:r>
+        <w:t xml:space="preserve">3.	</w:t>
+      </w:r>
+      <w:r>
+        <w:t xml:space="preserve">Conferir o perfil e marcar no chamado os acessos e equipamentos necessários (lista na seção 5). O pacote do perfil é o padrão; o que for além dele precisa de justificativa no chamado.</w:t>
+      </w:r>
+    </w:p>
+    <w:p>
+      <w:pPr>
+        <w:tabs>
+          <w:tab w:val="left" w:pos="720"/>
+        </w:tabs>
+        <w:ind w:left="720" w:hanging="400"/>
+      </w:pPr>
+      <w:r>
+        <w:t xml:space="preserve">4.	</w:t>
+      </w:r>
+      <w:r>
+        <w:t xml:space="preserve">Para o </w:t>
+      </w:r>
+      <w:r>
+        <w:rPr>
+          <w:b/>
+          <w:bCs/>
+        </w:rPr>
+        <w:t xml:space="preserve">Sistema VS</w:t>
+      </w:r>
+      <w:r>
+        <w:t xml:space="preserve">, informar o </w:t>
+      </w:r>
+      <w:r>
+        <w:rPr>
+          <w:b/>
+          <w:bCs/>
+        </w:rPr>
+        <w:t xml:space="preserve">perfil</w:t>
+      </w:r>
+      <w:r>
+        <w:t xml:space="preserve"> e </w:t>
+      </w:r>
+      <w:r>
+        <w:rPr>
+          <w:b/>
+          <w:bCs/>
+        </w:rPr>
+        <w:t xml:space="preserve">quais postos/unidades</w:t>
+      </w:r>
+      <w:r>
+        <w:t xml:space="preserve"> a pessoa pode ver. Na dúvida, o mínimo: gerente de posto vê só o próprio posto.</w:t>
+      </w:r>
+    </w:p>
+    <w:p>
+      <w:pPr>
+        <w:tabs>
+          <w:tab w:val="left" w:pos="720"/>
+        </w:tabs>
+        <w:ind w:left="720" w:hanging="400"/>
+      </w:pPr>
+      <w:r>
+        <w:t xml:space="preserve">5.	</w:t>
+      </w:r>
+      <w:r>
+        <w:rPr>
+          <w:b/>
+          <w:bCs/>
+        </w:rPr>
+        <w:t xml:space="preserve">Aprovar o chamado</w:t>
+      </w:r>
+      <w:r>
+        <w:t xml:space="preserve"> no GLPI.</w:t>
+      </w:r>
+    </w:p>
+    <w:p>
+      <w:pPr>
+        <w:pStyle w:val="Heading3"/>
+      </w:pPr>
+      <w:r>
+        <w:t xml:space="preserve">4.3 Preparação (TI)</w:t>
+      </w:r>
+    </w:p>
+    <w:p>
+      <w:pPr>
+        <w:pBdr>
+          <w:left w:val="single" w:color="999999" w:sz="12" w:space="8"/>
+        </w:pBdr>
+        <w:spacing w:after="160"/>
+        <w:ind w:left="240"/>
+      </w:pPr>
+      <w:r>
+        <w:rPr>
+          <w:b/>
+          <w:bCs/>
+        </w:rPr>
+        <w:t xml:space="preserve">Perfil A:</w:t>
+      </w:r>
+      <w:r>
+        <w:t xml:space="preserve"> a TI só cadastra a pessoa no GLPI, com o Formulário B sem acessos, e fecha o chamado. Os passos 6 a 17 não se aplicam.</w:t>
+      </w:r>
+    </w:p>
+    <w:p>
+      <w:pPr>
+        <w:tabs>
+          <w:tab w:val="left" w:pos="720"/>
+        </w:tabs>
+        <w:ind w:left="720" w:hanging="400"/>
+      </w:pPr>
+      <w:r>
+        <w:t xml:space="preserve">6.	</w:t>
+      </w:r>
+      <w:r>
+        <w:rPr>
+          <w:b/>
+          <w:bCs/>
+        </w:rPr>
+        <w:t xml:space="preserve">E-mail:</w:t>
+      </w:r>
+      <w:r>
+        <w:t xml:space="preserve"> criar a conta no padrão de </w:t>
+      </w:r>
+      <w:r>
+        <w:t xml:space="preserve">anexos/padrao-email.md</w:t>
+      </w:r>
+      <w:r>
+        <w:t xml:space="preserve"> (</w:t>
+      </w:r>
+      <w:r>
+        <w:rPr>
+          <w:rFonts w:ascii="Consolas" w:cs="Consolas" w:eastAsia="Consolas" w:hAnsi="Consolas"/>
+          <w:sz w:val="19"/>
+          <w:szCs w:val="19"/>
+        </w:rPr>
+        <w:t xml:space="preserve">nome.sobrenome@&lt;domínio-da-empresa&gt;</w:t>
+      </w:r>
+      <w:r>
+        <w:t xml:space="preserve">), no painel da hospedagem da empresa correta. Senha forte gerada pelo Vaultwarden.</w:t>
+      </w:r>
+    </w:p>
+    <w:p>
+      <w:pPr>
+        <w:tabs>
+          <w:tab w:val="left" w:pos="720"/>
+        </w:tabs>
+        <w:ind w:left="720" w:hanging="400"/>
+      </w:pPr>
+      <w:r>
+        <w:t xml:space="preserve">7.	</w:t>
+      </w:r>
+      <w:r>
+        <w:rPr>
+          <w:b/>
+          <w:bCs/>
+        </w:rPr>
+        <w:t xml:space="preserve">Assinatura de e-mail:</w:t>
+      </w:r>
+      <w:r>
+        <w:t xml:space="preserve"> receber do RH a </w:t>
+      </w:r>
+      <w:r>
+        <w:rPr>
+          <w:b/>
+          <w:bCs/>
+        </w:rPr>
+        <w:t xml:space="preserve">imagem de rodapé</w:t>
+      </w:r>
+      <w:r>
+        <w:t xml:space="preserve"> (</w:t>
+      </w:r>
+      <w:r>
+        <w:rPr>
+          <w:rFonts w:ascii="Consolas" w:cs="Consolas" w:eastAsia="Consolas" w:hAnsi="Consolas"/>
+          <w:sz w:val="19"/>
+          <w:szCs w:val="19"/>
+        </w:rPr>
+        <w:t xml:space="preserve">rodape-nome.sobrenome.png</w:t>
+      </w:r>
+      <w:r>
+        <w:t xml:space="preserve">) e a foto editada (passo 2).</w:t>
+      </w:r>
+    </w:p>
+    <w:p>
+      <w:pPr>
+        <w:tabs>
+          <w:tab w:val="left" w:pos="720"/>
+        </w:tabs>
+        <w:ind w:left="720" w:hanging="400"/>
+      </w:pPr>
+      <w:r>
+        <w:t xml:space="preserve">8.	</w:t>
+      </w:r>
+      <w:r>
+        <w:rPr>
+          <w:b/>
+          <w:bCs/>
+        </w:rPr>
+        <w:t xml:space="preserve">Sistema VS:</w:t>
+      </w:r>
+      <w:r>
+        <w:t xml:space="preserve"> criar o usuário com o perfil e os postos aprovados. Conferir logando com o usuário que ele </w:t>
+      </w:r>
+      <w:r>
+        <w:rPr>
+          <w:b/>
+          <w:bCs/>
+        </w:rPr>
+        <w:t xml:space="preserve">não</w:t>
+      </w:r>
+      <w:r>
+        <w:t xml:space="preserve"> enxerga posto ou tela fora do aprovado.</w:t>
+      </w:r>
+    </w:p>
+    <w:p>
+      <w:pPr>
+        <w:tabs>
+          <w:tab w:val="left" w:pos="720"/>
+        </w:tabs>
+        <w:ind w:left="720" w:hanging="400"/>
+      </w:pPr>
+      <w:r>
+        <w:t xml:space="preserve">9.	</w:t>
+      </w:r>
+      <w:r>
+        <w:rPr>
+          <w:b/>
+          <w:bCs/>
+        </w:rPr>
+        <w:t xml:space="preserve">ERP / Petroshow / Sigest / Infinitum:</w:t>
+      </w:r>
+      <w:r>
+        <w:t xml:space="preserve"> criar os usuários aprovados, com o perfil da função (nunca copiar o perfil de outra pessoa sem conferir).</w:t>
+      </w:r>
+    </w:p>
+    <w:p>
+      <w:pPr>
+        <w:tabs>
+          <w:tab w:val="left" w:pos="720"/>
+        </w:tabs>
+        <w:ind w:left="720" w:hanging="400"/>
+      </w:pPr>
+      <w:r>
+        <w:t xml:space="preserve">10.	</w:t>
+      </w:r>
+      <w:r>
+        <w:rPr>
+          <w:b/>
+          <w:bCs/>
+        </w:rPr>
+        <w:t xml:space="preserve">Computador</w:t>
+      </w:r>
+      <w:r>
+        <w:t xml:space="preserve"> (se aprovado):</w:t>
+      </w:r>
+    </w:p>
+    <w:p>
+      <w:pPr>
+        <w:pStyle w:val="ListParagraph"/>
+        <w:numPr>
+          <w:ilvl w:val="1"/>
+          <w:numId w:val="2"/>
+        </w:numPr>
+      </w:pPr>
+      <w:r>
+        <w:t xml:space="preserve">Preparar pela instalação padrão (POP-04 Linux ou POP-05 Windows).</w:t>
+      </w:r>
+    </w:p>
+    <w:p>
+      <w:pPr>
+        <w:pStyle w:val="ListParagraph"/>
+        <w:numPr>
+          <w:ilvl w:val="1"/>
+          <w:numId w:val="2"/>
+        </w:numPr>
+      </w:pPr>
+      <w:r>
+        <w:t xml:space="preserve">Criar o usuário local da pessoa, </w:t>
+      </w:r>
+      <w:r>
+        <w:rPr>
+          <w:b/>
+          <w:bCs/>
+        </w:rPr>
+        <w:t xml:space="preserve">sem permissão de administrador</w:t>
+      </w:r>
+      <w:r>
+        <w:t xml:space="preserve">.</w:t>
+      </w:r>
+    </w:p>
+    <w:p>
+      <w:pPr>
+        <w:pStyle w:val="ListParagraph"/>
+        <w:numPr>
+          <w:ilvl w:val="1"/>
+          <w:numId w:val="2"/>
+        </w:numPr>
+      </w:pPr>
+      <w:r>
+        <w:t xml:space="preserve">Registrar no </w:t>
+      </w:r>
+      <w:r>
+        <w:rPr>
+          <w:b/>
+          <w:bCs/>
+        </w:rPr>
+        <w:t xml:space="preserve">GLPI</w:t>
+      </w:r>
+      <w:r>
+        <w:t xml:space="preserve">: patrimônio, número de série, quem recebe.</w:t>
+      </w:r>
+    </w:p>
+    <w:p>
+      <w:pPr>
+        <w:tabs>
+          <w:tab w:val="left" w:pos="720"/>
+        </w:tabs>
+        <w:ind w:left="720" w:hanging="400"/>
+      </w:pPr>
+      <w:r>
+        <w:t xml:space="preserve">11.	</w:t>
+      </w:r>
+      <w:r>
+        <w:rPr>
+          <w:b/>
+          <w:bCs/>
+        </w:rPr>
+        <w:t xml:space="preserve">Celular</w:t>
+      </w:r>
+      <w:r>
+        <w:t xml:space="preserve"> (se aprovado):</w:t>
+      </w:r>
+    </w:p>
+    <w:p>
+      <w:pPr>
+        <w:pStyle w:val="ListParagraph"/>
+        <w:numPr>
+          <w:ilvl w:val="1"/>
+          <w:numId w:val="2"/>
+        </w:numPr>
+      </w:pPr>
+      <w:r>
+        <w:t xml:space="preserve">Registrar o aparelho no </w:t>
+      </w:r>
+      <w:r>
+        <w:rPr>
+          <w:b/>
+          <w:bCs/>
+        </w:rPr>
+        <w:t xml:space="preserve">Headwind MDM</w:t>
+      </w:r>
+      <w:r>
+        <w:t xml:space="preserve"> (Android Enterprise).</w:t>
+      </w:r>
+    </w:p>
+    <w:p>
+      <w:pPr>
+        <w:pStyle w:val="ListParagraph"/>
+        <w:numPr>
+          <w:ilvl w:val="1"/>
+          <w:numId w:val="2"/>
+        </w:numPr>
+      </w:pPr>
+      <w:r>
+        <w:t xml:space="preserve">Entrar com o </w:t>
+      </w:r>
+      <w:r>
+        <w:rPr>
+          <w:b/>
+          <w:bCs/>
+        </w:rPr>
+        <w:t xml:space="preserve">Gmail da empresa daquele aparelho</w:t>
+      </w:r>
+      <w:r>
+        <w:t xml:space="preserve"> (</w:t>
+      </w:r>
+      <w:r>
+        <w:rPr>
+          <w:rFonts w:ascii="Consolas" w:cs="Consolas" w:eastAsia="Consolas" w:hAnsi="Consolas"/>
+          <w:sz w:val="19"/>
+          <w:szCs w:val="19"/>
+        </w:rPr>
+        <w:t xml:space="preserve">celularNN.&lt;empresa&gt;@gmail.com</w:t>
+      </w:r>
+      <w:r>
+        <w:t xml:space="preserve">, senha no Vaultwarden). Se o aparelho é novo, a TI cria a conta antes, com e-mail de recuperação </w:t>
+      </w:r>
+      <w:r>
+        <w:rPr>
+          <w:rFonts w:ascii="Consolas" w:cs="Consolas" w:eastAsia="Consolas" w:hAnsi="Consolas"/>
+          <w:sz w:val="19"/>
+          <w:szCs w:val="19"/>
+        </w:rPr>
+        <w:t xml:space="preserve">lui@trrvaledaserra.com.br</w:t>
+      </w:r>
+      <w:r>
+        <w:t xml:space="preserve"> e telefone de recuperação do celular corporativo do Lui Grosz (POP-TI §4.1). O funcionário não usa Gmail pessoal no aparelho.</w:t>
+      </w:r>
+    </w:p>
+    <w:p>
+      <w:pPr>
+        <w:pStyle w:val="ListParagraph"/>
+        <w:numPr>
+          <w:ilvl w:val="1"/>
+          <w:numId w:val="2"/>
+        </w:numPr>
+      </w:pPr>
+      <w:r>
+        <w:t xml:space="preserve">Conferir que o aparelho recebeu os </w:t>
+      </w:r>
+      <w:r>
+        <w:rPr>
+          <w:b/>
+          <w:bCs/>
+        </w:rPr>
+        <w:t xml:space="preserve">apps padrão</w:t>
+      </w:r>
+      <w:r>
+        <w:t xml:space="preserve"> e todas as políticas do POP-TI §4.2 (bloqueio de apps, PIN, bloqueio de reset, bloqueio e wipe remotos, Wi-Fi, localização desativada).</w:t>
+      </w:r>
+    </w:p>
+    <w:p>
+      <w:pPr>
+        <w:tabs>
+          <w:tab w:val="left" w:pos="720"/>
+        </w:tabs>
+        <w:ind w:left="720" w:hanging="400"/>
+      </w:pPr>
+      <w:r>
+        <w:t xml:space="preserve">12.	</w:t>
+      </w:r>
+      <w:r>
+        <w:rPr>
+          <w:b/>
+          <w:bCs/>
+        </w:rPr>
+        <w:t xml:space="preserve">WhatsApp corporativo</w:t>
+      </w:r>
+      <w:r>
+        <w:t xml:space="preserve"> (se aprovado): número da empresa no celular corporativo, nome no padrão da empresa e </w:t>
+      </w:r>
+      <w:r>
+        <w:rPr>
+          <w:b/>
+          <w:bCs/>
+        </w:rPr>
+        <w:t xml:space="preserve">foto de perfil</w:t>
+      </w:r>
+      <w:r>
+        <w:t xml:space="preserve"> = a foto editada pelo RH, incluir nos grupos de trabalho aprovados. Configurar o </w:t>
+      </w:r>
+      <w:r>
+        <w:rPr>
+          <w:b/>
+          <w:bCs/>
+        </w:rPr>
+        <w:t xml:space="preserve">backup diário</w:t>
+      </w:r>
+      <w:r>
+        <w:t xml:space="preserve"> no Gmail da empresa, sem vídeos e com criptografia (POP-TI §4.3).</w:t>
+      </w:r>
+    </w:p>
+    <w:p>
+      <w:pPr>
+        <w:tabs>
+          <w:tab w:val="left" w:pos="720"/>
+        </w:tabs>
+        <w:ind w:left="720" w:hanging="400"/>
+      </w:pPr>
+      <w:r>
+        <w:t xml:space="preserve">13.	</w:t>
+      </w:r>
+      <w:r>
+        <w:t xml:space="preserve">Preencher no GLPI a ficha </w:t>
+      </w:r>
+      <w:r>
+        <w:rPr>
+          <w:b/>
+          <w:bCs/>
+        </w:rPr>
+        <w:t xml:space="preserve">Formulário B: Checklist de acessos</w:t>
+      </w:r>
+      <w:r>
+        <w:t xml:space="preserve"> com cada conta criada (sistema, usuário, data, quem criou) e salvar cada senha no </w:t>
+      </w:r>
+      <w:r>
+        <w:rPr>
+          <w:b/>
+          <w:bCs/>
+        </w:rPr>
+        <w:t xml:space="preserve">Vaultwarden</w:t>
+      </w:r>
+      <w:r>
+        <w:t xml:space="preserve">, na pasta do funcionário.</w:t>
+      </w:r>
+    </w:p>
+    <w:p>
+      <w:pPr>
+        <w:pStyle w:val="Heading3"/>
+      </w:pPr>
+      <w:r>
+        <w:t xml:space="preserve">4.4 Primeiro dia (TI + funcionário)</w:t>
+      </w:r>
+    </w:p>
+    <w:p>
+      <w:pPr>
+        <w:tabs>
+          <w:tab w:val="left" w:pos="720"/>
+        </w:tabs>
+        <w:ind w:left="720" w:hanging="400"/>
+      </w:pPr>
+      <w:r>
+        <w:t xml:space="preserve">14.	</w:t>
+      </w:r>
+      <w:r>
+        <w:t xml:space="preserve">Entregar os equipamentos e o </w:t>
+      </w:r>
+      <w:r>
+        <w:rPr>
+          <w:b/>
+          <w:bCs/>
+        </w:rPr>
+        <w:t xml:space="preserve">Formulário C: Termo de responsabilidade</w:t>
+      </w:r>
+      <w:r>
+        <w:t xml:space="preserve"> para assinatura (1 via com o funcionário, 1 na pasta do RH).</w:t>
+      </w:r>
+    </w:p>
+    <w:p>
+      <w:pPr>
+        <w:tabs>
+          <w:tab w:val="left" w:pos="720"/>
+        </w:tabs>
+        <w:ind w:left="720" w:hanging="400"/>
+      </w:pPr>
+      <w:r>
+        <w:t xml:space="preserve">15.	</w:t>
+      </w:r>
+      <w:r>
+        <w:t xml:space="preserve">Entregar as senhas ao funcionário pessoalmente e acompanhar o primeiro login em cada sistema. </w:t>
+      </w:r>
+      <w:r>
+        <w:rPr>
+          <w:b/>
+          <w:bCs/>
+        </w:rPr>
+        <w:t xml:space="preserve">Todas as senhas da pessoa ficam no Vaultwarden</w:t>
+      </w:r>
+      <w:r>
+        <w:t xml:space="preserve"> (pasta do funcionário). O funcionário </w:t>
+      </w:r>
+      <w:r>
+        <w:rPr>
+          <w:b/>
+          <w:bCs/>
+        </w:rPr>
+        <w:t xml:space="preserve">não troca</w:t>
+      </w:r>
+      <w:r>
+        <w:t xml:space="preserve"> as senhas: se precisar trocar, pede à TI, que troca e atualiza o cofre.</w:t>
+      </w:r>
+    </w:p>
+    <w:p>
+      <w:pPr>
+        <w:tabs>
+          <w:tab w:val="left" w:pos="720"/>
+        </w:tabs>
+        <w:ind w:left="720" w:hanging="400"/>
+      </w:pPr>
+      <w:r>
+        <w:t xml:space="preserve">16.	</w:t>
+      </w:r>
+      <w:r>
+        <w:t xml:space="preserve">Instalar a imagem de rodapé como assinatura no Outlook/webmail e colocar a foto de perfil no e-mail, se o programa permitir (passo a passo em </w:t>
+      </w:r>
+      <w:r>
+        <w:t xml:space="preserve">anexos/padrao-email.md</w:t>
+      </w:r>
+      <w:r>
+        <w:t xml:space="preserve">).</w:t>
+      </w:r>
+    </w:p>
+    <w:p>
+      <w:pPr>
+        <w:tabs>
+          <w:tab w:val="left" w:pos="720"/>
+        </w:tabs>
+        <w:ind w:left="720" w:hanging="400"/>
+      </w:pPr>
+      <w:r>
+        <w:t xml:space="preserve">17.	</w:t>
+      </w:r>
+      <w:r>
+        <w:t xml:space="preserve">Explicar as regras básicas: senha não se compartilha com colegas, não se troca sem a TI, aparelho perdido avisa a TI na hora (POP-03), app novo só via solicitação (POP-08).</w:t>
+      </w:r>
+    </w:p>
+    <w:p>
+      <w:pPr>
+        <w:pStyle w:val="Heading2"/>
+      </w:pPr>
+      <w:r>
+        <w:t xml:space="preserve">5. Lista de acessos e equipamentos possíveis</w:t>
+      </w:r>
+    </w:p>
+    <w:tbl>
+      <w:tblPr>
+        <w:tblW w:type="dxa" w:w="9638"/>
+        <w:tblBorders>
+          <w:top w:val="single" w:color="999999" w:sz="4"/>
+          <w:left w:val="single" w:color="999999" w:sz="4"/>
+          <w:bottom w:val="single" w:color="999999" w:sz="4"/>
+          <w:right w:val="single" w:color="999999" w:sz="4"/>
+          <w:insideH w:val="single" w:color="999999" w:sz="4"/>
+          <w:insideV w:val="single" w:color="999999" w:sz="4"/>
+        </w:tblBorders>
+      </w:tblPr>
+      <w:tblGrid>
+        <w:gridCol w:w="3283"/>
+        <w:gridCol w:w="6355"/>
+      </w:tblGrid>
+      <w:tr>
+        <w:trPr>
+          <w:tblHeader/>
+        </w:trPr>
+        <w:tc>
+          <w:tcPr>
+            <w:tcW w:type="dxa" w:w="3283"/>
             <w:shd w:fill="EEEEEE" w:color="auto" w:val="clear"/>
             <w:tcMar>
               <w:top w:type="dxa" w:w="60"/>
@@ -1111,7 +1674,7 @@
         </w:tc>
         <w:tc>
           <w:tcPr>
-            <w:tcW w:type="dxa" w:w="6516"/>
+            <w:tcW w:type="dxa" w:w="6355"/>
             <w:shd w:fill="EEEEEE" w:color="auto" w:val="clear"/>
             <w:tcMar>
               <w:top w:type="dxa" w:w="60"/>
@@ -1134,7 +1697,7 @@
       <w:tr>
         <w:tc>
           <w:tcPr>
-            <w:tcW w:type="dxa" w:w="3122"/>
+            <w:tcW w:type="dxa" w:w="3283"/>
             <w:tcMar>
               <w:top w:type="dxa" w:w="60"/>
               <w:left w:type="dxa" w:w="100"/>
@@ -1150,7 +1713,7 @@
         </w:tc>
         <w:tc>
           <w:tcPr>
-            <w:tcW w:type="dxa" w:w="6516"/>
+            <w:tcW w:type="dxa" w:w="6355"/>
             <w:tcMar>
               <w:top w:type="dxa" w:w="60"/>
               <w:left w:type="dxa" w:w="100"/>
@@ -1179,7 +1742,7 @@
       <w:tr>
         <w:tc>
           <w:tcPr>
-            <w:tcW w:type="dxa" w:w="3122"/>
+            <w:tcW w:type="dxa" w:w="3283"/>
             <w:tcMar>
               <w:top w:type="dxa" w:w="60"/>
               <w:left w:type="dxa" w:w="100"/>
@@ -1195,7 +1758,7 @@
         </w:tc>
         <w:tc>
           <w:tcPr>
-            <w:tcW w:type="dxa" w:w="6516"/>
+            <w:tcW w:type="dxa" w:w="6355"/>
             <w:tcMar>
               <w:top w:type="dxa" w:w="60"/>
               <w:left w:type="dxa" w:w="100"/>
@@ -1213,23 +1776,23 @@
       <w:tr>
         <w:tc>
           <w:tcPr>
-            <w:tcW w:type="dxa" w:w="3122"/>
-            <w:tcMar>
-              <w:top w:type="dxa" w:w="60"/>
-              <w:left w:type="dxa" w:w="100"/>
-              <w:bottom w:type="dxa" w:w="60"/>
-              <w:right w:type="dxa" w:w="100"/>
-            </w:tcMar>
-          </w:tcPr>
-          <w:p>
-            <w:r>
-              <w:t xml:space="preserve">ERP / Petroshow / Infinitum</w:t>
-            </w:r>
-          </w:p>
-        </w:tc>
-        <w:tc>
-          <w:tcPr>
-            <w:tcW w:type="dxa" w:w="6516"/>
+            <w:tcW w:type="dxa" w:w="3283"/>
+            <w:tcMar>
+              <w:top w:type="dxa" w:w="60"/>
+              <w:left w:type="dxa" w:w="100"/>
+              <w:bottom w:type="dxa" w:w="60"/>
+              <w:right w:type="dxa" w:w="100"/>
+            </w:tcMar>
+          </w:tcPr>
+          <w:p>
+            <w:r>
+              <w:t xml:space="preserve">ERP / Petroshow / Sigest / Infinitum</w:t>
+            </w:r>
+          </w:p>
+        </w:tc>
+        <w:tc>
+          <w:tcPr>
+            <w:tcW w:type="dxa" w:w="6355"/>
             <w:tcMar>
               <w:top w:type="dxa" w:w="60"/>
               <w:left w:type="dxa" w:w="100"/>
@@ -1247,7 +1810,7 @@
       <w:tr>
         <w:tc>
           <w:tcPr>
-            <w:tcW w:type="dxa" w:w="3122"/>
+            <w:tcW w:type="dxa" w:w="3283"/>
             <w:tcMar>
               <w:top w:type="dxa" w:w="60"/>
               <w:left w:type="dxa" w:w="100"/>
@@ -1263,7 +1826,7 @@
         </w:tc>
         <w:tc>
           <w:tcPr>
-            <w:tcW w:type="dxa" w:w="6516"/>
+            <w:tcW w:type="dxa" w:w="6355"/>
             <w:tcMar>
               <w:top w:type="dxa" w:w="60"/>
               <w:left w:type="dxa" w:w="100"/>
@@ -1281,7 +1844,7 @@
       <w:tr>
         <w:tc>
           <w:tcPr>
-            <w:tcW w:type="dxa" w:w="3122"/>
+            <w:tcW w:type="dxa" w:w="3283"/>
             <w:tcMar>
               <w:top w:type="dxa" w:w="60"/>
               <w:left w:type="dxa" w:w="100"/>
@@ -1297,7 +1860,7 @@
         </w:tc>
         <w:tc>
           <w:tcPr>
-            <w:tcW w:type="dxa" w:w="6516"/>
+            <w:tcW w:type="dxa" w:w="6355"/>
             <w:tcMar>
               <w:top w:type="dxa" w:w="60"/>
               <w:left w:type="dxa" w:w="100"/>
@@ -1315,7 +1878,7 @@
       <w:tr>
         <w:tc>
           <w:tcPr>
-            <w:tcW w:type="dxa" w:w="3122"/>
+            <w:tcW w:type="dxa" w:w="3283"/>
             <w:tcMar>
               <w:top w:type="dxa" w:w="60"/>
               <w:left w:type="dxa" w:w="100"/>
@@ -1331,7 +1894,7 @@
         </w:tc>
         <w:tc>
           <w:tcPr>
-            <w:tcW w:type="dxa" w:w="6516"/>
+            <w:tcW w:type="dxa" w:w="6355"/>
             <w:tcMar>
               <w:top w:type="dxa" w:w="60"/>
               <w:left w:type="dxa" w:w="100"/>
@@ -1409,7 +1972,19 @@
         </w:numPr>
       </w:pPr>
       <w:r>
-        <w:t xml:space="preserve">Tudo criado até o dia anterior ao início.</w:t>
+        <w:t xml:space="preserve">Perfis B, C e D: tudo criado até o dia anterior ao início (seção 3).</w:t>
+      </w:r>
+    </w:p>
+    <w:p>
+      <w:pPr>
+        <w:pStyle w:val="ListParagraph"/>
+        <w:numPr>
+          <w:ilvl w:val="0"/>
+          <w:numId w:val="2"/>
+        </w:numPr>
+      </w:pPr>
+      <w:r>
+        <w:t xml:space="preserve">Perfil A: chamado aberto e fechado até o dia do início.</w:t>
       </w:r>
     </w:p>
     <w:p>
@@ -2462,7 +3037,7 @@
           <w:b/>
           <w:bCs/>
         </w:rPr>
-        <w:t xml:space="preserve">ERP / Petroshow / Infinitum:</w:t>
+        <w:t xml:space="preserve">ERP / Petroshow / Sigest / Infinitum:</w:t>
       </w:r>
       <w:r>
         <w:t xml:space="preserve"> desativar os usuários (não excluir, pelo mesmo motivo).</w:t>
@@ -3719,7 +4294,7 @@
           <w:b/>
           <w:bCs/>
         </w:rPr>
-        <w:t xml:space="preserve">ERP / Petroshow / Infinitum:</w:t>
+        <w:t xml:space="preserve">ERP / Petroshow / Sigest / Infinitum:</w:t>
       </w:r>
       <w:r>
         <w:t xml:space="preserve"> ajustar perfil; remover acesso à unidade antiga.</w:t>
@@ -4410,7 +4985,7 @@
           <w:b/>
           <w:bCs/>
         </w:rPr>
-        <w:t xml:space="preserve">Sistema VS / ERP / Petroshow / Infinitum:</w:t>
+        <w:t xml:space="preserve">Sistema VS / ERP / Petroshow / Sigest / Infinitum:</w:t>
       </w:r>
       <w:r>
         <w:t xml:space="preserve"> desativar o usuário (sem excluir).</w:t>
@@ -6284,7 +6859,7 @@
         <w:t xml:space="preserve">Versão:</w:t>
       </w:r>
       <w:r>
-        <w:t xml:space="preserve"> 1.0 · </w:t>
+        <w:t xml:space="preserve"> 1.1 · </w:t>
       </w:r>
       <w:r>
         <w:rPr>
@@ -6294,7 +6869,7 @@
         <w:t xml:space="preserve">Data:</w:t>
       </w:r>
       <w:r>
-        <w:t xml:space="preserve"> 15/10/2026</w:t>
+        <w:t xml:space="preserve"> 16/10/2026</w:t>
       </w:r>
       <w:r>
         <w:br/>
@@ -6382,8 +6957,8 @@
         </w:tblBorders>
       </w:tblPr>
       <w:tblGrid>
-        <w:gridCol w:w="7744"/>
-        <w:gridCol w:w="1894"/>
+        <w:gridCol w:w="7834"/>
+        <w:gridCol w:w="1804"/>
       </w:tblGrid>
       <w:tr>
         <w:trPr>
@@ -6391,7 +6966,7 @@
         </w:trPr>
         <w:tc>
           <w:tcPr>
-            <w:tcW w:type="dxa" w:w="7744"/>
+            <w:tcW w:type="dxa" w:w="7834"/>
             <w:shd w:fill="EEEEEE" w:color="auto" w:val="clear"/>
             <w:tcMar>
               <w:top w:type="dxa" w:w="60"/>
@@ -6412,7 +6987,7 @@
         </w:tc>
         <w:tc>
           <w:tcPr>
-            <w:tcW w:type="dxa" w:w="1894"/>
+            <w:tcW w:type="dxa" w:w="1804"/>
             <w:shd w:fill="EEEEEE" w:color="auto" w:val="clear"/>
             <w:tcMar>
               <w:top w:type="dxa" w:w="60"/>
@@ -6435,7 +7010,7 @@
       <w:tr>
         <w:tc>
           <w:tcPr>
-            <w:tcW w:type="dxa" w:w="7744"/>
+            <w:tcW w:type="dxa" w:w="7834"/>
             <w:tcMar>
               <w:top w:type="dxa" w:w="60"/>
               <w:left w:type="dxa" w:w="100"/>
@@ -6451,7 +7026,7 @@
         </w:tc>
         <w:tc>
           <w:tcPr>
-            <w:tcW w:type="dxa" w:w="1894"/>
+            <w:tcW w:type="dxa" w:w="1804"/>
             <w:tcMar>
               <w:top w:type="dxa" w:w="60"/>
               <w:left w:type="dxa" w:w="100"/>
@@ -6465,7 +7040,7 @@
       <w:tr>
         <w:tc>
           <w:tcPr>
-            <w:tcW w:type="dxa" w:w="7744"/>
+            <w:tcW w:type="dxa" w:w="7834"/>
             <w:tcMar>
               <w:top w:type="dxa" w:w="60"/>
               <w:left w:type="dxa" w:w="100"/>
@@ -6481,7 +7056,7 @@
         </w:tc>
         <w:tc>
           <w:tcPr>
-            <w:tcW w:type="dxa" w:w="1894"/>
+            <w:tcW w:type="dxa" w:w="1804"/>
             <w:tcMar>
               <w:top w:type="dxa" w:w="60"/>
               <w:left w:type="dxa" w:w="100"/>
@@ -6495,7 +7070,7 @@
       <w:tr>
         <w:tc>
           <w:tcPr>
-            <w:tcW w:type="dxa" w:w="7744"/>
+            <w:tcW w:type="dxa" w:w="7834"/>
             <w:tcMar>
               <w:top w:type="dxa" w:w="60"/>
               <w:left w:type="dxa" w:w="100"/>
@@ -6511,7 +7086,7 @@
         </w:tc>
         <w:tc>
           <w:tcPr>
-            <w:tcW w:type="dxa" w:w="1894"/>
+            <w:tcW w:type="dxa" w:w="1804"/>
             <w:tcMar>
               <w:top w:type="dxa" w:w="60"/>
               <w:left w:type="dxa" w:w="100"/>
@@ -6525,53 +7100,57 @@
       <w:tr>
         <w:tc>
           <w:tcPr>
-            <w:tcW w:type="dxa" w:w="7744"/>
-            <w:tcMar>
-              <w:top w:type="dxa" w:w="60"/>
-              <w:left w:type="dxa" w:w="100"/>
-              <w:bottom w:type="dxa" w:w="60"/>
-              <w:right w:type="dxa" w:w="100"/>
-            </w:tcMar>
-          </w:tcPr>
-          <w:p>
-            <w:r>
-              <w:t xml:space="preserve">Posto / unidade</w:t>
-            </w:r>
-          </w:p>
-        </w:tc>
-        <w:tc>
-          <w:tcPr>
-            <w:tcW w:type="dxa" w:w="1894"/>
-            <w:tcMar>
-              <w:top w:type="dxa" w:w="60"/>
-              <w:left w:type="dxa" w:w="100"/>
-              <w:bottom w:type="dxa" w:w="60"/>
-              <w:right w:type="dxa" w:w="100"/>
-            </w:tcMar>
-          </w:tcPr>
-          <w:p/>
+            <w:tcW w:type="dxa" w:w="7834"/>
+            <w:tcMar>
+              <w:top w:type="dxa" w:w="60"/>
+              <w:left w:type="dxa" w:w="100"/>
+              <w:bottom w:type="dxa" w:w="60"/>
+              <w:right w:type="dxa" w:w="100"/>
+            </w:tcMar>
+          </w:tcPr>
+          <w:p>
+            <w:r>
+              <w:t xml:space="preserve">Perfil de entrada (POP-01 §3, só para entrada)</w:t>
+            </w:r>
+          </w:p>
+        </w:tc>
+        <w:tc>
+          <w:tcPr>
+            <w:tcW w:type="dxa" w:w="1804"/>
+            <w:tcMar>
+              <w:top w:type="dxa" w:w="60"/>
+              <w:left w:type="dxa" w:w="100"/>
+              <w:bottom w:type="dxa" w:w="60"/>
+              <w:right w:type="dxa" w:w="100"/>
+            </w:tcMar>
+          </w:tcPr>
+          <w:p>
+            <w:r>
+              <w:t xml:space="preserve">☐ A: Sem acesso de TI ☐ B: Estoquista ☐ C: Escritório ☐ D: Gestão</w:t>
+            </w:r>
+          </w:p>
         </w:tc>
       </w:tr>
       <w:tr>
         <w:tc>
           <w:tcPr>
-            <w:tcW w:type="dxa" w:w="7744"/>
-            <w:tcMar>
-              <w:top w:type="dxa" w:w="60"/>
-              <w:left w:type="dxa" w:w="100"/>
-              <w:bottom w:type="dxa" w:w="60"/>
-              <w:right w:type="dxa" w:w="100"/>
-            </w:tcMar>
-          </w:tcPr>
-          <w:p>
-            <w:r>
-              <w:t xml:space="preserve">Gestor</w:t>
-            </w:r>
-          </w:p>
-        </w:tc>
-        <w:tc>
-          <w:tcPr>
-            <w:tcW w:type="dxa" w:w="1894"/>
+            <w:tcW w:type="dxa" w:w="7834"/>
+            <w:tcMar>
+              <w:top w:type="dxa" w:w="60"/>
+              <w:left w:type="dxa" w:w="100"/>
+              <w:bottom w:type="dxa" w:w="60"/>
+              <w:right w:type="dxa" w:w="100"/>
+            </w:tcMar>
+          </w:tcPr>
+          <w:p>
+            <w:r>
+              <w:t xml:space="preserve">Posto / unidade</w:t>
+            </w:r>
+          </w:p>
+        </w:tc>
+        <w:tc>
+          <w:tcPr>
+            <w:tcW w:type="dxa" w:w="1804"/>
             <w:tcMar>
               <w:top w:type="dxa" w:w="60"/>
               <w:left w:type="dxa" w:w="100"/>
@@ -6585,23 +7164,23 @@
       <w:tr>
         <w:tc>
           <w:tcPr>
-            <w:tcW w:type="dxa" w:w="7744"/>
-            <w:tcMar>
-              <w:top w:type="dxa" w:w="60"/>
-              <w:left w:type="dxa" w:w="100"/>
-              <w:bottom w:type="dxa" w:w="60"/>
-              <w:right w:type="dxa" w:w="100"/>
-            </w:tcMar>
-          </w:tcPr>
-          <w:p>
-            <w:r>
-              <w:t xml:space="preserve">Data (início, mudança, saída ou afastamento)</w:t>
-            </w:r>
-          </w:p>
-        </w:tc>
-        <w:tc>
-          <w:tcPr>
-            <w:tcW w:type="dxa" w:w="1894"/>
+            <w:tcW w:type="dxa" w:w="7834"/>
+            <w:tcMar>
+              <w:top w:type="dxa" w:w="60"/>
+              <w:left w:type="dxa" w:w="100"/>
+              <w:bottom w:type="dxa" w:w="60"/>
+              <w:right w:type="dxa" w:w="100"/>
+            </w:tcMar>
+          </w:tcPr>
+          <w:p>
+            <w:r>
+              <w:t xml:space="preserve">Gestor</w:t>
+            </w:r>
+          </w:p>
+        </w:tc>
+        <w:tc>
+          <w:tcPr>
+            <w:tcW w:type="dxa" w:w="1804"/>
             <w:tcMar>
               <w:top w:type="dxa" w:w="60"/>
               <w:left w:type="dxa" w:w="100"/>
@@ -6615,23 +7194,23 @@
       <w:tr>
         <w:tc>
           <w:tcPr>
-            <w:tcW w:type="dxa" w:w="7744"/>
-            <w:tcMar>
-              <w:top w:type="dxa" w:w="60"/>
-              <w:left w:type="dxa" w:w="100"/>
-              <w:bottom w:type="dxa" w:w="60"/>
-              <w:right w:type="dxa" w:w="100"/>
-            </w:tcMar>
-          </w:tcPr>
-          <w:p>
-            <w:r>
-              <w:t xml:space="preserve">Hora (só para saída)</w:t>
-            </w:r>
-          </w:p>
-        </w:tc>
-        <w:tc>
-          <w:tcPr>
-            <w:tcW w:type="dxa" w:w="1894"/>
+            <w:tcW w:type="dxa" w:w="7834"/>
+            <w:tcMar>
+              <w:top w:type="dxa" w:w="60"/>
+              <w:left w:type="dxa" w:w="100"/>
+              <w:bottom w:type="dxa" w:w="60"/>
+              <w:right w:type="dxa" w:w="100"/>
+            </w:tcMar>
+          </w:tcPr>
+          <w:p>
+            <w:r>
+              <w:t xml:space="preserve">Data (início, mudança, saída ou afastamento)</w:t>
+            </w:r>
+          </w:p>
+        </w:tc>
+        <w:tc>
+          <w:tcPr>
+            <w:tcW w:type="dxa" w:w="1804"/>
             <w:tcMar>
               <w:top w:type="dxa" w:w="60"/>
               <w:left w:type="dxa" w:w="100"/>
@@ -6645,23 +7224,23 @@
       <w:tr>
         <w:tc>
           <w:tcPr>
-            <w:tcW w:type="dxa" w:w="7744"/>
-            <w:tcMar>
-              <w:top w:type="dxa" w:w="60"/>
-              <w:left w:type="dxa" w:w="100"/>
-              <w:bottom w:type="dxa" w:w="60"/>
-              <w:right w:type="dxa" w:w="100"/>
-            </w:tcMar>
-          </w:tcPr>
-          <w:p>
-            <w:r>
-              <w:t xml:space="preserve">Volta prevista (só para afastamento)</w:t>
-            </w:r>
-          </w:p>
-        </w:tc>
-        <w:tc>
-          <w:tcPr>
-            <w:tcW w:type="dxa" w:w="1894"/>
+            <w:tcW w:type="dxa" w:w="7834"/>
+            <w:tcMar>
+              <w:top w:type="dxa" w:w="60"/>
+              <w:left w:type="dxa" w:w="100"/>
+              <w:bottom w:type="dxa" w:w="60"/>
+              <w:right w:type="dxa" w:w="100"/>
+            </w:tcMar>
+          </w:tcPr>
+          <w:p>
+            <w:r>
+              <w:t xml:space="preserve">Hora (só para saída)</w:t>
+            </w:r>
+          </w:p>
+        </w:tc>
+        <w:tc>
+          <w:tcPr>
+            <w:tcW w:type="dxa" w:w="1804"/>
             <w:tcMar>
               <w:top w:type="dxa" w:w="60"/>
               <w:left w:type="dxa" w:w="100"/>
@@ -6675,7 +7254,37 @@
       <w:tr>
         <w:tc>
           <w:tcPr>
-            <w:tcW w:type="dxa" w:w="7744"/>
+            <w:tcW w:type="dxa" w:w="7834"/>
+            <w:tcMar>
+              <w:top w:type="dxa" w:w="60"/>
+              <w:left w:type="dxa" w:w="100"/>
+              <w:bottom w:type="dxa" w:w="60"/>
+              <w:right w:type="dxa" w:w="100"/>
+            </w:tcMar>
+          </w:tcPr>
+          <w:p>
+            <w:r>
+              <w:t xml:space="preserve">Volta prevista (só para afastamento)</w:t>
+            </w:r>
+          </w:p>
+        </w:tc>
+        <w:tc>
+          <w:tcPr>
+            <w:tcW w:type="dxa" w:w="1804"/>
+            <w:tcMar>
+              <w:top w:type="dxa" w:w="60"/>
+              <w:left w:type="dxa" w:w="100"/>
+              <w:bottom w:type="dxa" w:w="60"/>
+              <w:right w:type="dxa" w:w="100"/>
+            </w:tcMar>
+          </w:tcPr>
+          <w:p/>
+        </w:tc>
+      </w:tr>
+      <w:tr>
+        <w:tc>
+          <w:tcPr>
+            <w:tcW w:type="dxa" w:w="7834"/>
             <w:tcMar>
               <w:top w:type="dxa" w:w="60"/>
               <w:left w:type="dxa" w:w="100"/>
@@ -6708,7 +7317,7 @@
         </w:tc>
         <w:tc>
           <w:tcPr>
-            <w:tcW w:type="dxa" w:w="1894"/>
+            <w:tcW w:type="dxa" w:w="1804"/>
             <w:tcMar>
               <w:top w:type="dxa" w:w="60"/>
               <w:left w:type="dxa" w:w="100"/>
@@ -6722,7 +7331,7 @@
       <w:tr>
         <w:tc>
           <w:tcPr>
-            <w:tcW w:type="dxa" w:w="7744"/>
+            <w:tcW w:type="dxa" w:w="7834"/>
             <w:tcMar>
               <w:top w:type="dxa" w:w="60"/>
               <w:left w:type="dxa" w:w="100"/>
@@ -6738,7 +7347,7 @@
         </w:tc>
         <w:tc>
           <w:tcPr>
-            <w:tcW w:type="dxa" w:w="1894"/>
+            <w:tcW w:type="dxa" w:w="1804"/>
             <w:tcMar>
               <w:top w:type="dxa" w:w="60"/>
               <w:left w:type="dxa" w:w="100"/>
@@ -6752,7 +7361,7 @@
       <w:tr>
         <w:tc>
           <w:tcPr>
-            <w:tcW w:type="dxa" w:w="7744"/>
+            <w:tcW w:type="dxa" w:w="7834"/>
             <w:tcMar>
               <w:top w:type="dxa" w:w="60"/>
               <w:left w:type="dxa" w:w="100"/>
@@ -6768,7 +7377,7 @@
         </w:tc>
         <w:tc>
           <w:tcPr>
-            <w:tcW w:type="dxa" w:w="1894"/>
+            <w:tcW w:type="dxa" w:w="1804"/>
             <w:tcMar>
               <w:top w:type="dxa" w:w="60"/>
               <w:left w:type="dxa" w:w="100"/>
@@ -6782,7 +7391,7 @@
       <w:tr>
         <w:tc>
           <w:tcPr>
-            <w:tcW w:type="dxa" w:w="7744"/>
+            <w:tcW w:type="dxa" w:w="7834"/>
             <w:tcMar>
               <w:top w:type="dxa" w:w="60"/>
               <w:left w:type="dxa" w:w="100"/>
@@ -6798,7 +7407,7 @@
         </w:tc>
         <w:tc>
           <w:tcPr>
-            <w:tcW w:type="dxa" w:w="1894"/>
+            <w:tcW w:type="dxa" w:w="1804"/>
             <w:tcMar>
               <w:top w:type="dxa" w:w="60"/>
               <w:left w:type="dxa" w:w="100"/>
@@ -6839,9 +7448,9 @@
         </w:tblBorders>
       </w:tblPr>
       <w:tblGrid>
-        <w:gridCol w:w="4523"/>
-        <w:gridCol w:w="2536"/>
-        <w:gridCol w:w="2579"/>
+        <w:gridCol w:w="4409"/>
+        <w:gridCol w:w="2575"/>
+        <w:gridCol w:w="2654"/>
       </w:tblGrid>
       <w:tr>
         <w:trPr>
@@ -6849,7 +7458,7 @@
         </w:trPr>
         <w:tc>
           <w:tcPr>
-            <w:tcW w:type="dxa" w:w="4523"/>
+            <w:tcW w:type="dxa" w:w="4409"/>
             <w:shd w:fill="EEEEEE" w:color="auto" w:val="clear"/>
             <w:tcMar>
               <w:top w:type="dxa" w:w="60"/>
@@ -6870,7 +7479,7 @@
         </w:tc>
         <w:tc>
           <w:tcPr>
-            <w:tcW w:type="dxa" w:w="2536"/>
+            <w:tcW w:type="dxa" w:w="2575"/>
             <w:shd w:fill="EEEEEE" w:color="auto" w:val="clear"/>
             <w:tcMar>
               <w:top w:type="dxa" w:w="60"/>
@@ -6891,7 +7500,7 @@
         </w:tc>
         <w:tc>
           <w:tcPr>
-            <w:tcW w:type="dxa" w:w="2579"/>
+            <w:tcW w:type="dxa" w:w="2654"/>
             <w:shd w:fill="EEEEEE" w:color="auto" w:val="clear"/>
             <w:tcMar>
               <w:top w:type="dxa" w:w="60"/>
@@ -6914,7 +7523,7 @@
       <w:tr>
         <w:tc>
           <w:tcPr>
-            <w:tcW w:type="dxa" w:w="4523"/>
+            <w:tcW w:type="dxa" w:w="4409"/>
             <w:tcMar>
               <w:top w:type="dxa" w:w="60"/>
               <w:left w:type="dxa" w:w="100"/>
@@ -6930,7 +7539,7 @@
         </w:tc>
         <w:tc>
           <w:tcPr>
-            <w:tcW w:type="dxa" w:w="2536"/>
+            <w:tcW w:type="dxa" w:w="2575"/>
             <w:tcMar>
               <w:top w:type="dxa" w:w="60"/>
               <w:left w:type="dxa" w:w="100"/>
@@ -6946,7 +7555,7 @@
         </w:tc>
         <w:tc>
           <w:tcPr>
-            <w:tcW w:type="dxa" w:w="2579"/>
+            <w:tcW w:type="dxa" w:w="2654"/>
             <w:tcMar>
               <w:top w:type="dxa" w:w="60"/>
               <w:left w:type="dxa" w:w="100"/>
@@ -6960,7 +7569,7 @@
       <w:tr>
         <w:tc>
           <w:tcPr>
-            <w:tcW w:type="dxa" w:w="4523"/>
+            <w:tcW w:type="dxa" w:w="4409"/>
             <w:tcMar>
               <w:top w:type="dxa" w:w="60"/>
               <w:left w:type="dxa" w:w="100"/>
@@ -6976,7 +7585,7 @@
         </w:tc>
         <w:tc>
           <w:tcPr>
-            <w:tcW w:type="dxa" w:w="2536"/>
+            <w:tcW w:type="dxa" w:w="2575"/>
             <w:tcMar>
               <w:top w:type="dxa" w:w="60"/>
               <w:left w:type="dxa" w:w="100"/>
@@ -6992,7 +7601,7 @@
         </w:tc>
         <w:tc>
           <w:tcPr>
-            <w:tcW w:type="dxa" w:w="2579"/>
+            <w:tcW w:type="dxa" w:w="2654"/>
             <w:tcMar>
               <w:top w:type="dxa" w:w="60"/>
               <w:left w:type="dxa" w:w="100"/>
@@ -7010,7 +7619,7 @@
       <w:tr>
         <w:tc>
           <w:tcPr>
-            <w:tcW w:type="dxa" w:w="4523"/>
+            <w:tcW w:type="dxa" w:w="4409"/>
             <w:tcMar>
               <w:top w:type="dxa" w:w="60"/>
               <w:left w:type="dxa" w:w="100"/>
@@ -7026,7 +7635,7 @@
         </w:tc>
         <w:tc>
           <w:tcPr>
-            <w:tcW w:type="dxa" w:w="2536"/>
+            <w:tcW w:type="dxa" w:w="2575"/>
             <w:tcMar>
               <w:top w:type="dxa" w:w="60"/>
               <w:left w:type="dxa" w:w="100"/>
@@ -7042,7 +7651,7 @@
         </w:tc>
         <w:tc>
           <w:tcPr>
-            <w:tcW w:type="dxa" w:w="2579"/>
+            <w:tcW w:type="dxa" w:w="2654"/>
             <w:tcMar>
               <w:top w:type="dxa" w:w="60"/>
               <w:left w:type="dxa" w:w="100"/>
@@ -7060,7 +7669,7 @@
       <w:tr>
         <w:tc>
           <w:tcPr>
-            <w:tcW w:type="dxa" w:w="4523"/>
+            <w:tcW w:type="dxa" w:w="4409"/>
             <w:tcMar>
               <w:top w:type="dxa" w:w="60"/>
               <w:left w:type="dxa" w:w="100"/>
@@ -7076,7 +7685,7 @@
         </w:tc>
         <w:tc>
           <w:tcPr>
-            <w:tcW w:type="dxa" w:w="2536"/>
+            <w:tcW w:type="dxa" w:w="2575"/>
             <w:tcMar>
               <w:top w:type="dxa" w:w="60"/>
               <w:left w:type="dxa" w:w="100"/>
@@ -7092,7 +7701,7 @@
         </w:tc>
         <w:tc>
           <w:tcPr>
-            <w:tcW w:type="dxa" w:w="2579"/>
+            <w:tcW w:type="dxa" w:w="2654"/>
             <w:tcMar>
               <w:top w:type="dxa" w:w="60"/>
               <w:left w:type="dxa" w:w="100"/>
@@ -7110,23 +7719,23 @@
       <w:tr>
         <w:tc>
           <w:tcPr>
-            <w:tcW w:type="dxa" w:w="4523"/>
-            <w:tcMar>
-              <w:top w:type="dxa" w:w="60"/>
-              <w:left w:type="dxa" w:w="100"/>
-              <w:bottom w:type="dxa" w:w="60"/>
-              <w:right w:type="dxa" w:w="100"/>
-            </w:tcMar>
-          </w:tcPr>
-          <w:p>
-            <w:r>
-              <w:t xml:space="preserve">Infinitum</w:t>
-            </w:r>
-          </w:p>
-        </w:tc>
-        <w:tc>
-          <w:tcPr>
-            <w:tcW w:type="dxa" w:w="2536"/>
+            <w:tcW w:type="dxa" w:w="4409"/>
+            <w:tcMar>
+              <w:top w:type="dxa" w:w="60"/>
+              <w:left w:type="dxa" w:w="100"/>
+              <w:bottom w:type="dxa" w:w="60"/>
+              <w:right w:type="dxa" w:w="100"/>
+            </w:tcMar>
+          </w:tcPr>
+          <w:p>
+            <w:r>
+              <w:t xml:space="preserve">Sigest</w:t>
+            </w:r>
+          </w:p>
+        </w:tc>
+        <w:tc>
+          <w:tcPr>
+            <w:tcW w:type="dxa" w:w="2575"/>
             <w:tcMar>
               <w:top w:type="dxa" w:w="60"/>
               <w:left w:type="dxa" w:w="100"/>
@@ -7142,7 +7751,7 @@
         </w:tc>
         <w:tc>
           <w:tcPr>
-            <w:tcW w:type="dxa" w:w="2579"/>
+            <w:tcW w:type="dxa" w:w="2654"/>
             <w:tcMar>
               <w:top w:type="dxa" w:w="60"/>
               <w:left w:type="dxa" w:w="100"/>
@@ -7160,23 +7769,23 @@
       <w:tr>
         <w:tc>
           <w:tcPr>
-            <w:tcW w:type="dxa" w:w="4523"/>
-            <w:tcMar>
-              <w:top w:type="dxa" w:w="60"/>
-              <w:left w:type="dxa" w:w="100"/>
-              <w:bottom w:type="dxa" w:w="60"/>
-              <w:right w:type="dxa" w:w="100"/>
-            </w:tcMar>
-          </w:tcPr>
-          <w:p>
-            <w:r>
-              <w:t xml:space="preserve">Computador</w:t>
-            </w:r>
-          </w:p>
-        </w:tc>
-        <w:tc>
-          <w:tcPr>
-            <w:tcW w:type="dxa" w:w="2536"/>
+            <w:tcW w:type="dxa" w:w="4409"/>
+            <w:tcMar>
+              <w:top w:type="dxa" w:w="60"/>
+              <w:left w:type="dxa" w:w="100"/>
+              <w:bottom w:type="dxa" w:w="60"/>
+              <w:right w:type="dxa" w:w="100"/>
+            </w:tcMar>
+          </w:tcPr>
+          <w:p>
+            <w:r>
+              <w:t xml:space="preserve">Infinitum</w:t>
+            </w:r>
+          </w:p>
+        </w:tc>
+        <w:tc>
+          <w:tcPr>
+            <w:tcW w:type="dxa" w:w="2575"/>
             <w:tcMar>
               <w:top w:type="dxa" w:w="60"/>
               <w:left w:type="dxa" w:w="100"/>
@@ -7192,37 +7801,41 @@
         </w:tc>
         <w:tc>
           <w:tcPr>
-            <w:tcW w:type="dxa" w:w="2579"/>
-            <w:tcMar>
-              <w:top w:type="dxa" w:w="60"/>
-              <w:left w:type="dxa" w:w="100"/>
-              <w:bottom w:type="dxa" w:w="60"/>
-              <w:right w:type="dxa" w:w="100"/>
-            </w:tcMar>
-          </w:tcPr>
-          <w:p/>
+            <w:tcW w:type="dxa" w:w="2654"/>
+            <w:tcMar>
+              <w:top w:type="dxa" w:w="60"/>
+              <w:left w:type="dxa" w:w="100"/>
+              <w:bottom w:type="dxa" w:w="60"/>
+              <w:right w:type="dxa" w:w="100"/>
+            </w:tcMar>
+          </w:tcPr>
+          <w:p>
+            <w:r>
+              <w:t xml:space="preserve">perfil:</w:t>
+            </w:r>
+          </w:p>
         </w:tc>
       </w:tr>
       <w:tr>
         <w:tc>
           <w:tcPr>
-            <w:tcW w:type="dxa" w:w="4523"/>
-            <w:tcMar>
-              <w:top w:type="dxa" w:w="60"/>
-              <w:left w:type="dxa" w:w="100"/>
-              <w:bottom w:type="dxa" w:w="60"/>
-              <w:right w:type="dxa" w:w="100"/>
-            </w:tcMar>
-          </w:tcPr>
-          <w:p>
-            <w:r>
-              <w:t xml:space="preserve">Celular corporativo</w:t>
-            </w:r>
-          </w:p>
-        </w:tc>
-        <w:tc>
-          <w:tcPr>
-            <w:tcW w:type="dxa" w:w="2536"/>
+            <w:tcW w:type="dxa" w:w="4409"/>
+            <w:tcMar>
+              <w:top w:type="dxa" w:w="60"/>
+              <w:left w:type="dxa" w:w="100"/>
+              <w:bottom w:type="dxa" w:w="60"/>
+              <w:right w:type="dxa" w:w="100"/>
+            </w:tcMar>
+          </w:tcPr>
+          <w:p>
+            <w:r>
+              <w:t xml:space="preserve">Computador</w:t>
+            </w:r>
+          </w:p>
+        </w:tc>
+        <w:tc>
+          <w:tcPr>
+            <w:tcW w:type="dxa" w:w="2575"/>
             <w:tcMar>
               <w:top w:type="dxa" w:w="60"/>
               <w:left w:type="dxa" w:w="100"/>
@@ -7238,7 +7851,7 @@
         </w:tc>
         <w:tc>
           <w:tcPr>
-            <w:tcW w:type="dxa" w:w="2579"/>
+            <w:tcW w:type="dxa" w:w="2654"/>
             <w:tcMar>
               <w:top w:type="dxa" w:w="60"/>
               <w:left w:type="dxa" w:w="100"/>
@@ -7252,23 +7865,23 @@
       <w:tr>
         <w:tc>
           <w:tcPr>
-            <w:tcW w:type="dxa" w:w="4523"/>
-            <w:tcMar>
-              <w:top w:type="dxa" w:w="60"/>
-              <w:left w:type="dxa" w:w="100"/>
-              <w:bottom w:type="dxa" w:w="60"/>
-              <w:right w:type="dxa" w:w="100"/>
-            </w:tcMar>
-          </w:tcPr>
-          <w:p>
-            <w:r>
-              <w:t xml:space="preserve">WhatsApp corporativo</w:t>
-            </w:r>
-          </w:p>
-        </w:tc>
-        <w:tc>
-          <w:tcPr>
-            <w:tcW w:type="dxa" w:w="2536"/>
+            <w:tcW w:type="dxa" w:w="4409"/>
+            <w:tcMar>
+              <w:top w:type="dxa" w:w="60"/>
+              <w:left w:type="dxa" w:w="100"/>
+              <w:bottom w:type="dxa" w:w="60"/>
+              <w:right w:type="dxa" w:w="100"/>
+            </w:tcMar>
+          </w:tcPr>
+          <w:p>
+            <w:r>
+              <w:t xml:space="preserve">Celular corporativo</w:t>
+            </w:r>
+          </w:p>
+        </w:tc>
+        <w:tc>
+          <w:tcPr>
+            <w:tcW w:type="dxa" w:w="2575"/>
             <w:tcMar>
               <w:top w:type="dxa" w:w="60"/>
               <w:left w:type="dxa" w:w="100"/>
@@ -7284,25 +7897,71 @@
         </w:tc>
         <w:tc>
           <w:tcPr>
-            <w:tcW w:type="dxa" w:w="2579"/>
-            <w:tcMar>
-              <w:top w:type="dxa" w:w="60"/>
-              <w:left w:type="dxa" w:w="100"/>
-              <w:bottom w:type="dxa" w:w="60"/>
-              <w:right w:type="dxa" w:w="100"/>
-            </w:tcMar>
-          </w:tcPr>
-          <w:p>
-            <w:r>
-              <w:t xml:space="preserve">grupos:</w:t>
-            </w:r>
-          </w:p>
+            <w:tcW w:type="dxa" w:w="2654"/>
+            <w:tcMar>
+              <w:top w:type="dxa" w:w="60"/>
+              <w:left w:type="dxa" w:w="100"/>
+              <w:bottom w:type="dxa" w:w="60"/>
+              <w:right w:type="dxa" w:w="100"/>
+            </w:tcMar>
+          </w:tcPr>
+          <w:p/>
         </w:tc>
       </w:tr>
       <w:tr>
         <w:tc>
           <w:tcPr>
-            <w:tcW w:type="dxa" w:w="4523"/>
+            <w:tcW w:type="dxa" w:w="4409"/>
+            <w:tcMar>
+              <w:top w:type="dxa" w:w="60"/>
+              <w:left w:type="dxa" w:w="100"/>
+              <w:bottom w:type="dxa" w:w="60"/>
+              <w:right w:type="dxa" w:w="100"/>
+            </w:tcMar>
+          </w:tcPr>
+          <w:p>
+            <w:r>
+              <w:t xml:space="preserve">WhatsApp corporativo</w:t>
+            </w:r>
+          </w:p>
+        </w:tc>
+        <w:tc>
+          <w:tcPr>
+            <w:tcW w:type="dxa" w:w="2575"/>
+            <w:tcMar>
+              <w:top w:type="dxa" w:w="60"/>
+              <w:left w:type="dxa" w:w="100"/>
+              <w:bottom w:type="dxa" w:w="60"/>
+              <w:right w:type="dxa" w:w="100"/>
+            </w:tcMar>
+          </w:tcPr>
+          <w:p>
+            <w:r>
+              <w:t xml:space="preserve">☐</w:t>
+            </w:r>
+          </w:p>
+        </w:tc>
+        <w:tc>
+          <w:tcPr>
+            <w:tcW w:type="dxa" w:w="2654"/>
+            <w:tcMar>
+              <w:top w:type="dxa" w:w="60"/>
+              <w:left w:type="dxa" w:w="100"/>
+              <w:bottom w:type="dxa" w:w="60"/>
+              <w:right w:type="dxa" w:w="100"/>
+            </w:tcMar>
+          </w:tcPr>
+          <w:p>
+            <w:r>
+              <w:t xml:space="preserve">grupos:</w:t>
+            </w:r>
+          </w:p>
+        </w:tc>
+      </w:tr>
+      <w:tr>
+        <w:tc>
+          <w:tcPr>
+            <w:tcW w:type="dxa" w:w="4409"/>
             <w:tcMar>
               <w:top w:type="dxa" w:w="60"/>
               <w:left w:type="dxa" w:w="100"/>
@@ -7318,7 +7977,7 @@
         </w:tc>
         <w:tc>
           <w:tcPr>
-            <w:tcW w:type="dxa" w:w="2536"/>
+            <w:tcW w:type="dxa" w:w="2575"/>
             <w:tcMar>
               <w:top w:type="dxa" w:w="60"/>
               <w:left w:type="dxa" w:w="100"/>
@@ -7334,7 +7993,7 @@
         </w:tc>
         <w:tc>
           <w:tcPr>
-            <w:tcW w:type="dxa" w:w="2579"/>
+            <w:tcW w:type="dxa" w:w="2654"/>
             <w:tcMar>
               <w:top w:type="dxa" w:w="60"/>
               <w:left w:type="dxa" w:w="100"/>
@@ -7424,11 +8083,11 @@
         </w:tblBorders>
       </w:tblPr>
       <w:tblGrid>
-        <w:gridCol w:w="3352"/>
-        <w:gridCol w:w="1571"/>
-        <w:gridCol w:w="1571"/>
-        <w:gridCol w:w="1571"/>
-        <w:gridCol w:w="1573"/>
+        <w:gridCol w:w="3244"/>
+        <w:gridCol w:w="1598"/>
+        <w:gridCol w:w="1598"/>
+        <w:gridCol w:w="1598"/>
+        <w:gridCol w:w="1600"/>
       </w:tblGrid>
       <w:tr>
         <w:trPr>
@@ -7436,7 +8095,7 @@
         </w:trPr>
         <w:tc>
           <w:tcPr>
-            <w:tcW w:type="dxa" w:w="3352"/>
+            <w:tcW w:type="dxa" w:w="3244"/>
             <w:shd w:fill="EEEEEE" w:color="auto" w:val="clear"/>
             <w:tcMar>
               <w:top w:type="dxa" w:w="60"/>
@@ -7457,7 +8116,7 @@
         </w:tc>
         <w:tc>
           <w:tcPr>
-            <w:tcW w:type="dxa" w:w="1571"/>
+            <w:tcW w:type="dxa" w:w="1598"/>
             <w:shd w:fill="EEEEEE" w:color="auto" w:val="clear"/>
             <w:tcMar>
               <w:top w:type="dxa" w:w="60"/>
@@ -7478,7 +8137,7 @@
         </w:tc>
         <w:tc>
           <w:tcPr>
-            <w:tcW w:type="dxa" w:w="1571"/>
+            <w:tcW w:type="dxa" w:w="1598"/>
             <w:shd w:fill="EEEEEE" w:color="auto" w:val="clear"/>
             <w:tcMar>
               <w:top w:type="dxa" w:w="60"/>
@@ -7499,7 +8158,7 @@
         </w:tc>
         <w:tc>
           <w:tcPr>
-            <w:tcW w:type="dxa" w:w="1571"/>
+            <w:tcW w:type="dxa" w:w="1598"/>
             <w:shd w:fill="EEEEEE" w:color="auto" w:val="clear"/>
             <w:tcMar>
               <w:top w:type="dxa" w:w="60"/>
@@ -7520,7 +8179,7 @@
         </w:tc>
         <w:tc>
           <w:tcPr>
-            <w:tcW w:type="dxa" w:w="1573"/>
+            <w:tcW w:type="dxa" w:w="1600"/>
             <w:shd w:fill="EEEEEE" w:color="auto" w:val="clear"/>
             <w:tcMar>
               <w:top w:type="dxa" w:w="60"/>
@@ -7543,7 +8202,7 @@
       <w:tr>
         <w:tc>
           <w:tcPr>
-            <w:tcW w:type="dxa" w:w="3352"/>
+            <w:tcW w:type="dxa" w:w="3244"/>
             <w:tcMar>
               <w:top w:type="dxa" w:w="60"/>
               <w:left w:type="dxa" w:w="100"/>
@@ -7559,7 +8218,7 @@
         </w:tc>
         <w:tc>
           <w:tcPr>
-            <w:tcW w:type="dxa" w:w="1571"/>
+            <w:tcW w:type="dxa" w:w="1598"/>
             <w:tcMar>
               <w:top w:type="dxa" w:w="60"/>
               <w:left w:type="dxa" w:w="100"/>
@@ -7571,7 +8230,7 @@
         </w:tc>
         <w:tc>
           <w:tcPr>
-            <w:tcW w:type="dxa" w:w="1571"/>
+            <w:tcW w:type="dxa" w:w="1598"/>
             <w:tcMar>
               <w:top w:type="dxa" w:w="60"/>
               <w:left w:type="dxa" w:w="100"/>
@@ -7583,7 +8242,7 @@
         </w:tc>
         <w:tc>
           <w:tcPr>
-            <w:tcW w:type="dxa" w:w="1571"/>
+            <w:tcW w:type="dxa" w:w="1598"/>
             <w:tcMar>
               <w:top w:type="dxa" w:w="60"/>
               <w:left w:type="dxa" w:w="100"/>
@@ -7595,7 +8254,7 @@
         </w:tc>
         <w:tc>
           <w:tcPr>
-            <w:tcW w:type="dxa" w:w="1573"/>
+            <w:tcW w:type="dxa" w:w="1600"/>
             <w:tcMar>
               <w:top w:type="dxa" w:w="60"/>
               <w:left w:type="dxa" w:w="100"/>
@@ -7609,7 +8268,7 @@
       <w:tr>
         <w:tc>
           <w:tcPr>
-            <w:tcW w:type="dxa" w:w="3352"/>
+            <w:tcW w:type="dxa" w:w="3244"/>
             <w:tcMar>
               <w:top w:type="dxa" w:w="60"/>
               <w:left w:type="dxa" w:w="100"/>
@@ -7625,7 +8284,7 @@
         </w:tc>
         <w:tc>
           <w:tcPr>
-            <w:tcW w:type="dxa" w:w="1571"/>
+            <w:tcW w:type="dxa" w:w="1598"/>
             <w:tcMar>
               <w:top w:type="dxa" w:w="60"/>
               <w:left w:type="dxa" w:w="100"/>
@@ -7637,7 +8296,7 @@
         </w:tc>
         <w:tc>
           <w:tcPr>
-            <w:tcW w:type="dxa" w:w="1571"/>
+            <w:tcW w:type="dxa" w:w="1598"/>
             <w:tcMar>
               <w:top w:type="dxa" w:w="60"/>
               <w:left w:type="dxa" w:w="100"/>
@@ -7649,7 +8308,7 @@
         </w:tc>
         <w:tc>
           <w:tcPr>
-            <w:tcW w:type="dxa" w:w="1571"/>
+            <w:tcW w:type="dxa" w:w="1598"/>
             <w:tcMar>
               <w:top w:type="dxa" w:w="60"/>
               <w:left w:type="dxa" w:w="100"/>
@@ -7661,7 +8320,7 @@
         </w:tc>
         <w:tc>
           <w:tcPr>
-            <w:tcW w:type="dxa" w:w="1573"/>
+            <w:tcW w:type="dxa" w:w="1600"/>
             <w:tcMar>
               <w:top w:type="dxa" w:w="60"/>
               <w:left w:type="dxa" w:w="100"/>
@@ -7675,7 +8334,7 @@
       <w:tr>
         <w:tc>
           <w:tcPr>
-            <w:tcW w:type="dxa" w:w="3352"/>
+            <w:tcW w:type="dxa" w:w="3244"/>
             <w:tcMar>
               <w:top w:type="dxa" w:w="60"/>
               <w:left w:type="dxa" w:w="100"/>
@@ -7691,7 +8350,7 @@
         </w:tc>
         <w:tc>
           <w:tcPr>
-            <w:tcW w:type="dxa" w:w="1571"/>
+            <w:tcW w:type="dxa" w:w="1598"/>
             <w:tcMar>
               <w:top w:type="dxa" w:w="60"/>
               <w:left w:type="dxa" w:w="100"/>
@@ -7703,7 +8362,7 @@
         </w:tc>
         <w:tc>
           <w:tcPr>
-            <w:tcW w:type="dxa" w:w="1571"/>
+            <w:tcW w:type="dxa" w:w="1598"/>
             <w:tcMar>
               <w:top w:type="dxa" w:w="60"/>
               <w:left w:type="dxa" w:w="100"/>
@@ -7715,7 +8374,7 @@
         </w:tc>
         <w:tc>
           <w:tcPr>
-            <w:tcW w:type="dxa" w:w="1571"/>
+            <w:tcW w:type="dxa" w:w="1598"/>
             <w:tcMar>
               <w:top w:type="dxa" w:w="60"/>
               <w:left w:type="dxa" w:w="100"/>
@@ -7727,7 +8386,7 @@
         </w:tc>
         <w:tc>
           <w:tcPr>
-            <w:tcW w:type="dxa" w:w="1573"/>
+            <w:tcW w:type="dxa" w:w="1600"/>
             <w:tcMar>
               <w:top w:type="dxa" w:w="60"/>
               <w:left w:type="dxa" w:w="100"/>
@@ -7741,7 +8400,7 @@
       <w:tr>
         <w:tc>
           <w:tcPr>
-            <w:tcW w:type="dxa" w:w="3352"/>
+            <w:tcW w:type="dxa" w:w="3244"/>
             <w:tcMar>
               <w:top w:type="dxa" w:w="60"/>
               <w:left w:type="dxa" w:w="100"/>
@@ -7757,7 +8416,7 @@
         </w:tc>
         <w:tc>
           <w:tcPr>
-            <w:tcW w:type="dxa" w:w="1571"/>
+            <w:tcW w:type="dxa" w:w="1598"/>
             <w:tcMar>
               <w:top w:type="dxa" w:w="60"/>
               <w:left w:type="dxa" w:w="100"/>
@@ -7769,7 +8428,7 @@
         </w:tc>
         <w:tc>
           <w:tcPr>
-            <w:tcW w:type="dxa" w:w="1571"/>
+            <w:tcW w:type="dxa" w:w="1598"/>
             <w:tcMar>
               <w:top w:type="dxa" w:w="60"/>
               <w:left w:type="dxa" w:w="100"/>
@@ -7781,7 +8440,7 @@
         </w:tc>
         <w:tc>
           <w:tcPr>
-            <w:tcW w:type="dxa" w:w="1571"/>
+            <w:tcW w:type="dxa" w:w="1598"/>
             <w:tcMar>
               <w:top w:type="dxa" w:w="60"/>
               <w:left w:type="dxa" w:w="100"/>
@@ -7793,7 +8452,7 @@
         </w:tc>
         <w:tc>
           <w:tcPr>
-            <w:tcW w:type="dxa" w:w="1573"/>
+            <w:tcW w:type="dxa" w:w="1600"/>
             <w:tcMar>
               <w:top w:type="dxa" w:w="60"/>
               <w:left w:type="dxa" w:w="100"/>
@@ -7807,23 +8466,23 @@
       <w:tr>
         <w:tc>
           <w:tcPr>
-            <w:tcW w:type="dxa" w:w="3352"/>
-            <w:tcMar>
-              <w:top w:type="dxa" w:w="60"/>
-              <w:left w:type="dxa" w:w="100"/>
-              <w:bottom w:type="dxa" w:w="60"/>
-              <w:right w:type="dxa" w:w="100"/>
-            </w:tcMar>
-          </w:tcPr>
-          <w:p>
-            <w:r>
-              <w:t xml:space="preserve">Infinitum</w:t>
-            </w:r>
-          </w:p>
-        </w:tc>
-        <w:tc>
-          <w:tcPr>
-            <w:tcW w:type="dxa" w:w="1571"/>
+            <w:tcW w:type="dxa" w:w="3244"/>
+            <w:tcMar>
+              <w:top w:type="dxa" w:w="60"/>
+              <w:left w:type="dxa" w:w="100"/>
+              <w:bottom w:type="dxa" w:w="60"/>
+              <w:right w:type="dxa" w:w="100"/>
+            </w:tcMar>
+          </w:tcPr>
+          <w:p>
+            <w:r>
+              <w:t xml:space="preserve">Sigest</w:t>
+            </w:r>
+          </w:p>
+        </w:tc>
+        <w:tc>
+          <w:tcPr>
+            <w:tcW w:type="dxa" w:w="1598"/>
             <w:tcMar>
               <w:top w:type="dxa" w:w="60"/>
               <w:left w:type="dxa" w:w="100"/>
@@ -7835,7 +8494,7 @@
         </w:tc>
         <w:tc>
           <w:tcPr>
-            <w:tcW w:type="dxa" w:w="1571"/>
+            <w:tcW w:type="dxa" w:w="1598"/>
             <w:tcMar>
               <w:top w:type="dxa" w:w="60"/>
               <w:left w:type="dxa" w:w="100"/>
@@ -7847,7 +8506,7 @@
         </w:tc>
         <w:tc>
           <w:tcPr>
-            <w:tcW w:type="dxa" w:w="1571"/>
+            <w:tcW w:type="dxa" w:w="1598"/>
             <w:tcMar>
               <w:top w:type="dxa" w:w="60"/>
               <w:left w:type="dxa" w:w="100"/>
@@ -7859,7 +8518,7 @@
         </w:tc>
         <w:tc>
           <w:tcPr>
-            <w:tcW w:type="dxa" w:w="1573"/>
+            <w:tcW w:type="dxa" w:w="1600"/>
             <w:tcMar>
               <w:top w:type="dxa" w:w="60"/>
               <w:left w:type="dxa" w:w="100"/>
@@ -7873,23 +8532,23 @@
       <w:tr>
         <w:tc>
           <w:tcPr>
-            <w:tcW w:type="dxa" w:w="3352"/>
-            <w:tcMar>
-              <w:top w:type="dxa" w:w="60"/>
-              <w:left w:type="dxa" w:w="100"/>
-              <w:bottom w:type="dxa" w:w="60"/>
-              <w:right w:type="dxa" w:w="100"/>
-            </w:tcMar>
-          </w:tcPr>
-          <w:p>
-            <w:r>
-              <w:t xml:space="preserve">WhatsApp corporativo</w:t>
-            </w:r>
-          </w:p>
-        </w:tc>
-        <w:tc>
-          <w:tcPr>
-            <w:tcW w:type="dxa" w:w="1571"/>
+            <w:tcW w:type="dxa" w:w="3244"/>
+            <w:tcMar>
+              <w:top w:type="dxa" w:w="60"/>
+              <w:left w:type="dxa" w:w="100"/>
+              <w:bottom w:type="dxa" w:w="60"/>
+              <w:right w:type="dxa" w:w="100"/>
+            </w:tcMar>
+          </w:tcPr>
+          <w:p>
+            <w:r>
+              <w:t xml:space="preserve">Infinitum</w:t>
+            </w:r>
+          </w:p>
+        </w:tc>
+        <w:tc>
+          <w:tcPr>
+            <w:tcW w:type="dxa" w:w="1598"/>
             <w:tcMar>
               <w:top w:type="dxa" w:w="60"/>
               <w:left w:type="dxa" w:w="100"/>
@@ -7901,7 +8560,7 @@
         </w:tc>
         <w:tc>
           <w:tcPr>
-            <w:tcW w:type="dxa" w:w="1571"/>
+            <w:tcW w:type="dxa" w:w="1598"/>
             <w:tcMar>
               <w:top w:type="dxa" w:w="60"/>
               <w:left w:type="dxa" w:w="100"/>
@@ -7913,7 +8572,7 @@
         </w:tc>
         <w:tc>
           <w:tcPr>
-            <w:tcW w:type="dxa" w:w="1571"/>
+            <w:tcW w:type="dxa" w:w="1598"/>
             <w:tcMar>
               <w:top w:type="dxa" w:w="60"/>
               <w:left w:type="dxa" w:w="100"/>
@@ -7925,7 +8584,7 @@
         </w:tc>
         <w:tc>
           <w:tcPr>
-            <w:tcW w:type="dxa" w:w="1573"/>
+            <w:tcW w:type="dxa" w:w="1600"/>
             <w:tcMar>
               <w:top w:type="dxa" w:w="60"/>
               <w:left w:type="dxa" w:w="100"/>
@@ -7939,23 +8598,23 @@
       <w:tr>
         <w:tc>
           <w:tcPr>
-            <w:tcW w:type="dxa" w:w="3352"/>
-            <w:tcMar>
-              <w:top w:type="dxa" w:w="60"/>
-              <w:left w:type="dxa" w:w="100"/>
-              <w:bottom w:type="dxa" w:w="60"/>
-              <w:right w:type="dxa" w:w="100"/>
-            </w:tcMar>
-          </w:tcPr>
-          <w:p>
-            <w:r>
-              <w:t xml:space="preserve">Acesso remoto / VPN</w:t>
-            </w:r>
-          </w:p>
-        </w:tc>
-        <w:tc>
-          <w:tcPr>
-            <w:tcW w:type="dxa" w:w="1571"/>
+            <w:tcW w:type="dxa" w:w="3244"/>
+            <w:tcMar>
+              <w:top w:type="dxa" w:w="60"/>
+              <w:left w:type="dxa" w:w="100"/>
+              <w:bottom w:type="dxa" w:w="60"/>
+              <w:right w:type="dxa" w:w="100"/>
+            </w:tcMar>
+          </w:tcPr>
+          <w:p>
+            <w:r>
+              <w:t xml:space="preserve">WhatsApp corporativo</w:t>
+            </w:r>
+          </w:p>
+        </w:tc>
+        <w:tc>
+          <w:tcPr>
+            <w:tcW w:type="dxa" w:w="1598"/>
             <w:tcMar>
               <w:top w:type="dxa" w:w="60"/>
               <w:left w:type="dxa" w:w="100"/>
@@ -7967,7 +8626,7 @@
         </w:tc>
         <w:tc>
           <w:tcPr>
-            <w:tcW w:type="dxa" w:w="1571"/>
+            <w:tcW w:type="dxa" w:w="1598"/>
             <w:tcMar>
               <w:top w:type="dxa" w:w="60"/>
               <w:left w:type="dxa" w:w="100"/>
@@ -7979,7 +8638,7 @@
         </w:tc>
         <w:tc>
           <w:tcPr>
-            <w:tcW w:type="dxa" w:w="1571"/>
+            <w:tcW w:type="dxa" w:w="1598"/>
             <w:tcMar>
               <w:top w:type="dxa" w:w="60"/>
               <w:left w:type="dxa" w:w="100"/>
@@ -7991,7 +8650,7 @@
         </w:tc>
         <w:tc>
           <w:tcPr>
-            <w:tcW w:type="dxa" w:w="1573"/>
+            <w:tcW w:type="dxa" w:w="1600"/>
             <w:tcMar>
               <w:top w:type="dxa" w:w="60"/>
               <w:left w:type="dxa" w:w="100"/>
@@ -8005,23 +8664,23 @@
       <w:tr>
         <w:tc>
           <w:tcPr>
-            <w:tcW w:type="dxa" w:w="3352"/>
-            <w:tcMar>
-              <w:top w:type="dxa" w:w="60"/>
-              <w:left w:type="dxa" w:w="100"/>
-              <w:bottom w:type="dxa" w:w="60"/>
-              <w:right w:type="dxa" w:w="100"/>
-            </w:tcMar>
-          </w:tcPr>
-          <w:p>
-            <w:r>
-              <w:t xml:space="preserve">Senhas compartilhadas que conhece</w:t>
-            </w:r>
-          </w:p>
-        </w:tc>
-        <w:tc>
-          <w:tcPr>
-            <w:tcW w:type="dxa" w:w="1571"/>
+            <w:tcW w:type="dxa" w:w="3244"/>
+            <w:tcMar>
+              <w:top w:type="dxa" w:w="60"/>
+              <w:left w:type="dxa" w:w="100"/>
+              <w:bottom w:type="dxa" w:w="60"/>
+              <w:right w:type="dxa" w:w="100"/>
+            </w:tcMar>
+          </w:tcPr>
+          <w:p>
+            <w:r>
+              <w:t xml:space="preserve">Acesso remoto / VPN</w:t>
+            </w:r>
+          </w:p>
+        </w:tc>
+        <w:tc>
+          <w:tcPr>
+            <w:tcW w:type="dxa" w:w="1598"/>
             <w:tcMar>
               <w:top w:type="dxa" w:w="60"/>
               <w:left w:type="dxa" w:w="100"/>
@@ -8033,7 +8692,7 @@
         </w:tc>
         <w:tc>
           <w:tcPr>
-            <w:tcW w:type="dxa" w:w="1571"/>
+            <w:tcW w:type="dxa" w:w="1598"/>
             <w:tcMar>
               <w:top w:type="dxa" w:w="60"/>
               <w:left w:type="dxa" w:w="100"/>
@@ -8045,7 +8704,7 @@
         </w:tc>
         <w:tc>
           <w:tcPr>
-            <w:tcW w:type="dxa" w:w="1571"/>
+            <w:tcW w:type="dxa" w:w="1598"/>
             <w:tcMar>
               <w:top w:type="dxa" w:w="60"/>
               <w:left w:type="dxa" w:w="100"/>
@@ -8057,7 +8716,7 @@
         </w:tc>
         <w:tc>
           <w:tcPr>
-            <w:tcW w:type="dxa" w:w="1573"/>
+            <w:tcW w:type="dxa" w:w="1600"/>
             <w:tcMar>
               <w:top w:type="dxa" w:w="60"/>
               <w:left w:type="dxa" w:w="100"/>
@@ -8071,7 +8730,73 @@
       <w:tr>
         <w:tc>
           <w:tcPr>
-            <w:tcW w:type="dxa" w:w="3352"/>
+            <w:tcW w:type="dxa" w:w="3244"/>
+            <w:tcMar>
+              <w:top w:type="dxa" w:w="60"/>
+              <w:left w:type="dxa" w:w="100"/>
+              <w:bottom w:type="dxa" w:w="60"/>
+              <w:right w:type="dxa" w:w="100"/>
+            </w:tcMar>
+          </w:tcPr>
+          <w:p>
+            <w:r>
+              <w:t xml:space="preserve">Senhas compartilhadas que conhece</w:t>
+            </w:r>
+          </w:p>
+        </w:tc>
+        <w:tc>
+          <w:tcPr>
+            <w:tcW w:type="dxa" w:w="1598"/>
+            <w:tcMar>
+              <w:top w:type="dxa" w:w="60"/>
+              <w:left w:type="dxa" w:w="100"/>
+              <w:bottom w:type="dxa" w:w="60"/>
+              <w:right w:type="dxa" w:w="100"/>
+            </w:tcMar>
+          </w:tcPr>
+          <w:p/>
+        </w:tc>
+        <w:tc>
+          <w:tcPr>
+            <w:tcW w:type="dxa" w:w="1598"/>
+            <w:tcMar>
+              <w:top w:type="dxa" w:w="60"/>
+              <w:left w:type="dxa" w:w="100"/>
+              <w:bottom w:type="dxa" w:w="60"/>
+              <w:right w:type="dxa" w:w="100"/>
+            </w:tcMar>
+          </w:tcPr>
+          <w:p/>
+        </w:tc>
+        <w:tc>
+          <w:tcPr>
+            <w:tcW w:type="dxa" w:w="1598"/>
+            <w:tcMar>
+              <w:top w:type="dxa" w:w="60"/>
+              <w:left w:type="dxa" w:w="100"/>
+              <w:bottom w:type="dxa" w:w="60"/>
+              <w:right w:type="dxa" w:w="100"/>
+            </w:tcMar>
+          </w:tcPr>
+          <w:p/>
+        </w:tc>
+        <w:tc>
+          <w:tcPr>
+            <w:tcW w:type="dxa" w:w="1600"/>
+            <w:tcMar>
+              <w:top w:type="dxa" w:w="60"/>
+              <w:left w:type="dxa" w:w="100"/>
+              <w:bottom w:type="dxa" w:w="60"/>
+              <w:right w:type="dxa" w:w="100"/>
+            </w:tcMar>
+          </w:tcPr>
+          <w:p/>
+        </w:tc>
+      </w:tr>
+      <w:tr>
+        <w:tc>
+          <w:tcPr>
+            <w:tcW w:type="dxa" w:w="3244"/>
             <w:tcMar>
               <w:top w:type="dxa" w:w="60"/>
               <w:left w:type="dxa" w:w="100"/>
@@ -8087,7 +8812,7 @@
         </w:tc>
         <w:tc>
           <w:tcPr>
-            <w:tcW w:type="dxa" w:w="1571"/>
+            <w:tcW w:type="dxa" w:w="1598"/>
             <w:tcMar>
               <w:top w:type="dxa" w:w="60"/>
               <w:left w:type="dxa" w:w="100"/>
@@ -8099,7 +8824,7 @@
         </w:tc>
         <w:tc>
           <w:tcPr>
-            <w:tcW w:type="dxa" w:w="1571"/>
+            <w:tcW w:type="dxa" w:w="1598"/>
             <w:tcMar>
               <w:top w:type="dxa" w:w="60"/>
               <w:left w:type="dxa" w:w="100"/>
@@ -8111,7 +8836,7 @@
         </w:tc>
         <w:tc>
           <w:tcPr>
-            <w:tcW w:type="dxa" w:w="1571"/>
+            <w:tcW w:type="dxa" w:w="1598"/>
             <w:tcMar>
               <w:top w:type="dxa" w:w="60"/>
               <w:left w:type="dxa" w:w="100"/>
@@ -8123,7 +8848,7 @@
         </w:tc>
         <w:tc>
           <w:tcPr>
-            <w:tcW w:type="dxa" w:w="1573"/>
+            <w:tcW w:type="dxa" w:w="1600"/>
             <w:tcMar>
               <w:top w:type="dxa" w:w="60"/>
               <w:left w:type="dxa" w:w="100"/>

</xml_diff>

<commit_message>
Orion nos perfis C (escritório) e D (gestão) e nas listas de sistemas; impressão regerada
Co-Authored-By: Claude Opus 5.5 <noreply@anthropic.com>
</commit_message>
<xml_diff>
--- a/impressao/POPs-RH-revisao.docx
+++ b/impressao/POPs-RH-revisao.docx
@@ -398,10 +398,10 @@
         </w:tblBorders>
       </w:tblPr>
       <w:tblGrid>
-        <w:gridCol w:w="1135"/>
-        <w:gridCol w:w="2510"/>
-        <w:gridCol w:w="3541"/>
-        <w:gridCol w:w="2452"/>
+        <w:gridCol w:w="1123"/>
+        <w:gridCol w:w="2483"/>
+        <w:gridCol w:w="3606"/>
+        <w:gridCol w:w="2426"/>
       </w:tblGrid>
       <w:tr>
         <w:trPr>
@@ -409,7 +409,7 @@
         </w:trPr>
         <w:tc>
           <w:tcPr>
-            <w:tcW w:type="dxa" w:w="1135"/>
+            <w:tcW w:type="dxa" w:w="1123"/>
             <w:shd w:fill="EEEEEE" w:color="auto" w:val="clear"/>
             <w:tcMar>
               <w:top w:type="dxa" w:w="60"/>
@@ -430,7 +430,7 @@
         </w:tc>
         <w:tc>
           <w:tcPr>
-            <w:tcW w:type="dxa" w:w="2510"/>
+            <w:tcW w:type="dxa" w:w="2483"/>
             <w:shd w:fill="EEEEEE" w:color="auto" w:val="clear"/>
             <w:tcMar>
               <w:top w:type="dxa" w:w="60"/>
@@ -451,7 +451,7 @@
         </w:tc>
         <w:tc>
           <w:tcPr>
-            <w:tcW w:type="dxa" w:w="3541"/>
+            <w:tcW w:type="dxa" w:w="3606"/>
             <w:shd w:fill="EEEEEE" w:color="auto" w:val="clear"/>
             <w:tcMar>
               <w:top w:type="dxa" w:w="60"/>
@@ -472,7 +472,7 @@
         </w:tc>
         <w:tc>
           <w:tcPr>
-            <w:tcW w:type="dxa" w:w="2452"/>
+            <w:tcW w:type="dxa" w:w="2426"/>
             <w:shd w:fill="EEEEEE" w:color="auto" w:val="clear"/>
             <w:tcMar>
               <w:top w:type="dxa" w:w="60"/>
@@ -495,7 +495,7 @@
       <w:tr>
         <w:tc>
           <w:tcPr>
-            <w:tcW w:type="dxa" w:w="1135"/>
+            <w:tcW w:type="dxa" w:w="1123"/>
             <w:tcMar>
               <w:top w:type="dxa" w:w="60"/>
               <w:left w:type="dxa" w:w="100"/>
@@ -515,7 +515,7 @@
         </w:tc>
         <w:tc>
           <w:tcPr>
-            <w:tcW w:type="dxa" w:w="2510"/>
+            <w:tcW w:type="dxa" w:w="2483"/>
             <w:tcMar>
               <w:top w:type="dxa" w:w="60"/>
               <w:left w:type="dxa" w:w="100"/>
@@ -531,7 +531,7 @@
         </w:tc>
         <w:tc>
           <w:tcPr>
-            <w:tcW w:type="dxa" w:w="3541"/>
+            <w:tcW w:type="dxa" w:w="3606"/>
             <w:tcMar>
               <w:top w:type="dxa" w:w="60"/>
               <w:left w:type="dxa" w:w="100"/>
@@ -547,7 +547,7 @@
         </w:tc>
         <w:tc>
           <w:tcPr>
-            <w:tcW w:type="dxa" w:w="2452"/>
+            <w:tcW w:type="dxa" w:w="2426"/>
             <w:tcMar>
               <w:top w:type="dxa" w:w="60"/>
               <w:left w:type="dxa" w:w="100"/>
@@ -575,7 +575,7 @@
       <w:tr>
         <w:tc>
           <w:tcPr>
-            <w:tcW w:type="dxa" w:w="1135"/>
+            <w:tcW w:type="dxa" w:w="1123"/>
             <w:tcMar>
               <w:top w:type="dxa" w:w="60"/>
               <w:left w:type="dxa" w:w="100"/>
@@ -595,7 +595,7 @@
         </w:tc>
         <w:tc>
           <w:tcPr>
-            <w:tcW w:type="dxa" w:w="2510"/>
+            <w:tcW w:type="dxa" w:w="2483"/>
             <w:tcMar>
               <w:top w:type="dxa" w:w="60"/>
               <w:left w:type="dxa" w:w="100"/>
@@ -611,7 +611,7 @@
         </w:tc>
         <w:tc>
           <w:tcPr>
-            <w:tcW w:type="dxa" w:w="3541"/>
+            <w:tcW w:type="dxa" w:w="3606"/>
             <w:tcMar>
               <w:top w:type="dxa" w:w="60"/>
               <w:left w:type="dxa" w:w="100"/>
@@ -627,7 +627,7 @@
         </w:tc>
         <w:tc>
           <w:tcPr>
-            <w:tcW w:type="dxa" w:w="2452"/>
+            <w:tcW w:type="dxa" w:w="2426"/>
             <w:tcMar>
               <w:top w:type="dxa" w:w="60"/>
               <w:left w:type="dxa" w:w="100"/>
@@ -652,7 +652,7 @@
       <w:tr>
         <w:tc>
           <w:tcPr>
-            <w:tcW w:type="dxa" w:w="1135"/>
+            <w:tcW w:type="dxa" w:w="1123"/>
             <w:tcMar>
               <w:top w:type="dxa" w:w="60"/>
               <w:left w:type="dxa" w:w="100"/>
@@ -672,7 +672,7 @@
         </w:tc>
         <w:tc>
           <w:tcPr>
-            <w:tcW w:type="dxa" w:w="2510"/>
+            <w:tcW w:type="dxa" w:w="2483"/>
             <w:tcMar>
               <w:top w:type="dxa" w:w="60"/>
               <w:left w:type="dxa" w:w="100"/>
@@ -688,23 +688,23 @@
         </w:tc>
         <w:tc>
           <w:tcPr>
-            <w:tcW w:type="dxa" w:w="3541"/>
-            <w:tcMar>
-              <w:top w:type="dxa" w:w="60"/>
-              <w:left w:type="dxa" w:w="100"/>
-              <w:bottom w:type="dxa" w:w="60"/>
-              <w:right w:type="dxa" w:w="100"/>
-            </w:tcMar>
-          </w:tcPr>
-          <w:p>
-            <w:r>
-              <w:t xml:space="preserve">E-mail corporativo, Sistema VS, ERP e computador</w:t>
-            </w:r>
-          </w:p>
-        </w:tc>
-        <w:tc>
-          <w:tcPr>
-            <w:tcW w:type="dxa" w:w="2452"/>
+            <w:tcW w:type="dxa" w:w="3606"/>
+            <w:tcMar>
+              <w:top w:type="dxa" w:w="60"/>
+              <w:left w:type="dxa" w:w="100"/>
+              <w:bottom w:type="dxa" w:w="60"/>
+              <w:right w:type="dxa" w:w="100"/>
+            </w:tcMar>
+          </w:tcPr>
+          <w:p>
+            <w:r>
+              <w:t xml:space="preserve">E-mail corporativo, Sistema VS, ERP, Orion e computador</w:t>
+            </w:r>
+          </w:p>
+        </w:tc>
+        <w:tc>
+          <w:tcPr>
+            <w:tcW w:type="dxa" w:w="2426"/>
             <w:tcMar>
               <w:top w:type="dxa" w:w="60"/>
               <w:left w:type="dxa" w:w="100"/>
@@ -729,7 +729,7 @@
       <w:tr>
         <w:tc>
           <w:tcPr>
-            <w:tcW w:type="dxa" w:w="1135"/>
+            <w:tcW w:type="dxa" w:w="1123"/>
             <w:tcMar>
               <w:top w:type="dxa" w:w="60"/>
               <w:left w:type="dxa" w:w="100"/>
@@ -749,7 +749,7 @@
         </w:tc>
         <w:tc>
           <w:tcPr>
-            <w:tcW w:type="dxa" w:w="2510"/>
+            <w:tcW w:type="dxa" w:w="2483"/>
             <w:tcMar>
               <w:top w:type="dxa" w:w="60"/>
               <w:left w:type="dxa" w:w="100"/>
@@ -765,7 +765,7 @@
         </w:tc>
         <w:tc>
           <w:tcPr>
-            <w:tcW w:type="dxa" w:w="3541"/>
+            <w:tcW w:type="dxa" w:w="3606"/>
             <w:tcMar>
               <w:top w:type="dxa" w:w="60"/>
               <w:left w:type="dxa" w:w="100"/>
@@ -781,7 +781,7 @@
         </w:tc>
         <w:tc>
           <w:tcPr>
-            <w:tcW w:type="dxa" w:w="2452"/>
+            <w:tcW w:type="dxa" w:w="2426"/>
             <w:tcMar>
               <w:top w:type="dxa" w:w="60"/>
               <w:left w:type="dxa" w:w="100"/>
@@ -1256,7 +1256,7 @@
           <w:b/>
           <w:bCs/>
         </w:rPr>
-        <w:t xml:space="preserve">ERP / Petroshow / Sigest / Infinitum:</w:t>
+        <w:t xml:space="preserve">ERP / Petroshow / Sigest / Infinitum / Orion:</w:t>
       </w:r>
       <w:r>
         <w:t xml:space="preserve"> criar os usuários aprovados, com o perfil da função (nunca copiar o perfil de outra pessoa sem conferir).</w:t>
@@ -1644,8 +1644,8 @@
         </w:tblBorders>
       </w:tblPr>
       <w:tblGrid>
-        <w:gridCol w:w="3283"/>
-        <w:gridCol w:w="6355"/>
+        <w:gridCol w:w="3419"/>
+        <w:gridCol w:w="6219"/>
       </w:tblGrid>
       <w:tr>
         <w:trPr>
@@ -1653,7 +1653,7 @@
         </w:trPr>
         <w:tc>
           <w:tcPr>
-            <w:tcW w:type="dxa" w:w="3283"/>
+            <w:tcW w:type="dxa" w:w="3419"/>
             <w:shd w:fill="EEEEEE" w:color="auto" w:val="clear"/>
             <w:tcMar>
               <w:top w:type="dxa" w:w="60"/>
@@ -1674,7 +1674,7 @@
         </w:tc>
         <w:tc>
           <w:tcPr>
-            <w:tcW w:type="dxa" w:w="6355"/>
+            <w:tcW w:type="dxa" w:w="6219"/>
             <w:shd w:fill="EEEEEE" w:color="auto" w:val="clear"/>
             <w:tcMar>
               <w:top w:type="dxa" w:w="60"/>
@@ -1697,7 +1697,7 @@
       <w:tr>
         <w:tc>
           <w:tcPr>
-            <w:tcW w:type="dxa" w:w="3283"/>
+            <w:tcW w:type="dxa" w:w="3419"/>
             <w:tcMar>
               <w:top w:type="dxa" w:w="60"/>
               <w:left w:type="dxa" w:w="100"/>
@@ -1713,7 +1713,7 @@
         </w:tc>
         <w:tc>
           <w:tcPr>
-            <w:tcW w:type="dxa" w:w="6355"/>
+            <w:tcW w:type="dxa" w:w="6219"/>
             <w:tcMar>
               <w:top w:type="dxa" w:w="60"/>
               <w:left w:type="dxa" w:w="100"/>
@@ -1742,7 +1742,7 @@
       <w:tr>
         <w:tc>
           <w:tcPr>
-            <w:tcW w:type="dxa" w:w="3283"/>
+            <w:tcW w:type="dxa" w:w="3419"/>
             <w:tcMar>
               <w:top w:type="dxa" w:w="60"/>
               <w:left w:type="dxa" w:w="100"/>
@@ -1758,7 +1758,7 @@
         </w:tc>
         <w:tc>
           <w:tcPr>
-            <w:tcW w:type="dxa" w:w="6355"/>
+            <w:tcW w:type="dxa" w:w="6219"/>
             <w:tcMar>
               <w:top w:type="dxa" w:w="60"/>
               <w:left w:type="dxa" w:w="100"/>
@@ -1776,23 +1776,23 @@
       <w:tr>
         <w:tc>
           <w:tcPr>
-            <w:tcW w:type="dxa" w:w="3283"/>
-            <w:tcMar>
-              <w:top w:type="dxa" w:w="60"/>
-              <w:left w:type="dxa" w:w="100"/>
-              <w:bottom w:type="dxa" w:w="60"/>
-              <w:right w:type="dxa" w:w="100"/>
-            </w:tcMar>
-          </w:tcPr>
-          <w:p>
-            <w:r>
-              <w:t xml:space="preserve">ERP / Petroshow / Sigest / Infinitum</w:t>
-            </w:r>
-          </w:p>
-        </w:tc>
-        <w:tc>
-          <w:tcPr>
-            <w:tcW w:type="dxa" w:w="6355"/>
+            <w:tcW w:type="dxa" w:w="3419"/>
+            <w:tcMar>
+              <w:top w:type="dxa" w:w="60"/>
+              <w:left w:type="dxa" w:w="100"/>
+              <w:bottom w:type="dxa" w:w="60"/>
+              <w:right w:type="dxa" w:w="100"/>
+            </w:tcMar>
+          </w:tcPr>
+          <w:p>
+            <w:r>
+              <w:t xml:space="preserve">ERP / Petroshow / Sigest / Infinitum / Orion</w:t>
+            </w:r>
+          </w:p>
+        </w:tc>
+        <w:tc>
+          <w:tcPr>
+            <w:tcW w:type="dxa" w:w="6219"/>
             <w:tcMar>
               <w:top w:type="dxa" w:w="60"/>
               <w:left w:type="dxa" w:w="100"/>
@@ -1810,7 +1810,7 @@
       <w:tr>
         <w:tc>
           <w:tcPr>
-            <w:tcW w:type="dxa" w:w="3283"/>
+            <w:tcW w:type="dxa" w:w="3419"/>
             <w:tcMar>
               <w:top w:type="dxa" w:w="60"/>
               <w:left w:type="dxa" w:w="100"/>
@@ -1826,7 +1826,7 @@
         </w:tc>
         <w:tc>
           <w:tcPr>
-            <w:tcW w:type="dxa" w:w="6355"/>
+            <w:tcW w:type="dxa" w:w="6219"/>
             <w:tcMar>
               <w:top w:type="dxa" w:w="60"/>
               <w:left w:type="dxa" w:w="100"/>
@@ -1844,7 +1844,7 @@
       <w:tr>
         <w:tc>
           <w:tcPr>
-            <w:tcW w:type="dxa" w:w="3283"/>
+            <w:tcW w:type="dxa" w:w="3419"/>
             <w:tcMar>
               <w:top w:type="dxa" w:w="60"/>
               <w:left w:type="dxa" w:w="100"/>
@@ -1860,7 +1860,7 @@
         </w:tc>
         <w:tc>
           <w:tcPr>
-            <w:tcW w:type="dxa" w:w="6355"/>
+            <w:tcW w:type="dxa" w:w="6219"/>
             <w:tcMar>
               <w:top w:type="dxa" w:w="60"/>
               <w:left w:type="dxa" w:w="100"/>
@@ -1878,7 +1878,7 @@
       <w:tr>
         <w:tc>
           <w:tcPr>
-            <w:tcW w:type="dxa" w:w="3283"/>
+            <w:tcW w:type="dxa" w:w="3419"/>
             <w:tcMar>
               <w:top w:type="dxa" w:w="60"/>
               <w:left w:type="dxa" w:w="100"/>
@@ -1894,7 +1894,7 @@
         </w:tc>
         <w:tc>
           <w:tcPr>
-            <w:tcW w:type="dxa" w:w="6355"/>
+            <w:tcW w:type="dxa" w:w="6219"/>
             <w:tcMar>
               <w:top w:type="dxa" w:w="60"/>
               <w:left w:type="dxa" w:w="100"/>
@@ -3037,7 +3037,7 @@
           <w:b/>
           <w:bCs/>
         </w:rPr>
-        <w:t xml:space="preserve">ERP / Petroshow / Sigest / Infinitum:</w:t>
+        <w:t xml:space="preserve">ERP / Petroshow / Sigest / Infinitum / Orion:</w:t>
       </w:r>
       <w:r>
         <w:t xml:space="preserve"> desativar os usuários (não excluir, pelo mesmo motivo).</w:t>
@@ -4294,7 +4294,7 @@
           <w:b/>
           <w:bCs/>
         </w:rPr>
-        <w:t xml:space="preserve">ERP / Petroshow / Sigest / Infinitum:</w:t>
+        <w:t xml:space="preserve">ERP / Petroshow / Sigest / Infinitum / Orion:</w:t>
       </w:r>
       <w:r>
         <w:t xml:space="preserve"> ajustar perfil; remover acesso à unidade antiga.</w:t>
@@ -4985,7 +4985,7 @@
           <w:b/>
           <w:bCs/>
         </w:rPr>
-        <w:t xml:space="preserve">Sistema VS / ERP / Petroshow / Sigest / Infinitum:</w:t>
+        <w:t xml:space="preserve">Sistema VS / ERP / Petroshow / Sigest / Infinitum / Orion:</w:t>
       </w:r>
       <w:r>
         <w:t xml:space="preserve"> desativar o usuário (sem excluir).</w:t>
@@ -7448,9 +7448,9 @@
         </w:tblBorders>
       </w:tblPr>
       <w:tblGrid>
-        <w:gridCol w:w="4409"/>
-        <w:gridCol w:w="2575"/>
-        <w:gridCol w:w="2654"/>
+        <w:gridCol w:w="4291"/>
+        <w:gridCol w:w="2618"/>
+        <w:gridCol w:w="2729"/>
       </w:tblGrid>
       <w:tr>
         <w:trPr>
@@ -7458,7 +7458,7 @@
         </w:trPr>
         <w:tc>
           <w:tcPr>
-            <w:tcW w:type="dxa" w:w="4409"/>
+            <w:tcW w:type="dxa" w:w="4291"/>
             <w:shd w:fill="EEEEEE" w:color="auto" w:val="clear"/>
             <w:tcMar>
               <w:top w:type="dxa" w:w="60"/>
@@ -7479,7 +7479,7 @@
         </w:tc>
         <w:tc>
           <w:tcPr>
-            <w:tcW w:type="dxa" w:w="2575"/>
+            <w:tcW w:type="dxa" w:w="2618"/>
             <w:shd w:fill="EEEEEE" w:color="auto" w:val="clear"/>
             <w:tcMar>
               <w:top w:type="dxa" w:w="60"/>
@@ -7500,7 +7500,7 @@
         </w:tc>
         <w:tc>
           <w:tcPr>
-            <w:tcW w:type="dxa" w:w="2654"/>
+            <w:tcW w:type="dxa" w:w="2729"/>
             <w:shd w:fill="EEEEEE" w:color="auto" w:val="clear"/>
             <w:tcMar>
               <w:top w:type="dxa" w:w="60"/>
@@ -7523,7 +7523,7 @@
       <w:tr>
         <w:tc>
           <w:tcPr>
-            <w:tcW w:type="dxa" w:w="4409"/>
+            <w:tcW w:type="dxa" w:w="4291"/>
             <w:tcMar>
               <w:top w:type="dxa" w:w="60"/>
               <w:left w:type="dxa" w:w="100"/>
@@ -7539,7 +7539,7 @@
         </w:tc>
         <w:tc>
           <w:tcPr>
-            <w:tcW w:type="dxa" w:w="2575"/>
+            <w:tcW w:type="dxa" w:w="2618"/>
             <w:tcMar>
               <w:top w:type="dxa" w:w="60"/>
               <w:left w:type="dxa" w:w="100"/>
@@ -7555,7 +7555,7 @@
         </w:tc>
         <w:tc>
           <w:tcPr>
-            <w:tcW w:type="dxa" w:w="2654"/>
+            <w:tcW w:type="dxa" w:w="2729"/>
             <w:tcMar>
               <w:top w:type="dxa" w:w="60"/>
               <w:left w:type="dxa" w:w="100"/>
@@ -7569,7 +7569,7 @@
       <w:tr>
         <w:tc>
           <w:tcPr>
-            <w:tcW w:type="dxa" w:w="4409"/>
+            <w:tcW w:type="dxa" w:w="4291"/>
             <w:tcMar>
               <w:top w:type="dxa" w:w="60"/>
               <w:left w:type="dxa" w:w="100"/>
@@ -7585,7 +7585,7 @@
         </w:tc>
         <w:tc>
           <w:tcPr>
-            <w:tcW w:type="dxa" w:w="2575"/>
+            <w:tcW w:type="dxa" w:w="2618"/>
             <w:tcMar>
               <w:top w:type="dxa" w:w="60"/>
               <w:left w:type="dxa" w:w="100"/>
@@ -7601,7 +7601,7 @@
         </w:tc>
         <w:tc>
           <w:tcPr>
-            <w:tcW w:type="dxa" w:w="2654"/>
+            <w:tcW w:type="dxa" w:w="2729"/>
             <w:tcMar>
               <w:top w:type="dxa" w:w="60"/>
               <w:left w:type="dxa" w:w="100"/>
@@ -7619,7 +7619,7 @@
       <w:tr>
         <w:tc>
           <w:tcPr>
-            <w:tcW w:type="dxa" w:w="4409"/>
+            <w:tcW w:type="dxa" w:w="4291"/>
             <w:tcMar>
               <w:top w:type="dxa" w:w="60"/>
               <w:left w:type="dxa" w:w="100"/>
@@ -7635,7 +7635,7 @@
         </w:tc>
         <w:tc>
           <w:tcPr>
-            <w:tcW w:type="dxa" w:w="2575"/>
+            <w:tcW w:type="dxa" w:w="2618"/>
             <w:tcMar>
               <w:top w:type="dxa" w:w="60"/>
               <w:left w:type="dxa" w:w="100"/>
@@ -7651,7 +7651,7 @@
         </w:tc>
         <w:tc>
           <w:tcPr>
-            <w:tcW w:type="dxa" w:w="2654"/>
+            <w:tcW w:type="dxa" w:w="2729"/>
             <w:tcMar>
               <w:top w:type="dxa" w:w="60"/>
               <w:left w:type="dxa" w:w="100"/>
@@ -7669,7 +7669,7 @@
       <w:tr>
         <w:tc>
           <w:tcPr>
-            <w:tcW w:type="dxa" w:w="4409"/>
+            <w:tcW w:type="dxa" w:w="4291"/>
             <w:tcMar>
               <w:top w:type="dxa" w:w="60"/>
               <w:left w:type="dxa" w:w="100"/>
@@ -7685,7 +7685,7 @@
         </w:tc>
         <w:tc>
           <w:tcPr>
-            <w:tcW w:type="dxa" w:w="2575"/>
+            <w:tcW w:type="dxa" w:w="2618"/>
             <w:tcMar>
               <w:top w:type="dxa" w:w="60"/>
               <w:left w:type="dxa" w:w="100"/>
@@ -7701,7 +7701,7 @@
         </w:tc>
         <w:tc>
           <w:tcPr>
-            <w:tcW w:type="dxa" w:w="2654"/>
+            <w:tcW w:type="dxa" w:w="2729"/>
             <w:tcMar>
               <w:top w:type="dxa" w:w="60"/>
               <w:left w:type="dxa" w:w="100"/>
@@ -7719,7 +7719,7 @@
       <w:tr>
         <w:tc>
           <w:tcPr>
-            <w:tcW w:type="dxa" w:w="4409"/>
+            <w:tcW w:type="dxa" w:w="4291"/>
             <w:tcMar>
               <w:top w:type="dxa" w:w="60"/>
               <w:left w:type="dxa" w:w="100"/>
@@ -7735,7 +7735,7 @@
         </w:tc>
         <w:tc>
           <w:tcPr>
-            <w:tcW w:type="dxa" w:w="2575"/>
+            <w:tcW w:type="dxa" w:w="2618"/>
             <w:tcMar>
               <w:top w:type="dxa" w:w="60"/>
               <w:left w:type="dxa" w:w="100"/>
@@ -7751,7 +7751,7 @@
         </w:tc>
         <w:tc>
           <w:tcPr>
-            <w:tcW w:type="dxa" w:w="2654"/>
+            <w:tcW w:type="dxa" w:w="2729"/>
             <w:tcMar>
               <w:top w:type="dxa" w:w="60"/>
               <w:left w:type="dxa" w:w="100"/>
@@ -7769,23 +7769,23 @@
       <w:tr>
         <w:tc>
           <w:tcPr>
-            <w:tcW w:type="dxa" w:w="4409"/>
-            <w:tcMar>
-              <w:top w:type="dxa" w:w="60"/>
-              <w:left w:type="dxa" w:w="100"/>
-              <w:bottom w:type="dxa" w:w="60"/>
-              <w:right w:type="dxa" w:w="100"/>
-            </w:tcMar>
-          </w:tcPr>
-          <w:p>
-            <w:r>
-              <w:t xml:space="preserve">Infinitum</w:t>
-            </w:r>
-          </w:p>
-        </w:tc>
-        <w:tc>
-          <w:tcPr>
-            <w:tcW w:type="dxa" w:w="2575"/>
+            <w:tcW w:type="dxa" w:w="4291"/>
+            <w:tcMar>
+              <w:top w:type="dxa" w:w="60"/>
+              <w:left w:type="dxa" w:w="100"/>
+              <w:bottom w:type="dxa" w:w="60"/>
+              <w:right w:type="dxa" w:w="100"/>
+            </w:tcMar>
+          </w:tcPr>
+          <w:p>
+            <w:r>
+              <w:t xml:space="preserve">Orion</w:t>
+            </w:r>
+          </w:p>
+        </w:tc>
+        <w:tc>
+          <w:tcPr>
+            <w:tcW w:type="dxa" w:w="2618"/>
             <w:tcMar>
               <w:top w:type="dxa" w:w="60"/>
               <w:left w:type="dxa" w:w="100"/>
@@ -7801,7 +7801,7 @@
         </w:tc>
         <w:tc>
           <w:tcPr>
-            <w:tcW w:type="dxa" w:w="2654"/>
+            <w:tcW w:type="dxa" w:w="2729"/>
             <w:tcMar>
               <w:top w:type="dxa" w:w="60"/>
               <w:left w:type="dxa" w:w="100"/>
@@ -7819,23 +7819,23 @@
       <w:tr>
         <w:tc>
           <w:tcPr>
-            <w:tcW w:type="dxa" w:w="4409"/>
-            <w:tcMar>
-              <w:top w:type="dxa" w:w="60"/>
-              <w:left w:type="dxa" w:w="100"/>
-              <w:bottom w:type="dxa" w:w="60"/>
-              <w:right w:type="dxa" w:w="100"/>
-            </w:tcMar>
-          </w:tcPr>
-          <w:p>
-            <w:r>
-              <w:t xml:space="preserve">Computador</w:t>
-            </w:r>
-          </w:p>
-        </w:tc>
-        <w:tc>
-          <w:tcPr>
-            <w:tcW w:type="dxa" w:w="2575"/>
+            <w:tcW w:type="dxa" w:w="4291"/>
+            <w:tcMar>
+              <w:top w:type="dxa" w:w="60"/>
+              <w:left w:type="dxa" w:w="100"/>
+              <w:bottom w:type="dxa" w:w="60"/>
+              <w:right w:type="dxa" w:w="100"/>
+            </w:tcMar>
+          </w:tcPr>
+          <w:p>
+            <w:r>
+              <w:t xml:space="preserve">Infinitum</w:t>
+            </w:r>
+          </w:p>
+        </w:tc>
+        <w:tc>
+          <w:tcPr>
+            <w:tcW w:type="dxa" w:w="2618"/>
             <w:tcMar>
               <w:top w:type="dxa" w:w="60"/>
               <w:left w:type="dxa" w:w="100"/>
@@ -7851,37 +7851,41 @@
         </w:tc>
         <w:tc>
           <w:tcPr>
-            <w:tcW w:type="dxa" w:w="2654"/>
-            <w:tcMar>
-              <w:top w:type="dxa" w:w="60"/>
-              <w:left w:type="dxa" w:w="100"/>
-              <w:bottom w:type="dxa" w:w="60"/>
-              <w:right w:type="dxa" w:w="100"/>
-            </w:tcMar>
-          </w:tcPr>
-          <w:p/>
+            <w:tcW w:type="dxa" w:w="2729"/>
+            <w:tcMar>
+              <w:top w:type="dxa" w:w="60"/>
+              <w:left w:type="dxa" w:w="100"/>
+              <w:bottom w:type="dxa" w:w="60"/>
+              <w:right w:type="dxa" w:w="100"/>
+            </w:tcMar>
+          </w:tcPr>
+          <w:p>
+            <w:r>
+              <w:t xml:space="preserve">perfil:</w:t>
+            </w:r>
+          </w:p>
         </w:tc>
       </w:tr>
       <w:tr>
         <w:tc>
           <w:tcPr>
-            <w:tcW w:type="dxa" w:w="4409"/>
-            <w:tcMar>
-              <w:top w:type="dxa" w:w="60"/>
-              <w:left w:type="dxa" w:w="100"/>
-              <w:bottom w:type="dxa" w:w="60"/>
-              <w:right w:type="dxa" w:w="100"/>
-            </w:tcMar>
-          </w:tcPr>
-          <w:p>
-            <w:r>
-              <w:t xml:space="preserve">Celular corporativo</w:t>
-            </w:r>
-          </w:p>
-        </w:tc>
-        <w:tc>
-          <w:tcPr>
-            <w:tcW w:type="dxa" w:w="2575"/>
+            <w:tcW w:type="dxa" w:w="4291"/>
+            <w:tcMar>
+              <w:top w:type="dxa" w:w="60"/>
+              <w:left w:type="dxa" w:w="100"/>
+              <w:bottom w:type="dxa" w:w="60"/>
+              <w:right w:type="dxa" w:w="100"/>
+            </w:tcMar>
+          </w:tcPr>
+          <w:p>
+            <w:r>
+              <w:t xml:space="preserve">Computador</w:t>
+            </w:r>
+          </w:p>
+        </w:tc>
+        <w:tc>
+          <w:tcPr>
+            <w:tcW w:type="dxa" w:w="2618"/>
             <w:tcMar>
               <w:top w:type="dxa" w:w="60"/>
               <w:left w:type="dxa" w:w="100"/>
@@ -7897,7 +7901,7 @@
         </w:tc>
         <w:tc>
           <w:tcPr>
-            <w:tcW w:type="dxa" w:w="2654"/>
+            <w:tcW w:type="dxa" w:w="2729"/>
             <w:tcMar>
               <w:top w:type="dxa" w:w="60"/>
               <w:left w:type="dxa" w:w="100"/>
@@ -7911,23 +7915,23 @@
       <w:tr>
         <w:tc>
           <w:tcPr>
-            <w:tcW w:type="dxa" w:w="4409"/>
-            <w:tcMar>
-              <w:top w:type="dxa" w:w="60"/>
-              <w:left w:type="dxa" w:w="100"/>
-              <w:bottom w:type="dxa" w:w="60"/>
-              <w:right w:type="dxa" w:w="100"/>
-            </w:tcMar>
-          </w:tcPr>
-          <w:p>
-            <w:r>
-              <w:t xml:space="preserve">WhatsApp corporativo</w:t>
-            </w:r>
-          </w:p>
-        </w:tc>
-        <w:tc>
-          <w:tcPr>
-            <w:tcW w:type="dxa" w:w="2575"/>
+            <w:tcW w:type="dxa" w:w="4291"/>
+            <w:tcMar>
+              <w:top w:type="dxa" w:w="60"/>
+              <w:left w:type="dxa" w:w="100"/>
+              <w:bottom w:type="dxa" w:w="60"/>
+              <w:right w:type="dxa" w:w="100"/>
+            </w:tcMar>
+          </w:tcPr>
+          <w:p>
+            <w:r>
+              <w:t xml:space="preserve">Celular corporativo</w:t>
+            </w:r>
+          </w:p>
+        </w:tc>
+        <w:tc>
+          <w:tcPr>
+            <w:tcW w:type="dxa" w:w="2618"/>
             <w:tcMar>
               <w:top w:type="dxa" w:w="60"/>
               <w:left w:type="dxa" w:w="100"/>
@@ -7943,25 +7947,71 @@
         </w:tc>
         <w:tc>
           <w:tcPr>
-            <w:tcW w:type="dxa" w:w="2654"/>
-            <w:tcMar>
-              <w:top w:type="dxa" w:w="60"/>
-              <w:left w:type="dxa" w:w="100"/>
-              <w:bottom w:type="dxa" w:w="60"/>
-              <w:right w:type="dxa" w:w="100"/>
-            </w:tcMar>
-          </w:tcPr>
-          <w:p>
-            <w:r>
-              <w:t xml:space="preserve">grupos:</w:t>
-            </w:r>
-          </w:p>
+            <w:tcW w:type="dxa" w:w="2729"/>
+            <w:tcMar>
+              <w:top w:type="dxa" w:w="60"/>
+              <w:left w:type="dxa" w:w="100"/>
+              <w:bottom w:type="dxa" w:w="60"/>
+              <w:right w:type="dxa" w:w="100"/>
+            </w:tcMar>
+          </w:tcPr>
+          <w:p/>
         </w:tc>
       </w:tr>
       <w:tr>
         <w:tc>
           <w:tcPr>
-            <w:tcW w:type="dxa" w:w="4409"/>
+            <w:tcW w:type="dxa" w:w="4291"/>
+            <w:tcMar>
+              <w:top w:type="dxa" w:w="60"/>
+              <w:left w:type="dxa" w:w="100"/>
+              <w:bottom w:type="dxa" w:w="60"/>
+              <w:right w:type="dxa" w:w="100"/>
+            </w:tcMar>
+          </w:tcPr>
+          <w:p>
+            <w:r>
+              <w:t xml:space="preserve">WhatsApp corporativo</w:t>
+            </w:r>
+          </w:p>
+        </w:tc>
+        <w:tc>
+          <w:tcPr>
+            <w:tcW w:type="dxa" w:w="2618"/>
+            <w:tcMar>
+              <w:top w:type="dxa" w:w="60"/>
+              <w:left w:type="dxa" w:w="100"/>
+              <w:bottom w:type="dxa" w:w="60"/>
+              <w:right w:type="dxa" w:w="100"/>
+            </w:tcMar>
+          </w:tcPr>
+          <w:p>
+            <w:r>
+              <w:t xml:space="preserve">☐</w:t>
+            </w:r>
+          </w:p>
+        </w:tc>
+        <w:tc>
+          <w:tcPr>
+            <w:tcW w:type="dxa" w:w="2729"/>
+            <w:tcMar>
+              <w:top w:type="dxa" w:w="60"/>
+              <w:left w:type="dxa" w:w="100"/>
+              <w:bottom w:type="dxa" w:w="60"/>
+              <w:right w:type="dxa" w:w="100"/>
+            </w:tcMar>
+          </w:tcPr>
+          <w:p>
+            <w:r>
+              <w:t xml:space="preserve">grupos:</w:t>
+            </w:r>
+          </w:p>
+        </w:tc>
+      </w:tr>
+      <w:tr>
+        <w:tc>
+          <w:tcPr>
+            <w:tcW w:type="dxa" w:w="4291"/>
             <w:tcMar>
               <w:top w:type="dxa" w:w="60"/>
               <w:left w:type="dxa" w:w="100"/>
@@ -7977,7 +8027,7 @@
         </w:tc>
         <w:tc>
           <w:tcPr>
-            <w:tcW w:type="dxa" w:w="2575"/>
+            <w:tcW w:type="dxa" w:w="2618"/>
             <w:tcMar>
               <w:top w:type="dxa" w:w="60"/>
               <w:left w:type="dxa" w:w="100"/>
@@ -7993,7 +8043,7 @@
         </w:tc>
         <w:tc>
           <w:tcPr>
-            <w:tcW w:type="dxa" w:w="2654"/>
+            <w:tcW w:type="dxa" w:w="2729"/>
             <w:tcMar>
               <w:top w:type="dxa" w:w="60"/>
               <w:left w:type="dxa" w:w="100"/>
@@ -8083,11 +8133,11 @@
         </w:tblBorders>
       </w:tblPr>
       <w:tblGrid>
-        <w:gridCol w:w="3244"/>
-        <w:gridCol w:w="1598"/>
-        <w:gridCol w:w="1598"/>
-        <w:gridCol w:w="1598"/>
-        <w:gridCol w:w="1600"/>
+        <w:gridCol w:w="3137"/>
+        <w:gridCol w:w="1625"/>
+        <w:gridCol w:w="1625"/>
+        <w:gridCol w:w="1625"/>
+        <w:gridCol w:w="1626"/>
       </w:tblGrid>
       <w:tr>
         <w:trPr>
@@ -8095,7 +8145,7 @@
         </w:trPr>
         <w:tc>
           <w:tcPr>
-            <w:tcW w:type="dxa" w:w="3244"/>
+            <w:tcW w:type="dxa" w:w="3137"/>
             <w:shd w:fill="EEEEEE" w:color="auto" w:val="clear"/>
             <w:tcMar>
               <w:top w:type="dxa" w:w="60"/>
@@ -8116,7 +8166,7 @@
         </w:tc>
         <w:tc>
           <w:tcPr>
-            <w:tcW w:type="dxa" w:w="1598"/>
+            <w:tcW w:type="dxa" w:w="1625"/>
             <w:shd w:fill="EEEEEE" w:color="auto" w:val="clear"/>
             <w:tcMar>
               <w:top w:type="dxa" w:w="60"/>
@@ -8137,7 +8187,7 @@
         </w:tc>
         <w:tc>
           <w:tcPr>
-            <w:tcW w:type="dxa" w:w="1598"/>
+            <w:tcW w:type="dxa" w:w="1625"/>
             <w:shd w:fill="EEEEEE" w:color="auto" w:val="clear"/>
             <w:tcMar>
               <w:top w:type="dxa" w:w="60"/>
@@ -8158,7 +8208,7 @@
         </w:tc>
         <w:tc>
           <w:tcPr>
-            <w:tcW w:type="dxa" w:w="1598"/>
+            <w:tcW w:type="dxa" w:w="1625"/>
             <w:shd w:fill="EEEEEE" w:color="auto" w:val="clear"/>
             <w:tcMar>
               <w:top w:type="dxa" w:w="60"/>
@@ -8179,7 +8229,7 @@
         </w:tc>
         <w:tc>
           <w:tcPr>
-            <w:tcW w:type="dxa" w:w="1600"/>
+            <w:tcW w:type="dxa" w:w="1626"/>
             <w:shd w:fill="EEEEEE" w:color="auto" w:val="clear"/>
             <w:tcMar>
               <w:top w:type="dxa" w:w="60"/>
@@ -8202,7 +8252,7 @@
       <w:tr>
         <w:tc>
           <w:tcPr>
-            <w:tcW w:type="dxa" w:w="3244"/>
+            <w:tcW w:type="dxa" w:w="3137"/>
             <w:tcMar>
               <w:top w:type="dxa" w:w="60"/>
               <w:left w:type="dxa" w:w="100"/>
@@ -8218,7 +8268,7 @@
         </w:tc>
         <w:tc>
           <w:tcPr>
-            <w:tcW w:type="dxa" w:w="1598"/>
+            <w:tcW w:type="dxa" w:w="1625"/>
             <w:tcMar>
               <w:top w:type="dxa" w:w="60"/>
               <w:left w:type="dxa" w:w="100"/>
@@ -8230,7 +8280,7 @@
         </w:tc>
         <w:tc>
           <w:tcPr>
-            <w:tcW w:type="dxa" w:w="1598"/>
+            <w:tcW w:type="dxa" w:w="1625"/>
             <w:tcMar>
               <w:top w:type="dxa" w:w="60"/>
               <w:left w:type="dxa" w:w="100"/>
@@ -8242,7 +8292,7 @@
         </w:tc>
         <w:tc>
           <w:tcPr>
-            <w:tcW w:type="dxa" w:w="1598"/>
+            <w:tcW w:type="dxa" w:w="1625"/>
             <w:tcMar>
               <w:top w:type="dxa" w:w="60"/>
               <w:left w:type="dxa" w:w="100"/>
@@ -8254,7 +8304,7 @@
         </w:tc>
         <w:tc>
           <w:tcPr>
-            <w:tcW w:type="dxa" w:w="1600"/>
+            <w:tcW w:type="dxa" w:w="1626"/>
             <w:tcMar>
               <w:top w:type="dxa" w:w="60"/>
               <w:left w:type="dxa" w:w="100"/>
@@ -8268,7 +8318,7 @@
       <w:tr>
         <w:tc>
           <w:tcPr>
-            <w:tcW w:type="dxa" w:w="3244"/>
+            <w:tcW w:type="dxa" w:w="3137"/>
             <w:tcMar>
               <w:top w:type="dxa" w:w="60"/>
               <w:left w:type="dxa" w:w="100"/>
@@ -8284,7 +8334,7 @@
         </w:tc>
         <w:tc>
           <w:tcPr>
-            <w:tcW w:type="dxa" w:w="1598"/>
+            <w:tcW w:type="dxa" w:w="1625"/>
             <w:tcMar>
               <w:top w:type="dxa" w:w="60"/>
               <w:left w:type="dxa" w:w="100"/>
@@ -8296,7 +8346,7 @@
         </w:tc>
         <w:tc>
           <w:tcPr>
-            <w:tcW w:type="dxa" w:w="1598"/>
+            <w:tcW w:type="dxa" w:w="1625"/>
             <w:tcMar>
               <w:top w:type="dxa" w:w="60"/>
               <w:left w:type="dxa" w:w="100"/>
@@ -8308,7 +8358,7 @@
         </w:tc>
         <w:tc>
           <w:tcPr>
-            <w:tcW w:type="dxa" w:w="1598"/>
+            <w:tcW w:type="dxa" w:w="1625"/>
             <w:tcMar>
               <w:top w:type="dxa" w:w="60"/>
               <w:left w:type="dxa" w:w="100"/>
@@ -8320,7 +8370,7 @@
         </w:tc>
         <w:tc>
           <w:tcPr>
-            <w:tcW w:type="dxa" w:w="1600"/>
+            <w:tcW w:type="dxa" w:w="1626"/>
             <w:tcMar>
               <w:top w:type="dxa" w:w="60"/>
               <w:left w:type="dxa" w:w="100"/>
@@ -8334,7 +8384,7 @@
       <w:tr>
         <w:tc>
           <w:tcPr>
-            <w:tcW w:type="dxa" w:w="3244"/>
+            <w:tcW w:type="dxa" w:w="3137"/>
             <w:tcMar>
               <w:top w:type="dxa" w:w="60"/>
               <w:left w:type="dxa" w:w="100"/>
@@ -8350,7 +8400,7 @@
         </w:tc>
         <w:tc>
           <w:tcPr>
-            <w:tcW w:type="dxa" w:w="1598"/>
+            <w:tcW w:type="dxa" w:w="1625"/>
             <w:tcMar>
               <w:top w:type="dxa" w:w="60"/>
               <w:left w:type="dxa" w:w="100"/>
@@ -8362,7 +8412,7 @@
         </w:tc>
         <w:tc>
           <w:tcPr>
-            <w:tcW w:type="dxa" w:w="1598"/>
+            <w:tcW w:type="dxa" w:w="1625"/>
             <w:tcMar>
               <w:top w:type="dxa" w:w="60"/>
               <w:left w:type="dxa" w:w="100"/>
@@ -8374,7 +8424,7 @@
         </w:tc>
         <w:tc>
           <w:tcPr>
-            <w:tcW w:type="dxa" w:w="1598"/>
+            <w:tcW w:type="dxa" w:w="1625"/>
             <w:tcMar>
               <w:top w:type="dxa" w:w="60"/>
               <w:left w:type="dxa" w:w="100"/>
@@ -8386,7 +8436,7 @@
         </w:tc>
         <w:tc>
           <w:tcPr>
-            <w:tcW w:type="dxa" w:w="1600"/>
+            <w:tcW w:type="dxa" w:w="1626"/>
             <w:tcMar>
               <w:top w:type="dxa" w:w="60"/>
               <w:left w:type="dxa" w:w="100"/>
@@ -8400,7 +8450,7 @@
       <w:tr>
         <w:tc>
           <w:tcPr>
-            <w:tcW w:type="dxa" w:w="3244"/>
+            <w:tcW w:type="dxa" w:w="3137"/>
             <w:tcMar>
               <w:top w:type="dxa" w:w="60"/>
               <w:left w:type="dxa" w:w="100"/>
@@ -8416,7 +8466,7 @@
         </w:tc>
         <w:tc>
           <w:tcPr>
-            <w:tcW w:type="dxa" w:w="1598"/>
+            <w:tcW w:type="dxa" w:w="1625"/>
             <w:tcMar>
               <w:top w:type="dxa" w:w="60"/>
               <w:left w:type="dxa" w:w="100"/>
@@ -8428,7 +8478,7 @@
         </w:tc>
         <w:tc>
           <w:tcPr>
-            <w:tcW w:type="dxa" w:w="1598"/>
+            <w:tcW w:type="dxa" w:w="1625"/>
             <w:tcMar>
               <w:top w:type="dxa" w:w="60"/>
               <w:left w:type="dxa" w:w="100"/>
@@ -8440,7 +8490,7 @@
         </w:tc>
         <w:tc>
           <w:tcPr>
-            <w:tcW w:type="dxa" w:w="1598"/>
+            <w:tcW w:type="dxa" w:w="1625"/>
             <w:tcMar>
               <w:top w:type="dxa" w:w="60"/>
               <w:left w:type="dxa" w:w="100"/>
@@ -8452,7 +8502,7 @@
         </w:tc>
         <w:tc>
           <w:tcPr>
-            <w:tcW w:type="dxa" w:w="1600"/>
+            <w:tcW w:type="dxa" w:w="1626"/>
             <w:tcMar>
               <w:top w:type="dxa" w:w="60"/>
               <w:left w:type="dxa" w:w="100"/>
@@ -8466,7 +8516,7 @@
       <w:tr>
         <w:tc>
           <w:tcPr>
-            <w:tcW w:type="dxa" w:w="3244"/>
+            <w:tcW w:type="dxa" w:w="3137"/>
             <w:tcMar>
               <w:top w:type="dxa" w:w="60"/>
               <w:left w:type="dxa" w:w="100"/>
@@ -8482,7 +8532,7 @@
         </w:tc>
         <w:tc>
           <w:tcPr>
-            <w:tcW w:type="dxa" w:w="1598"/>
+            <w:tcW w:type="dxa" w:w="1625"/>
             <w:tcMar>
               <w:top w:type="dxa" w:w="60"/>
               <w:left w:type="dxa" w:w="100"/>
@@ -8494,7 +8544,7 @@
         </w:tc>
         <w:tc>
           <w:tcPr>
-            <w:tcW w:type="dxa" w:w="1598"/>
+            <w:tcW w:type="dxa" w:w="1625"/>
             <w:tcMar>
               <w:top w:type="dxa" w:w="60"/>
               <w:left w:type="dxa" w:w="100"/>
@@ -8506,7 +8556,7 @@
         </w:tc>
         <w:tc>
           <w:tcPr>
-            <w:tcW w:type="dxa" w:w="1598"/>
+            <w:tcW w:type="dxa" w:w="1625"/>
             <w:tcMar>
               <w:top w:type="dxa" w:w="60"/>
               <w:left w:type="dxa" w:w="100"/>
@@ -8518,7 +8568,7 @@
         </w:tc>
         <w:tc>
           <w:tcPr>
-            <w:tcW w:type="dxa" w:w="1600"/>
+            <w:tcW w:type="dxa" w:w="1626"/>
             <w:tcMar>
               <w:top w:type="dxa" w:w="60"/>
               <w:left w:type="dxa" w:w="100"/>
@@ -8532,23 +8582,23 @@
       <w:tr>
         <w:tc>
           <w:tcPr>
-            <w:tcW w:type="dxa" w:w="3244"/>
-            <w:tcMar>
-              <w:top w:type="dxa" w:w="60"/>
-              <w:left w:type="dxa" w:w="100"/>
-              <w:bottom w:type="dxa" w:w="60"/>
-              <w:right w:type="dxa" w:w="100"/>
-            </w:tcMar>
-          </w:tcPr>
-          <w:p>
-            <w:r>
-              <w:t xml:space="preserve">Infinitum</w:t>
-            </w:r>
-          </w:p>
-        </w:tc>
-        <w:tc>
-          <w:tcPr>
-            <w:tcW w:type="dxa" w:w="1598"/>
+            <w:tcW w:type="dxa" w:w="3137"/>
+            <w:tcMar>
+              <w:top w:type="dxa" w:w="60"/>
+              <w:left w:type="dxa" w:w="100"/>
+              <w:bottom w:type="dxa" w:w="60"/>
+              <w:right w:type="dxa" w:w="100"/>
+            </w:tcMar>
+          </w:tcPr>
+          <w:p>
+            <w:r>
+              <w:t xml:space="preserve">Orion</w:t>
+            </w:r>
+          </w:p>
+        </w:tc>
+        <w:tc>
+          <w:tcPr>
+            <w:tcW w:type="dxa" w:w="1625"/>
             <w:tcMar>
               <w:top w:type="dxa" w:w="60"/>
               <w:left w:type="dxa" w:w="100"/>
@@ -8560,7 +8610,7 @@
         </w:tc>
         <w:tc>
           <w:tcPr>
-            <w:tcW w:type="dxa" w:w="1598"/>
+            <w:tcW w:type="dxa" w:w="1625"/>
             <w:tcMar>
               <w:top w:type="dxa" w:w="60"/>
               <w:left w:type="dxa" w:w="100"/>
@@ -8572,7 +8622,7 @@
         </w:tc>
         <w:tc>
           <w:tcPr>
-            <w:tcW w:type="dxa" w:w="1598"/>
+            <w:tcW w:type="dxa" w:w="1625"/>
             <w:tcMar>
               <w:top w:type="dxa" w:w="60"/>
               <w:left w:type="dxa" w:w="100"/>
@@ -8584,7 +8634,7 @@
         </w:tc>
         <w:tc>
           <w:tcPr>
-            <w:tcW w:type="dxa" w:w="1600"/>
+            <w:tcW w:type="dxa" w:w="1626"/>
             <w:tcMar>
               <w:top w:type="dxa" w:w="60"/>
               <w:left w:type="dxa" w:w="100"/>
@@ -8598,23 +8648,23 @@
       <w:tr>
         <w:tc>
           <w:tcPr>
-            <w:tcW w:type="dxa" w:w="3244"/>
-            <w:tcMar>
-              <w:top w:type="dxa" w:w="60"/>
-              <w:left w:type="dxa" w:w="100"/>
-              <w:bottom w:type="dxa" w:w="60"/>
-              <w:right w:type="dxa" w:w="100"/>
-            </w:tcMar>
-          </w:tcPr>
-          <w:p>
-            <w:r>
-              <w:t xml:space="preserve">WhatsApp corporativo</w:t>
-            </w:r>
-          </w:p>
-        </w:tc>
-        <w:tc>
-          <w:tcPr>
-            <w:tcW w:type="dxa" w:w="1598"/>
+            <w:tcW w:type="dxa" w:w="3137"/>
+            <w:tcMar>
+              <w:top w:type="dxa" w:w="60"/>
+              <w:left w:type="dxa" w:w="100"/>
+              <w:bottom w:type="dxa" w:w="60"/>
+              <w:right w:type="dxa" w:w="100"/>
+            </w:tcMar>
+          </w:tcPr>
+          <w:p>
+            <w:r>
+              <w:t xml:space="preserve">Infinitum</w:t>
+            </w:r>
+          </w:p>
+        </w:tc>
+        <w:tc>
+          <w:tcPr>
+            <w:tcW w:type="dxa" w:w="1625"/>
             <w:tcMar>
               <w:top w:type="dxa" w:w="60"/>
               <w:left w:type="dxa" w:w="100"/>
@@ -8626,7 +8676,7 @@
         </w:tc>
         <w:tc>
           <w:tcPr>
-            <w:tcW w:type="dxa" w:w="1598"/>
+            <w:tcW w:type="dxa" w:w="1625"/>
             <w:tcMar>
               <w:top w:type="dxa" w:w="60"/>
               <w:left w:type="dxa" w:w="100"/>
@@ -8638,7 +8688,7 @@
         </w:tc>
         <w:tc>
           <w:tcPr>
-            <w:tcW w:type="dxa" w:w="1598"/>
+            <w:tcW w:type="dxa" w:w="1625"/>
             <w:tcMar>
               <w:top w:type="dxa" w:w="60"/>
               <w:left w:type="dxa" w:w="100"/>
@@ -8650,7 +8700,7 @@
         </w:tc>
         <w:tc>
           <w:tcPr>
-            <w:tcW w:type="dxa" w:w="1600"/>
+            <w:tcW w:type="dxa" w:w="1626"/>
             <w:tcMar>
               <w:top w:type="dxa" w:w="60"/>
               <w:left w:type="dxa" w:w="100"/>
@@ -8664,23 +8714,23 @@
       <w:tr>
         <w:tc>
           <w:tcPr>
-            <w:tcW w:type="dxa" w:w="3244"/>
-            <w:tcMar>
-              <w:top w:type="dxa" w:w="60"/>
-              <w:left w:type="dxa" w:w="100"/>
-              <w:bottom w:type="dxa" w:w="60"/>
-              <w:right w:type="dxa" w:w="100"/>
-            </w:tcMar>
-          </w:tcPr>
-          <w:p>
-            <w:r>
-              <w:t xml:space="preserve">Acesso remoto / VPN</w:t>
-            </w:r>
-          </w:p>
-        </w:tc>
-        <w:tc>
-          <w:tcPr>
-            <w:tcW w:type="dxa" w:w="1598"/>
+            <w:tcW w:type="dxa" w:w="3137"/>
+            <w:tcMar>
+              <w:top w:type="dxa" w:w="60"/>
+              <w:left w:type="dxa" w:w="100"/>
+              <w:bottom w:type="dxa" w:w="60"/>
+              <w:right w:type="dxa" w:w="100"/>
+            </w:tcMar>
+          </w:tcPr>
+          <w:p>
+            <w:r>
+              <w:t xml:space="preserve">WhatsApp corporativo</w:t>
+            </w:r>
+          </w:p>
+        </w:tc>
+        <w:tc>
+          <w:tcPr>
+            <w:tcW w:type="dxa" w:w="1625"/>
             <w:tcMar>
               <w:top w:type="dxa" w:w="60"/>
               <w:left w:type="dxa" w:w="100"/>
@@ -8692,7 +8742,7 @@
         </w:tc>
         <w:tc>
           <w:tcPr>
-            <w:tcW w:type="dxa" w:w="1598"/>
+            <w:tcW w:type="dxa" w:w="1625"/>
             <w:tcMar>
               <w:top w:type="dxa" w:w="60"/>
               <w:left w:type="dxa" w:w="100"/>
@@ -8704,7 +8754,7 @@
         </w:tc>
         <w:tc>
           <w:tcPr>
-            <w:tcW w:type="dxa" w:w="1598"/>
+            <w:tcW w:type="dxa" w:w="1625"/>
             <w:tcMar>
               <w:top w:type="dxa" w:w="60"/>
               <w:left w:type="dxa" w:w="100"/>
@@ -8716,7 +8766,7 @@
         </w:tc>
         <w:tc>
           <w:tcPr>
-            <w:tcW w:type="dxa" w:w="1600"/>
+            <w:tcW w:type="dxa" w:w="1626"/>
             <w:tcMar>
               <w:top w:type="dxa" w:w="60"/>
               <w:left w:type="dxa" w:w="100"/>
@@ -8730,23 +8780,23 @@
       <w:tr>
         <w:tc>
           <w:tcPr>
-            <w:tcW w:type="dxa" w:w="3244"/>
-            <w:tcMar>
-              <w:top w:type="dxa" w:w="60"/>
-              <w:left w:type="dxa" w:w="100"/>
-              <w:bottom w:type="dxa" w:w="60"/>
-              <w:right w:type="dxa" w:w="100"/>
-            </w:tcMar>
-          </w:tcPr>
-          <w:p>
-            <w:r>
-              <w:t xml:space="preserve">Senhas compartilhadas que conhece</w:t>
-            </w:r>
-          </w:p>
-        </w:tc>
-        <w:tc>
-          <w:tcPr>
-            <w:tcW w:type="dxa" w:w="1598"/>
+            <w:tcW w:type="dxa" w:w="3137"/>
+            <w:tcMar>
+              <w:top w:type="dxa" w:w="60"/>
+              <w:left w:type="dxa" w:w="100"/>
+              <w:bottom w:type="dxa" w:w="60"/>
+              <w:right w:type="dxa" w:w="100"/>
+            </w:tcMar>
+          </w:tcPr>
+          <w:p>
+            <w:r>
+              <w:t xml:space="preserve">Acesso remoto / VPN</w:t>
+            </w:r>
+          </w:p>
+        </w:tc>
+        <w:tc>
+          <w:tcPr>
+            <w:tcW w:type="dxa" w:w="1625"/>
             <w:tcMar>
               <w:top w:type="dxa" w:w="60"/>
               <w:left w:type="dxa" w:w="100"/>
@@ -8758,7 +8808,7 @@
         </w:tc>
         <w:tc>
           <w:tcPr>
-            <w:tcW w:type="dxa" w:w="1598"/>
+            <w:tcW w:type="dxa" w:w="1625"/>
             <w:tcMar>
               <w:top w:type="dxa" w:w="60"/>
               <w:left w:type="dxa" w:w="100"/>
@@ -8770,7 +8820,7 @@
         </w:tc>
         <w:tc>
           <w:tcPr>
-            <w:tcW w:type="dxa" w:w="1598"/>
+            <w:tcW w:type="dxa" w:w="1625"/>
             <w:tcMar>
               <w:top w:type="dxa" w:w="60"/>
               <w:left w:type="dxa" w:w="100"/>
@@ -8782,7 +8832,7 @@
         </w:tc>
         <w:tc>
           <w:tcPr>
-            <w:tcW w:type="dxa" w:w="1600"/>
+            <w:tcW w:type="dxa" w:w="1626"/>
             <w:tcMar>
               <w:top w:type="dxa" w:w="60"/>
               <w:left w:type="dxa" w:w="100"/>
@@ -8796,7 +8846,73 @@
       <w:tr>
         <w:tc>
           <w:tcPr>
-            <w:tcW w:type="dxa" w:w="3244"/>
+            <w:tcW w:type="dxa" w:w="3137"/>
+            <w:tcMar>
+              <w:top w:type="dxa" w:w="60"/>
+              <w:left w:type="dxa" w:w="100"/>
+              <w:bottom w:type="dxa" w:w="60"/>
+              <w:right w:type="dxa" w:w="100"/>
+            </w:tcMar>
+          </w:tcPr>
+          <w:p>
+            <w:r>
+              <w:t xml:space="preserve">Senhas compartilhadas que conhece</w:t>
+            </w:r>
+          </w:p>
+        </w:tc>
+        <w:tc>
+          <w:tcPr>
+            <w:tcW w:type="dxa" w:w="1625"/>
+            <w:tcMar>
+              <w:top w:type="dxa" w:w="60"/>
+              <w:left w:type="dxa" w:w="100"/>
+              <w:bottom w:type="dxa" w:w="60"/>
+              <w:right w:type="dxa" w:w="100"/>
+            </w:tcMar>
+          </w:tcPr>
+          <w:p/>
+        </w:tc>
+        <w:tc>
+          <w:tcPr>
+            <w:tcW w:type="dxa" w:w="1625"/>
+            <w:tcMar>
+              <w:top w:type="dxa" w:w="60"/>
+              <w:left w:type="dxa" w:w="100"/>
+              <w:bottom w:type="dxa" w:w="60"/>
+              <w:right w:type="dxa" w:w="100"/>
+            </w:tcMar>
+          </w:tcPr>
+          <w:p/>
+        </w:tc>
+        <w:tc>
+          <w:tcPr>
+            <w:tcW w:type="dxa" w:w="1625"/>
+            <w:tcMar>
+              <w:top w:type="dxa" w:w="60"/>
+              <w:left w:type="dxa" w:w="100"/>
+              <w:bottom w:type="dxa" w:w="60"/>
+              <w:right w:type="dxa" w:w="100"/>
+            </w:tcMar>
+          </w:tcPr>
+          <w:p/>
+        </w:tc>
+        <w:tc>
+          <w:tcPr>
+            <w:tcW w:type="dxa" w:w="1626"/>
+            <w:tcMar>
+              <w:top w:type="dxa" w:w="60"/>
+              <w:left w:type="dxa" w:w="100"/>
+              <w:bottom w:type="dxa" w:w="60"/>
+              <w:right w:type="dxa" w:w="100"/>
+            </w:tcMar>
+          </w:tcPr>
+          <w:p/>
+        </w:tc>
+      </w:tr>
+      <w:tr>
+        <w:tc>
+          <w:tcPr>
+            <w:tcW w:type="dxa" w:w="3137"/>
             <w:tcMar>
               <w:top w:type="dxa" w:w="60"/>
               <w:left w:type="dxa" w:w="100"/>
@@ -8812,7 +8928,7 @@
         </w:tc>
         <w:tc>
           <w:tcPr>
-            <w:tcW w:type="dxa" w:w="1598"/>
+            <w:tcW w:type="dxa" w:w="1625"/>
             <w:tcMar>
               <w:top w:type="dxa" w:w="60"/>
               <w:left w:type="dxa" w:w="100"/>
@@ -8824,7 +8940,7 @@
         </w:tc>
         <w:tc>
           <w:tcPr>
-            <w:tcW w:type="dxa" w:w="1598"/>
+            <w:tcW w:type="dxa" w:w="1625"/>
             <w:tcMar>
               <w:top w:type="dxa" w:w="60"/>
               <w:left w:type="dxa" w:w="100"/>
@@ -8836,7 +8952,7 @@
         </w:tc>
         <w:tc>
           <w:tcPr>
-            <w:tcW w:type="dxa" w:w="1598"/>
+            <w:tcW w:type="dxa" w:w="1625"/>
             <w:tcMar>
               <w:top w:type="dxa" w:w="60"/>
               <w:left w:type="dxa" w:w="100"/>
@@ -8848,7 +8964,7 @@
         </w:tc>
         <w:tc>
           <w:tcPr>
-            <w:tcW w:type="dxa" w:w="1600"/>
+            <w:tcW w:type="dxa" w:w="1626"/>
             <w:tcMar>
               <w:top w:type="dxa" w:w="60"/>
               <w:left w:type="dxa" w:w="100"/>

</xml_diff>

<commit_message>
Perfis de acesso: perfil B Oficina, tabela em todos os POPs, GLPI explicado
- POP-01 §3: perfil B passa a ser "Oficina" (estoquista, documentação,
  compras) com e-mail; C = tudo do B + Orion e computador; D = tudo do C.
- Tabela de perfis copiada para os POP-02 a POP-11.
- POP-01 §2: o que é o GLPI.
- ERP é o Petroshow: listas e formulários passam a dizer "Petroshow (ERP)".
- Impressão (PDFs e Word do RH) regerada.

Co-Authored-By: Claude Opus 5.5 <noreply@anthropic.com>
</commit_message>
<xml_diff>
--- a/impressao/POPs-RH-revisao.docx
+++ b/impressao/POPs-RH-revisao.docx
@@ -361,6 +361,55 @@
     <w:p/>
     <w:p>
       <w:pPr>
+        <w:pBdr>
+          <w:left w:val="single" w:color="999999" w:sz="12" w:space="8"/>
+        </w:pBdr>
+        <w:spacing w:after="160"/>
+        <w:ind w:left="240"/>
+      </w:pPr>
+      <w:r>
+        <w:rPr>
+          <w:b/>
+          <w:bCs/>
+        </w:rPr>
+        <w:t xml:space="preserve">O que é o GLPI:</w:t>
+      </w:r>
+      <w:r>
+        <w:t xml:space="preserve"> é o sistema da TI onde ficam os </w:t>
+      </w:r>
+      <w:r>
+        <w:rPr>
+          <w:b/>
+          <w:bCs/>
+        </w:rPr>
+        <w:t xml:space="preserve">chamados</w:t>
+      </w:r>
+      <w:r>
+        <w:t xml:space="preserve"> (todo pedido para a TI), o </w:t>
+      </w:r>
+      <w:r>
+        <w:rPr>
+          <w:b/>
+          <w:bCs/>
+        </w:rPr>
+        <w:t xml:space="preserve">inventário</w:t>
+      </w:r>
+      <w:r>
+        <w:t xml:space="preserve"> de computadores e celulares (com quem está cada aparelho) e a </w:t>
+      </w:r>
+      <w:r>
+        <w:rPr>
+          <w:b/>
+          <w:bCs/>
+        </w:rPr>
+        <w:t xml:space="preserve">ficha de acessos</w:t>
+      </w:r>
+      <w:r>
+        <w:t xml:space="preserve"> de cada funcionário (Formulário B). Funciona pelo navegador, com usuário e senha próprios, só na rede da empresa (de fora, pela VPN). O RH e o gestor abrem e aprovam o chamado ali, e acompanham pelo próprio chamado o que a TI já fez. É gratuito e roda no servidor da empresa (POP-TI §2).</w:t>
+      </w:r>
+    </w:p>
+    <w:p>
+      <w:pPr>
         <w:pStyle w:val="Heading2"/>
       </w:pPr>
       <w:r>
@@ -398,10 +447,10 @@
         </w:tblBorders>
       </w:tblPr>
       <w:tblGrid>
-        <w:gridCol w:w="1123"/>
-        <w:gridCol w:w="2483"/>
-        <w:gridCol w:w="3606"/>
-        <w:gridCol w:w="2426"/>
+        <w:gridCol w:w="1162"/>
+        <w:gridCol w:w="2676"/>
+        <w:gridCol w:w="3186"/>
+        <w:gridCol w:w="2614"/>
       </w:tblGrid>
       <w:tr>
         <w:trPr>
@@ -409,7 +458,7 @@
         </w:trPr>
         <w:tc>
           <w:tcPr>
-            <w:tcW w:type="dxa" w:w="1123"/>
+            <w:tcW w:type="dxa" w:w="1162"/>
             <w:shd w:fill="EEEEEE" w:color="auto" w:val="clear"/>
             <w:tcMar>
               <w:top w:type="dxa" w:w="60"/>
@@ -430,7 +479,7 @@
         </w:tc>
         <w:tc>
           <w:tcPr>
-            <w:tcW w:type="dxa" w:w="2483"/>
+            <w:tcW w:type="dxa" w:w="2676"/>
             <w:shd w:fill="EEEEEE" w:color="auto" w:val="clear"/>
             <w:tcMar>
               <w:top w:type="dxa" w:w="60"/>
@@ -451,7 +500,7 @@
         </w:tc>
         <w:tc>
           <w:tcPr>
-            <w:tcW w:type="dxa" w:w="3606"/>
+            <w:tcW w:type="dxa" w:w="3186"/>
             <w:shd w:fill="EEEEEE" w:color="auto" w:val="clear"/>
             <w:tcMar>
               <w:top w:type="dxa" w:w="60"/>
@@ -472,7 +521,7 @@
         </w:tc>
         <w:tc>
           <w:tcPr>
-            <w:tcW w:type="dxa" w:w="2426"/>
+            <w:tcW w:type="dxa" w:w="2614"/>
             <w:shd w:fill="EEEEEE" w:color="auto" w:val="clear"/>
             <w:tcMar>
               <w:top w:type="dxa" w:w="60"/>
@@ -495,7 +544,7 @@
       <w:tr>
         <w:tc>
           <w:tcPr>
-            <w:tcW w:type="dxa" w:w="1123"/>
+            <w:tcW w:type="dxa" w:w="1162"/>
             <w:tcMar>
               <w:top w:type="dxa" w:w="60"/>
               <w:left w:type="dxa" w:w="100"/>
@@ -515,7 +564,7 @@
         </w:tc>
         <w:tc>
           <w:tcPr>
-            <w:tcW w:type="dxa" w:w="2483"/>
+            <w:tcW w:type="dxa" w:w="2676"/>
             <w:tcMar>
               <w:top w:type="dxa" w:w="60"/>
               <w:left w:type="dxa" w:w="100"/>
@@ -531,7 +580,7 @@
         </w:tc>
         <w:tc>
           <w:tcPr>
-            <w:tcW w:type="dxa" w:w="3606"/>
+            <w:tcW w:type="dxa" w:w="3186"/>
             <w:tcMar>
               <w:top w:type="dxa" w:w="60"/>
               <w:left w:type="dxa" w:w="100"/>
@@ -547,7 +596,7 @@
         </w:tc>
         <w:tc>
           <w:tcPr>
-            <w:tcW w:type="dxa" w:w="2426"/>
+            <w:tcW w:type="dxa" w:w="2614"/>
             <w:tcMar>
               <w:top w:type="dxa" w:w="60"/>
               <w:left w:type="dxa" w:w="100"/>
@@ -575,59 +624,59 @@
       <w:tr>
         <w:tc>
           <w:tcPr>
-            <w:tcW w:type="dxa" w:w="1123"/>
-            <w:tcMar>
-              <w:top w:type="dxa" w:w="60"/>
-              <w:left w:type="dxa" w:w="100"/>
-              <w:bottom w:type="dxa" w:w="60"/>
-              <w:right w:type="dxa" w:w="100"/>
-            </w:tcMar>
-          </w:tcPr>
-          <w:p>
-            <w:r>
-              <w:rPr>
-                <w:b/>
-                <w:bCs/>
-              </w:rPr>
-              <w:t xml:space="preserve">B: Estoquista</w:t>
-            </w:r>
-          </w:p>
-        </w:tc>
-        <w:tc>
-          <w:tcPr>
-            <w:tcW w:type="dxa" w:w="2483"/>
-            <w:tcMar>
-              <w:top w:type="dxa" w:w="60"/>
-              <w:left w:type="dxa" w:w="100"/>
-              <w:bottom w:type="dxa" w:w="60"/>
-              <w:right w:type="dxa" w:w="100"/>
-            </w:tcMar>
-          </w:tcPr>
-          <w:p>
-            <w:r>
-              <w:t xml:space="preserve">Estoquista</w:t>
-            </w:r>
-          </w:p>
-        </w:tc>
-        <w:tc>
-          <w:tcPr>
-            <w:tcW w:type="dxa" w:w="3606"/>
-            <w:tcMar>
-              <w:top w:type="dxa" w:w="60"/>
-              <w:left w:type="dxa" w:w="100"/>
-              <w:bottom w:type="dxa" w:w="60"/>
-              <w:right w:type="dxa" w:w="100"/>
-            </w:tcMar>
-          </w:tcPr>
-          <w:p>
-            <w:r>
-              <w:t xml:space="preserve">Celular corporativo, Petroshow, Sigest, Infinitum e Sistema VS</w:t>
-            </w:r>
-          </w:p>
-        </w:tc>
-        <w:tc>
-          <w:tcPr>
-            <w:tcW w:type="dxa" w:w="2426"/>
+            <w:tcW w:type="dxa" w:w="1162"/>
+            <w:tcMar>
+              <w:top w:type="dxa" w:w="60"/>
+              <w:left w:type="dxa" w:w="100"/>
+              <w:bottom w:type="dxa" w:w="60"/>
+              <w:right w:type="dxa" w:w="100"/>
+            </w:tcMar>
+          </w:tcPr>
+          <w:p>
+            <w:r>
+              <w:rPr>
+                <w:b/>
+                <w:bCs/>
+              </w:rPr>
+              <w:t xml:space="preserve">B: Oficina</w:t>
+            </w:r>
+          </w:p>
+        </w:tc>
+        <w:tc>
+          <w:tcPr>
+            <w:tcW w:type="dxa" w:w="2676"/>
+            <w:tcMar>
+              <w:top w:type="dxa" w:w="60"/>
+              <w:left w:type="dxa" w:w="100"/>
+              <w:bottom w:type="dxa" w:w="60"/>
+              <w:right w:type="dxa" w:w="100"/>
+            </w:tcMar>
+          </w:tcPr>
+          <w:p>
+            <w:r>
+              <w:t xml:space="preserve">Estoquista, documentação, compras</w:t>
+            </w:r>
+          </w:p>
+        </w:tc>
+        <w:tc>
+          <w:tcPr>
+            <w:tcW w:type="dxa" w:w="3186"/>
+            <w:tcMar>
+              <w:top w:type="dxa" w:w="60"/>
+              <w:left w:type="dxa" w:w="100"/>
+              <w:bottom w:type="dxa" w:w="60"/>
+              <w:right w:type="dxa" w:w="100"/>
+            </w:tcMar>
+          </w:tcPr>
+          <w:p>
+            <w:r>
+              <w:t xml:space="preserve">Celular corporativo, e-mail corporativo, Petroshow, Sigest, Infinitum e Sistema VS</w:t>
+            </w:r>
+          </w:p>
+        </w:tc>
+        <w:tc>
+          <w:tcPr>
+            <w:tcW w:type="dxa" w:w="2614"/>
             <w:tcMar>
               <w:top w:type="dxa" w:w="60"/>
               <w:left w:type="dxa" w:w="100"/>
@@ -652,7 +701,7 @@
       <w:tr>
         <w:tc>
           <w:tcPr>
-            <w:tcW w:type="dxa" w:w="1123"/>
+            <w:tcW w:type="dxa" w:w="1162"/>
             <w:tcMar>
               <w:top w:type="dxa" w:w="60"/>
               <w:left w:type="dxa" w:w="100"/>
@@ -672,39 +721,39 @@
         </w:tc>
         <w:tc>
           <w:tcPr>
-            <w:tcW w:type="dxa" w:w="2483"/>
-            <w:tcMar>
-              <w:top w:type="dxa" w:w="60"/>
-              <w:left w:type="dxa" w:w="100"/>
-              <w:bottom w:type="dxa" w:w="60"/>
-              <w:right w:type="dxa" w:w="100"/>
-            </w:tcMar>
-          </w:tcPr>
-          <w:p>
-            <w:r>
-              <w:t xml:space="preserve">Administrativo, financeiro, comercial, RH/DP, documentação, compras</w:t>
-            </w:r>
-          </w:p>
-        </w:tc>
-        <w:tc>
-          <w:tcPr>
-            <w:tcW w:type="dxa" w:w="3606"/>
-            <w:tcMar>
-              <w:top w:type="dxa" w:w="60"/>
-              <w:left w:type="dxa" w:w="100"/>
-              <w:bottom w:type="dxa" w:w="60"/>
-              <w:right w:type="dxa" w:w="100"/>
-            </w:tcMar>
-          </w:tcPr>
-          <w:p>
-            <w:r>
-              <w:t xml:space="preserve">E-mail corporativo, Sistema VS, ERP, Orion e computador</w:t>
-            </w:r>
-          </w:p>
-        </w:tc>
-        <w:tc>
-          <w:tcPr>
-            <w:tcW w:type="dxa" w:w="2426"/>
+            <w:tcW w:type="dxa" w:w="2676"/>
+            <w:tcMar>
+              <w:top w:type="dxa" w:w="60"/>
+              <w:left w:type="dxa" w:w="100"/>
+              <w:bottom w:type="dxa" w:w="60"/>
+              <w:right w:type="dxa" w:w="100"/>
+            </w:tcMar>
+          </w:tcPr>
+          <w:p>
+            <w:r>
+              <w:t xml:space="preserve">Administrativo, financeiro, comercial, RH/DP</w:t>
+            </w:r>
+          </w:p>
+        </w:tc>
+        <w:tc>
+          <w:tcPr>
+            <w:tcW w:type="dxa" w:w="3186"/>
+            <w:tcMar>
+              <w:top w:type="dxa" w:w="60"/>
+              <w:left w:type="dxa" w:w="100"/>
+              <w:bottom w:type="dxa" w:w="60"/>
+              <w:right w:type="dxa" w:w="100"/>
+            </w:tcMar>
+          </w:tcPr>
+          <w:p>
+            <w:r>
+              <w:t xml:space="preserve">Tudo do perfil B, Orion e computador</w:t>
+            </w:r>
+          </w:p>
+        </w:tc>
+        <w:tc>
+          <w:tcPr>
+            <w:tcW w:type="dxa" w:w="2614"/>
             <w:tcMar>
               <w:top w:type="dxa" w:w="60"/>
               <w:left w:type="dxa" w:w="100"/>
@@ -729,7 +778,7 @@
       <w:tr>
         <w:tc>
           <w:tcPr>
-            <w:tcW w:type="dxa" w:w="1123"/>
+            <w:tcW w:type="dxa" w:w="1162"/>
             <w:tcMar>
               <w:top w:type="dxa" w:w="60"/>
               <w:left w:type="dxa" w:w="100"/>
@@ -749,7 +798,7 @@
         </w:tc>
         <w:tc>
           <w:tcPr>
-            <w:tcW w:type="dxa" w:w="2483"/>
+            <w:tcW w:type="dxa" w:w="2676"/>
             <w:tcMar>
               <w:top w:type="dxa" w:w="60"/>
               <w:left w:type="dxa" w:w="100"/>
@@ -765,23 +814,23 @@
         </w:tc>
         <w:tc>
           <w:tcPr>
-            <w:tcW w:type="dxa" w:w="3606"/>
-            <w:tcMar>
-              <w:top w:type="dxa" w:w="60"/>
-              <w:left w:type="dxa" w:w="100"/>
-              <w:bottom w:type="dxa" w:w="60"/>
-              <w:right w:type="dxa" w:w="100"/>
-            </w:tcMar>
-          </w:tcPr>
-          <w:p>
-            <w:r>
-              <w:t xml:space="preserve">Tudo do perfil C + celular corporativo e WhatsApp corporativo</w:t>
-            </w:r>
-          </w:p>
-        </w:tc>
-        <w:tc>
-          <w:tcPr>
-            <w:tcW w:type="dxa" w:w="2426"/>
+            <w:tcW w:type="dxa" w:w="3186"/>
+            <w:tcMar>
+              <w:top w:type="dxa" w:w="60"/>
+              <w:left w:type="dxa" w:w="100"/>
+              <w:bottom w:type="dxa" w:w="60"/>
+              <w:right w:type="dxa" w:w="100"/>
+            </w:tcMar>
+          </w:tcPr>
+          <w:p>
+            <w:r>
+              <w:t xml:space="preserve">Tudo do perfil C</w:t>
+            </w:r>
+          </w:p>
+        </w:tc>
+        <w:tc>
+          <w:tcPr>
+            <w:tcW w:type="dxa" w:w="2614"/>
             <w:tcMar>
               <w:top w:type="dxa" w:w="60"/>
               <w:left w:type="dxa" w:w="100"/>
@@ -1256,7 +1305,7 @@
           <w:b/>
           <w:bCs/>
         </w:rPr>
-        <w:t xml:space="preserve">ERP / Petroshow / Sigest / Infinitum / Orion:</w:t>
+        <w:t xml:space="preserve">Petroshow (ERP) / Sigest / Infinitum / Orion:</w:t>
       </w:r>
       <w:r>
         <w:t xml:space="preserve"> criar os usuários aprovados, com o perfil da função (nunca copiar o perfil de outra pessoa sem conferir).</w:t>
@@ -1786,7 +1835,7 @@
           </w:tcPr>
           <w:p>
             <w:r>
-              <w:t xml:space="preserve">ERP / Petroshow / Sigest / Infinitum / Orion</w:t>
+              <w:t xml:space="preserve">Petroshow (ERP) / Sigest / Infinitum / Orion</w:t>
             </w:r>
           </w:p>
         </w:tc>
@@ -3037,7 +3086,7 @@
           <w:b/>
           <w:bCs/>
         </w:rPr>
-        <w:t xml:space="preserve">ERP / Petroshow / Sigest / Infinitum / Orion:</w:t>
+        <w:t xml:space="preserve">Petroshow (ERP) / Sigest / Infinitum / Orion:</w:t>
       </w:r>
       <w:r>
         <w:t xml:space="preserve"> desativar os usuários (não excluir, pelo mesmo motivo).</w:t>
@@ -3452,6 +3501,452 @@
         <w:t xml:space="preserve">A revisão semestral (POP-11 §4) procura contas que escaparam deste POP.</w:t>
       </w:r>
     </w:p>
+    <w:p>
+      <w:pPr>
+        <w:pStyle w:val="Heading2"/>
+      </w:pPr>
+      <w:r>
+        <w:t xml:space="preserve">Perfis de acesso por cargo</w:t>
+      </w:r>
+    </w:p>
+    <w:p>
+      <w:pPr>
+        <w:pBdr>
+          <w:left w:val="single" w:color="999999" w:sz="12" w:space="8"/>
+        </w:pBdr>
+        <w:spacing w:after="160"/>
+        <w:ind w:left="240"/>
+      </w:pPr>
+      <w:r>
+        <w:t xml:space="preserve">Mesma tabela em todos os POPs. As regras completas estão no </w:t>
+      </w:r>
+      <w:r>
+        <w:t xml:space="preserve">POP-01 §3</w:t>
+      </w:r>
+      <w:r>
+        <w:t xml:space="preserve">.</w:t>
+      </w:r>
+    </w:p>
+    <w:tbl>
+      <w:tblPr>
+        <w:tblW w:type="dxa" w:w="9638"/>
+        <w:tblBorders>
+          <w:top w:val="single" w:color="999999" w:sz="4"/>
+          <w:left w:val="single" w:color="999999" w:sz="4"/>
+          <w:bottom w:val="single" w:color="999999" w:sz="4"/>
+          <w:right w:val="single" w:color="999999" w:sz="4"/>
+          <w:insideH w:val="single" w:color="999999" w:sz="4"/>
+          <w:insideV w:val="single" w:color="999999" w:sz="4"/>
+        </w:tblBorders>
+      </w:tblPr>
+      <w:tblGrid>
+        <w:gridCol w:w="1162"/>
+        <w:gridCol w:w="2676"/>
+        <w:gridCol w:w="3186"/>
+        <w:gridCol w:w="2614"/>
+      </w:tblGrid>
+      <w:tr>
+        <w:trPr>
+          <w:tblHeader/>
+        </w:trPr>
+        <w:tc>
+          <w:tcPr>
+            <w:tcW w:type="dxa" w:w="1162"/>
+            <w:shd w:fill="EEEEEE" w:color="auto" w:val="clear"/>
+            <w:tcMar>
+              <w:top w:type="dxa" w:w="60"/>
+              <w:left w:type="dxa" w:w="100"/>
+              <w:bottom w:type="dxa" w:w="60"/>
+              <w:right w:type="dxa" w:w="100"/>
+            </w:tcMar>
+          </w:tcPr>
+          <w:p>
+            <w:r>
+              <w:rPr>
+                <w:b/>
+                <w:bCs/>
+              </w:rPr>
+              <w:t xml:space="preserve">Perfil</w:t>
+            </w:r>
+          </w:p>
+        </w:tc>
+        <w:tc>
+          <w:tcPr>
+            <w:tcW w:type="dxa" w:w="2676"/>
+            <w:shd w:fill="EEEEEE" w:color="auto" w:val="clear"/>
+            <w:tcMar>
+              <w:top w:type="dxa" w:w="60"/>
+              <w:left w:type="dxa" w:w="100"/>
+              <w:bottom w:type="dxa" w:w="60"/>
+              <w:right w:type="dxa" w:w="100"/>
+            </w:tcMar>
+          </w:tcPr>
+          <w:p>
+            <w:r>
+              <w:rPr>
+                <w:b/>
+                <w:bCs/>
+              </w:rPr>
+              <w:t xml:space="preserve">Cargos</w:t>
+            </w:r>
+          </w:p>
+        </w:tc>
+        <w:tc>
+          <w:tcPr>
+            <w:tcW w:type="dxa" w:w="3186"/>
+            <w:shd w:fill="EEEEEE" w:color="auto" w:val="clear"/>
+            <w:tcMar>
+              <w:top w:type="dxa" w:w="60"/>
+              <w:left w:type="dxa" w:w="100"/>
+              <w:bottom w:type="dxa" w:w="60"/>
+              <w:right w:type="dxa" w:w="100"/>
+            </w:tcMar>
+          </w:tcPr>
+          <w:p>
+            <w:r>
+              <w:rPr>
+                <w:b/>
+                <w:bCs/>
+              </w:rPr>
+              <w:t xml:space="preserve">O que a TI entrega</w:t>
+            </w:r>
+          </w:p>
+        </w:tc>
+        <w:tc>
+          <w:tcPr>
+            <w:tcW w:type="dxa" w:w="2614"/>
+            <w:shd w:fill="EEEEEE" w:color="auto" w:val="clear"/>
+            <w:tcMar>
+              <w:top w:type="dxa" w:w="60"/>
+              <w:left w:type="dxa" w:w="100"/>
+              <w:bottom w:type="dxa" w:w="60"/>
+              <w:right w:type="dxa" w:w="100"/>
+            </w:tcMar>
+          </w:tcPr>
+          <w:p>
+            <w:r>
+              <w:rPr>
+                <w:b/>
+                <w:bCs/>
+              </w:rPr>
+              <w:t xml:space="preserve">RH abre o chamado</w:t>
+            </w:r>
+          </w:p>
+        </w:tc>
+      </w:tr>
+      <w:tr>
+        <w:tc>
+          <w:tcPr>
+            <w:tcW w:type="dxa" w:w="1162"/>
+            <w:tcMar>
+              <w:top w:type="dxa" w:w="60"/>
+              <w:left w:type="dxa" w:w="100"/>
+              <w:bottom w:type="dxa" w:w="60"/>
+              <w:right w:type="dxa" w:w="100"/>
+            </w:tcMar>
+          </w:tcPr>
+          <w:p>
+            <w:r>
+              <w:rPr>
+                <w:b/>
+                <w:bCs/>
+              </w:rPr>
+              <w:t xml:space="preserve">A: Sem acesso de TI</w:t>
+            </w:r>
+          </w:p>
+        </w:tc>
+        <w:tc>
+          <w:tcPr>
+            <w:tcW w:type="dxa" w:w="2676"/>
+            <w:tcMar>
+              <w:top w:type="dxa" w:w="60"/>
+              <w:left w:type="dxa" w:w="100"/>
+              <w:bottom w:type="dxa" w:w="60"/>
+              <w:right w:type="dxa" w:w="100"/>
+            </w:tcMar>
+          </w:tcPr>
+          <w:p>
+            <w:r>
+              <w:t xml:space="preserve">Motorista, zelador, auxiliar de limpeza, mecânico, borracheiro</w:t>
+            </w:r>
+          </w:p>
+        </w:tc>
+        <w:tc>
+          <w:tcPr>
+            <w:tcW w:type="dxa" w:w="3186"/>
+            <w:tcMar>
+              <w:top w:type="dxa" w:w="60"/>
+              <w:left w:type="dxa" w:w="100"/>
+              <w:bottom w:type="dxa" w:w="60"/>
+              <w:right w:type="dxa" w:w="100"/>
+            </w:tcMar>
+          </w:tcPr>
+          <w:p>
+            <w:r>
+              <w:t xml:space="preserve">Nada. O chamado serve só para registrar a pessoa</w:t>
+            </w:r>
+          </w:p>
+        </w:tc>
+        <w:tc>
+          <w:tcPr>
+            <w:tcW w:type="dxa" w:w="2614"/>
+            <w:tcMar>
+              <w:top w:type="dxa" w:w="60"/>
+              <w:left w:type="dxa" w:w="100"/>
+              <w:bottom w:type="dxa" w:w="60"/>
+              <w:right w:type="dxa" w:w="100"/>
+            </w:tcMar>
+          </w:tcPr>
+          <w:p>
+            <w:r>
+              <w:t xml:space="preserve">Até o </w:t>
+            </w:r>
+            <w:r>
+              <w:rPr>
+                <w:b/>
+                <w:bCs/>
+              </w:rPr>
+              <w:t xml:space="preserve">dia do início</w:t>
+            </w:r>
+            <w:r>
+              <w:t xml:space="preserve"> (pode começar no mesmo dia)</w:t>
+            </w:r>
+          </w:p>
+        </w:tc>
+      </w:tr>
+      <w:tr>
+        <w:tc>
+          <w:tcPr>
+            <w:tcW w:type="dxa" w:w="1162"/>
+            <w:tcMar>
+              <w:top w:type="dxa" w:w="60"/>
+              <w:left w:type="dxa" w:w="100"/>
+              <w:bottom w:type="dxa" w:w="60"/>
+              <w:right w:type="dxa" w:w="100"/>
+            </w:tcMar>
+          </w:tcPr>
+          <w:p>
+            <w:r>
+              <w:rPr>
+                <w:b/>
+                <w:bCs/>
+              </w:rPr>
+              <w:t xml:space="preserve">B: Oficina</w:t>
+            </w:r>
+          </w:p>
+        </w:tc>
+        <w:tc>
+          <w:tcPr>
+            <w:tcW w:type="dxa" w:w="2676"/>
+            <w:tcMar>
+              <w:top w:type="dxa" w:w="60"/>
+              <w:left w:type="dxa" w:w="100"/>
+              <w:bottom w:type="dxa" w:w="60"/>
+              <w:right w:type="dxa" w:w="100"/>
+            </w:tcMar>
+          </w:tcPr>
+          <w:p>
+            <w:r>
+              <w:t xml:space="preserve">Estoquista, documentação, compras</w:t>
+            </w:r>
+          </w:p>
+        </w:tc>
+        <w:tc>
+          <w:tcPr>
+            <w:tcW w:type="dxa" w:w="3186"/>
+            <w:tcMar>
+              <w:top w:type="dxa" w:w="60"/>
+              <w:left w:type="dxa" w:w="100"/>
+              <w:bottom w:type="dxa" w:w="60"/>
+              <w:right w:type="dxa" w:w="100"/>
+            </w:tcMar>
+          </w:tcPr>
+          <w:p>
+            <w:r>
+              <w:t xml:space="preserve">Celular corporativo, e-mail corporativo, Petroshow, Sigest, Infinitum e Sistema VS</w:t>
+            </w:r>
+          </w:p>
+        </w:tc>
+        <w:tc>
+          <w:tcPr>
+            <w:tcW w:type="dxa" w:w="2614"/>
+            <w:tcMar>
+              <w:top w:type="dxa" w:w="60"/>
+              <w:left w:type="dxa" w:w="100"/>
+              <w:bottom w:type="dxa" w:w="60"/>
+              <w:right w:type="dxa" w:w="100"/>
+            </w:tcMar>
+          </w:tcPr>
+          <w:p>
+            <w:r>
+              <w:rPr>
+                <w:b/>
+                <w:bCs/>
+              </w:rPr>
+              <w:t xml:space="preserve">2 dias úteis antes</w:t>
+            </w:r>
+            <w:r>
+              <w:t xml:space="preserve"> do início</w:t>
+            </w:r>
+          </w:p>
+        </w:tc>
+      </w:tr>
+      <w:tr>
+        <w:tc>
+          <w:tcPr>
+            <w:tcW w:type="dxa" w:w="1162"/>
+            <w:tcMar>
+              <w:top w:type="dxa" w:w="60"/>
+              <w:left w:type="dxa" w:w="100"/>
+              <w:bottom w:type="dxa" w:w="60"/>
+              <w:right w:type="dxa" w:w="100"/>
+            </w:tcMar>
+          </w:tcPr>
+          <w:p>
+            <w:r>
+              <w:rPr>
+                <w:b/>
+                <w:bCs/>
+              </w:rPr>
+              <w:t xml:space="preserve">C: Escritório</w:t>
+            </w:r>
+          </w:p>
+        </w:tc>
+        <w:tc>
+          <w:tcPr>
+            <w:tcW w:type="dxa" w:w="2676"/>
+            <w:tcMar>
+              <w:top w:type="dxa" w:w="60"/>
+              <w:left w:type="dxa" w:w="100"/>
+              <w:bottom w:type="dxa" w:w="60"/>
+              <w:right w:type="dxa" w:w="100"/>
+            </w:tcMar>
+          </w:tcPr>
+          <w:p>
+            <w:r>
+              <w:t xml:space="preserve">Administrativo, financeiro, comercial, RH/DP</w:t>
+            </w:r>
+          </w:p>
+        </w:tc>
+        <w:tc>
+          <w:tcPr>
+            <w:tcW w:type="dxa" w:w="3186"/>
+            <w:tcMar>
+              <w:top w:type="dxa" w:w="60"/>
+              <w:left w:type="dxa" w:w="100"/>
+              <w:bottom w:type="dxa" w:w="60"/>
+              <w:right w:type="dxa" w:w="100"/>
+            </w:tcMar>
+          </w:tcPr>
+          <w:p>
+            <w:r>
+              <w:t xml:space="preserve">Tudo do perfil B, Orion e computador</w:t>
+            </w:r>
+          </w:p>
+        </w:tc>
+        <w:tc>
+          <w:tcPr>
+            <w:tcW w:type="dxa" w:w="2614"/>
+            <w:tcMar>
+              <w:top w:type="dxa" w:w="60"/>
+              <w:left w:type="dxa" w:w="100"/>
+              <w:bottom w:type="dxa" w:w="60"/>
+              <w:right w:type="dxa" w:w="100"/>
+            </w:tcMar>
+          </w:tcPr>
+          <w:p>
+            <w:r>
+              <w:rPr>
+                <w:b/>
+                <w:bCs/>
+              </w:rPr>
+              <w:t xml:space="preserve">3 dias úteis antes</w:t>
+            </w:r>
+            <w:r>
+              <w:t xml:space="preserve"> do início</w:t>
+            </w:r>
+          </w:p>
+        </w:tc>
+      </w:tr>
+      <w:tr>
+        <w:tc>
+          <w:tcPr>
+            <w:tcW w:type="dxa" w:w="1162"/>
+            <w:tcMar>
+              <w:top w:type="dxa" w:w="60"/>
+              <w:left w:type="dxa" w:w="100"/>
+              <w:bottom w:type="dxa" w:w="60"/>
+              <w:right w:type="dxa" w:w="100"/>
+            </w:tcMar>
+          </w:tcPr>
+          <w:p>
+            <w:r>
+              <w:rPr>
+                <w:b/>
+                <w:bCs/>
+              </w:rPr>
+              <w:t xml:space="preserve">D: Gestão</w:t>
+            </w:r>
+          </w:p>
+        </w:tc>
+        <w:tc>
+          <w:tcPr>
+            <w:tcW w:type="dxa" w:w="2676"/>
+            <w:tcMar>
+              <w:top w:type="dxa" w:w="60"/>
+              <w:left w:type="dxa" w:w="100"/>
+              <w:bottom w:type="dxa" w:w="60"/>
+              <w:right w:type="dxa" w:w="100"/>
+            </w:tcMar>
+          </w:tcPr>
+          <w:p>
+            <w:r>
+              <w:t xml:space="preserve">Gerentes e supervisores</w:t>
+            </w:r>
+          </w:p>
+        </w:tc>
+        <w:tc>
+          <w:tcPr>
+            <w:tcW w:type="dxa" w:w="3186"/>
+            <w:tcMar>
+              <w:top w:type="dxa" w:w="60"/>
+              <w:left w:type="dxa" w:w="100"/>
+              <w:bottom w:type="dxa" w:w="60"/>
+              <w:right w:type="dxa" w:w="100"/>
+            </w:tcMar>
+          </w:tcPr>
+          <w:p>
+            <w:r>
+              <w:t xml:space="preserve">Tudo do perfil C</w:t>
+            </w:r>
+          </w:p>
+        </w:tc>
+        <w:tc>
+          <w:tcPr>
+            <w:tcW w:type="dxa" w:w="2614"/>
+            <w:tcMar>
+              <w:top w:type="dxa" w:w="60"/>
+              <w:left w:type="dxa" w:w="100"/>
+              <w:bottom w:type="dxa" w:w="60"/>
+              <w:right w:type="dxa" w:w="100"/>
+            </w:tcMar>
+          </w:tcPr>
+          <w:p>
+            <w:r>
+              <w:rPr>
+                <w:b/>
+                <w:bCs/>
+              </w:rPr>
+              <w:t xml:space="preserve">3 dias úteis antes</w:t>
+            </w:r>
+            <w:r>
+              <w:t xml:space="preserve"> do início</w:t>
+            </w:r>
+          </w:p>
+        </w:tc>
+      </w:tr>
+    </w:tbl>
+    <w:p/>
     <w:p>
       <w:pPr>
         <w:pStyle w:val="Heading2"/>
@@ -4294,7 +4789,7 @@
           <w:b/>
           <w:bCs/>
         </w:rPr>
-        <w:t xml:space="preserve">ERP / Petroshow / Sigest / Infinitum / Orion:</w:t>
+        <w:t xml:space="preserve">Petroshow (ERP) / Sigest / Infinitum / Orion:</w:t>
       </w:r>
       <w:r>
         <w:t xml:space="preserve"> ajustar perfil; remover acesso à unidade antiga.</w:t>
@@ -4985,7 +5480,7 @@
           <w:b/>
           <w:bCs/>
         </w:rPr>
-        <w:t xml:space="preserve">Sistema VS / ERP / Petroshow / Sigest / Infinitum / Orion:</w:t>
+        <w:t xml:space="preserve">Sistema VS / Petroshow (ERP) / Sigest / Infinitum / Orion:</w:t>
       </w:r>
       <w:r>
         <w:t xml:space="preserve"> desativar o usuário (sem excluir).</w:t>
@@ -5124,6 +5619,452 @@
         <w:t xml:space="preserve">Inventário no GLPI sempre atualizado.</w:t>
       </w:r>
     </w:p>
+    <w:p>
+      <w:pPr>
+        <w:pStyle w:val="Heading2"/>
+      </w:pPr>
+      <w:r>
+        <w:t xml:space="preserve">Perfis de acesso por cargo</w:t>
+      </w:r>
+    </w:p>
+    <w:p>
+      <w:pPr>
+        <w:pBdr>
+          <w:left w:val="single" w:color="999999" w:sz="12" w:space="8"/>
+        </w:pBdr>
+        <w:spacing w:after="160"/>
+        <w:ind w:left="240"/>
+      </w:pPr>
+      <w:r>
+        <w:t xml:space="preserve">Mesma tabela em todos os POPs. As regras completas estão no </w:t>
+      </w:r>
+      <w:r>
+        <w:t xml:space="preserve">POP-01 §3</w:t>
+      </w:r>
+      <w:r>
+        <w:t xml:space="preserve">.</w:t>
+      </w:r>
+    </w:p>
+    <w:tbl>
+      <w:tblPr>
+        <w:tblW w:type="dxa" w:w="9638"/>
+        <w:tblBorders>
+          <w:top w:val="single" w:color="999999" w:sz="4"/>
+          <w:left w:val="single" w:color="999999" w:sz="4"/>
+          <w:bottom w:val="single" w:color="999999" w:sz="4"/>
+          <w:right w:val="single" w:color="999999" w:sz="4"/>
+          <w:insideH w:val="single" w:color="999999" w:sz="4"/>
+          <w:insideV w:val="single" w:color="999999" w:sz="4"/>
+        </w:tblBorders>
+      </w:tblPr>
+      <w:tblGrid>
+        <w:gridCol w:w="1162"/>
+        <w:gridCol w:w="2676"/>
+        <w:gridCol w:w="3186"/>
+        <w:gridCol w:w="2614"/>
+      </w:tblGrid>
+      <w:tr>
+        <w:trPr>
+          <w:tblHeader/>
+        </w:trPr>
+        <w:tc>
+          <w:tcPr>
+            <w:tcW w:type="dxa" w:w="1162"/>
+            <w:shd w:fill="EEEEEE" w:color="auto" w:val="clear"/>
+            <w:tcMar>
+              <w:top w:type="dxa" w:w="60"/>
+              <w:left w:type="dxa" w:w="100"/>
+              <w:bottom w:type="dxa" w:w="60"/>
+              <w:right w:type="dxa" w:w="100"/>
+            </w:tcMar>
+          </w:tcPr>
+          <w:p>
+            <w:r>
+              <w:rPr>
+                <w:b/>
+                <w:bCs/>
+              </w:rPr>
+              <w:t xml:space="preserve">Perfil</w:t>
+            </w:r>
+          </w:p>
+        </w:tc>
+        <w:tc>
+          <w:tcPr>
+            <w:tcW w:type="dxa" w:w="2676"/>
+            <w:shd w:fill="EEEEEE" w:color="auto" w:val="clear"/>
+            <w:tcMar>
+              <w:top w:type="dxa" w:w="60"/>
+              <w:left w:type="dxa" w:w="100"/>
+              <w:bottom w:type="dxa" w:w="60"/>
+              <w:right w:type="dxa" w:w="100"/>
+            </w:tcMar>
+          </w:tcPr>
+          <w:p>
+            <w:r>
+              <w:rPr>
+                <w:b/>
+                <w:bCs/>
+              </w:rPr>
+              <w:t xml:space="preserve">Cargos</w:t>
+            </w:r>
+          </w:p>
+        </w:tc>
+        <w:tc>
+          <w:tcPr>
+            <w:tcW w:type="dxa" w:w="3186"/>
+            <w:shd w:fill="EEEEEE" w:color="auto" w:val="clear"/>
+            <w:tcMar>
+              <w:top w:type="dxa" w:w="60"/>
+              <w:left w:type="dxa" w:w="100"/>
+              <w:bottom w:type="dxa" w:w="60"/>
+              <w:right w:type="dxa" w:w="100"/>
+            </w:tcMar>
+          </w:tcPr>
+          <w:p>
+            <w:r>
+              <w:rPr>
+                <w:b/>
+                <w:bCs/>
+              </w:rPr>
+              <w:t xml:space="preserve">O que a TI entrega</w:t>
+            </w:r>
+          </w:p>
+        </w:tc>
+        <w:tc>
+          <w:tcPr>
+            <w:tcW w:type="dxa" w:w="2614"/>
+            <w:shd w:fill="EEEEEE" w:color="auto" w:val="clear"/>
+            <w:tcMar>
+              <w:top w:type="dxa" w:w="60"/>
+              <w:left w:type="dxa" w:w="100"/>
+              <w:bottom w:type="dxa" w:w="60"/>
+              <w:right w:type="dxa" w:w="100"/>
+            </w:tcMar>
+          </w:tcPr>
+          <w:p>
+            <w:r>
+              <w:rPr>
+                <w:b/>
+                <w:bCs/>
+              </w:rPr>
+              <w:t xml:space="preserve">RH abre o chamado</w:t>
+            </w:r>
+          </w:p>
+        </w:tc>
+      </w:tr>
+      <w:tr>
+        <w:tc>
+          <w:tcPr>
+            <w:tcW w:type="dxa" w:w="1162"/>
+            <w:tcMar>
+              <w:top w:type="dxa" w:w="60"/>
+              <w:left w:type="dxa" w:w="100"/>
+              <w:bottom w:type="dxa" w:w="60"/>
+              <w:right w:type="dxa" w:w="100"/>
+            </w:tcMar>
+          </w:tcPr>
+          <w:p>
+            <w:r>
+              <w:rPr>
+                <w:b/>
+                <w:bCs/>
+              </w:rPr>
+              <w:t xml:space="preserve">A: Sem acesso de TI</w:t>
+            </w:r>
+          </w:p>
+        </w:tc>
+        <w:tc>
+          <w:tcPr>
+            <w:tcW w:type="dxa" w:w="2676"/>
+            <w:tcMar>
+              <w:top w:type="dxa" w:w="60"/>
+              <w:left w:type="dxa" w:w="100"/>
+              <w:bottom w:type="dxa" w:w="60"/>
+              <w:right w:type="dxa" w:w="100"/>
+            </w:tcMar>
+          </w:tcPr>
+          <w:p>
+            <w:r>
+              <w:t xml:space="preserve">Motorista, zelador, auxiliar de limpeza, mecânico, borracheiro</w:t>
+            </w:r>
+          </w:p>
+        </w:tc>
+        <w:tc>
+          <w:tcPr>
+            <w:tcW w:type="dxa" w:w="3186"/>
+            <w:tcMar>
+              <w:top w:type="dxa" w:w="60"/>
+              <w:left w:type="dxa" w:w="100"/>
+              <w:bottom w:type="dxa" w:w="60"/>
+              <w:right w:type="dxa" w:w="100"/>
+            </w:tcMar>
+          </w:tcPr>
+          <w:p>
+            <w:r>
+              <w:t xml:space="preserve">Nada. O chamado serve só para registrar a pessoa</w:t>
+            </w:r>
+          </w:p>
+        </w:tc>
+        <w:tc>
+          <w:tcPr>
+            <w:tcW w:type="dxa" w:w="2614"/>
+            <w:tcMar>
+              <w:top w:type="dxa" w:w="60"/>
+              <w:left w:type="dxa" w:w="100"/>
+              <w:bottom w:type="dxa" w:w="60"/>
+              <w:right w:type="dxa" w:w="100"/>
+            </w:tcMar>
+          </w:tcPr>
+          <w:p>
+            <w:r>
+              <w:t xml:space="preserve">Até o </w:t>
+            </w:r>
+            <w:r>
+              <w:rPr>
+                <w:b/>
+                <w:bCs/>
+              </w:rPr>
+              <w:t xml:space="preserve">dia do início</w:t>
+            </w:r>
+            <w:r>
+              <w:t xml:space="preserve"> (pode começar no mesmo dia)</w:t>
+            </w:r>
+          </w:p>
+        </w:tc>
+      </w:tr>
+      <w:tr>
+        <w:tc>
+          <w:tcPr>
+            <w:tcW w:type="dxa" w:w="1162"/>
+            <w:tcMar>
+              <w:top w:type="dxa" w:w="60"/>
+              <w:left w:type="dxa" w:w="100"/>
+              <w:bottom w:type="dxa" w:w="60"/>
+              <w:right w:type="dxa" w:w="100"/>
+            </w:tcMar>
+          </w:tcPr>
+          <w:p>
+            <w:r>
+              <w:rPr>
+                <w:b/>
+                <w:bCs/>
+              </w:rPr>
+              <w:t xml:space="preserve">B: Oficina</w:t>
+            </w:r>
+          </w:p>
+        </w:tc>
+        <w:tc>
+          <w:tcPr>
+            <w:tcW w:type="dxa" w:w="2676"/>
+            <w:tcMar>
+              <w:top w:type="dxa" w:w="60"/>
+              <w:left w:type="dxa" w:w="100"/>
+              <w:bottom w:type="dxa" w:w="60"/>
+              <w:right w:type="dxa" w:w="100"/>
+            </w:tcMar>
+          </w:tcPr>
+          <w:p>
+            <w:r>
+              <w:t xml:space="preserve">Estoquista, documentação, compras</w:t>
+            </w:r>
+          </w:p>
+        </w:tc>
+        <w:tc>
+          <w:tcPr>
+            <w:tcW w:type="dxa" w:w="3186"/>
+            <w:tcMar>
+              <w:top w:type="dxa" w:w="60"/>
+              <w:left w:type="dxa" w:w="100"/>
+              <w:bottom w:type="dxa" w:w="60"/>
+              <w:right w:type="dxa" w:w="100"/>
+            </w:tcMar>
+          </w:tcPr>
+          <w:p>
+            <w:r>
+              <w:t xml:space="preserve">Celular corporativo, e-mail corporativo, Petroshow, Sigest, Infinitum e Sistema VS</w:t>
+            </w:r>
+          </w:p>
+        </w:tc>
+        <w:tc>
+          <w:tcPr>
+            <w:tcW w:type="dxa" w:w="2614"/>
+            <w:tcMar>
+              <w:top w:type="dxa" w:w="60"/>
+              <w:left w:type="dxa" w:w="100"/>
+              <w:bottom w:type="dxa" w:w="60"/>
+              <w:right w:type="dxa" w:w="100"/>
+            </w:tcMar>
+          </w:tcPr>
+          <w:p>
+            <w:r>
+              <w:rPr>
+                <w:b/>
+                <w:bCs/>
+              </w:rPr>
+              <w:t xml:space="preserve">2 dias úteis antes</w:t>
+            </w:r>
+            <w:r>
+              <w:t xml:space="preserve"> do início</w:t>
+            </w:r>
+          </w:p>
+        </w:tc>
+      </w:tr>
+      <w:tr>
+        <w:tc>
+          <w:tcPr>
+            <w:tcW w:type="dxa" w:w="1162"/>
+            <w:tcMar>
+              <w:top w:type="dxa" w:w="60"/>
+              <w:left w:type="dxa" w:w="100"/>
+              <w:bottom w:type="dxa" w:w="60"/>
+              <w:right w:type="dxa" w:w="100"/>
+            </w:tcMar>
+          </w:tcPr>
+          <w:p>
+            <w:r>
+              <w:rPr>
+                <w:b/>
+                <w:bCs/>
+              </w:rPr>
+              <w:t xml:space="preserve">C: Escritório</w:t>
+            </w:r>
+          </w:p>
+        </w:tc>
+        <w:tc>
+          <w:tcPr>
+            <w:tcW w:type="dxa" w:w="2676"/>
+            <w:tcMar>
+              <w:top w:type="dxa" w:w="60"/>
+              <w:left w:type="dxa" w:w="100"/>
+              <w:bottom w:type="dxa" w:w="60"/>
+              <w:right w:type="dxa" w:w="100"/>
+            </w:tcMar>
+          </w:tcPr>
+          <w:p>
+            <w:r>
+              <w:t xml:space="preserve">Administrativo, financeiro, comercial, RH/DP</w:t>
+            </w:r>
+          </w:p>
+        </w:tc>
+        <w:tc>
+          <w:tcPr>
+            <w:tcW w:type="dxa" w:w="3186"/>
+            <w:tcMar>
+              <w:top w:type="dxa" w:w="60"/>
+              <w:left w:type="dxa" w:w="100"/>
+              <w:bottom w:type="dxa" w:w="60"/>
+              <w:right w:type="dxa" w:w="100"/>
+            </w:tcMar>
+          </w:tcPr>
+          <w:p>
+            <w:r>
+              <w:t xml:space="preserve">Tudo do perfil B, Orion e computador</w:t>
+            </w:r>
+          </w:p>
+        </w:tc>
+        <w:tc>
+          <w:tcPr>
+            <w:tcW w:type="dxa" w:w="2614"/>
+            <w:tcMar>
+              <w:top w:type="dxa" w:w="60"/>
+              <w:left w:type="dxa" w:w="100"/>
+              <w:bottom w:type="dxa" w:w="60"/>
+              <w:right w:type="dxa" w:w="100"/>
+            </w:tcMar>
+          </w:tcPr>
+          <w:p>
+            <w:r>
+              <w:rPr>
+                <w:b/>
+                <w:bCs/>
+              </w:rPr>
+              <w:t xml:space="preserve">3 dias úteis antes</w:t>
+            </w:r>
+            <w:r>
+              <w:t xml:space="preserve"> do início</w:t>
+            </w:r>
+          </w:p>
+        </w:tc>
+      </w:tr>
+      <w:tr>
+        <w:tc>
+          <w:tcPr>
+            <w:tcW w:type="dxa" w:w="1162"/>
+            <w:tcMar>
+              <w:top w:type="dxa" w:w="60"/>
+              <w:left w:type="dxa" w:w="100"/>
+              <w:bottom w:type="dxa" w:w="60"/>
+              <w:right w:type="dxa" w:w="100"/>
+            </w:tcMar>
+          </w:tcPr>
+          <w:p>
+            <w:r>
+              <w:rPr>
+                <w:b/>
+                <w:bCs/>
+              </w:rPr>
+              <w:t xml:space="preserve">D: Gestão</w:t>
+            </w:r>
+          </w:p>
+        </w:tc>
+        <w:tc>
+          <w:tcPr>
+            <w:tcW w:type="dxa" w:w="2676"/>
+            <w:tcMar>
+              <w:top w:type="dxa" w:w="60"/>
+              <w:left w:type="dxa" w:w="100"/>
+              <w:bottom w:type="dxa" w:w="60"/>
+              <w:right w:type="dxa" w:w="100"/>
+            </w:tcMar>
+          </w:tcPr>
+          <w:p>
+            <w:r>
+              <w:t xml:space="preserve">Gerentes e supervisores</w:t>
+            </w:r>
+          </w:p>
+        </w:tc>
+        <w:tc>
+          <w:tcPr>
+            <w:tcW w:type="dxa" w:w="3186"/>
+            <w:tcMar>
+              <w:top w:type="dxa" w:w="60"/>
+              <w:left w:type="dxa" w:w="100"/>
+              <w:bottom w:type="dxa" w:w="60"/>
+              <w:right w:type="dxa" w:w="100"/>
+            </w:tcMar>
+          </w:tcPr>
+          <w:p>
+            <w:r>
+              <w:t xml:space="preserve">Tudo do perfil C</w:t>
+            </w:r>
+          </w:p>
+        </w:tc>
+        <w:tc>
+          <w:tcPr>
+            <w:tcW w:type="dxa" w:w="2614"/>
+            <w:tcMar>
+              <w:top w:type="dxa" w:w="60"/>
+              <w:left w:type="dxa" w:w="100"/>
+              <w:bottom w:type="dxa" w:w="60"/>
+              <w:right w:type="dxa" w:w="100"/>
+            </w:tcMar>
+          </w:tcPr>
+          <w:p>
+            <w:r>
+              <w:rPr>
+                <w:b/>
+                <w:bCs/>
+              </w:rPr>
+              <w:t xml:space="preserve">3 dias úteis antes</w:t>
+            </w:r>
+            <w:r>
+              <w:t xml:space="preserve"> do início</w:t>
+            </w:r>
+          </w:p>
+        </w:tc>
+      </w:tr>
+    </w:tbl>
+    <w:p/>
     <w:p>
       <w:pPr>
         <w:pStyle w:val="Heading2"/>
@@ -7448,9 +8389,9 @@
         </w:tblBorders>
       </w:tblPr>
       <w:tblGrid>
-        <w:gridCol w:w="4291"/>
-        <w:gridCol w:w="2618"/>
-        <w:gridCol w:w="2729"/>
+        <w:gridCol w:w="4573"/>
+        <w:gridCol w:w="2494"/>
+        <w:gridCol w:w="2571"/>
       </w:tblGrid>
       <w:tr>
         <w:trPr>
@@ -7458,7 +8399,7 @@
         </w:trPr>
         <w:tc>
           <w:tcPr>
-            <w:tcW w:type="dxa" w:w="4291"/>
+            <w:tcW w:type="dxa" w:w="4573"/>
             <w:shd w:fill="EEEEEE" w:color="auto" w:val="clear"/>
             <w:tcMar>
               <w:top w:type="dxa" w:w="60"/>
@@ -7479,7 +8420,7 @@
         </w:tc>
         <w:tc>
           <w:tcPr>
-            <w:tcW w:type="dxa" w:w="2618"/>
+            <w:tcW w:type="dxa" w:w="2494"/>
             <w:shd w:fill="EEEEEE" w:color="auto" w:val="clear"/>
             <w:tcMar>
               <w:top w:type="dxa" w:w="60"/>
@@ -7500,7 +8441,7 @@
         </w:tc>
         <w:tc>
           <w:tcPr>
-            <w:tcW w:type="dxa" w:w="2729"/>
+            <w:tcW w:type="dxa" w:w="2571"/>
             <w:shd w:fill="EEEEEE" w:color="auto" w:val="clear"/>
             <w:tcMar>
               <w:top w:type="dxa" w:w="60"/>
@@ -7523,7 +8464,7 @@
       <w:tr>
         <w:tc>
           <w:tcPr>
-            <w:tcW w:type="dxa" w:w="4291"/>
+            <w:tcW w:type="dxa" w:w="4573"/>
             <w:tcMar>
               <w:top w:type="dxa" w:w="60"/>
               <w:left w:type="dxa" w:w="100"/>
@@ -7539,7 +8480,7 @@
         </w:tc>
         <w:tc>
           <w:tcPr>
-            <w:tcW w:type="dxa" w:w="2618"/>
+            <w:tcW w:type="dxa" w:w="2494"/>
             <w:tcMar>
               <w:top w:type="dxa" w:w="60"/>
               <w:left w:type="dxa" w:w="100"/>
@@ -7555,7 +8496,7 @@
         </w:tc>
         <w:tc>
           <w:tcPr>
-            <w:tcW w:type="dxa" w:w="2729"/>
+            <w:tcW w:type="dxa" w:w="2571"/>
             <w:tcMar>
               <w:top w:type="dxa" w:w="60"/>
               <w:left w:type="dxa" w:w="100"/>
@@ -7569,7 +8510,7 @@
       <w:tr>
         <w:tc>
           <w:tcPr>
-            <w:tcW w:type="dxa" w:w="4291"/>
+            <w:tcW w:type="dxa" w:w="4573"/>
             <w:tcMar>
               <w:top w:type="dxa" w:w="60"/>
               <w:left w:type="dxa" w:w="100"/>
@@ -7585,7 +8526,7 @@
         </w:tc>
         <w:tc>
           <w:tcPr>
-            <w:tcW w:type="dxa" w:w="2618"/>
+            <w:tcW w:type="dxa" w:w="2494"/>
             <w:tcMar>
               <w:top w:type="dxa" w:w="60"/>
               <w:left w:type="dxa" w:w="100"/>
@@ -7601,7 +8542,7 @@
         </w:tc>
         <w:tc>
           <w:tcPr>
-            <w:tcW w:type="dxa" w:w="2729"/>
+            <w:tcW w:type="dxa" w:w="2571"/>
             <w:tcMar>
               <w:top w:type="dxa" w:w="60"/>
               <w:left w:type="dxa" w:w="100"/>
@@ -7619,23 +8560,23 @@
       <w:tr>
         <w:tc>
           <w:tcPr>
-            <w:tcW w:type="dxa" w:w="4291"/>
-            <w:tcMar>
-              <w:top w:type="dxa" w:w="60"/>
-              <w:left w:type="dxa" w:w="100"/>
-              <w:bottom w:type="dxa" w:w="60"/>
-              <w:right w:type="dxa" w:w="100"/>
-            </w:tcMar>
-          </w:tcPr>
-          <w:p>
-            <w:r>
-              <w:t xml:space="preserve">ERP</w:t>
-            </w:r>
-          </w:p>
-        </w:tc>
-        <w:tc>
-          <w:tcPr>
-            <w:tcW w:type="dxa" w:w="2618"/>
+            <w:tcW w:type="dxa" w:w="4573"/>
+            <w:tcMar>
+              <w:top w:type="dxa" w:w="60"/>
+              <w:left w:type="dxa" w:w="100"/>
+              <w:bottom w:type="dxa" w:w="60"/>
+              <w:right w:type="dxa" w:w="100"/>
+            </w:tcMar>
+          </w:tcPr>
+          <w:p>
+            <w:r>
+              <w:t xml:space="preserve">Petroshow (ERP)</w:t>
+            </w:r>
+          </w:p>
+        </w:tc>
+        <w:tc>
+          <w:tcPr>
+            <w:tcW w:type="dxa" w:w="2494"/>
             <w:tcMar>
               <w:top w:type="dxa" w:w="60"/>
               <w:left w:type="dxa" w:w="100"/>
@@ -7651,7 +8592,7 @@
         </w:tc>
         <w:tc>
           <w:tcPr>
-            <w:tcW w:type="dxa" w:w="2729"/>
+            <w:tcW w:type="dxa" w:w="2571"/>
             <w:tcMar>
               <w:top w:type="dxa" w:w="60"/>
               <w:left w:type="dxa" w:w="100"/>
@@ -7669,23 +8610,23 @@
       <w:tr>
         <w:tc>
           <w:tcPr>
-            <w:tcW w:type="dxa" w:w="4291"/>
-            <w:tcMar>
-              <w:top w:type="dxa" w:w="60"/>
-              <w:left w:type="dxa" w:w="100"/>
-              <w:bottom w:type="dxa" w:w="60"/>
-              <w:right w:type="dxa" w:w="100"/>
-            </w:tcMar>
-          </w:tcPr>
-          <w:p>
-            <w:r>
-              <w:t xml:space="preserve">Petroshow</w:t>
-            </w:r>
-          </w:p>
-        </w:tc>
-        <w:tc>
-          <w:tcPr>
-            <w:tcW w:type="dxa" w:w="2618"/>
+            <w:tcW w:type="dxa" w:w="4573"/>
+            <w:tcMar>
+              <w:top w:type="dxa" w:w="60"/>
+              <w:left w:type="dxa" w:w="100"/>
+              <w:bottom w:type="dxa" w:w="60"/>
+              <w:right w:type="dxa" w:w="100"/>
+            </w:tcMar>
+          </w:tcPr>
+          <w:p>
+            <w:r>
+              <w:t xml:space="preserve">Sigest</w:t>
+            </w:r>
+          </w:p>
+        </w:tc>
+        <w:tc>
+          <w:tcPr>
+            <w:tcW w:type="dxa" w:w="2494"/>
             <w:tcMar>
               <w:top w:type="dxa" w:w="60"/>
               <w:left w:type="dxa" w:w="100"/>
@@ -7701,7 +8642,7 @@
         </w:tc>
         <w:tc>
           <w:tcPr>
-            <w:tcW w:type="dxa" w:w="2729"/>
+            <w:tcW w:type="dxa" w:w="2571"/>
             <w:tcMar>
               <w:top w:type="dxa" w:w="60"/>
               <w:left w:type="dxa" w:w="100"/>
@@ -7719,23 +8660,23 @@
       <w:tr>
         <w:tc>
           <w:tcPr>
-            <w:tcW w:type="dxa" w:w="4291"/>
-            <w:tcMar>
-              <w:top w:type="dxa" w:w="60"/>
-              <w:left w:type="dxa" w:w="100"/>
-              <w:bottom w:type="dxa" w:w="60"/>
-              <w:right w:type="dxa" w:w="100"/>
-            </w:tcMar>
-          </w:tcPr>
-          <w:p>
-            <w:r>
-              <w:t xml:space="preserve">Sigest</w:t>
-            </w:r>
-          </w:p>
-        </w:tc>
-        <w:tc>
-          <w:tcPr>
-            <w:tcW w:type="dxa" w:w="2618"/>
+            <w:tcW w:type="dxa" w:w="4573"/>
+            <w:tcMar>
+              <w:top w:type="dxa" w:w="60"/>
+              <w:left w:type="dxa" w:w="100"/>
+              <w:bottom w:type="dxa" w:w="60"/>
+              <w:right w:type="dxa" w:w="100"/>
+            </w:tcMar>
+          </w:tcPr>
+          <w:p>
+            <w:r>
+              <w:t xml:space="preserve">Orion</w:t>
+            </w:r>
+          </w:p>
+        </w:tc>
+        <w:tc>
+          <w:tcPr>
+            <w:tcW w:type="dxa" w:w="2494"/>
             <w:tcMar>
               <w:top w:type="dxa" w:w="60"/>
               <w:left w:type="dxa" w:w="100"/>
@@ -7751,7 +8692,7 @@
         </w:tc>
         <w:tc>
           <w:tcPr>
-            <w:tcW w:type="dxa" w:w="2729"/>
+            <w:tcW w:type="dxa" w:w="2571"/>
             <w:tcMar>
               <w:top w:type="dxa" w:w="60"/>
               <w:left w:type="dxa" w:w="100"/>
@@ -7769,23 +8710,23 @@
       <w:tr>
         <w:tc>
           <w:tcPr>
-            <w:tcW w:type="dxa" w:w="4291"/>
-            <w:tcMar>
-              <w:top w:type="dxa" w:w="60"/>
-              <w:left w:type="dxa" w:w="100"/>
-              <w:bottom w:type="dxa" w:w="60"/>
-              <w:right w:type="dxa" w:w="100"/>
-            </w:tcMar>
-          </w:tcPr>
-          <w:p>
-            <w:r>
-              <w:t xml:space="preserve">Orion</w:t>
-            </w:r>
-          </w:p>
-        </w:tc>
-        <w:tc>
-          <w:tcPr>
-            <w:tcW w:type="dxa" w:w="2618"/>
+            <w:tcW w:type="dxa" w:w="4573"/>
+            <w:tcMar>
+              <w:top w:type="dxa" w:w="60"/>
+              <w:left w:type="dxa" w:w="100"/>
+              <w:bottom w:type="dxa" w:w="60"/>
+              <w:right w:type="dxa" w:w="100"/>
+            </w:tcMar>
+          </w:tcPr>
+          <w:p>
+            <w:r>
+              <w:t xml:space="preserve">Infinitum</w:t>
+            </w:r>
+          </w:p>
+        </w:tc>
+        <w:tc>
+          <w:tcPr>
+            <w:tcW w:type="dxa" w:w="2494"/>
             <w:tcMar>
               <w:top w:type="dxa" w:w="60"/>
               <w:left w:type="dxa" w:w="100"/>
@@ -7801,7 +8742,7 @@
         </w:tc>
         <w:tc>
           <w:tcPr>
-            <w:tcW w:type="dxa" w:w="2729"/>
+            <w:tcW w:type="dxa" w:w="2571"/>
             <w:tcMar>
               <w:top w:type="dxa" w:w="60"/>
               <w:left w:type="dxa" w:w="100"/>
@@ -7819,23 +8760,23 @@
       <w:tr>
         <w:tc>
           <w:tcPr>
-            <w:tcW w:type="dxa" w:w="4291"/>
-            <w:tcMar>
-              <w:top w:type="dxa" w:w="60"/>
-              <w:left w:type="dxa" w:w="100"/>
-              <w:bottom w:type="dxa" w:w="60"/>
-              <w:right w:type="dxa" w:w="100"/>
-            </w:tcMar>
-          </w:tcPr>
-          <w:p>
-            <w:r>
-              <w:t xml:space="preserve">Infinitum</w:t>
-            </w:r>
-          </w:p>
-        </w:tc>
-        <w:tc>
-          <w:tcPr>
-            <w:tcW w:type="dxa" w:w="2618"/>
+            <w:tcW w:type="dxa" w:w="4573"/>
+            <w:tcMar>
+              <w:top w:type="dxa" w:w="60"/>
+              <w:left w:type="dxa" w:w="100"/>
+              <w:bottom w:type="dxa" w:w="60"/>
+              <w:right w:type="dxa" w:w="100"/>
+            </w:tcMar>
+          </w:tcPr>
+          <w:p>
+            <w:r>
+              <w:t xml:space="preserve">Computador</w:t>
+            </w:r>
+          </w:p>
+        </w:tc>
+        <w:tc>
+          <w:tcPr>
+            <w:tcW w:type="dxa" w:w="2494"/>
             <w:tcMar>
               <w:top w:type="dxa" w:w="60"/>
               <w:left w:type="dxa" w:w="100"/>
@@ -7851,41 +8792,37 @@
         </w:tc>
         <w:tc>
           <w:tcPr>
-            <w:tcW w:type="dxa" w:w="2729"/>
-            <w:tcMar>
-              <w:top w:type="dxa" w:w="60"/>
-              <w:left w:type="dxa" w:w="100"/>
-              <w:bottom w:type="dxa" w:w="60"/>
-              <w:right w:type="dxa" w:w="100"/>
-            </w:tcMar>
-          </w:tcPr>
-          <w:p>
-            <w:r>
-              <w:t xml:space="preserve">perfil:</w:t>
-            </w:r>
-          </w:p>
+            <w:tcW w:type="dxa" w:w="2571"/>
+            <w:tcMar>
+              <w:top w:type="dxa" w:w="60"/>
+              <w:left w:type="dxa" w:w="100"/>
+              <w:bottom w:type="dxa" w:w="60"/>
+              <w:right w:type="dxa" w:w="100"/>
+            </w:tcMar>
+          </w:tcPr>
+          <w:p/>
         </w:tc>
       </w:tr>
       <w:tr>
         <w:tc>
           <w:tcPr>
-            <w:tcW w:type="dxa" w:w="4291"/>
-            <w:tcMar>
-              <w:top w:type="dxa" w:w="60"/>
-              <w:left w:type="dxa" w:w="100"/>
-              <w:bottom w:type="dxa" w:w="60"/>
-              <w:right w:type="dxa" w:w="100"/>
-            </w:tcMar>
-          </w:tcPr>
-          <w:p>
-            <w:r>
-              <w:t xml:space="preserve">Computador</w:t>
-            </w:r>
-          </w:p>
-        </w:tc>
-        <w:tc>
-          <w:tcPr>
-            <w:tcW w:type="dxa" w:w="2618"/>
+            <w:tcW w:type="dxa" w:w="4573"/>
+            <w:tcMar>
+              <w:top w:type="dxa" w:w="60"/>
+              <w:left w:type="dxa" w:w="100"/>
+              <w:bottom w:type="dxa" w:w="60"/>
+              <w:right w:type="dxa" w:w="100"/>
+            </w:tcMar>
+          </w:tcPr>
+          <w:p>
+            <w:r>
+              <w:t xml:space="preserve">Celular corporativo</w:t>
+            </w:r>
+          </w:p>
+        </w:tc>
+        <w:tc>
+          <w:tcPr>
+            <w:tcW w:type="dxa" w:w="2494"/>
             <w:tcMar>
               <w:top w:type="dxa" w:w="60"/>
               <w:left w:type="dxa" w:w="100"/>
@@ -7901,7 +8838,7 @@
         </w:tc>
         <w:tc>
           <w:tcPr>
-            <w:tcW w:type="dxa" w:w="2729"/>
+            <w:tcW w:type="dxa" w:w="2571"/>
             <w:tcMar>
               <w:top w:type="dxa" w:w="60"/>
               <w:left w:type="dxa" w:w="100"/>
@@ -7915,23 +8852,23 @@
       <w:tr>
         <w:tc>
           <w:tcPr>
-            <w:tcW w:type="dxa" w:w="4291"/>
-            <w:tcMar>
-              <w:top w:type="dxa" w:w="60"/>
-              <w:left w:type="dxa" w:w="100"/>
-              <w:bottom w:type="dxa" w:w="60"/>
-              <w:right w:type="dxa" w:w="100"/>
-            </w:tcMar>
-          </w:tcPr>
-          <w:p>
-            <w:r>
-              <w:t xml:space="preserve">Celular corporativo</w:t>
-            </w:r>
-          </w:p>
-        </w:tc>
-        <w:tc>
-          <w:tcPr>
-            <w:tcW w:type="dxa" w:w="2618"/>
+            <w:tcW w:type="dxa" w:w="4573"/>
+            <w:tcMar>
+              <w:top w:type="dxa" w:w="60"/>
+              <w:left w:type="dxa" w:w="100"/>
+              <w:bottom w:type="dxa" w:w="60"/>
+              <w:right w:type="dxa" w:w="100"/>
+            </w:tcMar>
+          </w:tcPr>
+          <w:p>
+            <w:r>
+              <w:t xml:space="preserve">WhatsApp corporativo</w:t>
+            </w:r>
+          </w:p>
+        </w:tc>
+        <w:tc>
+          <w:tcPr>
+            <w:tcW w:type="dxa" w:w="2494"/>
             <w:tcMar>
               <w:top w:type="dxa" w:w="60"/>
               <w:left w:type="dxa" w:w="100"/>
@@ -7947,37 +8884,41 @@
         </w:tc>
         <w:tc>
           <w:tcPr>
-            <w:tcW w:type="dxa" w:w="2729"/>
-            <w:tcMar>
-              <w:top w:type="dxa" w:w="60"/>
-              <w:left w:type="dxa" w:w="100"/>
-              <w:bottom w:type="dxa" w:w="60"/>
-              <w:right w:type="dxa" w:w="100"/>
-            </w:tcMar>
-          </w:tcPr>
-          <w:p/>
+            <w:tcW w:type="dxa" w:w="2571"/>
+            <w:tcMar>
+              <w:top w:type="dxa" w:w="60"/>
+              <w:left w:type="dxa" w:w="100"/>
+              <w:bottom w:type="dxa" w:w="60"/>
+              <w:right w:type="dxa" w:w="100"/>
+            </w:tcMar>
+          </w:tcPr>
+          <w:p>
+            <w:r>
+              <w:t xml:space="preserve">grupos:</w:t>
+            </w:r>
+          </w:p>
         </w:tc>
       </w:tr>
       <w:tr>
         <w:tc>
           <w:tcPr>
-            <w:tcW w:type="dxa" w:w="4291"/>
-            <w:tcMar>
-              <w:top w:type="dxa" w:w="60"/>
-              <w:left w:type="dxa" w:w="100"/>
-              <w:bottom w:type="dxa" w:w="60"/>
-              <w:right w:type="dxa" w:w="100"/>
-            </w:tcMar>
-          </w:tcPr>
-          <w:p>
-            <w:r>
-              <w:t xml:space="preserve">WhatsApp corporativo</w:t>
-            </w:r>
-          </w:p>
-        </w:tc>
-        <w:tc>
-          <w:tcPr>
-            <w:tcW w:type="dxa" w:w="2618"/>
+            <w:tcW w:type="dxa" w:w="4573"/>
+            <w:tcMar>
+              <w:top w:type="dxa" w:w="60"/>
+              <w:left w:type="dxa" w:w="100"/>
+              <w:bottom w:type="dxa" w:w="60"/>
+              <w:right w:type="dxa" w:w="100"/>
+            </w:tcMar>
+          </w:tcPr>
+          <w:p>
+            <w:r>
+              <w:t xml:space="preserve">Outro</w:t>
+            </w:r>
+          </w:p>
+        </w:tc>
+        <w:tc>
+          <w:tcPr>
+            <w:tcW w:type="dxa" w:w="2494"/>
             <w:tcMar>
               <w:top w:type="dxa" w:w="60"/>
               <w:left w:type="dxa" w:w="100"/>
@@ -7993,57 +8934,7 @@
         </w:tc>
         <w:tc>
           <w:tcPr>
-            <w:tcW w:type="dxa" w:w="2729"/>
-            <w:tcMar>
-              <w:top w:type="dxa" w:w="60"/>
-              <w:left w:type="dxa" w:w="100"/>
-              <w:bottom w:type="dxa" w:w="60"/>
-              <w:right w:type="dxa" w:w="100"/>
-            </w:tcMar>
-          </w:tcPr>
-          <w:p>
-            <w:r>
-              <w:t xml:space="preserve">grupos:</w:t>
-            </w:r>
-          </w:p>
-        </w:tc>
-      </w:tr>
-      <w:tr>
-        <w:tc>
-          <w:tcPr>
-            <w:tcW w:type="dxa" w:w="4291"/>
-            <w:tcMar>
-              <w:top w:type="dxa" w:w="60"/>
-              <w:left w:type="dxa" w:w="100"/>
-              <w:bottom w:type="dxa" w:w="60"/>
-              <w:right w:type="dxa" w:w="100"/>
-            </w:tcMar>
-          </w:tcPr>
-          <w:p>
-            <w:r>
-              <w:t xml:space="preserve">Outro</w:t>
-            </w:r>
-          </w:p>
-        </w:tc>
-        <w:tc>
-          <w:tcPr>
-            <w:tcW w:type="dxa" w:w="2618"/>
-            <w:tcMar>
-              <w:top w:type="dxa" w:w="60"/>
-              <w:left w:type="dxa" w:w="100"/>
-              <w:bottom w:type="dxa" w:w="60"/>
-              <w:right w:type="dxa" w:w="100"/>
-            </w:tcMar>
-          </w:tcPr>
-          <w:p>
-            <w:r>
-              <w:t xml:space="preserve">☐</w:t>
-            </w:r>
-          </w:p>
-        </w:tc>
-        <w:tc>
-          <w:tcPr>
-            <w:tcW w:type="dxa" w:w="2729"/>
+            <w:tcW w:type="dxa" w:w="2571"/>
             <w:tcMar>
               <w:top w:type="dxa" w:w="60"/>
               <w:left w:type="dxa" w:w="100"/>
@@ -8133,11 +9024,11 @@
         </w:tblBorders>
       </w:tblPr>
       <w:tblGrid>
-        <w:gridCol w:w="3137"/>
-        <w:gridCol w:w="1625"/>
-        <w:gridCol w:w="1625"/>
-        <w:gridCol w:w="1625"/>
-        <w:gridCol w:w="1626"/>
+        <w:gridCol w:w="3370"/>
+        <w:gridCol w:w="1566"/>
+        <w:gridCol w:w="1566"/>
+        <w:gridCol w:w="1566"/>
+        <w:gridCol w:w="1570"/>
       </w:tblGrid>
       <w:tr>
         <w:trPr>
@@ -8145,7 +9036,7 @@
         </w:trPr>
         <w:tc>
           <w:tcPr>
-            <w:tcW w:type="dxa" w:w="3137"/>
+            <w:tcW w:type="dxa" w:w="3370"/>
             <w:shd w:fill="EEEEEE" w:color="auto" w:val="clear"/>
             <w:tcMar>
               <w:top w:type="dxa" w:w="60"/>
@@ -8166,7 +9057,7 @@
         </w:tc>
         <w:tc>
           <w:tcPr>
-            <w:tcW w:type="dxa" w:w="1625"/>
+            <w:tcW w:type="dxa" w:w="1566"/>
             <w:shd w:fill="EEEEEE" w:color="auto" w:val="clear"/>
             <w:tcMar>
               <w:top w:type="dxa" w:w="60"/>
@@ -8187,7 +9078,7 @@
         </w:tc>
         <w:tc>
           <w:tcPr>
-            <w:tcW w:type="dxa" w:w="1625"/>
+            <w:tcW w:type="dxa" w:w="1566"/>
             <w:shd w:fill="EEEEEE" w:color="auto" w:val="clear"/>
             <w:tcMar>
               <w:top w:type="dxa" w:w="60"/>
@@ -8208,7 +9099,7 @@
         </w:tc>
         <w:tc>
           <w:tcPr>
-            <w:tcW w:type="dxa" w:w="1625"/>
+            <w:tcW w:type="dxa" w:w="1566"/>
             <w:shd w:fill="EEEEEE" w:color="auto" w:val="clear"/>
             <w:tcMar>
               <w:top w:type="dxa" w:w="60"/>
@@ -8229,7 +9120,7 @@
         </w:tc>
         <w:tc>
           <w:tcPr>
-            <w:tcW w:type="dxa" w:w="1626"/>
+            <w:tcW w:type="dxa" w:w="1570"/>
             <w:shd w:fill="EEEEEE" w:color="auto" w:val="clear"/>
             <w:tcMar>
               <w:top w:type="dxa" w:w="60"/>
@@ -8252,7 +9143,7 @@
       <w:tr>
         <w:tc>
           <w:tcPr>
-            <w:tcW w:type="dxa" w:w="3137"/>
+            <w:tcW w:type="dxa" w:w="3370"/>
             <w:tcMar>
               <w:top w:type="dxa" w:w="60"/>
               <w:left w:type="dxa" w:w="100"/>
@@ -8268,7 +9159,7 @@
         </w:tc>
         <w:tc>
           <w:tcPr>
-            <w:tcW w:type="dxa" w:w="1625"/>
+            <w:tcW w:type="dxa" w:w="1566"/>
             <w:tcMar>
               <w:top w:type="dxa" w:w="60"/>
               <w:left w:type="dxa" w:w="100"/>
@@ -8280,7 +9171,7 @@
         </w:tc>
         <w:tc>
           <w:tcPr>
-            <w:tcW w:type="dxa" w:w="1625"/>
+            <w:tcW w:type="dxa" w:w="1566"/>
             <w:tcMar>
               <w:top w:type="dxa" w:w="60"/>
               <w:left w:type="dxa" w:w="100"/>
@@ -8292,7 +9183,7 @@
         </w:tc>
         <w:tc>
           <w:tcPr>
-            <w:tcW w:type="dxa" w:w="1625"/>
+            <w:tcW w:type="dxa" w:w="1566"/>
             <w:tcMar>
               <w:top w:type="dxa" w:w="60"/>
               <w:left w:type="dxa" w:w="100"/>
@@ -8304,7 +9195,7 @@
         </w:tc>
         <w:tc>
           <w:tcPr>
-            <w:tcW w:type="dxa" w:w="1626"/>
+            <w:tcW w:type="dxa" w:w="1570"/>
             <w:tcMar>
               <w:top w:type="dxa" w:w="60"/>
               <w:left w:type="dxa" w:w="100"/>
@@ -8318,7 +9209,7 @@
       <w:tr>
         <w:tc>
           <w:tcPr>
-            <w:tcW w:type="dxa" w:w="3137"/>
+            <w:tcW w:type="dxa" w:w="3370"/>
             <w:tcMar>
               <w:top w:type="dxa" w:w="60"/>
               <w:left w:type="dxa" w:w="100"/>
@@ -8334,7 +9225,7 @@
         </w:tc>
         <w:tc>
           <w:tcPr>
-            <w:tcW w:type="dxa" w:w="1625"/>
+            <w:tcW w:type="dxa" w:w="1566"/>
             <w:tcMar>
               <w:top w:type="dxa" w:w="60"/>
               <w:left w:type="dxa" w:w="100"/>
@@ -8346,7 +9237,7 @@
         </w:tc>
         <w:tc>
           <w:tcPr>
-            <w:tcW w:type="dxa" w:w="1625"/>
+            <w:tcW w:type="dxa" w:w="1566"/>
             <w:tcMar>
               <w:top w:type="dxa" w:w="60"/>
               <w:left w:type="dxa" w:w="100"/>
@@ -8358,7 +9249,7 @@
         </w:tc>
         <w:tc>
           <w:tcPr>
-            <w:tcW w:type="dxa" w:w="1625"/>
+            <w:tcW w:type="dxa" w:w="1566"/>
             <w:tcMar>
               <w:top w:type="dxa" w:w="60"/>
               <w:left w:type="dxa" w:w="100"/>
@@ -8370,7 +9261,7 @@
         </w:tc>
         <w:tc>
           <w:tcPr>
-            <w:tcW w:type="dxa" w:w="1626"/>
+            <w:tcW w:type="dxa" w:w="1570"/>
             <w:tcMar>
               <w:top w:type="dxa" w:w="60"/>
               <w:left w:type="dxa" w:w="100"/>
@@ -8384,23 +9275,23 @@
       <w:tr>
         <w:tc>
           <w:tcPr>
-            <w:tcW w:type="dxa" w:w="3137"/>
-            <w:tcMar>
-              <w:top w:type="dxa" w:w="60"/>
-              <w:left w:type="dxa" w:w="100"/>
-              <w:bottom w:type="dxa" w:w="60"/>
-              <w:right w:type="dxa" w:w="100"/>
-            </w:tcMar>
-          </w:tcPr>
-          <w:p>
-            <w:r>
-              <w:t xml:space="preserve">ERP</w:t>
-            </w:r>
-          </w:p>
-        </w:tc>
-        <w:tc>
-          <w:tcPr>
-            <w:tcW w:type="dxa" w:w="1625"/>
+            <w:tcW w:type="dxa" w:w="3370"/>
+            <w:tcMar>
+              <w:top w:type="dxa" w:w="60"/>
+              <w:left w:type="dxa" w:w="100"/>
+              <w:bottom w:type="dxa" w:w="60"/>
+              <w:right w:type="dxa" w:w="100"/>
+            </w:tcMar>
+          </w:tcPr>
+          <w:p>
+            <w:r>
+              <w:t xml:space="preserve">Petroshow (ERP)</w:t>
+            </w:r>
+          </w:p>
+        </w:tc>
+        <w:tc>
+          <w:tcPr>
+            <w:tcW w:type="dxa" w:w="1566"/>
             <w:tcMar>
               <w:top w:type="dxa" w:w="60"/>
               <w:left w:type="dxa" w:w="100"/>
@@ -8412,7 +9303,7 @@
         </w:tc>
         <w:tc>
           <w:tcPr>
-            <w:tcW w:type="dxa" w:w="1625"/>
+            <w:tcW w:type="dxa" w:w="1566"/>
             <w:tcMar>
               <w:top w:type="dxa" w:w="60"/>
               <w:left w:type="dxa" w:w="100"/>
@@ -8424,7 +9315,7 @@
         </w:tc>
         <w:tc>
           <w:tcPr>
-            <w:tcW w:type="dxa" w:w="1625"/>
+            <w:tcW w:type="dxa" w:w="1566"/>
             <w:tcMar>
               <w:top w:type="dxa" w:w="60"/>
               <w:left w:type="dxa" w:w="100"/>
@@ -8436,7 +9327,7 @@
         </w:tc>
         <w:tc>
           <w:tcPr>
-            <w:tcW w:type="dxa" w:w="1626"/>
+            <w:tcW w:type="dxa" w:w="1570"/>
             <w:tcMar>
               <w:top w:type="dxa" w:w="60"/>
               <w:left w:type="dxa" w:w="100"/>
@@ -8450,23 +9341,23 @@
       <w:tr>
         <w:tc>
           <w:tcPr>
-            <w:tcW w:type="dxa" w:w="3137"/>
-            <w:tcMar>
-              <w:top w:type="dxa" w:w="60"/>
-              <w:left w:type="dxa" w:w="100"/>
-              <w:bottom w:type="dxa" w:w="60"/>
-              <w:right w:type="dxa" w:w="100"/>
-            </w:tcMar>
-          </w:tcPr>
-          <w:p>
-            <w:r>
-              <w:t xml:space="preserve">Petroshow</w:t>
-            </w:r>
-          </w:p>
-        </w:tc>
-        <w:tc>
-          <w:tcPr>
-            <w:tcW w:type="dxa" w:w="1625"/>
+            <w:tcW w:type="dxa" w:w="3370"/>
+            <w:tcMar>
+              <w:top w:type="dxa" w:w="60"/>
+              <w:left w:type="dxa" w:w="100"/>
+              <w:bottom w:type="dxa" w:w="60"/>
+              <w:right w:type="dxa" w:w="100"/>
+            </w:tcMar>
+          </w:tcPr>
+          <w:p>
+            <w:r>
+              <w:t xml:space="preserve">Sigest</w:t>
+            </w:r>
+          </w:p>
+        </w:tc>
+        <w:tc>
+          <w:tcPr>
+            <w:tcW w:type="dxa" w:w="1566"/>
             <w:tcMar>
               <w:top w:type="dxa" w:w="60"/>
               <w:left w:type="dxa" w:w="100"/>
@@ -8478,7 +9369,7 @@
         </w:tc>
         <w:tc>
           <w:tcPr>
-            <w:tcW w:type="dxa" w:w="1625"/>
+            <w:tcW w:type="dxa" w:w="1566"/>
             <w:tcMar>
               <w:top w:type="dxa" w:w="60"/>
               <w:left w:type="dxa" w:w="100"/>
@@ -8490,7 +9381,7 @@
         </w:tc>
         <w:tc>
           <w:tcPr>
-            <w:tcW w:type="dxa" w:w="1625"/>
+            <w:tcW w:type="dxa" w:w="1566"/>
             <w:tcMar>
               <w:top w:type="dxa" w:w="60"/>
               <w:left w:type="dxa" w:w="100"/>
@@ -8502,7 +9393,7 @@
         </w:tc>
         <w:tc>
           <w:tcPr>
-            <w:tcW w:type="dxa" w:w="1626"/>
+            <w:tcW w:type="dxa" w:w="1570"/>
             <w:tcMar>
               <w:top w:type="dxa" w:w="60"/>
               <w:left w:type="dxa" w:w="100"/>
@@ -8516,23 +9407,23 @@
       <w:tr>
         <w:tc>
           <w:tcPr>
-            <w:tcW w:type="dxa" w:w="3137"/>
-            <w:tcMar>
-              <w:top w:type="dxa" w:w="60"/>
-              <w:left w:type="dxa" w:w="100"/>
-              <w:bottom w:type="dxa" w:w="60"/>
-              <w:right w:type="dxa" w:w="100"/>
-            </w:tcMar>
-          </w:tcPr>
-          <w:p>
-            <w:r>
-              <w:t xml:space="preserve">Sigest</w:t>
-            </w:r>
-          </w:p>
-        </w:tc>
-        <w:tc>
-          <w:tcPr>
-            <w:tcW w:type="dxa" w:w="1625"/>
+            <w:tcW w:type="dxa" w:w="3370"/>
+            <w:tcMar>
+              <w:top w:type="dxa" w:w="60"/>
+              <w:left w:type="dxa" w:w="100"/>
+              <w:bottom w:type="dxa" w:w="60"/>
+              <w:right w:type="dxa" w:w="100"/>
+            </w:tcMar>
+          </w:tcPr>
+          <w:p>
+            <w:r>
+              <w:t xml:space="preserve">Orion</w:t>
+            </w:r>
+          </w:p>
+        </w:tc>
+        <w:tc>
+          <w:tcPr>
+            <w:tcW w:type="dxa" w:w="1566"/>
             <w:tcMar>
               <w:top w:type="dxa" w:w="60"/>
               <w:left w:type="dxa" w:w="100"/>
@@ -8544,7 +9435,7 @@
         </w:tc>
         <w:tc>
           <w:tcPr>
-            <w:tcW w:type="dxa" w:w="1625"/>
+            <w:tcW w:type="dxa" w:w="1566"/>
             <w:tcMar>
               <w:top w:type="dxa" w:w="60"/>
               <w:left w:type="dxa" w:w="100"/>
@@ -8556,7 +9447,7 @@
         </w:tc>
         <w:tc>
           <w:tcPr>
-            <w:tcW w:type="dxa" w:w="1625"/>
+            <w:tcW w:type="dxa" w:w="1566"/>
             <w:tcMar>
               <w:top w:type="dxa" w:w="60"/>
               <w:left w:type="dxa" w:w="100"/>
@@ -8568,7 +9459,7 @@
         </w:tc>
         <w:tc>
           <w:tcPr>
-            <w:tcW w:type="dxa" w:w="1626"/>
+            <w:tcW w:type="dxa" w:w="1570"/>
             <w:tcMar>
               <w:top w:type="dxa" w:w="60"/>
               <w:left w:type="dxa" w:w="100"/>
@@ -8582,23 +9473,23 @@
       <w:tr>
         <w:tc>
           <w:tcPr>
-            <w:tcW w:type="dxa" w:w="3137"/>
-            <w:tcMar>
-              <w:top w:type="dxa" w:w="60"/>
-              <w:left w:type="dxa" w:w="100"/>
-              <w:bottom w:type="dxa" w:w="60"/>
-              <w:right w:type="dxa" w:w="100"/>
-            </w:tcMar>
-          </w:tcPr>
-          <w:p>
-            <w:r>
-              <w:t xml:space="preserve">Orion</w:t>
-            </w:r>
-          </w:p>
-        </w:tc>
-        <w:tc>
-          <w:tcPr>
-            <w:tcW w:type="dxa" w:w="1625"/>
+            <w:tcW w:type="dxa" w:w="3370"/>
+            <w:tcMar>
+              <w:top w:type="dxa" w:w="60"/>
+              <w:left w:type="dxa" w:w="100"/>
+              <w:bottom w:type="dxa" w:w="60"/>
+              <w:right w:type="dxa" w:w="100"/>
+            </w:tcMar>
+          </w:tcPr>
+          <w:p>
+            <w:r>
+              <w:t xml:space="preserve">Infinitum</w:t>
+            </w:r>
+          </w:p>
+        </w:tc>
+        <w:tc>
+          <w:tcPr>
+            <w:tcW w:type="dxa" w:w="1566"/>
             <w:tcMar>
               <w:top w:type="dxa" w:w="60"/>
               <w:left w:type="dxa" w:w="100"/>
@@ -8610,7 +9501,7 @@
         </w:tc>
         <w:tc>
           <w:tcPr>
-            <w:tcW w:type="dxa" w:w="1625"/>
+            <w:tcW w:type="dxa" w:w="1566"/>
             <w:tcMar>
               <w:top w:type="dxa" w:w="60"/>
               <w:left w:type="dxa" w:w="100"/>
@@ -8622,7 +9513,7 @@
         </w:tc>
         <w:tc>
           <w:tcPr>
-            <w:tcW w:type="dxa" w:w="1625"/>
+            <w:tcW w:type="dxa" w:w="1566"/>
             <w:tcMar>
               <w:top w:type="dxa" w:w="60"/>
               <w:left w:type="dxa" w:w="100"/>
@@ -8634,7 +9525,7 @@
         </w:tc>
         <w:tc>
           <w:tcPr>
-            <w:tcW w:type="dxa" w:w="1626"/>
+            <w:tcW w:type="dxa" w:w="1570"/>
             <w:tcMar>
               <w:top w:type="dxa" w:w="60"/>
               <w:left w:type="dxa" w:w="100"/>
@@ -8648,23 +9539,23 @@
       <w:tr>
         <w:tc>
           <w:tcPr>
-            <w:tcW w:type="dxa" w:w="3137"/>
-            <w:tcMar>
-              <w:top w:type="dxa" w:w="60"/>
-              <w:left w:type="dxa" w:w="100"/>
-              <w:bottom w:type="dxa" w:w="60"/>
-              <w:right w:type="dxa" w:w="100"/>
-            </w:tcMar>
-          </w:tcPr>
-          <w:p>
-            <w:r>
-              <w:t xml:space="preserve">Infinitum</w:t>
-            </w:r>
-          </w:p>
-        </w:tc>
-        <w:tc>
-          <w:tcPr>
-            <w:tcW w:type="dxa" w:w="1625"/>
+            <w:tcW w:type="dxa" w:w="3370"/>
+            <w:tcMar>
+              <w:top w:type="dxa" w:w="60"/>
+              <w:left w:type="dxa" w:w="100"/>
+              <w:bottom w:type="dxa" w:w="60"/>
+              <w:right w:type="dxa" w:w="100"/>
+            </w:tcMar>
+          </w:tcPr>
+          <w:p>
+            <w:r>
+              <w:t xml:space="preserve">WhatsApp corporativo</w:t>
+            </w:r>
+          </w:p>
+        </w:tc>
+        <w:tc>
+          <w:tcPr>
+            <w:tcW w:type="dxa" w:w="1566"/>
             <w:tcMar>
               <w:top w:type="dxa" w:w="60"/>
               <w:left w:type="dxa" w:w="100"/>
@@ -8676,7 +9567,7 @@
         </w:tc>
         <w:tc>
           <w:tcPr>
-            <w:tcW w:type="dxa" w:w="1625"/>
+            <w:tcW w:type="dxa" w:w="1566"/>
             <w:tcMar>
               <w:top w:type="dxa" w:w="60"/>
               <w:left w:type="dxa" w:w="100"/>
@@ -8688,7 +9579,7 @@
         </w:tc>
         <w:tc>
           <w:tcPr>
-            <w:tcW w:type="dxa" w:w="1625"/>
+            <w:tcW w:type="dxa" w:w="1566"/>
             <w:tcMar>
               <w:top w:type="dxa" w:w="60"/>
               <w:left w:type="dxa" w:w="100"/>
@@ -8700,7 +9591,7 @@
         </w:tc>
         <w:tc>
           <w:tcPr>
-            <w:tcW w:type="dxa" w:w="1626"/>
+            <w:tcW w:type="dxa" w:w="1570"/>
             <w:tcMar>
               <w:top w:type="dxa" w:w="60"/>
               <w:left w:type="dxa" w:w="100"/>
@@ -8714,23 +9605,23 @@
       <w:tr>
         <w:tc>
           <w:tcPr>
-            <w:tcW w:type="dxa" w:w="3137"/>
-            <w:tcMar>
-              <w:top w:type="dxa" w:w="60"/>
-              <w:left w:type="dxa" w:w="100"/>
-              <w:bottom w:type="dxa" w:w="60"/>
-              <w:right w:type="dxa" w:w="100"/>
-            </w:tcMar>
-          </w:tcPr>
-          <w:p>
-            <w:r>
-              <w:t xml:space="preserve">WhatsApp corporativo</w:t>
-            </w:r>
-          </w:p>
-        </w:tc>
-        <w:tc>
-          <w:tcPr>
-            <w:tcW w:type="dxa" w:w="1625"/>
+            <w:tcW w:type="dxa" w:w="3370"/>
+            <w:tcMar>
+              <w:top w:type="dxa" w:w="60"/>
+              <w:left w:type="dxa" w:w="100"/>
+              <w:bottom w:type="dxa" w:w="60"/>
+              <w:right w:type="dxa" w:w="100"/>
+            </w:tcMar>
+          </w:tcPr>
+          <w:p>
+            <w:r>
+              <w:t xml:space="preserve">Acesso remoto / VPN</w:t>
+            </w:r>
+          </w:p>
+        </w:tc>
+        <w:tc>
+          <w:tcPr>
+            <w:tcW w:type="dxa" w:w="1566"/>
             <w:tcMar>
               <w:top w:type="dxa" w:w="60"/>
               <w:left w:type="dxa" w:w="100"/>
@@ -8742,7 +9633,7 @@
         </w:tc>
         <w:tc>
           <w:tcPr>
-            <w:tcW w:type="dxa" w:w="1625"/>
+            <w:tcW w:type="dxa" w:w="1566"/>
             <w:tcMar>
               <w:top w:type="dxa" w:w="60"/>
               <w:left w:type="dxa" w:w="100"/>
@@ -8754,7 +9645,7 @@
         </w:tc>
         <w:tc>
           <w:tcPr>
-            <w:tcW w:type="dxa" w:w="1625"/>
+            <w:tcW w:type="dxa" w:w="1566"/>
             <w:tcMar>
               <w:top w:type="dxa" w:w="60"/>
               <w:left w:type="dxa" w:w="100"/>
@@ -8766,7 +9657,7 @@
         </w:tc>
         <w:tc>
           <w:tcPr>
-            <w:tcW w:type="dxa" w:w="1626"/>
+            <w:tcW w:type="dxa" w:w="1570"/>
             <w:tcMar>
               <w:top w:type="dxa" w:w="60"/>
               <w:left w:type="dxa" w:w="100"/>
@@ -8780,23 +9671,23 @@
       <w:tr>
         <w:tc>
           <w:tcPr>
-            <w:tcW w:type="dxa" w:w="3137"/>
-            <w:tcMar>
-              <w:top w:type="dxa" w:w="60"/>
-              <w:left w:type="dxa" w:w="100"/>
-              <w:bottom w:type="dxa" w:w="60"/>
-              <w:right w:type="dxa" w:w="100"/>
-            </w:tcMar>
-          </w:tcPr>
-          <w:p>
-            <w:r>
-              <w:t xml:space="preserve">Acesso remoto / VPN</w:t>
-            </w:r>
-          </w:p>
-        </w:tc>
-        <w:tc>
-          <w:tcPr>
-            <w:tcW w:type="dxa" w:w="1625"/>
+            <w:tcW w:type="dxa" w:w="3370"/>
+            <w:tcMar>
+              <w:top w:type="dxa" w:w="60"/>
+              <w:left w:type="dxa" w:w="100"/>
+              <w:bottom w:type="dxa" w:w="60"/>
+              <w:right w:type="dxa" w:w="100"/>
+            </w:tcMar>
+          </w:tcPr>
+          <w:p>
+            <w:r>
+              <w:t xml:space="preserve">Senhas compartilhadas que conhece</w:t>
+            </w:r>
+          </w:p>
+        </w:tc>
+        <w:tc>
+          <w:tcPr>
+            <w:tcW w:type="dxa" w:w="1566"/>
             <w:tcMar>
               <w:top w:type="dxa" w:w="60"/>
               <w:left w:type="dxa" w:w="100"/>
@@ -8808,7 +9699,7 @@
         </w:tc>
         <w:tc>
           <w:tcPr>
-            <w:tcW w:type="dxa" w:w="1625"/>
+            <w:tcW w:type="dxa" w:w="1566"/>
             <w:tcMar>
               <w:top w:type="dxa" w:w="60"/>
               <w:left w:type="dxa" w:w="100"/>
@@ -8820,7 +9711,7 @@
         </w:tc>
         <w:tc>
           <w:tcPr>
-            <w:tcW w:type="dxa" w:w="1625"/>
+            <w:tcW w:type="dxa" w:w="1566"/>
             <w:tcMar>
               <w:top w:type="dxa" w:w="60"/>
               <w:left w:type="dxa" w:w="100"/>
@@ -8832,7 +9723,7 @@
         </w:tc>
         <w:tc>
           <w:tcPr>
-            <w:tcW w:type="dxa" w:w="1626"/>
+            <w:tcW w:type="dxa" w:w="1570"/>
             <w:tcMar>
               <w:top w:type="dxa" w:w="60"/>
               <w:left w:type="dxa" w:w="100"/>
@@ -8846,23 +9737,23 @@
       <w:tr>
         <w:tc>
           <w:tcPr>
-            <w:tcW w:type="dxa" w:w="3137"/>
-            <w:tcMar>
-              <w:top w:type="dxa" w:w="60"/>
-              <w:left w:type="dxa" w:w="100"/>
-              <w:bottom w:type="dxa" w:w="60"/>
-              <w:right w:type="dxa" w:w="100"/>
-            </w:tcMar>
-          </w:tcPr>
-          <w:p>
-            <w:r>
-              <w:t xml:space="preserve">Senhas compartilhadas que conhece</w:t>
-            </w:r>
-          </w:p>
-        </w:tc>
-        <w:tc>
-          <w:tcPr>
-            <w:tcW w:type="dxa" w:w="1625"/>
+            <w:tcW w:type="dxa" w:w="3370"/>
+            <w:tcMar>
+              <w:top w:type="dxa" w:w="60"/>
+              <w:left w:type="dxa" w:w="100"/>
+              <w:bottom w:type="dxa" w:w="60"/>
+              <w:right w:type="dxa" w:w="100"/>
+            </w:tcMar>
+          </w:tcPr>
+          <w:p>
+            <w:r>
+              <w:t xml:space="preserve">Outro</w:t>
+            </w:r>
+          </w:p>
+        </w:tc>
+        <w:tc>
+          <w:tcPr>
+            <w:tcW w:type="dxa" w:w="1566"/>
             <w:tcMar>
               <w:top w:type="dxa" w:w="60"/>
               <w:left w:type="dxa" w:w="100"/>
@@ -8874,7 +9765,7 @@
         </w:tc>
         <w:tc>
           <w:tcPr>
-            <w:tcW w:type="dxa" w:w="1625"/>
+            <w:tcW w:type="dxa" w:w="1566"/>
             <w:tcMar>
               <w:top w:type="dxa" w:w="60"/>
               <w:left w:type="dxa" w:w="100"/>
@@ -8886,7 +9777,7 @@
         </w:tc>
         <w:tc>
           <w:tcPr>
-            <w:tcW w:type="dxa" w:w="1625"/>
+            <w:tcW w:type="dxa" w:w="1566"/>
             <w:tcMar>
               <w:top w:type="dxa" w:w="60"/>
               <w:left w:type="dxa" w:w="100"/>
@@ -8898,73 +9789,7 @@
         </w:tc>
         <w:tc>
           <w:tcPr>
-            <w:tcW w:type="dxa" w:w="1626"/>
-            <w:tcMar>
-              <w:top w:type="dxa" w:w="60"/>
-              <w:left w:type="dxa" w:w="100"/>
-              <w:bottom w:type="dxa" w:w="60"/>
-              <w:right w:type="dxa" w:w="100"/>
-            </w:tcMar>
-          </w:tcPr>
-          <w:p/>
-        </w:tc>
-      </w:tr>
-      <w:tr>
-        <w:tc>
-          <w:tcPr>
-            <w:tcW w:type="dxa" w:w="3137"/>
-            <w:tcMar>
-              <w:top w:type="dxa" w:w="60"/>
-              <w:left w:type="dxa" w:w="100"/>
-              <w:bottom w:type="dxa" w:w="60"/>
-              <w:right w:type="dxa" w:w="100"/>
-            </w:tcMar>
-          </w:tcPr>
-          <w:p>
-            <w:r>
-              <w:t xml:space="preserve">Outro</w:t>
-            </w:r>
-          </w:p>
-        </w:tc>
-        <w:tc>
-          <w:tcPr>
-            <w:tcW w:type="dxa" w:w="1625"/>
-            <w:tcMar>
-              <w:top w:type="dxa" w:w="60"/>
-              <w:left w:type="dxa" w:w="100"/>
-              <w:bottom w:type="dxa" w:w="60"/>
-              <w:right w:type="dxa" w:w="100"/>
-            </w:tcMar>
-          </w:tcPr>
-          <w:p/>
-        </w:tc>
-        <w:tc>
-          <w:tcPr>
-            <w:tcW w:type="dxa" w:w="1625"/>
-            <w:tcMar>
-              <w:top w:type="dxa" w:w="60"/>
-              <w:left w:type="dxa" w:w="100"/>
-              <w:bottom w:type="dxa" w:w="60"/>
-              <w:right w:type="dxa" w:w="100"/>
-            </w:tcMar>
-          </w:tcPr>
-          <w:p/>
-        </w:tc>
-        <w:tc>
-          <w:tcPr>
-            <w:tcW w:type="dxa" w:w="1625"/>
-            <w:tcMar>
-              <w:top w:type="dxa" w:w="60"/>
-              <w:left w:type="dxa" w:w="100"/>
-              <w:bottom w:type="dxa" w:w="60"/>
-              <w:right w:type="dxa" w:w="100"/>
-            </w:tcMar>
-          </w:tcPr>
-          <w:p/>
-        </w:tc>
-        <w:tc>
-          <w:tcPr>
-            <w:tcW w:type="dxa" w:w="1626"/>
+            <w:tcW w:type="dxa" w:w="1570"/>
             <w:tcMar>
               <w:top w:type="dxa" w:w="60"/>
               <w:left w:type="dxa" w:w="100"/>

</xml_diff>

<commit_message>
POP-01 sem WhatsApp corporativo; Word só do POP-01 para o RH
gerar-docx.mjs aceita um POP só: node gerar-docx.mjs POPs/POP-01-entrada.md

Co-Authored-By: Claude Opus 5.5 <noreply@anthropic.com>
</commit_message>
<xml_diff>
--- a/impressao/POPs-RH-revisao.docx
+++ b/impressao/POPs-RH-revisao.docx
@@ -1176,7 +1176,7 @@
         <w:t xml:space="preserve">Perfil A:</w:t>
       </w:r>
       <w:r>
-        <w:t xml:space="preserve"> a TI só cadastra a pessoa no GLPI, com o Formulário B sem acessos, e fecha o chamado. Os passos 6 a 17 não se aplicam.</w:t>
+        <w:t xml:space="preserve"> a TI só cadastra a pessoa no GLPI, com o Formulário B sem acessos, e fecha o chamado. Os passos 6 a 16 não se aplicam.</w:t>
       </w:r>
     </w:p>
     <w:p>
@@ -1508,34 +1508,35 @@
         <w:t xml:space="preserve">12.	</w:t>
       </w:r>
       <w:r>
-        <w:rPr>
-          <w:b/>
-          <w:bCs/>
-        </w:rPr>
-        <w:t xml:space="preserve">WhatsApp corporativo</w:t>
-      </w:r>
-      <w:r>
-        <w:t xml:space="preserve"> (se aprovado): número da empresa no celular corporativo, nome no padrão da empresa e </w:t>
-      </w:r>
-      <w:r>
-        <w:rPr>
-          <w:b/>
-          <w:bCs/>
-        </w:rPr>
-        <w:t xml:space="preserve">foto de perfil</w:t>
-      </w:r>
-      <w:r>
-        <w:t xml:space="preserve"> = a foto editada pelo RH, incluir nos grupos de trabalho aprovados. Configurar o </w:t>
-      </w:r>
-      <w:r>
-        <w:rPr>
-          <w:b/>
-          <w:bCs/>
-        </w:rPr>
-        <w:t xml:space="preserve">backup diário</w:t>
-      </w:r>
-      <w:r>
-        <w:t xml:space="preserve"> no Gmail da empresa, sem vídeos e com criptografia (POP-TI §4.3).</w:t>
+        <w:t xml:space="preserve">Preencher no GLPI a ficha </w:t>
+      </w:r>
+      <w:r>
+        <w:rPr>
+          <w:b/>
+          <w:bCs/>
+        </w:rPr>
+        <w:t xml:space="preserve">Formulário B: Checklist de acessos</w:t>
+      </w:r>
+      <w:r>
+        <w:t xml:space="preserve"> com cada conta criada (sistema, usuário, data, quem criou) e salvar cada senha no </w:t>
+      </w:r>
+      <w:r>
+        <w:rPr>
+          <w:b/>
+          <w:bCs/>
+        </w:rPr>
+        <w:t xml:space="preserve">Vaultwarden</w:t>
+      </w:r>
+      <w:r>
+        <w:t xml:space="preserve">, na pasta do funcionário.</w:t>
+      </w:r>
+    </w:p>
+    <w:p>
+      <w:pPr>
+        <w:pStyle w:val="Heading3"/>
+      </w:pPr>
+      <w:r>
+        <w:t xml:space="preserve">4.4 Primeiro dia (TI + funcionário)</w:t>
       </w:r>
     </w:p>
     <w:p>
@@ -1549,35 +1550,17 @@
         <w:t xml:space="preserve">13.	</w:t>
       </w:r>
       <w:r>
-        <w:t xml:space="preserve">Preencher no GLPI a ficha </w:t>
-      </w:r>
-      <w:r>
-        <w:rPr>
-          <w:b/>
-          <w:bCs/>
-        </w:rPr>
-        <w:t xml:space="preserve">Formulário B: Checklist de acessos</w:t>
-      </w:r>
-      <w:r>
-        <w:t xml:space="preserve"> com cada conta criada (sistema, usuário, data, quem criou) e salvar cada senha no </w:t>
-      </w:r>
-      <w:r>
-        <w:rPr>
-          <w:b/>
-          <w:bCs/>
-        </w:rPr>
-        <w:t xml:space="preserve">Vaultwarden</w:t>
-      </w:r>
-      <w:r>
-        <w:t xml:space="preserve">, na pasta do funcionário.</w:t>
-      </w:r>
-    </w:p>
-    <w:p>
-      <w:pPr>
-        <w:pStyle w:val="Heading3"/>
-      </w:pPr>
-      <w:r>
-        <w:t xml:space="preserve">4.4 Primeiro dia (TI + funcionário)</w:t>
+        <w:t xml:space="preserve">Entregar os equipamentos e o </w:t>
+      </w:r>
+      <w:r>
+        <w:rPr>
+          <w:b/>
+          <w:bCs/>
+        </w:rPr>
+        <w:t xml:space="preserve">Formulário C: Termo de responsabilidade</w:t>
+      </w:r>
+      <w:r>
+        <w:t xml:space="preserve"> para assinatura (1 via com o funcionário, 1 na pasta do RH).</w:t>
       </w:r>
     </w:p>
     <w:p>
@@ -1591,17 +1574,27 @@
         <w:t xml:space="preserve">14.	</w:t>
       </w:r>
       <w:r>
-        <w:t xml:space="preserve">Entregar os equipamentos e o </w:t>
-      </w:r>
-      <w:r>
-        <w:rPr>
-          <w:b/>
-          <w:bCs/>
-        </w:rPr>
-        <w:t xml:space="preserve">Formulário C: Termo de responsabilidade</w:t>
-      </w:r>
-      <w:r>
-        <w:t xml:space="preserve"> para assinatura (1 via com o funcionário, 1 na pasta do RH).</w:t>
+        <w:t xml:space="preserve">Entregar as senhas ao funcionário pessoalmente e acompanhar o primeiro login em cada sistema. </w:t>
+      </w:r>
+      <w:r>
+        <w:rPr>
+          <w:b/>
+          <w:bCs/>
+        </w:rPr>
+        <w:t xml:space="preserve">Todas as senhas da pessoa ficam no Vaultwarden</w:t>
+      </w:r>
+      <w:r>
+        <w:t xml:space="preserve"> (pasta do funcionário). O funcionário </w:t>
+      </w:r>
+      <w:r>
+        <w:rPr>
+          <w:b/>
+          <w:bCs/>
+        </w:rPr>
+        <w:t xml:space="preserve">não troca</w:t>
+      </w:r>
+      <w:r>
+        <w:t xml:space="preserve"> as senhas: se precisar trocar, pede à TI, que troca e atualiza o cofre.</w:t>
       </w:r>
     </w:p>
     <w:p>
@@ -1615,27 +1608,13 @@
         <w:t xml:space="preserve">15.	</w:t>
       </w:r>
       <w:r>
-        <w:t xml:space="preserve">Entregar as senhas ao funcionário pessoalmente e acompanhar o primeiro login em cada sistema. </w:t>
-      </w:r>
-      <w:r>
-        <w:rPr>
-          <w:b/>
-          <w:bCs/>
-        </w:rPr>
-        <w:t xml:space="preserve">Todas as senhas da pessoa ficam no Vaultwarden</w:t>
-      </w:r>
-      <w:r>
-        <w:t xml:space="preserve"> (pasta do funcionário). O funcionário </w:t>
-      </w:r>
-      <w:r>
-        <w:rPr>
-          <w:b/>
-          <w:bCs/>
-        </w:rPr>
-        <w:t xml:space="preserve">não troca</w:t>
-      </w:r>
-      <w:r>
-        <w:t xml:space="preserve"> as senhas: se precisar trocar, pede à TI, que troca e atualiza o cofre.</w:t>
+        <w:t xml:space="preserve">Instalar a imagem de rodapé como assinatura no Outlook/webmail e colocar a foto de perfil no e-mail, se o programa permitir (passo a passo em </w:t>
+      </w:r>
+      <w:r>
+        <w:t xml:space="preserve">anexos/padrao-email.md</w:t>
+      </w:r>
+      <w:r>
+        <w:t xml:space="preserve">).</w:t>
       </w:r>
     </w:p>
     <w:p>
@@ -1647,26 +1626,6 @@
       </w:pPr>
       <w:r>
         <w:t xml:space="preserve">16.	</w:t>
-      </w:r>
-      <w:r>
-        <w:t xml:space="preserve">Instalar a imagem de rodapé como assinatura no Outlook/webmail e colocar a foto de perfil no e-mail, se o programa permitir (passo a passo em </w:t>
-      </w:r>
-      <w:r>
-        <w:t xml:space="preserve">anexos/padrao-email.md</w:t>
-      </w:r>
-      <w:r>
-        <w:t xml:space="preserve">).</w:t>
-      </w:r>
-    </w:p>
-    <w:p>
-      <w:pPr>
-        <w:tabs>
-          <w:tab w:val="left" w:pos="720"/>
-        </w:tabs>
-        <w:ind w:left="720" w:hanging="400"/>
-      </w:pPr>
-      <w:r>
-        <w:t xml:space="preserve">17.	</w:t>
       </w:r>
       <w:r>
         <w:t xml:space="preserve">Explicar as regras básicas: senha não se compartilha com colegas, não se troca sem a TI, aparelho perdido avisa a TI na hora (POP-03), app novo só via solicitação (POP-08).</w:t>
@@ -1693,8 +1652,8 @@
         </w:tblBorders>
       </w:tblPr>
       <w:tblGrid>
-        <w:gridCol w:w="3419"/>
-        <w:gridCol w:w="6219"/>
+        <w:gridCol w:w="3416"/>
+        <w:gridCol w:w="6222"/>
       </w:tblGrid>
       <w:tr>
         <w:trPr>
@@ -1702,7 +1661,7 @@
         </w:trPr>
         <w:tc>
           <w:tcPr>
-            <w:tcW w:type="dxa" w:w="3419"/>
+            <w:tcW w:type="dxa" w:w="3416"/>
             <w:shd w:fill="EEEEEE" w:color="auto" w:val="clear"/>
             <w:tcMar>
               <w:top w:type="dxa" w:w="60"/>
@@ -1723,7 +1682,7 @@
         </w:tc>
         <w:tc>
           <w:tcPr>
-            <w:tcW w:type="dxa" w:w="6219"/>
+            <w:tcW w:type="dxa" w:w="6222"/>
             <w:shd w:fill="EEEEEE" w:color="auto" w:val="clear"/>
             <w:tcMar>
               <w:top w:type="dxa" w:w="60"/>
@@ -1746,7 +1705,7 @@
       <w:tr>
         <w:tc>
           <w:tcPr>
-            <w:tcW w:type="dxa" w:w="3419"/>
+            <w:tcW w:type="dxa" w:w="3416"/>
             <w:tcMar>
               <w:top w:type="dxa" w:w="60"/>
               <w:left w:type="dxa" w:w="100"/>
@@ -1762,7 +1721,7 @@
         </w:tc>
         <w:tc>
           <w:tcPr>
-            <w:tcW w:type="dxa" w:w="6219"/>
+            <w:tcW w:type="dxa" w:w="6222"/>
             <w:tcMar>
               <w:top w:type="dxa" w:w="60"/>
               <w:left w:type="dxa" w:w="100"/>
@@ -1791,7 +1750,7 @@
       <w:tr>
         <w:tc>
           <w:tcPr>
-            <w:tcW w:type="dxa" w:w="3419"/>
+            <w:tcW w:type="dxa" w:w="3416"/>
             <w:tcMar>
               <w:top w:type="dxa" w:w="60"/>
               <w:left w:type="dxa" w:w="100"/>
@@ -1807,7 +1766,7 @@
         </w:tc>
         <w:tc>
           <w:tcPr>
-            <w:tcW w:type="dxa" w:w="6219"/>
+            <w:tcW w:type="dxa" w:w="6222"/>
             <w:tcMar>
               <w:top w:type="dxa" w:w="60"/>
               <w:left w:type="dxa" w:w="100"/>
@@ -1825,7 +1784,7 @@
       <w:tr>
         <w:tc>
           <w:tcPr>
-            <w:tcW w:type="dxa" w:w="3419"/>
+            <w:tcW w:type="dxa" w:w="3416"/>
             <w:tcMar>
               <w:top w:type="dxa" w:w="60"/>
               <w:left w:type="dxa" w:w="100"/>
@@ -1841,7 +1800,7 @@
         </w:tc>
         <w:tc>
           <w:tcPr>
-            <w:tcW w:type="dxa" w:w="6219"/>
+            <w:tcW w:type="dxa" w:w="6222"/>
             <w:tcMar>
               <w:top w:type="dxa" w:w="60"/>
               <w:left w:type="dxa" w:w="100"/>
@@ -1859,7 +1818,7 @@
       <w:tr>
         <w:tc>
           <w:tcPr>
-            <w:tcW w:type="dxa" w:w="3419"/>
+            <w:tcW w:type="dxa" w:w="3416"/>
             <w:tcMar>
               <w:top w:type="dxa" w:w="60"/>
               <w:left w:type="dxa" w:w="100"/>
@@ -1875,7 +1834,7 @@
         </w:tc>
         <w:tc>
           <w:tcPr>
-            <w:tcW w:type="dxa" w:w="6219"/>
+            <w:tcW w:type="dxa" w:w="6222"/>
             <w:tcMar>
               <w:top w:type="dxa" w:w="60"/>
               <w:left w:type="dxa" w:w="100"/>
@@ -1893,7 +1852,7 @@
       <w:tr>
         <w:tc>
           <w:tcPr>
-            <w:tcW w:type="dxa" w:w="3419"/>
+            <w:tcW w:type="dxa" w:w="3416"/>
             <w:tcMar>
               <w:top w:type="dxa" w:w="60"/>
               <w:left w:type="dxa" w:w="100"/>
@@ -1909,7 +1868,7 @@
         </w:tc>
         <w:tc>
           <w:tcPr>
-            <w:tcW w:type="dxa" w:w="6219"/>
+            <w:tcW w:type="dxa" w:w="6222"/>
             <w:tcMar>
               <w:top w:type="dxa" w:w="60"/>
               <w:left w:type="dxa" w:w="100"/>
@@ -1920,40 +1879,6 @@
           <w:p>
             <w:r>
               <w:t xml:space="preserve">Headwind MDM + políticas decididas</w:t>
-            </w:r>
-          </w:p>
-        </w:tc>
-      </w:tr>
-      <w:tr>
-        <w:tc>
-          <w:tcPr>
-            <w:tcW w:type="dxa" w:w="3419"/>
-            <w:tcMar>
-              <w:top w:type="dxa" w:w="60"/>
-              <w:left w:type="dxa" w:w="100"/>
-              <w:bottom w:type="dxa" w:w="60"/>
-              <w:right w:type="dxa" w:w="100"/>
-            </w:tcMar>
-          </w:tcPr>
-          <w:p>
-            <w:r>
-              <w:t xml:space="preserve">WhatsApp corporativo</w:t>
-            </w:r>
-          </w:p>
-        </w:tc>
-        <w:tc>
-          <w:tcPr>
-            <w:tcW w:type="dxa" w:w="6219"/>
-            <w:tcMar>
-              <w:top w:type="dxa" w:w="60"/>
-              <w:left w:type="dxa" w:w="100"/>
-              <w:bottom w:type="dxa" w:w="60"/>
-              <w:right w:type="dxa" w:w="100"/>
-            </w:tcMar>
-          </w:tcPr>
-          <w:p>
-            <w:r>
-              <w:t xml:space="preserve">O número é da empresa, não da pessoa</w:t>
             </w:r>
           </w:p>
         </w:tc>

</xml_diff>

<commit_message>
Sem WhatsApp corporativo: o WhatsApp é o normal, no celular da empresa
Remove o item "WhatsApp corporativo" dos formulários, do padrão de e-mail, do POP-02 e do POP-11. Apps padrão: WhatsApp normal no lugar do Business. Backup e restauração do WhatsApp do celular continuam. Impressão regerada.

Co-Authored-By: Claude Opus 5.5 <noreply@anthropic.com>
</commit_message>
<xml_diff>
--- a/impressao/POPs-RH-revisao.docx
+++ b/impressao/POPs-RH-revisao.docx
@@ -2364,8 +2364,8 @@
         </w:tblBorders>
       </w:tblPr>
       <w:tblGrid>
-        <w:gridCol w:w="1095"/>
-        <w:gridCol w:w="8543"/>
+        <w:gridCol w:w="1099"/>
+        <w:gridCol w:w="8539"/>
       </w:tblGrid>
       <w:tr>
         <w:trPr>
@@ -2373,7 +2373,7 @@
         </w:trPr>
         <w:tc>
           <w:tcPr>
-            <w:tcW w:type="dxa" w:w="1095"/>
+            <w:tcW w:type="dxa" w:w="1099"/>
             <w:shd w:fill="EEEEEE" w:color="auto" w:val="clear"/>
             <w:tcMar>
               <w:top w:type="dxa" w:w="60"/>
@@ -2394,7 +2394,7 @@
         </w:tc>
         <w:tc>
           <w:tcPr>
-            <w:tcW w:type="dxa" w:w="8543"/>
+            <w:tcW w:type="dxa" w:w="8539"/>
             <w:shd w:fill="EEEEEE" w:color="auto" w:val="clear"/>
             <w:tcMar>
               <w:top w:type="dxa" w:w="60"/>
@@ -2417,7 +2417,7 @@
       <w:tr>
         <w:tc>
           <w:tcPr>
-            <w:tcW w:type="dxa" w:w="1095"/>
+            <w:tcW w:type="dxa" w:w="1099"/>
             <w:tcMar>
               <w:top w:type="dxa" w:w="60"/>
               <w:left w:type="dxa" w:w="100"/>
@@ -2437,7 +2437,7 @@
         </w:tc>
         <w:tc>
           <w:tcPr>
-            <w:tcW w:type="dxa" w:w="8543"/>
+            <w:tcW w:type="dxa" w:w="8539"/>
             <w:tcMar>
               <w:top w:type="dxa" w:w="60"/>
               <w:left w:type="dxa" w:w="100"/>
@@ -2465,7 +2465,7 @@
       <w:tr>
         <w:tc>
           <w:tcPr>
-            <w:tcW w:type="dxa" w:w="1095"/>
+            <w:tcW w:type="dxa" w:w="1099"/>
             <w:tcMar>
               <w:top w:type="dxa" w:w="60"/>
               <w:left w:type="dxa" w:w="100"/>
@@ -2485,17 +2485,17 @@
         </w:tc>
         <w:tc>
           <w:tcPr>
-            <w:tcW w:type="dxa" w:w="8543"/>
-            <w:tcMar>
-              <w:top w:type="dxa" w:w="60"/>
-              <w:left w:type="dxa" w:w="100"/>
-              <w:bottom w:type="dxa" w:w="60"/>
-              <w:right w:type="dxa" w:w="100"/>
-            </w:tcMar>
-          </w:tcPr>
-          <w:p>
-            <w:r>
-              <w:t xml:space="preserve">Diz quem assume os e-mails, o WhatsApp e os arquivos da pessoa</w:t>
+            <w:tcW w:type="dxa" w:w="8539"/>
+            <w:tcMar>
+              <w:top w:type="dxa" w:w="60"/>
+              <w:left w:type="dxa" w:w="100"/>
+              <w:bottom w:type="dxa" w:w="60"/>
+              <w:right w:type="dxa" w:w="100"/>
+            </w:tcMar>
+          </w:tcPr>
+          <w:p>
+            <w:r>
+              <w:t xml:space="preserve">Diz quem assume os e-mails, o celular e os arquivos da pessoa</w:t>
             </w:r>
           </w:p>
         </w:tc>
@@ -2503,7 +2503,7 @@
       <w:tr>
         <w:tc>
           <w:tcPr>
-            <w:tcW w:type="dxa" w:w="1095"/>
+            <w:tcW w:type="dxa" w:w="1099"/>
             <w:tcMar>
               <w:top w:type="dxa" w:w="60"/>
               <w:left w:type="dxa" w:w="100"/>
@@ -2523,7 +2523,7 @@
         </w:tc>
         <w:tc>
           <w:tcPr>
-            <w:tcW w:type="dxa" w:w="8543"/>
+            <w:tcW w:type="dxa" w:w="8539"/>
             <w:tcMar>
               <w:top w:type="dxa" w:w="60"/>
               <w:left w:type="dxa" w:w="100"/>
@@ -2822,7 +2822,7 @@
         <w:t xml:space="preserve">Gestor</w:t>
       </w:r>
       <w:r>
-        <w:t xml:space="preserve"> informa: quem recebe os e-mails, quem fica com o WhatsApp corporativo, para onde vão os arquivos.</w:t>
+        <w:t xml:space="preserve"> informa: quem recebe os e-mails, quem fica com o celular corporativo (e o WhatsApp dele), para onde vão os arquivos.</w:t>
       </w:r>
     </w:p>
     <w:p>
@@ -3032,10 +3032,10 @@
           <w:b/>
           <w:bCs/>
         </w:rPr>
-        <w:t xml:space="preserve">WhatsApp corporativo:</w:t>
-      </w:r>
-      <w:r>
-        <w:t xml:space="preserve"> o número é da empresa. Conferir que o backup do dia foi feito (POP-TI §4.3), recolher o aparelho, passar o atendimento para quem assume e trocar o nome/foto do perfil.</w:t>
+        <w:t xml:space="preserve">Celular e WhatsApp:</w:t>
+      </w:r>
+      <w:r>
+        <w:t xml:space="preserve"> o número é da empresa. Conferir que o backup do dia foi feito (POP-TI §4.3), recolher o aparelho, entregar a quem assume o atendimento e trocar o nome do perfil do WhatsApp.</w:t>
       </w:r>
     </w:p>
     <w:p>
@@ -5429,28 +5429,7 @@
         <w:t xml:space="preserve">Celular corporativo:</w:t>
       </w:r>
       <w:r>
-        <w:t xml:space="preserve"> fica com a pessoa ou volta para a empresa, conforme o gestor decidir. Se ficar, continua sob as políticas do Headwind MDM.</w:t>
-      </w:r>
-    </w:p>
-    <w:p>
-      <w:pPr>
-        <w:tabs>
-          <w:tab w:val="left" w:pos="1440"/>
-        </w:tabs>
-        <w:ind w:left="1440" w:hanging="400"/>
-      </w:pPr>
-      <w:r>
-        <w:t xml:space="preserve">4.	</w:t>
-      </w:r>
-      <w:r>
-        <w:rPr>
-          <w:b/>
-          <w:bCs/>
-        </w:rPr>
-        <w:t xml:space="preserve">WhatsApp corporativo:</w:t>
-      </w:r>
-      <w:r>
-        <w:t xml:space="preserve"> se outra pessoa assumir o atendimento, o aparelho fica com ela durante o afastamento.</w:t>
+        <w:t xml:space="preserve"> fica com a pessoa ou volta para a empresa, conforme o gestor decidir. Se ficar, continua sob as políticas do Headwind MDM. Se outra pessoa assumir o atendimento pelo WhatsApp do aparelho, o celular fica com ela durante o afastamento.</w:t>
       </w:r>
     </w:p>
     <w:p>
@@ -6886,10 +6865,10 @@
           <w:b/>
           <w:bCs/>
         </w:rPr>
-        <w:t xml:space="preserve">Telefone/WhatsApp</w:t>
-      </w:r>
-      <w:r>
-        <w:t xml:space="preserve"> corporativo, no formato </w:t>
+        <w:t xml:space="preserve">Telefone</w:t>
+      </w:r>
+      <w:r>
+        <w:t xml:space="preserve"> do celular corporativo, no formato </w:t>
       </w:r>
       <w:r>
         <w:rPr>
@@ -7324,7 +7303,7 @@
         <w:t xml:space="preserve">foto de perfil</w:t>
       </w:r>
       <w:r>
-        <w:t xml:space="preserve"> (WhatsApp corporativo e e-mail).</w:t>
+        <w:t xml:space="preserve"> do e-mail.</w:t>
       </w:r>
     </w:p>
     <w:p>
@@ -7429,7 +7408,7 @@
         <w:t xml:space="preserve">Autorização:</w:t>
       </w:r>
       <w:r>
-        <w:t xml:space="preserve"> o funcionário autoriza o uso da foto ao assinar o Formulário C. Na saída (POP-02), a foto sai do perfil do WhatsApp e não é mais usada.</w:t>
+        <w:t xml:space="preserve"> o funcionário autoriza o uso da foto ao assinar o Formulário C. Na saída (POP-02), a foto sai do e-mail e da assinatura e não é mais usada.</w:t>
       </w:r>
     </w:p>
     <w:p>
@@ -7823,8 +7802,8 @@
         </w:tblBorders>
       </w:tblPr>
       <w:tblGrid>
-        <w:gridCol w:w="7834"/>
-        <w:gridCol w:w="1804"/>
+        <w:gridCol w:w="7830"/>
+        <w:gridCol w:w="1808"/>
       </w:tblGrid>
       <w:tr>
         <w:trPr>
@@ -7832,7 +7811,7 @@
         </w:trPr>
         <w:tc>
           <w:tcPr>
-            <w:tcW w:type="dxa" w:w="7834"/>
+            <w:tcW w:type="dxa" w:w="7830"/>
             <w:shd w:fill="EEEEEE" w:color="auto" w:val="clear"/>
             <w:tcMar>
               <w:top w:type="dxa" w:w="60"/>
@@ -7853,7 +7832,7 @@
         </w:tc>
         <w:tc>
           <w:tcPr>
-            <w:tcW w:type="dxa" w:w="1804"/>
+            <w:tcW w:type="dxa" w:w="1808"/>
             <w:shd w:fill="EEEEEE" w:color="auto" w:val="clear"/>
             <w:tcMar>
               <w:top w:type="dxa" w:w="60"/>
@@ -7876,7 +7855,7 @@
       <w:tr>
         <w:tc>
           <w:tcPr>
-            <w:tcW w:type="dxa" w:w="7834"/>
+            <w:tcW w:type="dxa" w:w="7830"/>
             <w:tcMar>
               <w:top w:type="dxa" w:w="60"/>
               <w:left w:type="dxa" w:w="100"/>
@@ -7892,7 +7871,7 @@
         </w:tc>
         <w:tc>
           <w:tcPr>
-            <w:tcW w:type="dxa" w:w="1804"/>
+            <w:tcW w:type="dxa" w:w="1808"/>
             <w:tcMar>
               <w:top w:type="dxa" w:w="60"/>
               <w:left w:type="dxa" w:w="100"/>
@@ -7906,7 +7885,7 @@
       <w:tr>
         <w:tc>
           <w:tcPr>
-            <w:tcW w:type="dxa" w:w="7834"/>
+            <w:tcW w:type="dxa" w:w="7830"/>
             <w:tcMar>
               <w:top w:type="dxa" w:w="60"/>
               <w:left w:type="dxa" w:w="100"/>
@@ -7922,7 +7901,7 @@
         </w:tc>
         <w:tc>
           <w:tcPr>
-            <w:tcW w:type="dxa" w:w="1804"/>
+            <w:tcW w:type="dxa" w:w="1808"/>
             <w:tcMar>
               <w:top w:type="dxa" w:w="60"/>
               <w:left w:type="dxa" w:w="100"/>
@@ -7936,7 +7915,7 @@
       <w:tr>
         <w:tc>
           <w:tcPr>
-            <w:tcW w:type="dxa" w:w="7834"/>
+            <w:tcW w:type="dxa" w:w="7830"/>
             <w:tcMar>
               <w:top w:type="dxa" w:w="60"/>
               <w:left w:type="dxa" w:w="100"/>
@@ -7952,7 +7931,7 @@
         </w:tc>
         <w:tc>
           <w:tcPr>
-            <w:tcW w:type="dxa" w:w="1804"/>
+            <w:tcW w:type="dxa" w:w="1808"/>
             <w:tcMar>
               <w:top w:type="dxa" w:w="60"/>
               <w:left w:type="dxa" w:w="100"/>
@@ -7966,7 +7945,7 @@
       <w:tr>
         <w:tc>
           <w:tcPr>
-            <w:tcW w:type="dxa" w:w="7834"/>
+            <w:tcW w:type="dxa" w:w="7830"/>
             <w:tcMar>
               <w:top w:type="dxa" w:w="60"/>
               <w:left w:type="dxa" w:w="100"/>
@@ -7982,7 +7961,7 @@
         </w:tc>
         <w:tc>
           <w:tcPr>
-            <w:tcW w:type="dxa" w:w="1804"/>
+            <w:tcW w:type="dxa" w:w="1808"/>
             <w:tcMar>
               <w:top w:type="dxa" w:w="60"/>
               <w:left w:type="dxa" w:w="100"/>
@@ -8000,7 +7979,7 @@
       <w:tr>
         <w:tc>
           <w:tcPr>
-            <w:tcW w:type="dxa" w:w="7834"/>
+            <w:tcW w:type="dxa" w:w="7830"/>
             <w:tcMar>
               <w:top w:type="dxa" w:w="60"/>
               <w:left w:type="dxa" w:w="100"/>
@@ -8016,7 +7995,7 @@
         </w:tc>
         <w:tc>
           <w:tcPr>
-            <w:tcW w:type="dxa" w:w="1804"/>
+            <w:tcW w:type="dxa" w:w="1808"/>
             <w:tcMar>
               <w:top w:type="dxa" w:w="60"/>
               <w:left w:type="dxa" w:w="100"/>
@@ -8030,7 +8009,7 @@
       <w:tr>
         <w:tc>
           <w:tcPr>
-            <w:tcW w:type="dxa" w:w="7834"/>
+            <w:tcW w:type="dxa" w:w="7830"/>
             <w:tcMar>
               <w:top w:type="dxa" w:w="60"/>
               <w:left w:type="dxa" w:w="100"/>
@@ -8046,7 +8025,7 @@
         </w:tc>
         <w:tc>
           <w:tcPr>
-            <w:tcW w:type="dxa" w:w="1804"/>
+            <w:tcW w:type="dxa" w:w="1808"/>
             <w:tcMar>
               <w:top w:type="dxa" w:w="60"/>
               <w:left w:type="dxa" w:w="100"/>
@@ -8060,7 +8039,7 @@
       <w:tr>
         <w:tc>
           <w:tcPr>
-            <w:tcW w:type="dxa" w:w="7834"/>
+            <w:tcW w:type="dxa" w:w="7830"/>
             <w:tcMar>
               <w:top w:type="dxa" w:w="60"/>
               <w:left w:type="dxa" w:w="100"/>
@@ -8076,7 +8055,7 @@
         </w:tc>
         <w:tc>
           <w:tcPr>
-            <w:tcW w:type="dxa" w:w="1804"/>
+            <w:tcW w:type="dxa" w:w="1808"/>
             <w:tcMar>
               <w:top w:type="dxa" w:w="60"/>
               <w:left w:type="dxa" w:w="100"/>
@@ -8090,7 +8069,7 @@
       <w:tr>
         <w:tc>
           <w:tcPr>
-            <w:tcW w:type="dxa" w:w="7834"/>
+            <w:tcW w:type="dxa" w:w="7830"/>
             <w:tcMar>
               <w:top w:type="dxa" w:w="60"/>
               <w:left w:type="dxa" w:w="100"/>
@@ -8106,7 +8085,7 @@
         </w:tc>
         <w:tc>
           <w:tcPr>
-            <w:tcW w:type="dxa" w:w="1804"/>
+            <w:tcW w:type="dxa" w:w="1808"/>
             <w:tcMar>
               <w:top w:type="dxa" w:w="60"/>
               <w:left w:type="dxa" w:w="100"/>
@@ -8120,7 +8099,7 @@
       <w:tr>
         <w:tc>
           <w:tcPr>
-            <w:tcW w:type="dxa" w:w="7834"/>
+            <w:tcW w:type="dxa" w:w="7830"/>
             <w:tcMar>
               <w:top w:type="dxa" w:w="60"/>
               <w:left w:type="dxa" w:w="100"/>
@@ -8136,7 +8115,7 @@
         </w:tc>
         <w:tc>
           <w:tcPr>
-            <w:tcW w:type="dxa" w:w="1804"/>
+            <w:tcW w:type="dxa" w:w="1808"/>
             <w:tcMar>
               <w:top w:type="dxa" w:w="60"/>
               <w:left w:type="dxa" w:w="100"/>
@@ -8150,7 +8129,7 @@
       <w:tr>
         <w:tc>
           <w:tcPr>
-            <w:tcW w:type="dxa" w:w="7834"/>
+            <w:tcW w:type="dxa" w:w="7830"/>
             <w:tcMar>
               <w:top w:type="dxa" w:w="60"/>
               <w:left w:type="dxa" w:w="100"/>
@@ -8183,7 +8162,7 @@
         </w:tc>
         <w:tc>
           <w:tcPr>
-            <w:tcW w:type="dxa" w:w="1804"/>
+            <w:tcW w:type="dxa" w:w="1808"/>
             <w:tcMar>
               <w:top w:type="dxa" w:w="60"/>
               <w:left w:type="dxa" w:w="100"/>
@@ -8197,7 +8176,7 @@
       <w:tr>
         <w:tc>
           <w:tcPr>
-            <w:tcW w:type="dxa" w:w="7834"/>
+            <w:tcW w:type="dxa" w:w="7830"/>
             <w:tcMar>
               <w:top w:type="dxa" w:w="60"/>
               <w:left w:type="dxa" w:w="100"/>
@@ -8213,7 +8192,7 @@
         </w:tc>
         <w:tc>
           <w:tcPr>
-            <w:tcW w:type="dxa" w:w="1804"/>
+            <w:tcW w:type="dxa" w:w="1808"/>
             <w:tcMar>
               <w:top w:type="dxa" w:w="60"/>
               <w:left w:type="dxa" w:w="100"/>
@@ -8227,23 +8206,23 @@
       <w:tr>
         <w:tc>
           <w:tcPr>
-            <w:tcW w:type="dxa" w:w="7834"/>
-            <w:tcMar>
-              <w:top w:type="dxa" w:w="60"/>
-              <w:left w:type="dxa" w:w="100"/>
-              <w:bottom w:type="dxa" w:w="60"/>
-              <w:right w:type="dxa" w:w="100"/>
-            </w:tcMar>
-          </w:tcPr>
-          <w:p>
-            <w:r>
-              <w:t xml:space="preserve">Saída: quem assume e-mail, WhatsApp e arquivos</w:t>
-            </w:r>
-          </w:p>
-        </w:tc>
-        <w:tc>
-          <w:tcPr>
-            <w:tcW w:type="dxa" w:w="1804"/>
+            <w:tcW w:type="dxa" w:w="7830"/>
+            <w:tcMar>
+              <w:top w:type="dxa" w:w="60"/>
+              <w:left w:type="dxa" w:w="100"/>
+              <w:bottom w:type="dxa" w:w="60"/>
+              <w:right w:type="dxa" w:w="100"/>
+            </w:tcMar>
+          </w:tcPr>
+          <w:p>
+            <w:r>
+              <w:t xml:space="preserve">Saída: quem assume e-mail, celular e arquivos</w:t>
+            </w:r>
+          </w:p>
+        </w:tc>
+        <w:tc>
+          <w:tcPr>
+            <w:tcW w:type="dxa" w:w="1808"/>
             <w:tcMar>
               <w:top w:type="dxa" w:w="60"/>
               <w:left w:type="dxa" w:w="100"/>
@@ -8257,7 +8236,7 @@
       <w:tr>
         <w:tc>
           <w:tcPr>
-            <w:tcW w:type="dxa" w:w="7834"/>
+            <w:tcW w:type="dxa" w:w="7830"/>
             <w:tcMar>
               <w:top w:type="dxa" w:w="60"/>
               <w:left w:type="dxa" w:w="100"/>
@@ -8273,7 +8252,7 @@
         </w:tc>
         <w:tc>
           <w:tcPr>
-            <w:tcW w:type="dxa" w:w="1804"/>
+            <w:tcW w:type="dxa" w:w="1808"/>
             <w:tcMar>
               <w:top w:type="dxa" w:w="60"/>
               <w:left w:type="dxa" w:w="100"/>
@@ -8314,9 +8293,9 @@
         </w:tblBorders>
       </w:tblPr>
       <w:tblGrid>
-        <w:gridCol w:w="4573"/>
-        <w:gridCol w:w="2494"/>
-        <w:gridCol w:w="2571"/>
+        <w:gridCol w:w="4384"/>
+        <w:gridCol w:w="2604"/>
+        <w:gridCol w:w="2650"/>
       </w:tblGrid>
       <w:tr>
         <w:trPr>
@@ -8324,7 +8303,7 @@
         </w:trPr>
         <w:tc>
           <w:tcPr>
-            <w:tcW w:type="dxa" w:w="4573"/>
+            <w:tcW w:type="dxa" w:w="4384"/>
             <w:shd w:fill="EEEEEE" w:color="auto" w:val="clear"/>
             <w:tcMar>
               <w:top w:type="dxa" w:w="60"/>
@@ -8345,7 +8324,7 @@
         </w:tc>
         <w:tc>
           <w:tcPr>
-            <w:tcW w:type="dxa" w:w="2494"/>
+            <w:tcW w:type="dxa" w:w="2604"/>
             <w:shd w:fill="EEEEEE" w:color="auto" w:val="clear"/>
             <w:tcMar>
               <w:top w:type="dxa" w:w="60"/>
@@ -8366,7 +8345,7 @@
         </w:tc>
         <w:tc>
           <w:tcPr>
-            <w:tcW w:type="dxa" w:w="2571"/>
+            <w:tcW w:type="dxa" w:w="2650"/>
             <w:shd w:fill="EEEEEE" w:color="auto" w:val="clear"/>
             <w:tcMar>
               <w:top w:type="dxa" w:w="60"/>
@@ -8389,7 +8368,7 @@
       <w:tr>
         <w:tc>
           <w:tcPr>
-            <w:tcW w:type="dxa" w:w="4573"/>
+            <w:tcW w:type="dxa" w:w="4384"/>
             <w:tcMar>
               <w:top w:type="dxa" w:w="60"/>
               <w:left w:type="dxa" w:w="100"/>
@@ -8405,7 +8384,7 @@
         </w:tc>
         <w:tc>
           <w:tcPr>
-            <w:tcW w:type="dxa" w:w="2494"/>
+            <w:tcW w:type="dxa" w:w="2604"/>
             <w:tcMar>
               <w:top w:type="dxa" w:w="60"/>
               <w:left w:type="dxa" w:w="100"/>
@@ -8421,7 +8400,7 @@
         </w:tc>
         <w:tc>
           <w:tcPr>
-            <w:tcW w:type="dxa" w:w="2571"/>
+            <w:tcW w:type="dxa" w:w="2650"/>
             <w:tcMar>
               <w:top w:type="dxa" w:w="60"/>
               <w:left w:type="dxa" w:w="100"/>
@@ -8435,7 +8414,7 @@
       <w:tr>
         <w:tc>
           <w:tcPr>
-            <w:tcW w:type="dxa" w:w="4573"/>
+            <w:tcW w:type="dxa" w:w="4384"/>
             <w:tcMar>
               <w:top w:type="dxa" w:w="60"/>
               <w:left w:type="dxa" w:w="100"/>
@@ -8451,7 +8430,7 @@
         </w:tc>
         <w:tc>
           <w:tcPr>
-            <w:tcW w:type="dxa" w:w="2494"/>
+            <w:tcW w:type="dxa" w:w="2604"/>
             <w:tcMar>
               <w:top w:type="dxa" w:w="60"/>
               <w:left w:type="dxa" w:w="100"/>
@@ -8467,7 +8446,7 @@
         </w:tc>
         <w:tc>
           <w:tcPr>
-            <w:tcW w:type="dxa" w:w="2571"/>
+            <w:tcW w:type="dxa" w:w="2650"/>
             <w:tcMar>
               <w:top w:type="dxa" w:w="60"/>
               <w:left w:type="dxa" w:w="100"/>
@@ -8485,7 +8464,7 @@
       <w:tr>
         <w:tc>
           <w:tcPr>
-            <w:tcW w:type="dxa" w:w="4573"/>
+            <w:tcW w:type="dxa" w:w="4384"/>
             <w:tcMar>
               <w:top w:type="dxa" w:w="60"/>
               <w:left w:type="dxa" w:w="100"/>
@@ -8501,7 +8480,7 @@
         </w:tc>
         <w:tc>
           <w:tcPr>
-            <w:tcW w:type="dxa" w:w="2494"/>
+            <w:tcW w:type="dxa" w:w="2604"/>
             <w:tcMar>
               <w:top w:type="dxa" w:w="60"/>
               <w:left w:type="dxa" w:w="100"/>
@@ -8517,7 +8496,7 @@
         </w:tc>
         <w:tc>
           <w:tcPr>
-            <w:tcW w:type="dxa" w:w="2571"/>
+            <w:tcW w:type="dxa" w:w="2650"/>
             <w:tcMar>
               <w:top w:type="dxa" w:w="60"/>
               <w:left w:type="dxa" w:w="100"/>
@@ -8535,7 +8514,7 @@
       <w:tr>
         <w:tc>
           <w:tcPr>
-            <w:tcW w:type="dxa" w:w="4573"/>
+            <w:tcW w:type="dxa" w:w="4384"/>
             <w:tcMar>
               <w:top w:type="dxa" w:w="60"/>
               <w:left w:type="dxa" w:w="100"/>
@@ -8551,7 +8530,7 @@
         </w:tc>
         <w:tc>
           <w:tcPr>
-            <w:tcW w:type="dxa" w:w="2494"/>
+            <w:tcW w:type="dxa" w:w="2604"/>
             <w:tcMar>
               <w:top w:type="dxa" w:w="60"/>
               <w:left w:type="dxa" w:w="100"/>
@@ -8567,7 +8546,7 @@
         </w:tc>
         <w:tc>
           <w:tcPr>
-            <w:tcW w:type="dxa" w:w="2571"/>
+            <w:tcW w:type="dxa" w:w="2650"/>
             <w:tcMar>
               <w:top w:type="dxa" w:w="60"/>
               <w:left w:type="dxa" w:w="100"/>
@@ -8585,7 +8564,7 @@
       <w:tr>
         <w:tc>
           <w:tcPr>
-            <w:tcW w:type="dxa" w:w="4573"/>
+            <w:tcW w:type="dxa" w:w="4384"/>
             <w:tcMar>
               <w:top w:type="dxa" w:w="60"/>
               <w:left w:type="dxa" w:w="100"/>
@@ -8601,7 +8580,7 @@
         </w:tc>
         <w:tc>
           <w:tcPr>
-            <w:tcW w:type="dxa" w:w="2494"/>
+            <w:tcW w:type="dxa" w:w="2604"/>
             <w:tcMar>
               <w:top w:type="dxa" w:w="60"/>
               <w:left w:type="dxa" w:w="100"/>
@@ -8617,7 +8596,7 @@
         </w:tc>
         <w:tc>
           <w:tcPr>
-            <w:tcW w:type="dxa" w:w="2571"/>
+            <w:tcW w:type="dxa" w:w="2650"/>
             <w:tcMar>
               <w:top w:type="dxa" w:w="60"/>
               <w:left w:type="dxa" w:w="100"/>
@@ -8635,7 +8614,7 @@
       <w:tr>
         <w:tc>
           <w:tcPr>
-            <w:tcW w:type="dxa" w:w="4573"/>
+            <w:tcW w:type="dxa" w:w="4384"/>
             <w:tcMar>
               <w:top w:type="dxa" w:w="60"/>
               <w:left w:type="dxa" w:w="100"/>
@@ -8651,7 +8630,7 @@
         </w:tc>
         <w:tc>
           <w:tcPr>
-            <w:tcW w:type="dxa" w:w="2494"/>
+            <w:tcW w:type="dxa" w:w="2604"/>
             <w:tcMar>
               <w:top w:type="dxa" w:w="60"/>
               <w:left w:type="dxa" w:w="100"/>
@@ -8667,7 +8646,7 @@
         </w:tc>
         <w:tc>
           <w:tcPr>
-            <w:tcW w:type="dxa" w:w="2571"/>
+            <w:tcW w:type="dxa" w:w="2650"/>
             <w:tcMar>
               <w:top w:type="dxa" w:w="60"/>
               <w:left w:type="dxa" w:w="100"/>
@@ -8685,7 +8664,7 @@
       <w:tr>
         <w:tc>
           <w:tcPr>
-            <w:tcW w:type="dxa" w:w="4573"/>
+            <w:tcW w:type="dxa" w:w="4384"/>
             <w:tcMar>
               <w:top w:type="dxa" w:w="60"/>
               <w:left w:type="dxa" w:w="100"/>
@@ -8701,7 +8680,7 @@
         </w:tc>
         <w:tc>
           <w:tcPr>
-            <w:tcW w:type="dxa" w:w="2494"/>
+            <w:tcW w:type="dxa" w:w="2604"/>
             <w:tcMar>
               <w:top w:type="dxa" w:w="60"/>
               <w:left w:type="dxa" w:w="100"/>
@@ -8717,7 +8696,7 @@
         </w:tc>
         <w:tc>
           <w:tcPr>
-            <w:tcW w:type="dxa" w:w="2571"/>
+            <w:tcW w:type="dxa" w:w="2650"/>
             <w:tcMar>
               <w:top w:type="dxa" w:w="60"/>
               <w:left w:type="dxa" w:w="100"/>
@@ -8731,7 +8710,7 @@
       <w:tr>
         <w:tc>
           <w:tcPr>
-            <w:tcW w:type="dxa" w:w="4573"/>
+            <w:tcW w:type="dxa" w:w="4384"/>
             <w:tcMar>
               <w:top w:type="dxa" w:w="60"/>
               <w:left w:type="dxa" w:w="100"/>
@@ -8747,7 +8726,7 @@
         </w:tc>
         <w:tc>
           <w:tcPr>
-            <w:tcW w:type="dxa" w:w="2494"/>
+            <w:tcW w:type="dxa" w:w="2604"/>
             <w:tcMar>
               <w:top w:type="dxa" w:w="60"/>
               <w:left w:type="dxa" w:w="100"/>
@@ -8763,7 +8742,7 @@
         </w:tc>
         <w:tc>
           <w:tcPr>
-            <w:tcW w:type="dxa" w:w="2571"/>
+            <w:tcW w:type="dxa" w:w="2650"/>
             <w:tcMar>
               <w:top w:type="dxa" w:w="60"/>
               <w:left w:type="dxa" w:w="100"/>
@@ -8777,23 +8756,23 @@
       <w:tr>
         <w:tc>
           <w:tcPr>
-            <w:tcW w:type="dxa" w:w="4573"/>
-            <w:tcMar>
-              <w:top w:type="dxa" w:w="60"/>
-              <w:left w:type="dxa" w:w="100"/>
-              <w:bottom w:type="dxa" w:w="60"/>
-              <w:right w:type="dxa" w:w="100"/>
-            </w:tcMar>
-          </w:tcPr>
-          <w:p>
-            <w:r>
-              <w:t xml:space="preserve">WhatsApp corporativo</w:t>
-            </w:r>
-          </w:p>
-        </w:tc>
-        <w:tc>
-          <w:tcPr>
-            <w:tcW w:type="dxa" w:w="2494"/>
+            <w:tcW w:type="dxa" w:w="4384"/>
+            <w:tcMar>
+              <w:top w:type="dxa" w:w="60"/>
+              <w:left w:type="dxa" w:w="100"/>
+              <w:bottom w:type="dxa" w:w="60"/>
+              <w:right w:type="dxa" w:w="100"/>
+            </w:tcMar>
+          </w:tcPr>
+          <w:p>
+            <w:r>
+              <w:t xml:space="preserve">Outro</w:t>
+            </w:r>
+          </w:p>
+        </w:tc>
+        <w:tc>
+          <w:tcPr>
+            <w:tcW w:type="dxa" w:w="2604"/>
             <w:tcMar>
               <w:top w:type="dxa" w:w="60"/>
               <w:left w:type="dxa" w:w="100"/>
@@ -8809,57 +8788,7 @@
         </w:tc>
         <w:tc>
           <w:tcPr>
-            <w:tcW w:type="dxa" w:w="2571"/>
-            <w:tcMar>
-              <w:top w:type="dxa" w:w="60"/>
-              <w:left w:type="dxa" w:w="100"/>
-              <w:bottom w:type="dxa" w:w="60"/>
-              <w:right w:type="dxa" w:w="100"/>
-            </w:tcMar>
-          </w:tcPr>
-          <w:p>
-            <w:r>
-              <w:t xml:space="preserve">grupos:</w:t>
-            </w:r>
-          </w:p>
-        </w:tc>
-      </w:tr>
-      <w:tr>
-        <w:tc>
-          <w:tcPr>
-            <w:tcW w:type="dxa" w:w="4573"/>
-            <w:tcMar>
-              <w:top w:type="dxa" w:w="60"/>
-              <w:left w:type="dxa" w:w="100"/>
-              <w:bottom w:type="dxa" w:w="60"/>
-              <w:right w:type="dxa" w:w="100"/>
-            </w:tcMar>
-          </w:tcPr>
-          <w:p>
-            <w:r>
-              <w:t xml:space="preserve">Outro</w:t>
-            </w:r>
-          </w:p>
-        </w:tc>
-        <w:tc>
-          <w:tcPr>
-            <w:tcW w:type="dxa" w:w="2494"/>
-            <w:tcMar>
-              <w:top w:type="dxa" w:w="60"/>
-              <w:left w:type="dxa" w:w="100"/>
-              <w:bottom w:type="dxa" w:w="60"/>
-              <w:right w:type="dxa" w:w="100"/>
-            </w:tcMar>
-          </w:tcPr>
-          <w:p>
-            <w:r>
-              <w:t xml:space="preserve">☐</w:t>
-            </w:r>
-          </w:p>
-        </w:tc>
-        <w:tc>
-          <w:tcPr>
-            <w:tcW w:type="dxa" w:w="2571"/>
+            <w:tcW w:type="dxa" w:w="2650"/>
             <w:tcMar>
               <w:top w:type="dxa" w:w="60"/>
               <w:left w:type="dxa" w:w="100"/>
@@ -8949,11 +8878,11 @@
         </w:tblBorders>
       </w:tblPr>
       <w:tblGrid>
-        <w:gridCol w:w="3370"/>
-        <w:gridCol w:w="1566"/>
-        <w:gridCol w:w="1566"/>
-        <w:gridCol w:w="1566"/>
-        <w:gridCol w:w="1570"/>
+        <w:gridCol w:w="3248"/>
+        <w:gridCol w:w="1597"/>
+        <w:gridCol w:w="1597"/>
+        <w:gridCol w:w="1597"/>
+        <w:gridCol w:w="1599"/>
       </w:tblGrid>
       <w:tr>
         <w:trPr>
@@ -8961,7 +8890,7 @@
         </w:trPr>
         <w:tc>
           <w:tcPr>
-            <w:tcW w:type="dxa" w:w="3370"/>
+            <w:tcW w:type="dxa" w:w="3248"/>
             <w:shd w:fill="EEEEEE" w:color="auto" w:val="clear"/>
             <w:tcMar>
               <w:top w:type="dxa" w:w="60"/>
@@ -8982,7 +8911,7 @@
         </w:tc>
         <w:tc>
           <w:tcPr>
-            <w:tcW w:type="dxa" w:w="1566"/>
+            <w:tcW w:type="dxa" w:w="1597"/>
             <w:shd w:fill="EEEEEE" w:color="auto" w:val="clear"/>
             <w:tcMar>
               <w:top w:type="dxa" w:w="60"/>
@@ -9003,7 +8932,7 @@
         </w:tc>
         <w:tc>
           <w:tcPr>
-            <w:tcW w:type="dxa" w:w="1566"/>
+            <w:tcW w:type="dxa" w:w="1597"/>
             <w:shd w:fill="EEEEEE" w:color="auto" w:val="clear"/>
             <w:tcMar>
               <w:top w:type="dxa" w:w="60"/>
@@ -9024,7 +8953,7 @@
         </w:tc>
         <w:tc>
           <w:tcPr>
-            <w:tcW w:type="dxa" w:w="1566"/>
+            <w:tcW w:type="dxa" w:w="1597"/>
             <w:shd w:fill="EEEEEE" w:color="auto" w:val="clear"/>
             <w:tcMar>
               <w:top w:type="dxa" w:w="60"/>
@@ -9045,7 +8974,7 @@
         </w:tc>
         <w:tc>
           <w:tcPr>
-            <w:tcW w:type="dxa" w:w="1570"/>
+            <w:tcW w:type="dxa" w:w="1599"/>
             <w:shd w:fill="EEEEEE" w:color="auto" w:val="clear"/>
             <w:tcMar>
               <w:top w:type="dxa" w:w="60"/>
@@ -9068,7 +8997,7 @@
       <w:tr>
         <w:tc>
           <w:tcPr>
-            <w:tcW w:type="dxa" w:w="3370"/>
+            <w:tcW w:type="dxa" w:w="3248"/>
             <w:tcMar>
               <w:top w:type="dxa" w:w="60"/>
               <w:left w:type="dxa" w:w="100"/>
@@ -9084,7 +9013,7 @@
         </w:tc>
         <w:tc>
           <w:tcPr>
-            <w:tcW w:type="dxa" w:w="1566"/>
+            <w:tcW w:type="dxa" w:w="1597"/>
             <w:tcMar>
               <w:top w:type="dxa" w:w="60"/>
               <w:left w:type="dxa" w:w="100"/>
@@ -9096,7 +9025,7 @@
         </w:tc>
         <w:tc>
           <w:tcPr>
-            <w:tcW w:type="dxa" w:w="1566"/>
+            <w:tcW w:type="dxa" w:w="1597"/>
             <w:tcMar>
               <w:top w:type="dxa" w:w="60"/>
               <w:left w:type="dxa" w:w="100"/>
@@ -9108,7 +9037,7 @@
         </w:tc>
         <w:tc>
           <w:tcPr>
-            <w:tcW w:type="dxa" w:w="1566"/>
+            <w:tcW w:type="dxa" w:w="1597"/>
             <w:tcMar>
               <w:top w:type="dxa" w:w="60"/>
               <w:left w:type="dxa" w:w="100"/>
@@ -9120,7 +9049,7 @@
         </w:tc>
         <w:tc>
           <w:tcPr>
-            <w:tcW w:type="dxa" w:w="1570"/>
+            <w:tcW w:type="dxa" w:w="1599"/>
             <w:tcMar>
               <w:top w:type="dxa" w:w="60"/>
               <w:left w:type="dxa" w:w="100"/>
@@ -9134,7 +9063,7 @@
       <w:tr>
         <w:tc>
           <w:tcPr>
-            <w:tcW w:type="dxa" w:w="3370"/>
+            <w:tcW w:type="dxa" w:w="3248"/>
             <w:tcMar>
               <w:top w:type="dxa" w:w="60"/>
               <w:left w:type="dxa" w:w="100"/>
@@ -9150,7 +9079,7 @@
         </w:tc>
         <w:tc>
           <w:tcPr>
-            <w:tcW w:type="dxa" w:w="1566"/>
+            <w:tcW w:type="dxa" w:w="1597"/>
             <w:tcMar>
               <w:top w:type="dxa" w:w="60"/>
               <w:left w:type="dxa" w:w="100"/>
@@ -9162,7 +9091,7 @@
         </w:tc>
         <w:tc>
           <w:tcPr>
-            <w:tcW w:type="dxa" w:w="1566"/>
+            <w:tcW w:type="dxa" w:w="1597"/>
             <w:tcMar>
               <w:top w:type="dxa" w:w="60"/>
               <w:left w:type="dxa" w:w="100"/>
@@ -9174,7 +9103,7 @@
         </w:tc>
         <w:tc>
           <w:tcPr>
-            <w:tcW w:type="dxa" w:w="1566"/>
+            <w:tcW w:type="dxa" w:w="1597"/>
             <w:tcMar>
               <w:top w:type="dxa" w:w="60"/>
               <w:left w:type="dxa" w:w="100"/>
@@ -9186,7 +9115,7 @@
         </w:tc>
         <w:tc>
           <w:tcPr>
-            <w:tcW w:type="dxa" w:w="1570"/>
+            <w:tcW w:type="dxa" w:w="1599"/>
             <w:tcMar>
               <w:top w:type="dxa" w:w="60"/>
               <w:left w:type="dxa" w:w="100"/>
@@ -9200,7 +9129,7 @@
       <w:tr>
         <w:tc>
           <w:tcPr>
-            <w:tcW w:type="dxa" w:w="3370"/>
+            <w:tcW w:type="dxa" w:w="3248"/>
             <w:tcMar>
               <w:top w:type="dxa" w:w="60"/>
               <w:left w:type="dxa" w:w="100"/>
@@ -9216,7 +9145,7 @@
         </w:tc>
         <w:tc>
           <w:tcPr>
-            <w:tcW w:type="dxa" w:w="1566"/>
+            <w:tcW w:type="dxa" w:w="1597"/>
             <w:tcMar>
               <w:top w:type="dxa" w:w="60"/>
               <w:left w:type="dxa" w:w="100"/>
@@ -9228,7 +9157,7 @@
         </w:tc>
         <w:tc>
           <w:tcPr>
-            <w:tcW w:type="dxa" w:w="1566"/>
+            <w:tcW w:type="dxa" w:w="1597"/>
             <w:tcMar>
               <w:top w:type="dxa" w:w="60"/>
               <w:left w:type="dxa" w:w="100"/>
@@ -9240,7 +9169,7 @@
         </w:tc>
         <w:tc>
           <w:tcPr>
-            <w:tcW w:type="dxa" w:w="1566"/>
+            <w:tcW w:type="dxa" w:w="1597"/>
             <w:tcMar>
               <w:top w:type="dxa" w:w="60"/>
               <w:left w:type="dxa" w:w="100"/>
@@ -9252,7 +9181,7 @@
         </w:tc>
         <w:tc>
           <w:tcPr>
-            <w:tcW w:type="dxa" w:w="1570"/>
+            <w:tcW w:type="dxa" w:w="1599"/>
             <w:tcMar>
               <w:top w:type="dxa" w:w="60"/>
               <w:left w:type="dxa" w:w="100"/>
@@ -9266,7 +9195,7 @@
       <w:tr>
         <w:tc>
           <w:tcPr>
-            <w:tcW w:type="dxa" w:w="3370"/>
+            <w:tcW w:type="dxa" w:w="3248"/>
             <w:tcMar>
               <w:top w:type="dxa" w:w="60"/>
               <w:left w:type="dxa" w:w="100"/>
@@ -9282,7 +9211,7 @@
         </w:tc>
         <w:tc>
           <w:tcPr>
-            <w:tcW w:type="dxa" w:w="1566"/>
+            <w:tcW w:type="dxa" w:w="1597"/>
             <w:tcMar>
               <w:top w:type="dxa" w:w="60"/>
               <w:left w:type="dxa" w:w="100"/>
@@ -9294,7 +9223,7 @@
         </w:tc>
         <w:tc>
           <w:tcPr>
-            <w:tcW w:type="dxa" w:w="1566"/>
+            <w:tcW w:type="dxa" w:w="1597"/>
             <w:tcMar>
               <w:top w:type="dxa" w:w="60"/>
               <w:left w:type="dxa" w:w="100"/>
@@ -9306,7 +9235,7 @@
         </w:tc>
         <w:tc>
           <w:tcPr>
-            <w:tcW w:type="dxa" w:w="1566"/>
+            <w:tcW w:type="dxa" w:w="1597"/>
             <w:tcMar>
               <w:top w:type="dxa" w:w="60"/>
               <w:left w:type="dxa" w:w="100"/>
@@ -9318,7 +9247,7 @@
         </w:tc>
         <w:tc>
           <w:tcPr>
-            <w:tcW w:type="dxa" w:w="1570"/>
+            <w:tcW w:type="dxa" w:w="1599"/>
             <w:tcMar>
               <w:top w:type="dxa" w:w="60"/>
               <w:left w:type="dxa" w:w="100"/>
@@ -9332,7 +9261,7 @@
       <w:tr>
         <w:tc>
           <w:tcPr>
-            <w:tcW w:type="dxa" w:w="3370"/>
+            <w:tcW w:type="dxa" w:w="3248"/>
             <w:tcMar>
               <w:top w:type="dxa" w:w="60"/>
               <w:left w:type="dxa" w:w="100"/>
@@ -9348,7 +9277,7 @@
         </w:tc>
         <w:tc>
           <w:tcPr>
-            <w:tcW w:type="dxa" w:w="1566"/>
+            <w:tcW w:type="dxa" w:w="1597"/>
             <w:tcMar>
               <w:top w:type="dxa" w:w="60"/>
               <w:left w:type="dxa" w:w="100"/>
@@ -9360,7 +9289,7 @@
         </w:tc>
         <w:tc>
           <w:tcPr>
-            <w:tcW w:type="dxa" w:w="1566"/>
+            <w:tcW w:type="dxa" w:w="1597"/>
             <w:tcMar>
               <w:top w:type="dxa" w:w="60"/>
               <w:left w:type="dxa" w:w="100"/>
@@ -9372,7 +9301,7 @@
         </w:tc>
         <w:tc>
           <w:tcPr>
-            <w:tcW w:type="dxa" w:w="1566"/>
+            <w:tcW w:type="dxa" w:w="1597"/>
             <w:tcMar>
               <w:top w:type="dxa" w:w="60"/>
               <w:left w:type="dxa" w:w="100"/>
@@ -9384,7 +9313,7 @@
         </w:tc>
         <w:tc>
           <w:tcPr>
-            <w:tcW w:type="dxa" w:w="1570"/>
+            <w:tcW w:type="dxa" w:w="1599"/>
             <w:tcMar>
               <w:top w:type="dxa" w:w="60"/>
               <w:left w:type="dxa" w:w="100"/>
@@ -9398,7 +9327,7 @@
       <w:tr>
         <w:tc>
           <w:tcPr>
-            <w:tcW w:type="dxa" w:w="3370"/>
+            <w:tcW w:type="dxa" w:w="3248"/>
             <w:tcMar>
               <w:top w:type="dxa" w:w="60"/>
               <w:left w:type="dxa" w:w="100"/>
@@ -9414,7 +9343,7 @@
         </w:tc>
         <w:tc>
           <w:tcPr>
-            <w:tcW w:type="dxa" w:w="1566"/>
+            <w:tcW w:type="dxa" w:w="1597"/>
             <w:tcMar>
               <w:top w:type="dxa" w:w="60"/>
               <w:left w:type="dxa" w:w="100"/>
@@ -9426,7 +9355,7 @@
         </w:tc>
         <w:tc>
           <w:tcPr>
-            <w:tcW w:type="dxa" w:w="1566"/>
+            <w:tcW w:type="dxa" w:w="1597"/>
             <w:tcMar>
               <w:top w:type="dxa" w:w="60"/>
               <w:left w:type="dxa" w:w="100"/>
@@ -9438,7 +9367,7 @@
         </w:tc>
         <w:tc>
           <w:tcPr>
-            <w:tcW w:type="dxa" w:w="1566"/>
+            <w:tcW w:type="dxa" w:w="1597"/>
             <w:tcMar>
               <w:top w:type="dxa" w:w="60"/>
               <w:left w:type="dxa" w:w="100"/>
@@ -9450,7 +9379,7 @@
         </w:tc>
         <w:tc>
           <w:tcPr>
-            <w:tcW w:type="dxa" w:w="1570"/>
+            <w:tcW w:type="dxa" w:w="1599"/>
             <w:tcMar>
               <w:top w:type="dxa" w:w="60"/>
               <w:left w:type="dxa" w:w="100"/>
@@ -9464,23 +9393,23 @@
       <w:tr>
         <w:tc>
           <w:tcPr>
-            <w:tcW w:type="dxa" w:w="3370"/>
-            <w:tcMar>
-              <w:top w:type="dxa" w:w="60"/>
-              <w:left w:type="dxa" w:w="100"/>
-              <w:bottom w:type="dxa" w:w="60"/>
-              <w:right w:type="dxa" w:w="100"/>
-            </w:tcMar>
-          </w:tcPr>
-          <w:p>
-            <w:r>
-              <w:t xml:space="preserve">WhatsApp corporativo</w:t>
-            </w:r>
-          </w:p>
-        </w:tc>
-        <w:tc>
-          <w:tcPr>
-            <w:tcW w:type="dxa" w:w="1566"/>
+            <w:tcW w:type="dxa" w:w="3248"/>
+            <w:tcMar>
+              <w:top w:type="dxa" w:w="60"/>
+              <w:left w:type="dxa" w:w="100"/>
+              <w:bottom w:type="dxa" w:w="60"/>
+              <w:right w:type="dxa" w:w="100"/>
+            </w:tcMar>
+          </w:tcPr>
+          <w:p>
+            <w:r>
+              <w:t xml:space="preserve">Acesso remoto / VPN</w:t>
+            </w:r>
+          </w:p>
+        </w:tc>
+        <w:tc>
+          <w:tcPr>
+            <w:tcW w:type="dxa" w:w="1597"/>
             <w:tcMar>
               <w:top w:type="dxa" w:w="60"/>
               <w:left w:type="dxa" w:w="100"/>
@@ -9492,7 +9421,7 @@
         </w:tc>
         <w:tc>
           <w:tcPr>
-            <w:tcW w:type="dxa" w:w="1566"/>
+            <w:tcW w:type="dxa" w:w="1597"/>
             <w:tcMar>
               <w:top w:type="dxa" w:w="60"/>
               <w:left w:type="dxa" w:w="100"/>
@@ -9504,7 +9433,7 @@
         </w:tc>
         <w:tc>
           <w:tcPr>
-            <w:tcW w:type="dxa" w:w="1566"/>
+            <w:tcW w:type="dxa" w:w="1597"/>
             <w:tcMar>
               <w:top w:type="dxa" w:w="60"/>
               <w:left w:type="dxa" w:w="100"/>
@@ -9516,7 +9445,7 @@
         </w:tc>
         <w:tc>
           <w:tcPr>
-            <w:tcW w:type="dxa" w:w="1570"/>
+            <w:tcW w:type="dxa" w:w="1599"/>
             <w:tcMar>
               <w:top w:type="dxa" w:w="60"/>
               <w:left w:type="dxa" w:w="100"/>
@@ -9530,23 +9459,23 @@
       <w:tr>
         <w:tc>
           <w:tcPr>
-            <w:tcW w:type="dxa" w:w="3370"/>
-            <w:tcMar>
-              <w:top w:type="dxa" w:w="60"/>
-              <w:left w:type="dxa" w:w="100"/>
-              <w:bottom w:type="dxa" w:w="60"/>
-              <w:right w:type="dxa" w:w="100"/>
-            </w:tcMar>
-          </w:tcPr>
-          <w:p>
-            <w:r>
-              <w:t xml:space="preserve">Acesso remoto / VPN</w:t>
-            </w:r>
-          </w:p>
-        </w:tc>
-        <w:tc>
-          <w:tcPr>
-            <w:tcW w:type="dxa" w:w="1566"/>
+            <w:tcW w:type="dxa" w:w="3248"/>
+            <w:tcMar>
+              <w:top w:type="dxa" w:w="60"/>
+              <w:left w:type="dxa" w:w="100"/>
+              <w:bottom w:type="dxa" w:w="60"/>
+              <w:right w:type="dxa" w:w="100"/>
+            </w:tcMar>
+          </w:tcPr>
+          <w:p>
+            <w:r>
+              <w:t xml:space="preserve">Senhas compartilhadas que conhece</w:t>
+            </w:r>
+          </w:p>
+        </w:tc>
+        <w:tc>
+          <w:tcPr>
+            <w:tcW w:type="dxa" w:w="1597"/>
             <w:tcMar>
               <w:top w:type="dxa" w:w="60"/>
               <w:left w:type="dxa" w:w="100"/>
@@ -9558,7 +9487,7 @@
         </w:tc>
         <w:tc>
           <w:tcPr>
-            <w:tcW w:type="dxa" w:w="1566"/>
+            <w:tcW w:type="dxa" w:w="1597"/>
             <w:tcMar>
               <w:top w:type="dxa" w:w="60"/>
               <w:left w:type="dxa" w:w="100"/>
@@ -9570,7 +9499,7 @@
         </w:tc>
         <w:tc>
           <w:tcPr>
-            <w:tcW w:type="dxa" w:w="1566"/>
+            <w:tcW w:type="dxa" w:w="1597"/>
             <w:tcMar>
               <w:top w:type="dxa" w:w="60"/>
               <w:left w:type="dxa" w:w="100"/>
@@ -9582,7 +9511,7 @@
         </w:tc>
         <w:tc>
           <w:tcPr>
-            <w:tcW w:type="dxa" w:w="1570"/>
+            <w:tcW w:type="dxa" w:w="1599"/>
             <w:tcMar>
               <w:top w:type="dxa" w:w="60"/>
               <w:left w:type="dxa" w:w="100"/>
@@ -9596,23 +9525,23 @@
       <w:tr>
         <w:tc>
           <w:tcPr>
-            <w:tcW w:type="dxa" w:w="3370"/>
-            <w:tcMar>
-              <w:top w:type="dxa" w:w="60"/>
-              <w:left w:type="dxa" w:w="100"/>
-              <w:bottom w:type="dxa" w:w="60"/>
-              <w:right w:type="dxa" w:w="100"/>
-            </w:tcMar>
-          </w:tcPr>
-          <w:p>
-            <w:r>
-              <w:t xml:space="preserve">Senhas compartilhadas que conhece</w:t>
-            </w:r>
-          </w:p>
-        </w:tc>
-        <w:tc>
-          <w:tcPr>
-            <w:tcW w:type="dxa" w:w="1566"/>
+            <w:tcW w:type="dxa" w:w="3248"/>
+            <w:tcMar>
+              <w:top w:type="dxa" w:w="60"/>
+              <w:left w:type="dxa" w:w="100"/>
+              <w:bottom w:type="dxa" w:w="60"/>
+              <w:right w:type="dxa" w:w="100"/>
+            </w:tcMar>
+          </w:tcPr>
+          <w:p>
+            <w:r>
+              <w:t xml:space="preserve">Outro</w:t>
+            </w:r>
+          </w:p>
+        </w:tc>
+        <w:tc>
+          <w:tcPr>
+            <w:tcW w:type="dxa" w:w="1597"/>
             <w:tcMar>
               <w:top w:type="dxa" w:w="60"/>
               <w:left w:type="dxa" w:w="100"/>
@@ -9624,7 +9553,7 @@
         </w:tc>
         <w:tc>
           <w:tcPr>
-            <w:tcW w:type="dxa" w:w="1566"/>
+            <w:tcW w:type="dxa" w:w="1597"/>
             <w:tcMar>
               <w:top w:type="dxa" w:w="60"/>
               <w:left w:type="dxa" w:w="100"/>
@@ -9636,7 +9565,7 @@
         </w:tc>
         <w:tc>
           <w:tcPr>
-            <w:tcW w:type="dxa" w:w="1566"/>
+            <w:tcW w:type="dxa" w:w="1597"/>
             <w:tcMar>
               <w:top w:type="dxa" w:w="60"/>
               <w:left w:type="dxa" w:w="100"/>
@@ -9648,73 +9577,7 @@
         </w:tc>
         <w:tc>
           <w:tcPr>
-            <w:tcW w:type="dxa" w:w="1570"/>
-            <w:tcMar>
-              <w:top w:type="dxa" w:w="60"/>
-              <w:left w:type="dxa" w:w="100"/>
-              <w:bottom w:type="dxa" w:w="60"/>
-              <w:right w:type="dxa" w:w="100"/>
-            </w:tcMar>
-          </w:tcPr>
-          <w:p/>
-        </w:tc>
-      </w:tr>
-      <w:tr>
-        <w:tc>
-          <w:tcPr>
-            <w:tcW w:type="dxa" w:w="3370"/>
-            <w:tcMar>
-              <w:top w:type="dxa" w:w="60"/>
-              <w:left w:type="dxa" w:w="100"/>
-              <w:bottom w:type="dxa" w:w="60"/>
-              <w:right w:type="dxa" w:w="100"/>
-            </w:tcMar>
-          </w:tcPr>
-          <w:p>
-            <w:r>
-              <w:t xml:space="preserve">Outro</w:t>
-            </w:r>
-          </w:p>
-        </w:tc>
-        <w:tc>
-          <w:tcPr>
-            <w:tcW w:type="dxa" w:w="1566"/>
-            <w:tcMar>
-              <w:top w:type="dxa" w:w="60"/>
-              <w:left w:type="dxa" w:w="100"/>
-              <w:bottom w:type="dxa" w:w="60"/>
-              <w:right w:type="dxa" w:w="100"/>
-            </w:tcMar>
-          </w:tcPr>
-          <w:p/>
-        </w:tc>
-        <w:tc>
-          <w:tcPr>
-            <w:tcW w:type="dxa" w:w="1566"/>
-            <w:tcMar>
-              <w:top w:type="dxa" w:w="60"/>
-              <w:left w:type="dxa" w:w="100"/>
-              <w:bottom w:type="dxa" w:w="60"/>
-              <w:right w:type="dxa" w:w="100"/>
-            </w:tcMar>
-          </w:tcPr>
-          <w:p/>
-        </w:tc>
-        <w:tc>
-          <w:tcPr>
-            <w:tcW w:type="dxa" w:w="1566"/>
-            <w:tcMar>
-              <w:top w:type="dxa" w:w="60"/>
-              <w:left w:type="dxa" w:w="100"/>
-              <w:bottom w:type="dxa" w:w="60"/>
-              <w:right w:type="dxa" w:w="100"/>
-            </w:tcMar>
-          </w:tcPr>
-          <w:p/>
-        </w:tc>
-        <w:tc>
-          <w:tcPr>
-            <w:tcW w:type="dxa" w:w="1570"/>
+            <w:tcW w:type="dxa" w:w="1599"/>
             <w:tcMar>
               <w:top w:type="dxa" w:w="60"/>
               <w:left w:type="dxa" w:w="100"/>
@@ -10158,7 +10021,7 @@
         <w:t xml:space="preserve">6.	</w:t>
       </w:r>
       <w:r>
-        <w:t xml:space="preserve">Autorizo o uso da minha foto no perfil do WhatsApp corporativo, no e-mail e na assinatura de e-mail, somente enquanto eu trabalhar na empresa.</w:t>
+        <w:t xml:space="preserve">Autorizo o uso da minha foto no e-mail e na assinatura de e-mail, somente enquanto eu trabalhar na empresa.</w:t>
       </w:r>
     </w:p>
     <w:p>

</xml_diff>

<commit_message>
Férias, atestados e afastamentos ficam só com o RH
POP-11 v1.1: sai a seção de afastamento; a TI não participa. Formulários A e D sem o tipo Afastamento. Formulário A: perfil B corrigido para Oficina. Impressão regerada.

Co-Authored-By: Claude Opus 5.5 <noreply@anthropic.com>
</commit_message>
<xml_diff>
--- a/impressao/POPs-RH-revisao.docx
+++ b/impressao/POPs-RH-revisao.docx
@@ -4165,7 +4165,7 @@
         <w:t xml:space="preserve">Versão:</w:t>
       </w:r>
       <w:r>
-        <w:t xml:space="preserve"> 1.0 · </w:t>
+        <w:t xml:space="preserve"> 1.1 · </w:t>
       </w:r>
       <w:r>
         <w:rPr>
@@ -4175,7 +4175,7 @@
         <w:t xml:space="preserve">Data:</w:t>
       </w:r>
       <w:r>
-        <w:t xml:space="preserve"> 15/10/2026 · </w:t>
+        <w:t xml:space="preserve"> 16/10/2026 · </w:t>
       </w:r>
       <w:r>
         <w:rPr>
@@ -4229,7 +4229,7 @@
         <w:t xml:space="preserve">iguais ao que a função atual precisa</w:t>
       </w:r>
       <w:r>
-        <w:t xml:space="preserve">: nem faltando, nem sobrando. Cobre quatro situações:</w:t>
+        <w:t xml:space="preserve">: nem faltando, nem sobrando. Cobre três situações:</w:t>
       </w:r>
     </w:p>
     <w:tbl>
@@ -4245,9 +4245,9 @@
         </w:tblBorders>
       </w:tblPr>
       <w:tblGrid>
-        <w:gridCol w:w="1396"/>
-        <w:gridCol w:w="5633"/>
-        <w:gridCol w:w="2609"/>
+        <w:gridCol w:w="1352"/>
+        <w:gridCol w:w="5241"/>
+        <w:gridCol w:w="3045"/>
       </w:tblGrid>
       <w:tr>
         <w:trPr>
@@ -4255,7 +4255,7 @@
         </w:trPr>
         <w:tc>
           <w:tcPr>
-            <w:tcW w:type="dxa" w:w="1396"/>
+            <w:tcW w:type="dxa" w:w="1352"/>
             <w:shd w:fill="EEEEEE" w:color="auto" w:val="clear"/>
             <w:tcMar>
               <w:top w:type="dxa" w:w="60"/>
@@ -4276,7 +4276,7 @@
         </w:tc>
         <w:tc>
           <w:tcPr>
-            <w:tcW w:type="dxa" w:w="5633"/>
+            <w:tcW w:type="dxa" w:w="5241"/>
             <w:shd w:fill="EEEEEE" w:color="auto" w:val="clear"/>
             <w:tcMar>
               <w:top w:type="dxa" w:w="60"/>
@@ -4297,7 +4297,7 @@
         </w:tc>
         <w:tc>
           <w:tcPr>
-            <w:tcW w:type="dxa" w:w="2609"/>
+            <w:tcW w:type="dxa" w:w="3045"/>
             <w:shd w:fill="EEEEEE" w:color="auto" w:val="clear"/>
             <w:tcMar>
               <w:top w:type="dxa" w:w="60"/>
@@ -4320,7 +4320,7 @@
       <w:tr>
         <w:tc>
           <w:tcPr>
-            <w:tcW w:type="dxa" w:w="1396"/>
+            <w:tcW w:type="dxa" w:w="1352"/>
             <w:tcMar>
               <w:top w:type="dxa" w:w="60"/>
               <w:left w:type="dxa" w:w="100"/>
@@ -4336,7 +4336,7 @@
         </w:tc>
         <w:tc>
           <w:tcPr>
-            <w:tcW w:type="dxa" w:w="5633"/>
+            <w:tcW w:type="dxa" w:w="5241"/>
             <w:tcMar>
               <w:top w:type="dxa" w:w="60"/>
               <w:left w:type="dxa" w:w="100"/>
@@ -4352,7 +4352,7 @@
         </w:tc>
         <w:tc>
           <w:tcPr>
-            <w:tcW w:type="dxa" w:w="2609"/>
+            <w:tcW w:type="dxa" w:w="3045"/>
             <w:tcMar>
               <w:top w:type="dxa" w:w="60"/>
               <w:left w:type="dxa" w:w="100"/>
@@ -4370,7 +4370,7 @@
       <w:tr>
         <w:tc>
           <w:tcPr>
-            <w:tcW w:type="dxa" w:w="1396"/>
+            <w:tcW w:type="dxa" w:w="1352"/>
             <w:tcMar>
               <w:top w:type="dxa" w:w="60"/>
               <w:left w:type="dxa" w:w="100"/>
@@ -4386,7 +4386,7 @@
         </w:tc>
         <w:tc>
           <w:tcPr>
-            <w:tcW w:type="dxa" w:w="5633"/>
+            <w:tcW w:type="dxa" w:w="5241"/>
             <w:tcMar>
               <w:top w:type="dxa" w:w="60"/>
               <w:left w:type="dxa" w:w="100"/>
@@ -4402,7 +4402,7 @@
         </w:tc>
         <w:tc>
           <w:tcPr>
-            <w:tcW w:type="dxa" w:w="2609"/>
+            <w:tcW w:type="dxa" w:w="3045"/>
             <w:tcMar>
               <w:top w:type="dxa" w:w="60"/>
               <w:left w:type="dxa" w:w="100"/>
@@ -4420,7 +4420,7 @@
       <w:tr>
         <w:tc>
           <w:tcPr>
-            <w:tcW w:type="dxa" w:w="1396"/>
+            <w:tcW w:type="dxa" w:w="1352"/>
             <w:tcMar>
               <w:top w:type="dxa" w:w="60"/>
               <w:left w:type="dxa" w:w="100"/>
@@ -4436,7 +4436,7 @@
         </w:tc>
         <w:tc>
           <w:tcPr>
-            <w:tcW w:type="dxa" w:w="5633"/>
+            <w:tcW w:type="dxa" w:w="5241"/>
             <w:tcMar>
               <w:top w:type="dxa" w:w="60"/>
               <w:left w:type="dxa" w:w="100"/>
@@ -4452,7 +4452,7 @@
         </w:tc>
         <w:tc>
           <w:tcPr>
-            <w:tcW w:type="dxa" w:w="2609"/>
+            <w:tcW w:type="dxa" w:w="3045"/>
             <w:tcMar>
               <w:top w:type="dxa" w:w="60"/>
               <w:left w:type="dxa" w:w="100"/>
@@ -4463,62 +4463,27 @@
           <w:p>
             <w:r>
               <w:t xml:space="preserve">Funcionário, gestor ou TI</w:t>
-            </w:r>
-          </w:p>
-        </w:tc>
-      </w:tr>
-      <w:tr>
-        <w:tc>
-          <w:tcPr>
-            <w:tcW w:type="dxa" w:w="1396"/>
-            <w:tcMar>
-              <w:top w:type="dxa" w:w="60"/>
-              <w:left w:type="dxa" w:w="100"/>
-              <w:bottom w:type="dxa" w:w="60"/>
-              <w:right w:type="dxa" w:w="100"/>
-            </w:tcMar>
-          </w:tcPr>
-          <w:p>
-            <w:r>
-              <w:t xml:space="preserve">6</w:t>
-            </w:r>
-          </w:p>
-        </w:tc>
-        <w:tc>
-          <w:tcPr>
-            <w:tcW w:type="dxa" w:w="5633"/>
-            <w:tcMar>
-              <w:top w:type="dxa" w:w="60"/>
-              <w:left w:type="dxa" w:w="100"/>
-              <w:bottom w:type="dxa" w:w="60"/>
-              <w:right w:type="dxa" w:w="100"/>
-            </w:tcMar>
-          </w:tcPr>
-          <w:p>
-            <w:r>
-              <w:t xml:space="preserve">Afastamento ou férias longas</w:t>
-            </w:r>
-          </w:p>
-        </w:tc>
-        <w:tc>
-          <w:tcPr>
-            <w:tcW w:type="dxa" w:w="2609"/>
-            <w:tcMar>
-              <w:top w:type="dxa" w:w="60"/>
-              <w:left w:type="dxa" w:w="100"/>
-              <w:bottom w:type="dxa" w:w="60"/>
-              <w:right w:type="dxa" w:w="100"/>
-            </w:tcMar>
-          </w:tcPr>
-          <w:p>
-            <w:r>
-              <w:t xml:space="preserve">RH</w:t>
             </w:r>
           </w:p>
         </w:tc>
       </w:tr>
     </w:tbl>
     <w:p/>
+    <w:p>
+      <w:pPr>
+        <w:spacing w:after="120"/>
+      </w:pPr>
+      <w:r>
+        <w:rPr>
+          <w:b/>
+          <w:bCs/>
+        </w:rPr>
+        <w:t xml:space="preserve">Férias, atestados e afastamentos são assunto só do RH:</w:t>
+      </w:r>
+      <w:r>
+        <w:t xml:space="preserve"> não abrem chamado para a TI e não mudam acessos nem equipamentos. Se o afastamento virar desligamento, segue o POP-02.</w:t>
+      </w:r>
+    </w:p>
     <w:p>
       <w:pPr>
         <w:pStyle w:val="Heading2"/>
@@ -5264,215 +5229,7 @@
         <w:pStyle w:val="Heading2"/>
       </w:pPr>
       <w:r>
-        <w:t xml:space="preserve">6. Afastamento ou férias longas</w:t>
-      </w:r>
-    </w:p>
-    <w:p>
-      <w:pPr>
-        <w:spacing w:after="120"/>
-      </w:pPr>
-      <w:r>
-        <w:rPr>
-          <w:b/>
-          <w:bCs/>
-        </w:rPr>
-        <w:t xml:space="preserve">Quando aplicar:</w:t>
-      </w:r>
-      <w:r>
-        <w:t xml:space="preserve"> férias ou afastamento de </w:t>
-      </w:r>
-      <w:r>
-        <w:rPr>
-          <w:b/>
-          <w:bCs/>
-        </w:rPr>
-        <w:t xml:space="preserve">15 dias ou mais</w:t>
-      </w:r>
-      <w:r>
-        <w:t xml:space="preserve"> (licença, afastamento médico, suspensão).</w:t>
-      </w:r>
-    </w:p>
-    <w:p>
-      <w:pPr>
-        <w:spacing w:after="120"/>
-      </w:pPr>
-      <w:r>
-        <w:rPr>
-          <w:b/>
-          <w:bCs/>
-        </w:rPr>
-        <w:t xml:space="preserve">Regra:</w:t>
-      </w:r>
-      <w:r>
-        <w:t xml:space="preserve"> </w:t>
-      </w:r>
-      <w:r>
-        <w:rPr>
-          <w:b/>
-          <w:bCs/>
-        </w:rPr>
-        <w:t xml:space="preserve">suspender</w:t>
-      </w:r>
-      <w:r>
-        <w:t xml:space="preserve">, nunca apagar. Na volta, reativa como estava.</w:t>
-      </w:r>
-    </w:p>
-    <w:p>
-      <w:pPr>
-        <w:tabs>
-          <w:tab w:val="left" w:pos="720"/>
-        </w:tabs>
-        <w:ind w:left="720" w:hanging="400"/>
-      </w:pPr>
-      <w:r>
-        <w:t xml:space="preserve">1.	</w:t>
-      </w:r>
-      <w:r>
-        <w:rPr>
-          <w:b/>
-          <w:bCs/>
-        </w:rPr>
-        <w:t xml:space="preserve">RH</w:t>
-      </w:r>
-      <w:r>
-        <w:t xml:space="preserve"> abre o chamado no GLPI (Formulário A), tipo </w:t>
-      </w:r>
-      <w:r>
-        <w:rPr>
-          <w:b/>
-          <w:bCs/>
-        </w:rPr>
-        <w:t xml:space="preserve">Afastamento</w:t>
-      </w:r>
-      <w:r>
-        <w:t xml:space="preserve">: data de saída e de volta prevista.</w:t>
-      </w:r>
-    </w:p>
-    <w:p>
-      <w:pPr>
-        <w:tabs>
-          <w:tab w:val="left" w:pos="720"/>
-        </w:tabs>
-        <w:ind w:left="720" w:hanging="400"/>
-      </w:pPr>
-      <w:r>
-        <w:t xml:space="preserve">2.	</w:t>
-      </w:r>
-      <w:r>
-        <w:rPr>
-          <w:b/>
-          <w:bCs/>
-        </w:rPr>
-        <w:t xml:space="preserve">TI</w:t>
-      </w:r>
-      <w:r>
-        <w:t xml:space="preserve">, no último dia antes do afastamento:</w:t>
-      </w:r>
-    </w:p>
-    <w:p>
-      <w:pPr>
-        <w:tabs>
-          <w:tab w:val="left" w:pos="1440"/>
-        </w:tabs>
-        <w:ind w:left="1440" w:hanging="400"/>
-      </w:pPr>
-      <w:r>
-        <w:t xml:space="preserve">1.	</w:t>
-      </w:r>
-      <w:r>
-        <w:rPr>
-          <w:b/>
-          <w:bCs/>
-        </w:rPr>
-        <w:t xml:space="preserve">E-mail:</w:t>
-      </w:r>
-      <w:r>
-        <w:t xml:space="preserve"> resposta automática ("ausente até dd/mm, falar com &lt;gestor/setor&gt;"). Se o gestor pedir, encaminhar cópia para o setor.</w:t>
-      </w:r>
-    </w:p>
-    <w:p>
-      <w:pPr>
-        <w:tabs>
-          <w:tab w:val="left" w:pos="1440"/>
-        </w:tabs>
-        <w:ind w:left="1440" w:hanging="400"/>
-      </w:pPr>
-      <w:r>
-        <w:t xml:space="preserve">2.	</w:t>
-      </w:r>
-      <w:r>
-        <w:rPr>
-          <w:b/>
-          <w:bCs/>
-        </w:rPr>
-        <w:t xml:space="preserve">Sistema VS / Petroshow (ERP) / Sigest / Infinitum / Orion:</w:t>
-      </w:r>
-      <w:r>
-        <w:t xml:space="preserve"> desativar o usuário (sem excluir).</w:t>
-      </w:r>
-    </w:p>
-    <w:p>
-      <w:pPr>
-        <w:tabs>
-          <w:tab w:val="left" w:pos="1440"/>
-        </w:tabs>
-        <w:ind w:left="1440" w:hanging="400"/>
-      </w:pPr>
-      <w:r>
-        <w:t xml:space="preserve">3.	</w:t>
-      </w:r>
-      <w:r>
-        <w:rPr>
-          <w:b/>
-          <w:bCs/>
-        </w:rPr>
-        <w:t xml:space="preserve">Celular corporativo:</w:t>
-      </w:r>
-      <w:r>
-        <w:t xml:space="preserve"> fica com a pessoa ou volta para a empresa, conforme o gestor decidir. Se ficar, continua sob as políticas do Headwind MDM. Se outra pessoa assumir o atendimento pelo WhatsApp do aparelho, o celular fica com ela durante o afastamento.</w:t>
-      </w:r>
-    </w:p>
-    <w:p>
-      <w:pPr>
-        <w:tabs>
-          <w:tab w:val="left" w:pos="720"/>
-        </w:tabs>
-        <w:ind w:left="720" w:hanging="400"/>
-      </w:pPr>
-      <w:r>
-        <w:t xml:space="preserve">3.	</w:t>
-      </w:r>
-      <w:r>
-        <w:rPr>
-          <w:b/>
-          <w:bCs/>
-        </w:rPr>
-        <w:t xml:space="preserve">Na volta</w:t>
-      </w:r>
-      <w:r>
-        <w:t xml:space="preserve">, com aviso do RH: reativar os usuários, tirar a resposta automática e conferir que as senhas do Vaultwarden ainda funcionam.</w:t>
-      </w:r>
-    </w:p>
-    <w:p>
-      <w:pPr>
-        <w:tabs>
-          <w:tab w:val="left" w:pos="720"/>
-        </w:tabs>
-        <w:ind w:left="720" w:hanging="400"/>
-      </w:pPr>
-      <w:r>
-        <w:t xml:space="preserve">4.	</w:t>
-      </w:r>
-      <w:r>
-        <w:t xml:space="preserve">Se a volta virar desligamento, seguir o POP-02.</w:t>
-      </w:r>
-    </w:p>
-    <w:p>
-      <w:pPr>
-        <w:pStyle w:val="Heading2"/>
-      </w:pPr>
-      <w:r>
-        <w:t xml:space="preserve">7. Registro</w:t>
+        <w:t xml:space="preserve">6. Registro</w:t>
       </w:r>
     </w:p>
     <w:p>
@@ -7786,7 +7543,7 @@
         <w:t xml:space="preserve">Tipo:</w:t>
       </w:r>
       <w:r>
-        <w:t xml:space="preserve"> ☐ Entrada ☐ Mudança de função/posto ☐ Troca de equipamento ☐ Afastamento ☐ Saída</w:t>
+        <w:t xml:space="preserve"> ☐ Entrada ☐ Mudança de função/posto ☐ Troca de equipamento ☐ Saída</w:t>
       </w:r>
     </w:p>
     <w:tbl>
@@ -7802,8 +7559,8 @@
         </w:tblBorders>
       </w:tblPr>
       <w:tblGrid>
-        <w:gridCol w:w="7830"/>
-        <w:gridCol w:w="1808"/>
+        <w:gridCol w:w="7725"/>
+        <w:gridCol w:w="1913"/>
       </w:tblGrid>
       <w:tr>
         <w:trPr>
@@ -7811,7 +7568,7 @@
         </w:trPr>
         <w:tc>
           <w:tcPr>
-            <w:tcW w:type="dxa" w:w="7830"/>
+            <w:tcW w:type="dxa" w:w="7725"/>
             <w:shd w:fill="EEEEEE" w:color="auto" w:val="clear"/>
             <w:tcMar>
               <w:top w:type="dxa" w:w="60"/>
@@ -7832,7 +7589,7 @@
         </w:tc>
         <w:tc>
           <w:tcPr>
-            <w:tcW w:type="dxa" w:w="1808"/>
+            <w:tcW w:type="dxa" w:w="1913"/>
             <w:shd w:fill="EEEEEE" w:color="auto" w:val="clear"/>
             <w:tcMar>
               <w:top w:type="dxa" w:w="60"/>
@@ -7855,7 +7612,7 @@
       <w:tr>
         <w:tc>
           <w:tcPr>
-            <w:tcW w:type="dxa" w:w="7830"/>
+            <w:tcW w:type="dxa" w:w="7725"/>
             <w:tcMar>
               <w:top w:type="dxa" w:w="60"/>
               <w:left w:type="dxa" w:w="100"/>
@@ -7871,7 +7628,7 @@
         </w:tc>
         <w:tc>
           <w:tcPr>
-            <w:tcW w:type="dxa" w:w="1808"/>
+            <w:tcW w:type="dxa" w:w="1913"/>
             <w:tcMar>
               <w:top w:type="dxa" w:w="60"/>
               <w:left w:type="dxa" w:w="100"/>
@@ -7885,7 +7642,7 @@
       <w:tr>
         <w:tc>
           <w:tcPr>
-            <w:tcW w:type="dxa" w:w="7830"/>
+            <w:tcW w:type="dxa" w:w="7725"/>
             <w:tcMar>
               <w:top w:type="dxa" w:w="60"/>
               <w:left w:type="dxa" w:w="100"/>
@@ -7901,7 +7658,7 @@
         </w:tc>
         <w:tc>
           <w:tcPr>
-            <w:tcW w:type="dxa" w:w="1808"/>
+            <w:tcW w:type="dxa" w:w="1913"/>
             <w:tcMar>
               <w:top w:type="dxa" w:w="60"/>
               <w:left w:type="dxa" w:w="100"/>
@@ -7915,7 +7672,7 @@
       <w:tr>
         <w:tc>
           <w:tcPr>
-            <w:tcW w:type="dxa" w:w="7830"/>
+            <w:tcW w:type="dxa" w:w="7725"/>
             <w:tcMar>
               <w:top w:type="dxa" w:w="60"/>
               <w:left w:type="dxa" w:w="100"/>
@@ -7931,7 +7688,7 @@
         </w:tc>
         <w:tc>
           <w:tcPr>
-            <w:tcW w:type="dxa" w:w="1808"/>
+            <w:tcW w:type="dxa" w:w="1913"/>
             <w:tcMar>
               <w:top w:type="dxa" w:w="60"/>
               <w:left w:type="dxa" w:w="100"/>
@@ -7945,7 +7702,7 @@
       <w:tr>
         <w:tc>
           <w:tcPr>
-            <w:tcW w:type="dxa" w:w="7830"/>
+            <w:tcW w:type="dxa" w:w="7725"/>
             <w:tcMar>
               <w:top w:type="dxa" w:w="60"/>
               <w:left w:type="dxa" w:w="100"/>
@@ -7961,17 +7718,17 @@
         </w:tc>
         <w:tc>
           <w:tcPr>
-            <w:tcW w:type="dxa" w:w="1808"/>
-            <w:tcMar>
-              <w:top w:type="dxa" w:w="60"/>
-              <w:left w:type="dxa" w:w="100"/>
-              <w:bottom w:type="dxa" w:w="60"/>
-              <w:right w:type="dxa" w:w="100"/>
-            </w:tcMar>
-          </w:tcPr>
-          <w:p>
-            <w:r>
-              <w:t xml:space="preserve">☐ A: Sem acesso de TI ☐ B: Estoquista ☐ C: Escritório ☐ D: Gestão</w:t>
+            <w:tcW w:type="dxa" w:w="1913"/>
+            <w:tcMar>
+              <w:top w:type="dxa" w:w="60"/>
+              <w:left w:type="dxa" w:w="100"/>
+              <w:bottom w:type="dxa" w:w="60"/>
+              <w:right w:type="dxa" w:w="100"/>
+            </w:tcMar>
+          </w:tcPr>
+          <w:p>
+            <w:r>
+              <w:t xml:space="preserve">☐ A: Sem acesso de TI ☐ B: Oficina ☐ C: Escritório ☐ D: Gestão</w:t>
             </w:r>
           </w:p>
         </w:tc>
@@ -7979,7 +7736,7 @@
       <w:tr>
         <w:tc>
           <w:tcPr>
-            <w:tcW w:type="dxa" w:w="7830"/>
+            <w:tcW w:type="dxa" w:w="7725"/>
             <w:tcMar>
               <w:top w:type="dxa" w:w="60"/>
               <w:left w:type="dxa" w:w="100"/>
@@ -7995,7 +7752,7 @@
         </w:tc>
         <w:tc>
           <w:tcPr>
-            <w:tcW w:type="dxa" w:w="1808"/>
+            <w:tcW w:type="dxa" w:w="1913"/>
             <w:tcMar>
               <w:top w:type="dxa" w:w="60"/>
               <w:left w:type="dxa" w:w="100"/>
@@ -8009,7 +7766,7 @@
       <w:tr>
         <w:tc>
           <w:tcPr>
-            <w:tcW w:type="dxa" w:w="7830"/>
+            <w:tcW w:type="dxa" w:w="7725"/>
             <w:tcMar>
               <w:top w:type="dxa" w:w="60"/>
               <w:left w:type="dxa" w:w="100"/>
@@ -8025,7 +7782,7 @@
         </w:tc>
         <w:tc>
           <w:tcPr>
-            <w:tcW w:type="dxa" w:w="1808"/>
+            <w:tcW w:type="dxa" w:w="1913"/>
             <w:tcMar>
               <w:top w:type="dxa" w:w="60"/>
               <w:left w:type="dxa" w:w="100"/>
@@ -8039,23 +7796,23 @@
       <w:tr>
         <w:tc>
           <w:tcPr>
-            <w:tcW w:type="dxa" w:w="7830"/>
-            <w:tcMar>
-              <w:top w:type="dxa" w:w="60"/>
-              <w:left w:type="dxa" w:w="100"/>
-              <w:bottom w:type="dxa" w:w="60"/>
-              <w:right w:type="dxa" w:w="100"/>
-            </w:tcMar>
-          </w:tcPr>
-          <w:p>
-            <w:r>
-              <w:t xml:space="preserve">Data (início, mudança, saída ou afastamento)</w:t>
-            </w:r>
-          </w:p>
-        </w:tc>
-        <w:tc>
-          <w:tcPr>
-            <w:tcW w:type="dxa" w:w="1808"/>
+            <w:tcW w:type="dxa" w:w="7725"/>
+            <w:tcMar>
+              <w:top w:type="dxa" w:w="60"/>
+              <w:left w:type="dxa" w:w="100"/>
+              <w:bottom w:type="dxa" w:w="60"/>
+              <w:right w:type="dxa" w:w="100"/>
+            </w:tcMar>
+          </w:tcPr>
+          <w:p>
+            <w:r>
+              <w:t xml:space="preserve">Data (início, mudança ou saída)</w:t>
+            </w:r>
+          </w:p>
+        </w:tc>
+        <w:tc>
+          <w:tcPr>
+            <w:tcW w:type="dxa" w:w="1913"/>
             <w:tcMar>
               <w:top w:type="dxa" w:w="60"/>
               <w:left w:type="dxa" w:w="100"/>
@@ -8069,7 +7826,7 @@
       <w:tr>
         <w:tc>
           <w:tcPr>
-            <w:tcW w:type="dxa" w:w="7830"/>
+            <w:tcW w:type="dxa" w:w="7725"/>
             <w:tcMar>
               <w:top w:type="dxa" w:w="60"/>
               <w:left w:type="dxa" w:w="100"/>
@@ -8085,7 +7842,7 @@
         </w:tc>
         <w:tc>
           <w:tcPr>
-            <w:tcW w:type="dxa" w:w="1808"/>
+            <w:tcW w:type="dxa" w:w="1913"/>
             <w:tcMar>
               <w:top w:type="dxa" w:w="60"/>
               <w:left w:type="dxa" w:w="100"/>
@@ -8099,23 +7856,40 @@
       <w:tr>
         <w:tc>
           <w:tcPr>
-            <w:tcW w:type="dxa" w:w="7830"/>
-            <w:tcMar>
-              <w:top w:type="dxa" w:w="60"/>
-              <w:left w:type="dxa" w:w="100"/>
-              <w:bottom w:type="dxa" w:w="60"/>
-              <w:right w:type="dxa" w:w="100"/>
-            </w:tcMar>
-          </w:tcPr>
-          <w:p>
-            <w:r>
-              <w:t xml:space="preserve">Volta prevista (só para afastamento)</w:t>
-            </w:r>
-          </w:p>
-        </w:tc>
-        <w:tc>
-          <w:tcPr>
-            <w:tcW w:type="dxa" w:w="1808"/>
+            <w:tcW w:type="dxa" w:w="7725"/>
+            <w:tcMar>
+              <w:top w:type="dxa" w:w="60"/>
+              <w:left w:type="dxa" w:w="100"/>
+              <w:bottom w:type="dxa" w:w="60"/>
+              <w:right w:type="dxa" w:w="100"/>
+            </w:tcMar>
+          </w:tcPr>
+          <w:p>
+            <w:r>
+              <w:t xml:space="preserve">Mudança: função/posto </w:t>
+            </w:r>
+            <w:r>
+              <w:rPr>
+                <w:b/>
+                <w:bCs/>
+              </w:rPr>
+              <w:t xml:space="preserve">antigo</w:t>
+            </w:r>
+            <w:r>
+              <w:t xml:space="preserve"> → </w:t>
+            </w:r>
+            <w:r>
+              <w:rPr>
+                <w:b/>
+                <w:bCs/>
+              </w:rPr>
+              <w:t xml:space="preserve">novo</w:t>
+            </w:r>
+          </w:p>
+        </w:tc>
+        <w:tc>
+          <w:tcPr>
+            <w:tcW w:type="dxa" w:w="1913"/>
             <w:tcMar>
               <w:top w:type="dxa" w:w="60"/>
               <w:left w:type="dxa" w:w="100"/>
@@ -8129,40 +7903,23 @@
       <w:tr>
         <w:tc>
           <w:tcPr>
-            <w:tcW w:type="dxa" w:w="7830"/>
-            <w:tcMar>
-              <w:top w:type="dxa" w:w="60"/>
-              <w:left w:type="dxa" w:w="100"/>
-              <w:bottom w:type="dxa" w:w="60"/>
-              <w:right w:type="dxa" w:w="100"/>
-            </w:tcMar>
-          </w:tcPr>
-          <w:p>
-            <w:r>
-              <w:t xml:space="preserve">Mudança: função/posto </w:t>
-            </w:r>
-            <w:r>
-              <w:rPr>
-                <w:b/>
-                <w:bCs/>
-              </w:rPr>
-              <w:t xml:space="preserve">antigo</w:t>
-            </w:r>
-            <w:r>
-              <w:t xml:space="preserve"> → </w:t>
-            </w:r>
-            <w:r>
-              <w:rPr>
-                <w:b/>
-                <w:bCs/>
-              </w:rPr>
-              <w:t xml:space="preserve">novo</w:t>
-            </w:r>
-          </w:p>
-        </w:tc>
-        <w:tc>
-          <w:tcPr>
-            <w:tcW w:type="dxa" w:w="1808"/>
+            <w:tcW w:type="dxa" w:w="7725"/>
+            <w:tcMar>
+              <w:top w:type="dxa" w:w="60"/>
+              <w:left w:type="dxa" w:w="100"/>
+              <w:bottom w:type="dxa" w:w="60"/>
+              <w:right w:type="dxa" w:w="100"/>
+            </w:tcMar>
+          </w:tcPr>
+          <w:p>
+            <w:r>
+              <w:t xml:space="preserve">Saída: tipo (pedido / pela empresa / justa causa)</w:t>
+            </w:r>
+          </w:p>
+        </w:tc>
+        <w:tc>
+          <w:tcPr>
+            <w:tcW w:type="dxa" w:w="1913"/>
             <w:tcMar>
               <w:top w:type="dxa" w:w="60"/>
               <w:left w:type="dxa" w:w="100"/>
@@ -8176,23 +7933,23 @@
       <w:tr>
         <w:tc>
           <w:tcPr>
-            <w:tcW w:type="dxa" w:w="7830"/>
-            <w:tcMar>
-              <w:top w:type="dxa" w:w="60"/>
-              <w:left w:type="dxa" w:w="100"/>
-              <w:bottom w:type="dxa" w:w="60"/>
-              <w:right w:type="dxa" w:w="100"/>
-            </w:tcMar>
-          </w:tcPr>
-          <w:p>
-            <w:r>
-              <w:t xml:space="preserve">Saída: tipo (pedido / pela empresa / justa causa)</w:t>
-            </w:r>
-          </w:p>
-        </w:tc>
-        <w:tc>
-          <w:tcPr>
-            <w:tcW w:type="dxa" w:w="1808"/>
+            <w:tcW w:type="dxa" w:w="7725"/>
+            <w:tcMar>
+              <w:top w:type="dxa" w:w="60"/>
+              <w:left w:type="dxa" w:w="100"/>
+              <w:bottom w:type="dxa" w:w="60"/>
+              <w:right w:type="dxa" w:w="100"/>
+            </w:tcMar>
+          </w:tcPr>
+          <w:p>
+            <w:r>
+              <w:t xml:space="preserve">Saída: quem assume e-mail, celular e arquivos</w:t>
+            </w:r>
+          </w:p>
+        </w:tc>
+        <w:tc>
+          <w:tcPr>
+            <w:tcW w:type="dxa" w:w="1913"/>
             <w:tcMar>
               <w:top w:type="dxa" w:w="60"/>
               <w:left w:type="dxa" w:w="100"/>
@@ -8206,37 +7963,7 @@
       <w:tr>
         <w:tc>
           <w:tcPr>
-            <w:tcW w:type="dxa" w:w="7830"/>
-            <w:tcMar>
-              <w:top w:type="dxa" w:w="60"/>
-              <w:left w:type="dxa" w:w="100"/>
-              <w:bottom w:type="dxa" w:w="60"/>
-              <w:right w:type="dxa" w:w="100"/>
-            </w:tcMar>
-          </w:tcPr>
-          <w:p>
-            <w:r>
-              <w:t xml:space="preserve">Saída: quem assume e-mail, celular e arquivos</w:t>
-            </w:r>
-          </w:p>
-        </w:tc>
-        <w:tc>
-          <w:tcPr>
-            <w:tcW w:type="dxa" w:w="1808"/>
-            <w:tcMar>
-              <w:top w:type="dxa" w:w="60"/>
-              <w:left w:type="dxa" w:w="100"/>
-              <w:bottom w:type="dxa" w:w="60"/>
-              <w:right w:type="dxa" w:w="100"/>
-            </w:tcMar>
-          </w:tcPr>
-          <w:p/>
-        </w:tc>
-      </w:tr>
-      <w:tr>
-        <w:tc>
-          <w:tcPr>
-            <w:tcW w:type="dxa" w:w="7830"/>
+            <w:tcW w:type="dxa" w:w="7725"/>
             <w:tcMar>
               <w:top w:type="dxa" w:w="60"/>
               <w:left w:type="dxa" w:w="100"/>
@@ -8252,7 +7979,7 @@
         </w:tc>
         <w:tc>
           <w:tcPr>
-            <w:tcW w:type="dxa" w:w="1808"/>
+            <w:tcW w:type="dxa" w:w="1913"/>
             <w:tcMar>
               <w:top w:type="dxa" w:w="60"/>
               <w:left w:type="dxa" w:w="100"/>
@@ -10098,7 +9825,7 @@
         <w:t xml:space="preserve">Motivo:</w:t>
       </w:r>
       <w:r>
-        <w:t xml:space="preserve"> ☐ Saída ☐ Troca ☐ Afastamento ☐ Outro</w:t>
+        <w:t xml:space="preserve"> ☐ Saída ☐ Troca ☐ Outro</w:t>
       </w:r>
     </w:p>
     <w:tbl>

</xml_diff>

<commit_message>
POPs v1.1: funcoes no lugar dos nomes de ferramentas
Os POPs passam a citar so a funcao (cofre de senhas, acesso remoto,
MDM, backup dos PCs etc.), exceto o GLPI. Qual programa faz cada
funcao fica em anexos/ferramentas.md, unico lugar a mudar quando uma
ferramenta for trocada. Anexo entra no PDF completo de TI; PDFs e
Word do RH regenerados.

Co-Authored-By: Claude Opus 5.5 <noreply@anthropic.com>
</commit_message>
<xml_diff>
--- a/impressao/POPs-RH-revisao.docx
+++ b/impressao/POPs-RH-revisao.docx
@@ -26,7 +26,7 @@
         <w:t xml:space="preserve">Versão:</w:t>
       </w:r>
       <w:r>
-        <w:t xml:space="preserve"> 1.0 · </w:t>
+        <w:t xml:space="preserve"> 1.1 · </w:t>
       </w:r>
       <w:r>
         <w:rPr>
@@ -36,7 +36,7 @@
         <w:t xml:space="preserve">Data:</w:t>
       </w:r>
       <w:r>
-        <w:t xml:space="preserve"> 15/10/2026 · </w:t>
+        <w:t xml:space="preserve"> 17/10/2026 · </w:t>
       </w:r>
       <w:r>
         <w:rPr>
@@ -602,7 +602,7 @@
         <w:t xml:space="preserve">nome.sobrenome@&lt;domínio-da-empresa&gt;</w:t>
       </w:r>
       <w:r>
-        <w:t xml:space="preserve">), no painel da hospedagem da empresa correta. Senha forte gerada pelo Vaultwarden.</w:t>
+        <w:t xml:space="preserve">), no painel da hospedagem da empresa correta. Senha forte gerada pelo cofre de senhas.</w:t>
       </w:r>
     </w:p>
     <w:p>
@@ -813,10 +813,10 @@
           <w:b/>
           <w:bCs/>
         </w:rPr>
-        <w:t xml:space="preserve">Headwind MDM</w:t>
-      </w:r>
-      <w:r>
-        <w:t xml:space="preserve"> (Android Enterprise).</w:t>
+        <w:t xml:space="preserve">MDM</w:t>
+      </w:r>
+      <w:r>
+        <w:t xml:space="preserve">.</w:t>
       </w:r>
     </w:p>
     <w:p>
@@ -849,7 +849,7 @@
         <w:t xml:space="preserve">celularNN.&lt;empresa&gt;@gmail.com</w:t>
       </w:r>
       <w:r>
-        <w:t xml:space="preserve">, senha no Vaultwarden). Se o aparelho é novo, a TI cria a conta antes, com e-mail de recuperação </w:t>
+        <w:t xml:space="preserve">, senha no cofre de senhas). Se o aparelho é novo, a TI cria a conta antes, com e-mail de recuperação </w:t>
       </w:r>
       <w:r>
         <w:rPr>
@@ -954,7 +954,7 @@
           <w:b/>
           <w:bCs/>
         </w:rPr>
-        <w:t xml:space="preserve">Vaultwarden</w:t>
+        <w:t xml:space="preserve">cofre de senhas</w:t>
       </w:r>
       <w:r>
         <w:t xml:space="preserve">, na pasta do funcionário.</w:t>
@@ -1010,7 +1010,7 @@
           <w:b/>
           <w:bCs/>
         </w:rPr>
-        <w:t xml:space="preserve">Todas as senhas da pessoa ficam no Vaultwarden</w:t>
+        <w:t xml:space="preserve">Todas as senhas da pessoa ficam no cofre de senhas</w:t>
       </w:r>
       <w:r>
         <w:t xml:space="preserve"> (pasta do funcionário). O funcionário </w:t>
@@ -1081,8 +1081,8 @@
         </w:tblBorders>
       </w:tblPr>
       <w:tblGrid>
-        <w:gridCol w:w="3122"/>
-        <w:gridCol w:w="6516"/>
+        <w:gridCol w:w="3203"/>
+        <w:gridCol w:w="6435"/>
       </w:tblGrid>
       <w:tr>
         <w:trPr>
@@ -1090,7 +1090,7 @@
         </w:trPr>
         <w:tc>
           <w:tcPr>
-            <w:tcW w:type="dxa" w:w="3122"/>
+            <w:tcW w:type="dxa" w:w="3203"/>
             <w:shd w:fill="EEEEEE" w:color="auto" w:val="clear"/>
             <w:tcMar>
               <w:top w:type="dxa" w:w="60"/>
@@ -1111,7 +1111,7 @@
         </w:tc>
         <w:tc>
           <w:tcPr>
-            <w:tcW w:type="dxa" w:w="6516"/>
+            <w:tcW w:type="dxa" w:w="6435"/>
             <w:shd w:fill="EEEEEE" w:color="auto" w:val="clear"/>
             <w:tcMar>
               <w:top w:type="dxa" w:w="60"/>
@@ -1134,7 +1134,7 @@
       <w:tr>
         <w:tc>
           <w:tcPr>
-            <w:tcW w:type="dxa" w:w="3122"/>
+            <w:tcW w:type="dxa" w:w="3203"/>
             <w:tcMar>
               <w:top w:type="dxa" w:w="60"/>
               <w:left w:type="dxa" w:w="100"/>
@@ -1150,7 +1150,7 @@
         </w:tc>
         <w:tc>
           <w:tcPr>
-            <w:tcW w:type="dxa" w:w="6516"/>
+            <w:tcW w:type="dxa" w:w="6435"/>
             <w:tcMar>
               <w:top w:type="dxa" w:w="60"/>
               <w:left w:type="dxa" w:w="100"/>
@@ -1179,7 +1179,7 @@
       <w:tr>
         <w:tc>
           <w:tcPr>
-            <w:tcW w:type="dxa" w:w="3122"/>
+            <w:tcW w:type="dxa" w:w="3203"/>
             <w:tcMar>
               <w:top w:type="dxa" w:w="60"/>
               <w:left w:type="dxa" w:w="100"/>
@@ -1195,7 +1195,7 @@
         </w:tc>
         <w:tc>
           <w:tcPr>
-            <w:tcW w:type="dxa" w:w="6516"/>
+            <w:tcW w:type="dxa" w:w="6435"/>
             <w:tcMar>
               <w:top w:type="dxa" w:w="60"/>
               <w:left w:type="dxa" w:w="100"/>
@@ -1213,7 +1213,7 @@
       <w:tr>
         <w:tc>
           <w:tcPr>
-            <w:tcW w:type="dxa" w:w="3122"/>
+            <w:tcW w:type="dxa" w:w="3203"/>
             <w:tcMar>
               <w:top w:type="dxa" w:w="60"/>
               <w:left w:type="dxa" w:w="100"/>
@@ -1229,7 +1229,7 @@
         </w:tc>
         <w:tc>
           <w:tcPr>
-            <w:tcW w:type="dxa" w:w="6516"/>
+            <w:tcW w:type="dxa" w:w="6435"/>
             <w:tcMar>
               <w:top w:type="dxa" w:w="60"/>
               <w:left w:type="dxa" w:w="100"/>
@@ -1247,7 +1247,7 @@
       <w:tr>
         <w:tc>
           <w:tcPr>
-            <w:tcW w:type="dxa" w:w="3122"/>
+            <w:tcW w:type="dxa" w:w="3203"/>
             <w:tcMar>
               <w:top w:type="dxa" w:w="60"/>
               <w:left w:type="dxa" w:w="100"/>
@@ -1263,7 +1263,7 @@
         </w:tc>
         <w:tc>
           <w:tcPr>
-            <w:tcW w:type="dxa" w:w="6516"/>
+            <w:tcW w:type="dxa" w:w="6435"/>
             <w:tcMar>
               <w:top w:type="dxa" w:w="60"/>
               <w:left w:type="dxa" w:w="100"/>
@@ -1281,7 +1281,7 @@
       <w:tr>
         <w:tc>
           <w:tcPr>
-            <w:tcW w:type="dxa" w:w="3122"/>
+            <w:tcW w:type="dxa" w:w="3203"/>
             <w:tcMar>
               <w:top w:type="dxa" w:w="60"/>
               <w:left w:type="dxa" w:w="100"/>
@@ -1297,17 +1297,17 @@
         </w:tc>
         <w:tc>
           <w:tcPr>
-            <w:tcW w:type="dxa" w:w="6516"/>
-            <w:tcMar>
-              <w:top w:type="dxa" w:w="60"/>
-              <w:left w:type="dxa" w:w="100"/>
-              <w:bottom w:type="dxa" w:w="60"/>
-              <w:right w:type="dxa" w:w="100"/>
-            </w:tcMar>
-          </w:tcPr>
-          <w:p>
-            <w:r>
-              <w:t xml:space="preserve">Headwind MDM + políticas decididas</w:t>
+            <w:tcW w:type="dxa" w:w="6435"/>
+            <w:tcMar>
+              <w:top w:type="dxa" w:w="60"/>
+              <w:left w:type="dxa" w:w="100"/>
+              <w:bottom w:type="dxa" w:w="60"/>
+              <w:right w:type="dxa" w:w="100"/>
+            </w:tcMar>
+          </w:tcPr>
+          <w:p>
+            <w:r>
+              <w:t xml:space="preserve">MDM + políticas decididas</w:t>
             </w:r>
           </w:p>
         </w:tc>
@@ -1315,7 +1315,7 @@
       <w:tr>
         <w:tc>
           <w:tcPr>
-            <w:tcW w:type="dxa" w:w="3122"/>
+            <w:tcW w:type="dxa" w:w="3203"/>
             <w:tcMar>
               <w:top w:type="dxa" w:w="60"/>
               <w:left w:type="dxa" w:w="100"/>
@@ -1331,7 +1331,7 @@
         </w:tc>
         <w:tc>
           <w:tcPr>
-            <w:tcW w:type="dxa" w:w="6516"/>
+            <w:tcW w:type="dxa" w:w="6435"/>
             <w:tcMar>
               <w:top w:type="dxa" w:w="60"/>
               <w:left w:type="dxa" w:w="100"/>
@@ -1727,7 +1727,7 @@
         <w:t xml:space="preserve">Versão:</w:t>
       </w:r>
       <w:r>
-        <w:t xml:space="preserve"> 1.0 · </w:t>
+        <w:t xml:space="preserve"> 1.1 · </w:t>
       </w:r>
       <w:r>
         <w:rPr>
@@ -1737,7 +1737,7 @@
         <w:t xml:space="preserve">Data:</w:t>
       </w:r>
       <w:r>
-        <w:t xml:space="preserve"> 15/10/2026 · </w:t>
+        <w:t xml:space="preserve"> 17/10/2026 · </w:t>
       </w:r>
       <w:r>
         <w:rPr>
@@ -2322,7 +2322,7 @@
           <w:b/>
           <w:bCs/>
         </w:rPr>
-        <w:t xml:space="preserve">UrBackup</w:t>
+        <w:t xml:space="preserve">backup dos PCs</w:t>
       </w:r>
       <w:r>
         <w:t xml:space="preserve"> e copia os arquivos de trabalho para quem assume.</w:t>
@@ -2371,7 +2371,7 @@
         </w:numPr>
       </w:pPr>
       <w:r>
-        <w:t xml:space="preserve">Trocar a senha no painel da hospedagem (a pessoa perde o acesso na hora) e atualizar no Vaultwarden.</w:t>
+        <w:t xml:space="preserve">Trocar a senha no painel da hospedagem (a pessoa perde o acesso na hora) e atualizar no cofre de senhas.</w:t>
       </w:r>
     </w:p>
     <w:p>
@@ -2528,7 +2528,7 @@
         <w:t xml:space="preserve">Senhas compartilhadas</w:t>
       </w:r>
       <w:r>
-        <w:t xml:space="preserve"> que a pessoa conhecia (Wi-Fi, contas de setor, sistemas com login único): trocar. Atualizar as senhas novas no Vaultwarden.</w:t>
+        <w:t xml:space="preserve"> que a pessoa conhecia (Wi-Fi, contas de setor, sistemas com login único): trocar. Atualizar as senhas novas no cofre de senhas.</w:t>
       </w:r>
     </w:p>
     <w:p>
@@ -2549,14 +2549,14 @@
         <w:t xml:space="preserve">Acesso remoto:</w:t>
       </w:r>
       <w:r>
-        <w:t xml:space="preserve"> remover a pessoa do </w:t>
-      </w:r>
-      <w:r>
-        <w:rPr>
-          <w:b/>
-          <w:bCs/>
-        </w:rPr>
-        <w:t xml:space="preserve">MeshCentral</w:t>
+        <w:t xml:space="preserve"> remover a pessoa da </w:t>
+      </w:r>
+      <w:r>
+        <w:rPr>
+          <w:b/>
+          <w:bCs/>
+        </w:rPr>
+        <w:t xml:space="preserve">ferramenta de acesso remoto</w:t>
       </w:r>
       <w:r>
         <w:t xml:space="preserve"> e da </w:t>
@@ -2566,7 +2566,7 @@
           <w:b/>
           <w:bCs/>
         </w:rPr>
-        <w:t xml:space="preserve">VPN WireGuard</w:t>
+        <w:t xml:space="preserve">VPN</w:t>
       </w:r>
       <w:r>
         <w:t xml:space="preserve">, se tinha acesso.</w:t>
@@ -2646,7 +2646,7 @@
         <w:t xml:space="preserve">wipe</w:t>
       </w:r>
       <w:r>
-        <w:t xml:space="preserve"> pelo Headwind MDM. Depois do wipe, desbloquear com o Gmail da empresa do aparelho (FRP) e trocar a senha dessa conta no Vaultwarden antes de entregar o aparelho a outra pessoa. Se o aparelho não foi devolvido: </w:t>
+        <w:t xml:space="preserve"> pelo MDM. Depois do wipe, desbloquear com o Gmail da empresa do aparelho (FRP) e trocar a senha dessa conta no cofre de senhas antes de entregar o aparelho a outra pessoa. Se o aparelho não foi devolvido: </w:t>
       </w:r>
       <w:r>
         <w:rPr>
@@ -2685,7 +2685,7 @@
         <w:t xml:space="preserve">todas</w:t>
       </w:r>
       <w:r>
-        <w:t xml:space="preserve"> as contas Gmail dos aparelhos para o do novo responsável e atualizar o Vaultwarden.</w:t>
+        <w:t xml:space="preserve"> as contas Gmail dos aparelhos para o do novo responsável e atualizar o cofre de senhas.</w:t>
       </w:r>
     </w:p>
     <w:p>
@@ -2796,7 +2796,7 @@
         <w:t xml:space="preserve">Esse backup nunca é apagado</w:t>
       </w:r>
       <w:r>
-        <w:t xml:space="preserve"> e entra na cópia noturna do servidor (Restic).</w:t>
+        <w:t xml:space="preserve"> e entra na cópia noturna do servidor (backup do servidor).</w:t>
       </w:r>
     </w:p>
     <w:p>
@@ -3170,7 +3170,7 @@
         <w:t xml:space="preserve">Versão:</w:t>
       </w:r>
       <w:r>
-        <w:t xml:space="preserve"> 1.0 · </w:t>
+        <w:t xml:space="preserve"> 1.1 · </w:t>
       </w:r>
       <w:r>
         <w:rPr>
@@ -3180,7 +3180,7 @@
         <w:t xml:space="preserve">Data:</w:t>
       </w:r>
       <w:r>
-        <w:t xml:space="preserve"> 15/10/2026 · </w:t>
+        <w:t xml:space="preserve"> 17/10/2026 · </w:t>
       </w:r>
       <w:r>
         <w:rPr>
@@ -4088,7 +4088,7 @@
         <w:t xml:space="preserve">TI</w:t>
       </w:r>
       <w:r>
-        <w:t xml:space="preserve"> prepara o equipamento novo (POP-04/05 para PC; Headwind MDM com as políticas decididas para celular).</w:t>
+        <w:t xml:space="preserve"> prepara o equipamento novo (POP-04/05 para PC; MDM com as políticas decididas para celular).</w:t>
       </w:r>
     </w:p>
     <w:p>
@@ -4116,7 +4116,7 @@
           <w:b/>
           <w:bCs/>
         </w:rPr>
-        <w:t xml:space="preserve">UrBackup</w:t>
+        <w:t xml:space="preserve">backup dos PCs</w:t>
       </w:r>
       <w:r>
         <w:t xml:space="preserve">). Celular: o WhatsApp volta pelo backup do Gmail da empresa.</w:t>
@@ -4196,7 +4196,7 @@
         <w:t xml:space="preserve">Celular:</w:t>
       </w:r>
       <w:r>
-        <w:t xml:space="preserve"> remover do Headwind MDM só </w:t>
+        <w:t xml:space="preserve"> remover do MDM só </w:t>
       </w:r>
       <w:r>
         <w:rPr>
@@ -4434,7 +4434,7 @@
         <w:t xml:space="preserve">Celular corporativo:</w:t>
       </w:r>
       <w:r>
-        <w:t xml:space="preserve"> fica com a pessoa ou volta para a empresa, conforme o gestor decidir. Se ficar, continua sob as políticas do Headwind MDM.</w:t>
+        <w:t xml:space="preserve"> fica com a pessoa ou volta para a empresa, conforme o gestor decidir. Se ficar, continua sob as políticas do MDM.</w:t>
       </w:r>
     </w:p>
     <w:p>
@@ -4476,7 +4476,7 @@
         <w:t xml:space="preserve">Na volta</w:t>
       </w:r>
       <w:r>
-        <w:t xml:space="preserve">, com aviso do RH: reativar os usuários, tirar a resposta automática e conferir que as senhas do Vaultwarden ainda funcionam.</w:t>
+        <w:t xml:space="preserve">, com aviso do RH: reativar os usuários, tirar a resposta automática e conferir que as senhas do cofre de senhas ainda funcionam.</w:t>
       </w:r>
     </w:p>
     <w:p>
@@ -4842,7 +4842,7 @@
         <w:t xml:space="preserve">Versão:</w:t>
       </w:r>
       <w:r>
-        <w:t xml:space="preserve"> 1.0 · </w:t>
+        <w:t xml:space="preserve"> 1.1 · </w:t>
       </w:r>
       <w:r>
         <w:rPr>
@@ -4852,7 +4852,7 @@
         <w:t xml:space="preserve">Data:</w:t>
       </w:r>
       <w:r>
-        <w:t xml:space="preserve"> 15/10/2026</w:t>
+        <w:t xml:space="preserve"> 17/10/2026</w:t>
       </w:r>
       <w:r>
         <w:br/>
@@ -4910,9 +4910,8 @@
         </w:tblBorders>
       </w:tblPr>
       <w:tblGrid>
-        <w:gridCol w:w="3745"/>
-        <w:gridCol w:w="4516"/>
-        <w:gridCol w:w="1377"/>
+        <w:gridCol w:w="4369"/>
+        <w:gridCol w:w="5269"/>
       </w:tblGrid>
       <w:tr>
         <w:trPr>
@@ -4920,7 +4919,7 @@
         </w:trPr>
         <w:tc>
           <w:tcPr>
-            <w:tcW w:type="dxa" w:w="3745"/>
+            <w:tcW w:type="dxa" w:w="4369"/>
             <w:shd w:fill="EEEEEE" w:color="auto" w:val="clear"/>
             <w:tcMar>
               <w:top w:type="dxa" w:w="60"/>
@@ -4941,7 +4940,7 @@
         </w:tc>
         <w:tc>
           <w:tcPr>
-            <w:tcW w:type="dxa" w:w="4516"/>
+            <w:tcW w:type="dxa" w:w="5269"/>
             <w:shd w:fill="EEEEEE" w:color="auto" w:val="clear"/>
             <w:tcMar>
               <w:top w:type="dxa" w:w="60"/>
@@ -4960,32 +4959,11 @@
             </w:r>
           </w:p>
         </w:tc>
-        <w:tc>
-          <w:tcPr>
-            <w:tcW w:type="dxa" w:w="1377"/>
-            <w:shd w:fill="EEEEEE" w:color="auto" w:val="clear"/>
-            <w:tcMar>
-              <w:top w:type="dxa" w:w="60"/>
-              <w:left w:type="dxa" w:w="100"/>
-              <w:bottom w:type="dxa" w:w="60"/>
-              <w:right w:type="dxa" w:w="100"/>
-            </w:tcMar>
-          </w:tcPr>
-          <w:p>
-            <w:r>
-              <w:rPr>
-                <w:b/>
-                <w:bCs/>
-              </w:rPr>
-              <w:t xml:space="preserve">Hospedagem</w:t>
-            </w:r>
-          </w:p>
-        </w:tc>
       </w:tr>
       <w:tr>
         <w:tc>
           <w:tcPr>
-            <w:tcW w:type="dxa" w:w="3745"/>
+            <w:tcW w:type="dxa" w:w="4369"/>
             <w:tcMar>
               <w:top w:type="dxa" w:w="60"/>
               <w:left w:type="dxa" w:w="100"/>
@@ -5001,7 +4979,7 @@
         </w:tc>
         <w:tc>
           <w:tcPr>
-            <w:tcW w:type="dxa" w:w="4516"/>
+            <w:tcW w:type="dxa" w:w="5269"/>
             <w:tcMar>
               <w:top w:type="dxa" w:w="60"/>
               <w:left w:type="dxa" w:w="100"/>
@@ -5020,27 +4998,11 @@
             </w:r>
           </w:p>
         </w:tc>
-        <w:tc>
-          <w:tcPr>
-            <w:tcW w:type="dxa" w:w="1377"/>
-            <w:tcMar>
-              <w:top w:type="dxa" w:w="60"/>
-              <w:left w:type="dxa" w:w="100"/>
-              <w:bottom w:type="dxa" w:w="60"/>
-              <w:right w:type="dxa" w:w="100"/>
-            </w:tcMar>
-          </w:tcPr>
-          <w:p>
-            <w:r>
-              <w:t xml:space="preserve">Ittek</w:t>
-            </w:r>
-          </w:p>
-        </w:tc>
       </w:tr>
       <w:tr>
         <w:tc>
           <w:tcPr>
-            <w:tcW w:type="dxa" w:w="3745"/>
+            <w:tcW w:type="dxa" w:w="4369"/>
             <w:tcMar>
               <w:top w:type="dxa" w:w="60"/>
               <w:left w:type="dxa" w:w="100"/>
@@ -5056,7 +5018,7 @@
         </w:tc>
         <w:tc>
           <w:tcPr>
-            <w:tcW w:type="dxa" w:w="4516"/>
+            <w:tcW w:type="dxa" w:w="5269"/>
             <w:tcMar>
               <w:top w:type="dxa" w:w="60"/>
               <w:left w:type="dxa" w:w="100"/>
@@ -5075,27 +5037,11 @@
             </w:r>
           </w:p>
         </w:tc>
-        <w:tc>
-          <w:tcPr>
-            <w:tcW w:type="dxa" w:w="1377"/>
-            <w:tcMar>
-              <w:top w:type="dxa" w:w="60"/>
-              <w:left w:type="dxa" w:w="100"/>
-              <w:bottom w:type="dxa" w:w="60"/>
-              <w:right w:type="dxa" w:w="100"/>
-            </w:tcMar>
-          </w:tcPr>
-          <w:p>
-            <w:r>
-              <w:t xml:space="preserve">Ittek</w:t>
-            </w:r>
-          </w:p>
-        </w:tc>
       </w:tr>
       <w:tr>
         <w:tc>
           <w:tcPr>
-            <w:tcW w:type="dxa" w:w="3745"/>
+            <w:tcW w:type="dxa" w:w="4369"/>
             <w:tcMar>
               <w:top w:type="dxa" w:w="60"/>
               <w:left w:type="dxa" w:w="100"/>
@@ -5111,7 +5057,7 @@
         </w:tc>
         <w:tc>
           <w:tcPr>
-            <w:tcW w:type="dxa" w:w="4516"/>
+            <w:tcW w:type="dxa" w:w="5269"/>
             <w:tcMar>
               <w:top w:type="dxa" w:w="60"/>
               <w:left w:type="dxa" w:w="100"/>
@@ -5130,25 +5076,23 @@
             </w:r>
           </w:p>
         </w:tc>
-        <w:tc>
-          <w:tcPr>
-            <w:tcW w:type="dxa" w:w="1377"/>
-            <w:tcMar>
-              <w:top w:type="dxa" w:w="60"/>
-              <w:left w:type="dxa" w:w="100"/>
-              <w:bottom w:type="dxa" w:w="60"/>
-              <w:right w:type="dxa" w:w="100"/>
-            </w:tcMar>
-          </w:tcPr>
-          <w:p>
-            <w:r>
-              <w:t xml:space="preserve">Ittek</w:t>
-            </w:r>
-          </w:p>
-        </w:tc>
       </w:tr>
     </w:tbl>
     <w:p/>
+    <w:p>
+      <w:pPr>
+        <w:spacing w:after="120"/>
+      </w:pPr>
+      <w:r>
+        <w:t xml:space="preserve">O provedor de hospedagem atual está no </w:t>
+      </w:r>
+      <w:r>
+        <w:t xml:space="preserve">anexo de ferramentas</w:t>
+      </w:r>
+      <w:r>
+        <w:t xml:space="preserve">.</w:t>
+      </w:r>
+    </w:p>
     <w:p>
       <w:pPr>
         <w:pBdr>
@@ -6284,7 +6228,7 @@
         <w:t xml:space="preserve">Versão:</w:t>
       </w:r>
       <w:r>
-        <w:t xml:space="preserve"> 1.0 · </w:t>
+        <w:t xml:space="preserve"> 1.1 · </w:t>
       </w:r>
       <w:r>
         <w:rPr>
@@ -6294,7 +6238,7 @@
         <w:t xml:space="preserve">Data:</w:t>
       </w:r>
       <w:r>
-        <w:t xml:space="preserve"> 15/10/2026</w:t>
+        <w:t xml:space="preserve"> 17/10/2026</w:t>
       </w:r>
       <w:r>
         <w:br/>
@@ -8923,7 +8867,7 @@
         <w:spacing w:after="120"/>
       </w:pPr>
       <w:r>
-        <w:t xml:space="preserve">☐ Celular: wipe feito pelo Headwind MDM em </w:t>
+        <w:t xml:space="preserve">☐ Celular: wipe feito pelo MDM em </w:t>
       </w:r>
       <w:r>
         <w:rPr>

</xml_diff>

<commit_message>
Revisao do RH: integracao de 2 dias, Orion e Petroshow como ERP
- POP-01: solicitacao com 2 dias uteis; dias 1 e 2 de integracao
  (roteiro pelos setores, montado pelo RH com o gestor), entrega de
  acessos e equipamentos no fim do 2o dia.
- Petroshow e o ERP: sai o item "ERP" separado; entra o Orion.
- POP-02: sem resposta automatica, encaminhamento e troca de senhas
  compartilhadas, conforme revisao do RH.
- PDFs e Word regenerados.

Co-Authored-By: Claude Opus 5.5 <noreply@anthropic.com>
</commit_message>
<xml_diff>
--- a/impressao/POPs-RH-revisao.docx
+++ b/impressao/POPs-RH-revisao.docx
@@ -80,7 +80,17 @@
         <w:spacing w:after="120"/>
       </w:pPr>
       <w:r>
-        <w:t xml:space="preserve">Garantir que todo funcionário novo comece a trabalhar no primeiro dia com </w:t>
+        <w:t xml:space="preserve">Garantir que todo funcionário novo conheça a empresa nos </w:t>
+      </w:r>
+      <w:r>
+        <w:rPr>
+          <w:b/>
+          <w:bCs/>
+        </w:rPr>
+        <w:t xml:space="preserve">dois primeiros dias (integração)</w:t>
+      </w:r>
+      <w:r>
+        <w:t xml:space="preserve"> e, ao fim deles, receba </w:t>
       </w:r>
       <w:r>
         <w:rPr>
@@ -114,8 +124,8 @@
         </w:tblBorders>
       </w:tblPr>
       <w:tblGrid>
-        <w:gridCol w:w="2041"/>
-        <w:gridCol w:w="7597"/>
+        <w:gridCol w:w="1780"/>
+        <w:gridCol w:w="7858"/>
       </w:tblGrid>
       <w:tr>
         <w:trPr>
@@ -123,7 +133,7 @@
         </w:trPr>
         <w:tc>
           <w:tcPr>
-            <w:tcW w:type="dxa" w:w="2041"/>
+            <w:tcW w:type="dxa" w:w="1780"/>
             <w:shd w:fill="EEEEEE" w:color="auto" w:val="clear"/>
             <w:tcMar>
               <w:top w:type="dxa" w:w="60"/>
@@ -144,7 +154,7 @@
         </w:tc>
         <w:tc>
           <w:tcPr>
-            <w:tcW w:type="dxa" w:w="7597"/>
+            <w:tcW w:type="dxa" w:w="7858"/>
             <w:shd w:fill="EEEEEE" w:color="auto" w:val="clear"/>
             <w:tcMar>
               <w:top w:type="dxa" w:w="60"/>
@@ -167,7 +177,7 @@
       <w:tr>
         <w:tc>
           <w:tcPr>
-            <w:tcW w:type="dxa" w:w="2041"/>
+            <w:tcW w:type="dxa" w:w="1780"/>
             <w:tcMar>
               <w:top w:type="dxa" w:w="60"/>
               <w:left w:type="dxa" w:w="100"/>
@@ -187,7 +197,7 @@
         </w:tc>
         <w:tc>
           <w:tcPr>
-            <w:tcW w:type="dxa" w:w="7597"/>
+            <w:tcW w:type="dxa" w:w="7858"/>
             <w:tcMar>
               <w:top w:type="dxa" w:w="60"/>
               <w:left w:type="dxa" w:w="100"/>
@@ -207,7 +217,7 @@
               <w:t xml:space="preserve">Solicitação de TI</w:t>
             </w:r>
             <w:r>
-              <w:t xml:space="preserve"> no GLPI (Formulário A)</w:t>
+              <w:t xml:space="preserve"> no GLPI (Formulário A). Organiza o roteiro de integração</w:t>
             </w:r>
           </w:p>
         </w:tc>
@@ -215,7 +225,7 @@
       <w:tr>
         <w:tc>
           <w:tcPr>
-            <w:tcW w:type="dxa" w:w="2041"/>
+            <w:tcW w:type="dxa" w:w="1780"/>
             <w:tcMar>
               <w:top w:type="dxa" w:w="60"/>
               <w:left w:type="dxa" w:w="100"/>
@@ -238,17 +248,17 @@
         </w:tc>
         <w:tc>
           <w:tcPr>
-            <w:tcW w:type="dxa" w:w="7597"/>
-            <w:tcMar>
-              <w:top w:type="dxa" w:w="60"/>
-              <w:left w:type="dxa" w:w="100"/>
-              <w:bottom w:type="dxa" w:w="60"/>
-              <w:right w:type="dxa" w:w="100"/>
-            </w:tcMar>
-          </w:tcPr>
-          <w:p>
-            <w:r>
-              <w:t xml:space="preserve">Aprova a lista de acessos e equipamentos</w:t>
+            <w:tcW w:type="dxa" w:w="7858"/>
+            <w:tcMar>
+              <w:top w:type="dxa" w:w="60"/>
+              <w:left w:type="dxa" w:w="100"/>
+              <w:bottom w:type="dxa" w:w="60"/>
+              <w:right w:type="dxa" w:w="100"/>
+            </w:tcMar>
+          </w:tcPr>
+          <w:p>
+            <w:r>
+              <w:t xml:space="preserve">Aprova a lista de acessos e equipamentos. Diz quais setores a integração não pode deixar de fora</w:t>
             </w:r>
           </w:p>
         </w:tc>
@@ -256,7 +266,7 @@
       <w:tr>
         <w:tc>
           <w:tcPr>
-            <w:tcW w:type="dxa" w:w="2041"/>
+            <w:tcW w:type="dxa" w:w="1780"/>
             <w:tcMar>
               <w:top w:type="dxa" w:w="60"/>
               <w:left w:type="dxa" w:w="100"/>
@@ -276,7 +286,7 @@
         </w:tc>
         <w:tc>
           <w:tcPr>
-            <w:tcW w:type="dxa" w:w="7597"/>
+            <w:tcW w:type="dxa" w:w="7858"/>
             <w:tcMar>
               <w:top w:type="dxa" w:w="60"/>
               <w:left w:type="dxa" w:w="100"/>
@@ -294,7 +304,7 @@
       <w:tr>
         <w:tc>
           <w:tcPr>
-            <w:tcW w:type="dxa" w:w="2041"/>
+            <w:tcW w:type="dxa" w:w="1780"/>
             <w:tcMar>
               <w:top w:type="dxa" w:w="60"/>
               <w:left w:type="dxa" w:w="100"/>
@@ -314,7 +324,7 @@
         </w:tc>
         <w:tc>
           <w:tcPr>
-            <w:tcW w:type="dxa" w:w="7597"/>
+            <w:tcW w:type="dxa" w:w="7858"/>
             <w:tcMar>
               <w:top w:type="dxa" w:w="60"/>
               <w:left w:type="dxa" w:w="100"/>
@@ -355,7 +365,7 @@
           <w:b/>
           <w:bCs/>
         </w:rPr>
-        <w:t xml:space="preserve">no mínimo 3 dias úteis antes</w:t>
+        <w:t xml:space="preserve">no mínimo 2 dias úteis antes</w:t>
       </w:r>
       <w:r>
         <w:t xml:space="preserve"> da data de início.</w:t>
@@ -370,17 +380,36 @@
         </w:numPr>
       </w:pPr>
       <w:r>
-        <w:t xml:space="preserve">Tudo pronto </w:t>
-      </w:r>
-      <w:r>
-        <w:rPr>
-          <w:b/>
-          <w:bCs/>
-        </w:rPr>
-        <w:t xml:space="preserve">até o dia anterior</w:t>
-      </w:r>
-      <w:r>
-        <w:t xml:space="preserve"> ao início.</w:t>
+        <w:rPr>
+          <w:b/>
+          <w:bCs/>
+        </w:rPr>
+        <w:t xml:space="preserve">Dias 1 e 2:</w:t>
+      </w:r>
+      <w:r>
+        <w:t xml:space="preserve"> integração (seção 4.4). O funcionário já trabalha, mas ainda sem login, senhas, celular e computador.</w:t>
+      </w:r>
+    </w:p>
+    <w:p>
+      <w:pPr>
+        <w:pStyle w:val="ListParagraph"/>
+        <w:numPr>
+          <w:ilvl w:val="0"/>
+          <w:numId w:val="2"/>
+        </w:numPr>
+      </w:pPr>
+      <w:r>
+        <w:t xml:space="preserve">Tudo pronto e entregue </w:t>
+      </w:r>
+      <w:r>
+        <w:rPr>
+          <w:b/>
+          <w:bCs/>
+        </w:rPr>
+        <w:t xml:space="preserve">até o fim do 2º dia</w:t>
+      </w:r>
+      <w:r>
+        <w:t xml:space="preserve"> de trabalho.</w:t>
       </w:r>
     </w:p>
     <w:p>
@@ -693,7 +722,7 @@
           <w:b/>
           <w:bCs/>
         </w:rPr>
-        <w:t xml:space="preserve">ERP / Petroshow / Infinitum:</w:t>
+        <w:t xml:space="preserve">Petroshow / Infinitum / Orion:</w:t>
       </w:r>
       <w:r>
         <w:t xml:space="preserve"> criar os usuários aprovados, com o perfil da função (nunca copiar o perfil de outra pessoa sem conferir).</w:t>
@@ -965,7 +994,35 @@
         <w:pStyle w:val="Heading3"/>
       </w:pPr>
       <w:r>
-        <w:t xml:space="preserve">4.4 Primeiro dia (TI + funcionário)</w:t>
+        <w:t xml:space="preserve">4.4 Integração: dias 1 e 2 (RH + gestor)</w:t>
+      </w:r>
+    </w:p>
+    <w:p>
+      <w:pPr>
+        <w:spacing w:after="120"/>
+      </w:pPr>
+      <w:r>
+        <w:t xml:space="preserve">Nos dois primeiros dias o funcionário </w:t>
+      </w:r>
+      <w:r>
+        <w:rPr>
+          <w:b/>
+          <w:bCs/>
+        </w:rPr>
+        <w:t xml:space="preserve">ainda não tem</w:t>
+      </w:r>
+      <w:r>
+        <w:t xml:space="preserve"> login, senhas, celular nem computador. Ele usa esse tempo para passar por </w:t>
+      </w:r>
+      <w:r>
+        <w:rPr>
+          <w:b/>
+          <w:bCs/>
+        </w:rPr>
+        <w:t xml:space="preserve">todos os setores da empresa</w:t>
+      </w:r>
+      <w:r>
+        <w:t xml:space="preserve"> e entender como o trabalho anda de ponta a ponta: do pedido à entrega, do posto ao escritório. Enquanto isso, a TI termina a preparação (seção 4.3).</w:t>
       </w:r>
     </w:p>
     <w:p>
@@ -979,17 +1036,24 @@
         <w:t xml:space="preserve">14.	</w:t>
       </w:r>
       <w:r>
-        <w:t xml:space="preserve">Entregar os equipamentos e o </w:t>
-      </w:r>
-      <w:r>
-        <w:rPr>
-          <w:b/>
-          <w:bCs/>
-        </w:rPr>
-        <w:t xml:space="preserve">Formulário C: Termo de responsabilidade</w:t>
-      </w:r>
-      <w:r>
-        <w:t xml:space="preserve"> para assinatura (1 via com o funcionário, 1 na pasta do RH).</w:t>
+        <w:rPr>
+          <w:b/>
+          <w:bCs/>
+        </w:rPr>
+        <w:t xml:space="preserve">RH</w:t>
+      </w:r>
+      <w:r>
+        <w:t xml:space="preserve">, com o gestor, monta o </w:t>
+      </w:r>
+      <w:r>
+        <w:rPr>
+          <w:b/>
+          <w:bCs/>
+        </w:rPr>
+        <w:t xml:space="preserve">roteiro de integração</w:t>
+      </w:r>
+      <w:r>
+        <w:t xml:space="preserve">: os setores, a ordem, os horários e quem recebe o funcionário em cada um. Os setores que o gestor marcou como essenciais entram primeiro.</w:t>
       </w:r>
     </w:p>
     <w:p>
@@ -1003,27 +1067,17 @@
         <w:t xml:space="preserve">15.	</w:t>
       </w:r>
       <w:r>
-        <w:t xml:space="preserve">Entregar as senhas ao funcionário pessoalmente e acompanhar o primeiro login em cada sistema. </w:t>
-      </w:r>
-      <w:r>
-        <w:rPr>
-          <w:b/>
-          <w:bCs/>
-        </w:rPr>
-        <w:t xml:space="preserve">Todas as senhas da pessoa ficam no cofre de senhas</w:t>
-      </w:r>
-      <w:r>
-        <w:t xml:space="preserve"> (pasta do funcionário). O funcionário </w:t>
-      </w:r>
-      <w:r>
-        <w:rPr>
-          <w:b/>
-          <w:bCs/>
-        </w:rPr>
-        <w:t xml:space="preserve">não troca</w:t>
-      </w:r>
-      <w:r>
-        <w:t xml:space="preserve"> as senhas: se precisar trocar, pede à TI, que troca e atualiza o cofre.</w:t>
+        <w:t xml:space="preserve">Em cada setor, a pessoa que recebe explica o que o setor faz, com quem se relaciona e como o trabalho chega e sai dali. O funcionário acompanha o trabalho e </w:t>
+      </w:r>
+      <w:r>
+        <w:rPr>
+          <w:b/>
+          <w:bCs/>
+        </w:rPr>
+        <w:t xml:space="preserve">pode ver os sistemas na tela de quem está trabalhando</w:t>
+      </w:r>
+      <w:r>
+        <w:t xml:space="preserve">.</w:t>
       </w:r>
     </w:p>
     <w:p>
@@ -1037,13 +1091,17 @@
         <w:t xml:space="preserve">16.	</w:t>
       </w:r>
       <w:r>
-        <w:t xml:space="preserve">Instalar a imagem de rodapé como assinatura no Outlook/webmail e colocar a foto de perfil no e-mail, se o programa permitir (passo a passo em </w:t>
-      </w:r>
-      <w:r>
-        <w:t xml:space="preserve">anexos/padrao-email.md</w:t>
-      </w:r>
-      <w:r>
-        <w:t xml:space="preserve">).</w:t>
+        <w:t xml:space="preserve">Durante a integração o funcionário </w:t>
+      </w:r>
+      <w:r>
+        <w:rPr>
+          <w:b/>
+          <w:bCs/>
+        </w:rPr>
+        <w:t xml:space="preserve">não usa login nem senha de ninguém</w:t>
+      </w:r>
+      <w:r>
+        <w:t xml:space="preserve">. Precisou de acesso para fazer algo: espera a entrega no fim do 2º dia.</w:t>
       </w:r>
     </w:p>
     <w:p>
@@ -1055,6 +1113,106 @@
       </w:pPr>
       <w:r>
         <w:t xml:space="preserve">17.	</w:t>
+      </w:r>
+      <w:r>
+        <w:t xml:space="preserve">O RH guarda o roteiro cumprido na pasta do funcionário.</w:t>
+      </w:r>
+    </w:p>
+    <w:p>
+      <w:pPr>
+        <w:pStyle w:val="Heading3"/>
+      </w:pPr>
+      <w:r>
+        <w:t xml:space="preserve">4.5 Fim do 2º dia: entrega (TI + funcionário)</w:t>
+      </w:r>
+    </w:p>
+    <w:p>
+      <w:pPr>
+        <w:tabs>
+          <w:tab w:val="left" w:pos="720"/>
+        </w:tabs>
+        <w:ind w:left="720" w:hanging="400"/>
+      </w:pPr>
+      <w:r>
+        <w:t xml:space="preserve">18.	</w:t>
+      </w:r>
+      <w:r>
+        <w:t xml:space="preserve">Entregar os equipamentos e o </w:t>
+      </w:r>
+      <w:r>
+        <w:rPr>
+          <w:b/>
+          <w:bCs/>
+        </w:rPr>
+        <w:t xml:space="preserve">Formulário C: Termo de responsabilidade</w:t>
+      </w:r>
+      <w:r>
+        <w:t xml:space="preserve"> para assinatura (1 via com o funcionário, 1 na pasta do RH).</w:t>
+      </w:r>
+    </w:p>
+    <w:p>
+      <w:pPr>
+        <w:tabs>
+          <w:tab w:val="left" w:pos="720"/>
+        </w:tabs>
+        <w:ind w:left="720" w:hanging="400"/>
+      </w:pPr>
+      <w:r>
+        <w:t xml:space="preserve">19.	</w:t>
+      </w:r>
+      <w:r>
+        <w:t xml:space="preserve">Entregar as senhas ao funcionário pessoalmente e acompanhar o primeiro login em cada sistema. </w:t>
+      </w:r>
+      <w:r>
+        <w:rPr>
+          <w:b/>
+          <w:bCs/>
+        </w:rPr>
+        <w:t xml:space="preserve">Todas as senhas da pessoa ficam no cofre de senhas</w:t>
+      </w:r>
+      <w:r>
+        <w:t xml:space="preserve"> (pasta do funcionário). O funcionário </w:t>
+      </w:r>
+      <w:r>
+        <w:rPr>
+          <w:b/>
+          <w:bCs/>
+        </w:rPr>
+        <w:t xml:space="preserve">não troca</w:t>
+      </w:r>
+      <w:r>
+        <w:t xml:space="preserve"> as senhas: se precisar trocar, pede à TI, que troca e atualiza o cofre.</w:t>
+      </w:r>
+    </w:p>
+    <w:p>
+      <w:pPr>
+        <w:tabs>
+          <w:tab w:val="left" w:pos="720"/>
+        </w:tabs>
+        <w:ind w:left="720" w:hanging="400"/>
+      </w:pPr>
+      <w:r>
+        <w:t xml:space="preserve">20.	</w:t>
+      </w:r>
+      <w:r>
+        <w:t xml:space="preserve">Instalar a imagem de rodapé como assinatura no Outlook/webmail e colocar a foto de perfil no e-mail, se o programa permitir (passo a passo em </w:t>
+      </w:r>
+      <w:r>
+        <w:t xml:space="preserve">anexos/padrao-email.md</w:t>
+      </w:r>
+      <w:r>
+        <w:t xml:space="preserve">).</w:t>
+      </w:r>
+    </w:p>
+    <w:p>
+      <w:pPr>
+        <w:tabs>
+          <w:tab w:val="left" w:pos="720"/>
+        </w:tabs>
+        <w:ind w:left="720" w:hanging="400"/>
+      </w:pPr>
+      <w:r>
+        <w:t xml:space="preserve">21.	</w:t>
       </w:r>
       <w:r>
         <w:t xml:space="preserve">Explicar as regras básicas: senha não se compartilha com colegas, não se troca sem a TI, aparelho perdido avisa a TI na hora (POP-03), app novo só via solicitação (POP-08).</w:t>
@@ -1081,8 +1239,8 @@
         </w:tblBorders>
       </w:tblPr>
       <w:tblGrid>
-        <w:gridCol w:w="3203"/>
-        <w:gridCol w:w="6435"/>
+        <w:gridCol w:w="3348"/>
+        <w:gridCol w:w="6290"/>
       </w:tblGrid>
       <w:tr>
         <w:trPr>
@@ -1090,7 +1248,7 @@
         </w:trPr>
         <w:tc>
           <w:tcPr>
-            <w:tcW w:type="dxa" w:w="3203"/>
+            <w:tcW w:type="dxa" w:w="3348"/>
             <w:shd w:fill="EEEEEE" w:color="auto" w:val="clear"/>
             <w:tcMar>
               <w:top w:type="dxa" w:w="60"/>
@@ -1111,7 +1269,7 @@
         </w:tc>
         <w:tc>
           <w:tcPr>
-            <w:tcW w:type="dxa" w:w="6435"/>
+            <w:tcW w:type="dxa" w:w="6290"/>
             <w:shd w:fill="EEEEEE" w:color="auto" w:val="clear"/>
             <w:tcMar>
               <w:top w:type="dxa" w:w="60"/>
@@ -1134,7 +1292,7 @@
       <w:tr>
         <w:tc>
           <w:tcPr>
-            <w:tcW w:type="dxa" w:w="3203"/>
+            <w:tcW w:type="dxa" w:w="3348"/>
             <w:tcMar>
               <w:top w:type="dxa" w:w="60"/>
               <w:left w:type="dxa" w:w="100"/>
@@ -1150,7 +1308,7 @@
         </w:tc>
         <w:tc>
           <w:tcPr>
-            <w:tcW w:type="dxa" w:w="6435"/>
+            <w:tcW w:type="dxa" w:w="6290"/>
             <w:tcMar>
               <w:top w:type="dxa" w:w="60"/>
               <w:left w:type="dxa" w:w="100"/>
@@ -1179,7 +1337,7 @@
       <w:tr>
         <w:tc>
           <w:tcPr>
-            <w:tcW w:type="dxa" w:w="3203"/>
+            <w:tcW w:type="dxa" w:w="3348"/>
             <w:tcMar>
               <w:top w:type="dxa" w:w="60"/>
               <w:left w:type="dxa" w:w="100"/>
@@ -1195,7 +1353,7 @@
         </w:tc>
         <w:tc>
           <w:tcPr>
-            <w:tcW w:type="dxa" w:w="6435"/>
+            <w:tcW w:type="dxa" w:w="6290"/>
             <w:tcMar>
               <w:top w:type="dxa" w:w="60"/>
               <w:left w:type="dxa" w:w="100"/>
@@ -1213,23 +1371,23 @@
       <w:tr>
         <w:tc>
           <w:tcPr>
-            <w:tcW w:type="dxa" w:w="3203"/>
-            <w:tcMar>
-              <w:top w:type="dxa" w:w="60"/>
-              <w:left w:type="dxa" w:w="100"/>
-              <w:bottom w:type="dxa" w:w="60"/>
-              <w:right w:type="dxa" w:w="100"/>
-            </w:tcMar>
-          </w:tcPr>
-          <w:p>
-            <w:r>
-              <w:t xml:space="preserve">ERP / Petroshow / Infinitum</w:t>
-            </w:r>
-          </w:p>
-        </w:tc>
-        <w:tc>
-          <w:tcPr>
-            <w:tcW w:type="dxa" w:w="6435"/>
+            <w:tcW w:type="dxa" w:w="3348"/>
+            <w:tcMar>
+              <w:top w:type="dxa" w:w="60"/>
+              <w:left w:type="dxa" w:w="100"/>
+              <w:bottom w:type="dxa" w:w="60"/>
+              <w:right w:type="dxa" w:w="100"/>
+            </w:tcMar>
+          </w:tcPr>
+          <w:p>
+            <w:r>
+              <w:t xml:space="preserve">Petroshow (ERP) / Infinitum / Orion</w:t>
+            </w:r>
+          </w:p>
+        </w:tc>
+        <w:tc>
+          <w:tcPr>
+            <w:tcW w:type="dxa" w:w="6290"/>
             <w:tcMar>
               <w:top w:type="dxa" w:w="60"/>
               <w:left w:type="dxa" w:w="100"/>
@@ -1247,7 +1405,7 @@
       <w:tr>
         <w:tc>
           <w:tcPr>
-            <w:tcW w:type="dxa" w:w="3203"/>
+            <w:tcW w:type="dxa" w:w="3348"/>
             <w:tcMar>
               <w:top w:type="dxa" w:w="60"/>
               <w:left w:type="dxa" w:w="100"/>
@@ -1263,7 +1421,7 @@
         </w:tc>
         <w:tc>
           <w:tcPr>
-            <w:tcW w:type="dxa" w:w="6435"/>
+            <w:tcW w:type="dxa" w:w="6290"/>
             <w:tcMar>
               <w:top w:type="dxa" w:w="60"/>
               <w:left w:type="dxa" w:w="100"/>
@@ -1281,7 +1439,7 @@
       <w:tr>
         <w:tc>
           <w:tcPr>
-            <w:tcW w:type="dxa" w:w="3203"/>
+            <w:tcW w:type="dxa" w:w="3348"/>
             <w:tcMar>
               <w:top w:type="dxa" w:w="60"/>
               <w:left w:type="dxa" w:w="100"/>
@@ -1297,7 +1455,7 @@
         </w:tc>
         <w:tc>
           <w:tcPr>
-            <w:tcW w:type="dxa" w:w="6435"/>
+            <w:tcW w:type="dxa" w:w="6290"/>
             <w:tcMar>
               <w:top w:type="dxa" w:w="60"/>
               <w:left w:type="dxa" w:w="100"/>
@@ -1315,7 +1473,7 @@
       <w:tr>
         <w:tc>
           <w:tcPr>
-            <w:tcW w:type="dxa" w:w="3203"/>
+            <w:tcW w:type="dxa" w:w="3348"/>
             <w:tcMar>
               <w:top w:type="dxa" w:w="60"/>
               <w:left w:type="dxa" w:w="100"/>
@@ -1331,7 +1489,7 @@
         </w:tc>
         <w:tc>
           <w:tcPr>
-            <w:tcW w:type="dxa" w:w="6435"/>
+            <w:tcW w:type="dxa" w:w="6290"/>
             <w:tcMar>
               <w:top w:type="dxa" w:w="60"/>
               <w:left w:type="dxa" w:w="100"/>
@@ -1377,7 +1535,7 @@
         </w:numPr>
       </w:pPr>
       <w:r>
-        <w:t xml:space="preserve">Formulário C (termo assinado) na pasta do funcionário no RH.</w:t>
+        <w:t xml:space="preserve">Formulário C (termo assinado) e roteiro de integração cumprido na pasta do funcionário no RH.</w:t>
       </w:r>
     </w:p>
     <w:p>
@@ -1409,7 +1567,7 @@
         </w:numPr>
       </w:pPr>
       <w:r>
-        <w:t xml:space="preserve">Tudo criado até o dia anterior ao início.</w:t>
+        <w:t xml:space="preserve">Tudo criado e entregue até o fim do 2º dia (fim da integração).</w:t>
       </w:r>
     </w:p>
     <w:p>
@@ -2376,6 +2534,218 @@
     </w:p>
     <w:p>
       <w:pPr>
+        <w:tabs>
+          <w:tab w:val="left" w:pos="720"/>
+        </w:tabs>
+        <w:ind w:left="720" w:hanging="400"/>
+      </w:pPr>
+      <w:r>
+        <w:t xml:space="preserve">6.	</w:t>
+      </w:r>
+      <w:r>
+        <w:rPr>
+          <w:b/>
+          <w:bCs/>
+        </w:rPr>
+        <w:t xml:space="preserve">Sistema VS:</w:t>
+      </w:r>
+      <w:r>
+        <w:t xml:space="preserve"> desativar o usuário (não excluir: o histórico de quem fez o quê precisa continuar).</w:t>
+      </w:r>
+    </w:p>
+    <w:p>
+      <w:pPr>
+        <w:tabs>
+          <w:tab w:val="left" w:pos="720"/>
+        </w:tabs>
+        <w:ind w:left="720" w:hanging="400"/>
+      </w:pPr>
+      <w:r>
+        <w:t xml:space="preserve">7.	</w:t>
+      </w:r>
+      <w:r>
+        <w:rPr>
+          <w:b/>
+          <w:bCs/>
+        </w:rPr>
+        <w:t xml:space="preserve">Petroshow / Infinitum / Orion:</w:t>
+      </w:r>
+      <w:r>
+        <w:t xml:space="preserve"> desativar os usuários (não excluir, pelo mesmo motivo).</w:t>
+      </w:r>
+    </w:p>
+    <w:p>
+      <w:pPr>
+        <w:tabs>
+          <w:tab w:val="left" w:pos="720"/>
+        </w:tabs>
+        <w:ind w:left="720" w:hanging="400"/>
+      </w:pPr>
+      <w:r>
+        <w:t xml:space="preserve">8.	</w:t>
+      </w:r>
+      <w:r>
+        <w:rPr>
+          <w:b/>
+          <w:bCs/>
+        </w:rPr>
+        <w:t xml:space="preserve">WhatsApp corporativo:</w:t>
+      </w:r>
+      <w:r>
+        <w:t xml:space="preserve"> o número é da empresa. Conferir que o backup do dia foi feito (POP-TI §4.3), recolher o aparelho, passar o atendimento para quem assume e trocar o nome/foto do perfil.</w:t>
+      </w:r>
+    </w:p>
+    <w:p>
+      <w:pPr>
+        <w:tabs>
+          <w:tab w:val="left" w:pos="720"/>
+        </w:tabs>
+        <w:ind w:left="720" w:hanging="400"/>
+      </w:pPr>
+      <w:r>
+        <w:t xml:space="preserve">9.	</w:t>
+      </w:r>
+      <w:r>
+        <w:rPr>
+          <w:b/>
+          <w:bCs/>
+        </w:rPr>
+        <w:t xml:space="preserve">Grupos de WhatsApp pessoais de trabalho:</w:t>
+      </w:r>
+      <w:r>
+        <w:t xml:space="preserve"> se a pessoa estava em grupos de trabalho com o número pessoal, removê-la.</w:t>
+      </w:r>
+    </w:p>
+    <w:p>
+      <w:pPr>
+        <w:tabs>
+          <w:tab w:val="left" w:pos="720"/>
+        </w:tabs>
+        <w:ind w:left="720" w:hanging="400"/>
+      </w:pPr>
+      <w:r>
+        <w:t xml:space="preserve">10.	</w:t>
+      </w:r>
+      <w:r>
+        <w:rPr>
+          <w:b/>
+          <w:bCs/>
+        </w:rPr>
+        <w:t xml:space="preserve">Acesso remoto:</w:t>
+      </w:r>
+      <w:r>
+        <w:t xml:space="preserve"> remover a pessoa da </w:t>
+      </w:r>
+      <w:r>
+        <w:rPr>
+          <w:b/>
+          <w:bCs/>
+        </w:rPr>
+        <w:t xml:space="preserve">ferramenta de acesso remoto</w:t>
+      </w:r>
+      <w:r>
+        <w:t xml:space="preserve"> e da </w:t>
+      </w:r>
+      <w:r>
+        <w:rPr>
+          <w:b/>
+          <w:bCs/>
+        </w:rPr>
+        <w:t xml:space="preserve">VPN</w:t>
+      </w:r>
+      <w:r>
+        <w:t xml:space="preserve">, se tinha acesso.</w:t>
+      </w:r>
+    </w:p>
+    <w:p>
+      <w:pPr>
+        <w:pStyle w:val="Heading3"/>
+      </w:pPr>
+      <w:r>
+        <w:t xml:space="preserve">4.3 Equipamentos</w:t>
+      </w:r>
+    </w:p>
+    <w:p>
+      <w:pPr>
+        <w:tabs>
+          <w:tab w:val="left" w:pos="720"/>
+        </w:tabs>
+        <w:ind w:left="720" w:hanging="400"/>
+      </w:pPr>
+      <w:r>
+        <w:t xml:space="preserve">11.	</w:t>
+      </w:r>
+      <w:r>
+        <w:t xml:space="preserve">Recolher todos os equipamentos do Formulário C (termo de responsabilidade) e conferir a lista item por item.</w:t>
+      </w:r>
+    </w:p>
+    <w:p>
+      <w:pPr>
+        <w:tabs>
+          <w:tab w:val="left" w:pos="720"/>
+        </w:tabs>
+        <w:ind w:left="720" w:hanging="400"/>
+      </w:pPr>
+      <w:r>
+        <w:t xml:space="preserve">12.	</w:t>
+      </w:r>
+      <w:r>
+        <w:t xml:space="preserve">Preencher o </w:t>
+      </w:r>
+      <w:r>
+        <w:rPr>
+          <w:b/>
+          <w:bCs/>
+        </w:rPr>
+        <w:t xml:space="preserve">Formulário D: Termo de devolução</w:t>
+      </w:r>
+      <w:r>
+        <w:t xml:space="preserve">, assinado pelo funcionário e pela TI. Equipamento faltando ou danificado: registrar no termo e avisar o RH.</w:t>
+      </w:r>
+    </w:p>
+    <w:p>
+      <w:pPr>
+        <w:tabs>
+          <w:tab w:val="left" w:pos="720"/>
+        </w:tabs>
+        <w:ind w:left="720" w:hanging="400"/>
+      </w:pPr>
+      <w:r>
+        <w:t xml:space="preserve">13.	</w:t>
+      </w:r>
+      <w:r>
+        <w:rPr>
+          <w:b/>
+          <w:bCs/>
+        </w:rPr>
+        <w:t xml:space="preserve">Celular corporativo:</w:t>
+      </w:r>
+      <w:r>
+        <w:t xml:space="preserve"> fazer o </w:t>
+      </w:r>
+      <w:r>
+        <w:rPr>
+          <w:b/>
+          <w:bCs/>
+        </w:rPr>
+        <w:t xml:space="preserve">wipe</w:t>
+      </w:r>
+      <w:r>
+        <w:t xml:space="preserve"> pelo MDM. Depois do wipe, desbloquear com o Gmail da empresa do aparelho (FRP) e trocar a senha dessa conta no cofre de senhas antes de entregar o aparelho a outra pessoa. Se o aparelho não foi devolvido: </w:t>
+      </w:r>
+      <w:r>
+        <w:rPr>
+          <w:b/>
+          <w:bCs/>
+        </w:rPr>
+        <w:t xml:space="preserve">bloqueio remoto</w:t>
+      </w:r>
+      <w:r>
+        <w:t xml:space="preserve"> na hora e seguir o POP-03.</w:t>
+      </w:r>
+    </w:p>
+    <w:p>
+      <w:pPr>
         <w:pStyle w:val="ListParagraph"/>
         <w:numPr>
           <w:ilvl w:val="1"/>
@@ -2383,7 +2753,95 @@
         </w:numPr>
       </w:pPr>
       <w:r>
-        <w:t xml:space="preserve">Desconectar as sessões abertas e remover o e-mail de celulares/Outlook, se o painel permitir.</w:t>
+        <w:rPr>
+          <w:b/>
+          <w:bCs/>
+        </w:rPr>
+        <w:t xml:space="preserve">Se quem sai é o responsável de TI:</w:t>
+      </w:r>
+      <w:r>
+        <w:t xml:space="preserve"> antes de excluir o e-mail dele, trocar o e-mail e o telefone de recuperação de </w:t>
+      </w:r>
+      <w:r>
+        <w:rPr>
+          <w:b/>
+          <w:bCs/>
+        </w:rPr>
+        <w:t xml:space="preserve">todas</w:t>
+      </w:r>
+      <w:r>
+        <w:t xml:space="preserve"> as contas Gmail dos aparelhos para o do novo responsável e atualizar o cofre de senhas.</w:t>
+      </w:r>
+    </w:p>
+    <w:p>
+      <w:pPr>
+        <w:tabs>
+          <w:tab w:val="left" w:pos="720"/>
+        </w:tabs>
+        <w:ind w:left="720" w:hanging="400"/>
+      </w:pPr>
+      <w:r>
+        <w:t xml:space="preserve">14.	</w:t>
+      </w:r>
+      <w:r>
+        <w:rPr>
+          <w:b/>
+          <w:bCs/>
+        </w:rPr>
+        <w:t xml:space="preserve">Computador:</w:t>
+      </w:r>
+      <w:r>
+        <w:t xml:space="preserve"> depois da cópia dos arquivos (passo 4), apagar o usuário da pessoa ou reinstalar pela instalação padrão (POP-04/05) antes de passar para outra pessoa.</w:t>
+      </w:r>
+    </w:p>
+    <w:p>
+      <w:pPr>
+        <w:tabs>
+          <w:tab w:val="left" w:pos="720"/>
+        </w:tabs>
+        <w:ind w:left="720" w:hanging="400"/>
+      </w:pPr>
+      <w:r>
+        <w:t xml:space="preserve">15.	</w:t>
+      </w:r>
+      <w:r>
+        <w:t xml:space="preserve">Atualizar o inventário no </w:t>
+      </w:r>
+      <w:r>
+        <w:rPr>
+          <w:b/>
+          <w:bCs/>
+        </w:rPr>
+        <w:t xml:space="preserve">GLPI</w:t>
+      </w:r>
+      <w:r>
+        <w:t xml:space="preserve">: equipamento devolvido, "disponível" ou "em manutenção".</w:t>
+      </w:r>
+    </w:p>
+    <w:p>
+      <w:pPr>
+        <w:pStyle w:val="Heading3"/>
+      </w:pPr>
+      <w:r>
+        <w:t xml:space="preserve">4.4 Depois da saída</w:t>
+      </w:r>
+    </w:p>
+    <w:p>
+      <w:pPr>
+        <w:tabs>
+          <w:tab w:val="left" w:pos="720"/>
+        </w:tabs>
+        <w:ind w:left="720" w:hanging="400"/>
+      </w:pPr>
+      <w:r>
+        <w:t xml:space="preserve">16.	</w:t>
+      </w:r>
+      <w:r>
+        <w:rPr>
+          <w:b/>
+          <w:bCs/>
+        </w:rPr>
+        <w:t xml:space="preserve">Após 90 dias:</w:t>
       </w:r>
     </w:p>
     <w:p>
@@ -2395,13 +2853,35 @@
         </w:numPr>
       </w:pPr>
       <w:r>
-        <w:t xml:space="preserve">Ativar resposta automática: "Fulano não faz mais parte da equipe. Para assuntos de </w:t>
-      </w:r>
-      <w:r>
-        <w:t xml:space="preserve">, escreva para </w:t>
-      </w:r>
-      <w:r>
-        <w:t xml:space="preserve">".</w:t>
+        <w:rPr>
+          <w:b/>
+          <w:bCs/>
+        </w:rPr>
+        <w:t xml:space="preserve">Backup permanente da caixa:</w:t>
+      </w:r>
+      <w:r>
+        <w:t xml:space="preserve"> baixar a caixa de e-mail inteira (todas as pastas: entrada, enviados, arquivadas) por IMAP para o servidor, na pasta </w:t>
+      </w:r>
+      <w:r>
+        <w:rPr>
+          <w:rFonts w:ascii="Consolas" w:cs="Consolas" w:eastAsia="Consolas" w:hAnsi="Consolas"/>
+          <w:sz w:val="19"/>
+          <w:szCs w:val="19"/>
+        </w:rPr>
+        <w:t xml:space="preserve">emails-ex-funcionarios/&lt;nome.sobrenome&gt;/</w:t>
+      </w:r>
+      <w:r>
+        <w:t xml:space="preserve">. Abrir alguns e-mails do backup para conferir. </w:t>
+      </w:r>
+      <w:r>
+        <w:rPr>
+          <w:b/>
+          <w:bCs/>
+        </w:rPr>
+        <w:t xml:space="preserve">Esse backup nunca é apagado</w:t>
+      </w:r>
+      <w:r>
+        <w:t xml:space="preserve"> e entra na cópia noturna do servidor (backup do servidor).</w:t>
       </w:r>
     </w:p>
     <w:p>
@@ -2413,17 +2893,17 @@
         </w:numPr>
       </w:pPr>
       <w:r>
-        <w:t xml:space="preserve">Encaminhar para o gestor (ou para quem ele indicou) por </w:t>
-      </w:r>
-      <w:r>
-        <w:rPr>
-          <w:b/>
-          <w:bCs/>
-        </w:rPr>
-        <w:t xml:space="preserve">90 dias</w:t>
-      </w:r>
-      <w:r>
-        <w:t xml:space="preserve">.</w:t>
+        <w:t xml:space="preserve">Só depois do backup conferido: </w:t>
+      </w:r>
+      <w:r>
+        <w:rPr>
+          <w:b/>
+          <w:bCs/>
+        </w:rPr>
+        <w:t xml:space="preserve">excluir a conta de e-mail</w:t>
+      </w:r>
+      <w:r>
+        <w:t xml:space="preserve"> (libera a licença na hospedagem).</w:t>
       </w:r>
     </w:p>
     <w:p>
@@ -2434,402 +2914,7 @@
         <w:ind w:left="720" w:hanging="400"/>
       </w:pPr>
       <w:r>
-        <w:t xml:space="preserve">6.	</w:t>
-      </w:r>
-      <w:r>
-        <w:rPr>
-          <w:b/>
-          <w:bCs/>
-        </w:rPr>
-        <w:t xml:space="preserve">Sistema VS:</w:t>
-      </w:r>
-      <w:r>
-        <w:t xml:space="preserve"> desativar o usuário (não excluir: o histórico de quem fez o quê precisa continuar).</w:t>
-      </w:r>
-    </w:p>
-    <w:p>
-      <w:pPr>
-        <w:tabs>
-          <w:tab w:val="left" w:pos="720"/>
-        </w:tabs>
-        <w:ind w:left="720" w:hanging="400"/>
-      </w:pPr>
-      <w:r>
-        <w:t xml:space="preserve">7.	</w:t>
-      </w:r>
-      <w:r>
-        <w:rPr>
-          <w:b/>
-          <w:bCs/>
-        </w:rPr>
-        <w:t xml:space="preserve">ERP / Petroshow / Infinitum:</w:t>
-      </w:r>
-      <w:r>
-        <w:t xml:space="preserve"> desativar os usuários (não excluir, pelo mesmo motivo).</w:t>
-      </w:r>
-    </w:p>
-    <w:p>
-      <w:pPr>
-        <w:tabs>
-          <w:tab w:val="left" w:pos="720"/>
-        </w:tabs>
-        <w:ind w:left="720" w:hanging="400"/>
-      </w:pPr>
-      <w:r>
-        <w:t xml:space="preserve">8.	</w:t>
-      </w:r>
-      <w:r>
-        <w:rPr>
-          <w:b/>
-          <w:bCs/>
-        </w:rPr>
-        <w:t xml:space="preserve">WhatsApp corporativo:</w:t>
-      </w:r>
-      <w:r>
-        <w:t xml:space="preserve"> o número é da empresa. Conferir que o backup do dia foi feito (POP-TI §4.3), recolher o aparelho, passar o atendimento para quem assume e trocar o nome/foto do perfil.</w:t>
-      </w:r>
-    </w:p>
-    <w:p>
-      <w:pPr>
-        <w:tabs>
-          <w:tab w:val="left" w:pos="720"/>
-        </w:tabs>
-        <w:ind w:left="720" w:hanging="400"/>
-      </w:pPr>
-      <w:r>
-        <w:t xml:space="preserve">9.	</w:t>
-      </w:r>
-      <w:r>
-        <w:rPr>
-          <w:b/>
-          <w:bCs/>
-        </w:rPr>
-        <w:t xml:space="preserve">Grupos de WhatsApp pessoais de trabalho:</w:t>
-      </w:r>
-      <w:r>
-        <w:t xml:space="preserve"> se a pessoa estava em grupos de trabalho com o número pessoal, removê-la.</w:t>
-      </w:r>
-    </w:p>
-    <w:p>
-      <w:pPr>
-        <w:tabs>
-          <w:tab w:val="left" w:pos="720"/>
-        </w:tabs>
-        <w:ind w:left="720" w:hanging="400"/>
-      </w:pPr>
-      <w:r>
-        <w:t xml:space="preserve">10.	</w:t>
-      </w:r>
-      <w:r>
-        <w:rPr>
-          <w:b/>
-          <w:bCs/>
-        </w:rPr>
-        <w:t xml:space="preserve">Senhas compartilhadas</w:t>
-      </w:r>
-      <w:r>
-        <w:t xml:space="preserve"> que a pessoa conhecia (Wi-Fi, contas de setor, sistemas com login único): trocar. Atualizar as senhas novas no cofre de senhas.</w:t>
-      </w:r>
-    </w:p>
-    <w:p>
-      <w:pPr>
-        <w:tabs>
-          <w:tab w:val="left" w:pos="720"/>
-        </w:tabs>
-        <w:ind w:left="720" w:hanging="400"/>
-      </w:pPr>
-      <w:r>
-        <w:t xml:space="preserve">11.	</w:t>
-      </w:r>
-      <w:r>
-        <w:rPr>
-          <w:b/>
-          <w:bCs/>
-        </w:rPr>
-        <w:t xml:space="preserve">Acesso remoto:</w:t>
-      </w:r>
-      <w:r>
-        <w:t xml:space="preserve"> remover a pessoa da </w:t>
-      </w:r>
-      <w:r>
-        <w:rPr>
-          <w:b/>
-          <w:bCs/>
-        </w:rPr>
-        <w:t xml:space="preserve">ferramenta de acesso remoto</w:t>
-      </w:r>
-      <w:r>
-        <w:t xml:space="preserve"> e da </w:t>
-      </w:r>
-      <w:r>
-        <w:rPr>
-          <w:b/>
-          <w:bCs/>
-        </w:rPr>
-        <w:t xml:space="preserve">VPN</w:t>
-      </w:r>
-      <w:r>
-        <w:t xml:space="preserve">, se tinha acesso.</w:t>
-      </w:r>
-    </w:p>
-    <w:p>
-      <w:pPr>
-        <w:pStyle w:val="Heading3"/>
-      </w:pPr>
-      <w:r>
-        <w:t xml:space="preserve">4.3 Equipamentos</w:t>
-      </w:r>
-    </w:p>
-    <w:p>
-      <w:pPr>
-        <w:tabs>
-          <w:tab w:val="left" w:pos="720"/>
-        </w:tabs>
-        <w:ind w:left="720" w:hanging="400"/>
-      </w:pPr>
-      <w:r>
-        <w:t xml:space="preserve">12.	</w:t>
-      </w:r>
-      <w:r>
-        <w:t xml:space="preserve">Recolher todos os equipamentos do Formulário C (termo de responsabilidade) e conferir a lista item por item.</w:t>
-      </w:r>
-    </w:p>
-    <w:p>
-      <w:pPr>
-        <w:tabs>
-          <w:tab w:val="left" w:pos="720"/>
-        </w:tabs>
-        <w:ind w:left="720" w:hanging="400"/>
-      </w:pPr>
-      <w:r>
-        <w:t xml:space="preserve">13.	</w:t>
-      </w:r>
-      <w:r>
-        <w:t xml:space="preserve">Preencher o </w:t>
-      </w:r>
-      <w:r>
-        <w:rPr>
-          <w:b/>
-          <w:bCs/>
-        </w:rPr>
-        <w:t xml:space="preserve">Formulário D: Termo de devolução</w:t>
-      </w:r>
-      <w:r>
-        <w:t xml:space="preserve">, assinado pelo funcionário e pela TI. Equipamento faltando ou danificado: registrar no termo e avisar o RH.</w:t>
-      </w:r>
-    </w:p>
-    <w:p>
-      <w:pPr>
-        <w:tabs>
-          <w:tab w:val="left" w:pos="720"/>
-        </w:tabs>
-        <w:ind w:left="720" w:hanging="400"/>
-      </w:pPr>
-      <w:r>
-        <w:t xml:space="preserve">14.	</w:t>
-      </w:r>
-      <w:r>
-        <w:rPr>
-          <w:b/>
-          <w:bCs/>
-        </w:rPr>
-        <w:t xml:space="preserve">Celular corporativo:</w:t>
-      </w:r>
-      <w:r>
-        <w:t xml:space="preserve"> fazer o </w:t>
-      </w:r>
-      <w:r>
-        <w:rPr>
-          <w:b/>
-          <w:bCs/>
-        </w:rPr>
-        <w:t xml:space="preserve">wipe</w:t>
-      </w:r>
-      <w:r>
-        <w:t xml:space="preserve"> pelo MDM. Depois do wipe, desbloquear com o Gmail da empresa do aparelho (FRP) e trocar a senha dessa conta no cofre de senhas antes de entregar o aparelho a outra pessoa. Se o aparelho não foi devolvido: </w:t>
-      </w:r>
-      <w:r>
-        <w:rPr>
-          <w:b/>
-          <w:bCs/>
-        </w:rPr>
-        <w:t xml:space="preserve">bloqueio remoto</w:t>
-      </w:r>
-      <w:r>
-        <w:t xml:space="preserve"> na hora e seguir o POP-03.</w:t>
-      </w:r>
-    </w:p>
-    <w:p>
-      <w:pPr>
-        <w:pStyle w:val="ListParagraph"/>
-        <w:numPr>
-          <w:ilvl w:val="1"/>
-          <w:numId w:val="2"/>
-        </w:numPr>
-      </w:pPr>
-      <w:r>
-        <w:rPr>
-          <w:b/>
-          <w:bCs/>
-        </w:rPr>
-        <w:t xml:space="preserve">Se quem sai é o responsável de TI:</w:t>
-      </w:r>
-      <w:r>
-        <w:t xml:space="preserve"> antes de excluir o e-mail dele, trocar o e-mail e o telefone de recuperação de </w:t>
-      </w:r>
-      <w:r>
-        <w:rPr>
-          <w:b/>
-          <w:bCs/>
-        </w:rPr>
-        <w:t xml:space="preserve">todas</w:t>
-      </w:r>
-      <w:r>
-        <w:t xml:space="preserve"> as contas Gmail dos aparelhos para o do novo responsável e atualizar o cofre de senhas.</w:t>
-      </w:r>
-    </w:p>
-    <w:p>
-      <w:pPr>
-        <w:tabs>
-          <w:tab w:val="left" w:pos="720"/>
-        </w:tabs>
-        <w:ind w:left="720" w:hanging="400"/>
-      </w:pPr>
-      <w:r>
-        <w:t xml:space="preserve">15.	</w:t>
-      </w:r>
-      <w:r>
-        <w:rPr>
-          <w:b/>
-          <w:bCs/>
-        </w:rPr>
-        <w:t xml:space="preserve">Computador:</w:t>
-      </w:r>
-      <w:r>
-        <w:t xml:space="preserve"> depois da cópia dos arquivos (passo 4), apagar o usuário da pessoa ou reinstalar pela instalação padrão (POP-04/05) antes de passar para outra pessoa.</w:t>
-      </w:r>
-    </w:p>
-    <w:p>
-      <w:pPr>
-        <w:tabs>
-          <w:tab w:val="left" w:pos="720"/>
-        </w:tabs>
-        <w:ind w:left="720" w:hanging="400"/>
-      </w:pPr>
-      <w:r>
-        <w:t xml:space="preserve">16.	</w:t>
-      </w:r>
-      <w:r>
-        <w:t xml:space="preserve">Atualizar o inventário no </w:t>
-      </w:r>
-      <w:r>
-        <w:rPr>
-          <w:b/>
-          <w:bCs/>
-        </w:rPr>
-        <w:t xml:space="preserve">GLPI</w:t>
-      </w:r>
-      <w:r>
-        <w:t xml:space="preserve">: equipamento devolvido, "disponível" ou "em manutenção".</w:t>
-      </w:r>
-    </w:p>
-    <w:p>
-      <w:pPr>
-        <w:pStyle w:val="Heading3"/>
-      </w:pPr>
-      <w:r>
-        <w:t xml:space="preserve">4.4 Depois da saída</w:t>
-      </w:r>
-    </w:p>
-    <w:p>
-      <w:pPr>
-        <w:tabs>
-          <w:tab w:val="left" w:pos="720"/>
-        </w:tabs>
-        <w:ind w:left="720" w:hanging="400"/>
-      </w:pPr>
-      <w:r>
         <w:t xml:space="preserve">17.	</w:t>
-      </w:r>
-      <w:r>
-        <w:rPr>
-          <w:b/>
-          <w:bCs/>
-        </w:rPr>
-        <w:t xml:space="preserve">Após 90 dias:</w:t>
-      </w:r>
-    </w:p>
-    <w:p>
-      <w:pPr>
-        <w:pStyle w:val="ListParagraph"/>
-        <w:numPr>
-          <w:ilvl w:val="1"/>
-          <w:numId w:val="2"/>
-        </w:numPr>
-      </w:pPr>
-      <w:r>
-        <w:rPr>
-          <w:b/>
-          <w:bCs/>
-        </w:rPr>
-        <w:t xml:space="preserve">Backup permanente da caixa:</w:t>
-      </w:r>
-      <w:r>
-        <w:t xml:space="preserve"> baixar a caixa de e-mail inteira (todas as pastas: entrada, enviados, arquivadas) por IMAP para o servidor, na pasta </w:t>
-      </w:r>
-      <w:r>
-        <w:rPr>
-          <w:rFonts w:ascii="Consolas" w:cs="Consolas" w:eastAsia="Consolas" w:hAnsi="Consolas"/>
-          <w:sz w:val="19"/>
-          <w:szCs w:val="19"/>
-        </w:rPr>
-        <w:t xml:space="preserve">emails-ex-funcionarios/&lt;nome.sobrenome&gt;/</w:t>
-      </w:r>
-      <w:r>
-        <w:t xml:space="preserve">. Abrir alguns e-mails do backup para conferir. </w:t>
-      </w:r>
-      <w:r>
-        <w:rPr>
-          <w:b/>
-          <w:bCs/>
-        </w:rPr>
-        <w:t xml:space="preserve">Esse backup nunca é apagado</w:t>
-      </w:r>
-      <w:r>
-        <w:t xml:space="preserve"> e entra na cópia noturna do servidor (backup do servidor).</w:t>
-      </w:r>
-    </w:p>
-    <w:p>
-      <w:pPr>
-        <w:pStyle w:val="ListParagraph"/>
-        <w:numPr>
-          <w:ilvl w:val="1"/>
-          <w:numId w:val="2"/>
-        </w:numPr>
-      </w:pPr>
-      <w:r>
-        <w:t xml:space="preserve">Só depois do backup conferido: desligar o encaminhamento e </w:t>
-      </w:r>
-      <w:r>
-        <w:rPr>
-          <w:b/>
-          <w:bCs/>
-        </w:rPr>
-        <w:t xml:space="preserve">excluir a conta de e-mail</w:t>
-      </w:r>
-      <w:r>
-        <w:t xml:space="preserve"> (libera a licença na hospedagem).</w:t>
-      </w:r>
-    </w:p>
-    <w:p>
-      <w:pPr>
-        <w:tabs>
-          <w:tab w:val="left" w:pos="720"/>
-        </w:tabs>
-        <w:ind w:left="720" w:hanging="400"/>
-      </w:pPr>
-      <w:r>
-        <w:t xml:space="preserve">18.	</w:t>
       </w:r>
       <w:r>
         <w:t xml:space="preserve">Fechar o chamado no GLPI com o Formulário B todo marcado. Arquivar o Formulário D (papel) na pasta do funcionário no RH.</w:t>
@@ -3719,7 +3804,7 @@
           <w:b/>
           <w:bCs/>
         </w:rPr>
-        <w:t xml:space="preserve">ERP / Petroshow / Infinitum:</w:t>
+        <w:t xml:space="preserve">Petroshow / Infinitum / Orion:</w:t>
       </w:r>
       <w:r>
         <w:t xml:space="preserve"> ajustar perfil; remover acesso à unidade antiga.</w:t>
@@ -4410,7 +4495,7 @@
           <w:b/>
           <w:bCs/>
         </w:rPr>
-        <w:t xml:space="preserve">Sistema VS / ERP / Petroshow / Infinitum:</w:t>
+        <w:t xml:space="preserve">Sistema VS / Petroshow / Infinitum / Orion:</w:t>
       </w:r>
       <w:r>
         <w:t xml:space="preserve"> desativar o usuário (sem excluir).</w:t>
@@ -5848,7 +5933,7 @@
         <w:t xml:space="preserve">Quando:</w:t>
       </w:r>
       <w:r>
-        <w:t xml:space="preserve"> na admissão (POP-01), antes do primeiro dia.</w:t>
+        <w:t xml:space="preserve"> na admissão (POP-01), no máximo no 1º dia da integração, para o rodapé ficar pronto até o fim do 2º dia.</w:t>
       </w:r>
     </w:p>
     <w:p>
@@ -6783,9 +6868,9 @@
         </w:tblBorders>
       </w:tblPr>
       <w:tblGrid>
-        <w:gridCol w:w="4523"/>
-        <w:gridCol w:w="2536"/>
-        <w:gridCol w:w="2579"/>
+        <w:gridCol w:w="4696"/>
+        <w:gridCol w:w="2450"/>
+        <w:gridCol w:w="2492"/>
       </w:tblGrid>
       <w:tr>
         <w:trPr>
@@ -6793,7 +6878,7 @@
         </w:trPr>
         <w:tc>
           <w:tcPr>
-            <w:tcW w:type="dxa" w:w="4523"/>
+            <w:tcW w:type="dxa" w:w="4696"/>
             <w:shd w:fill="EEEEEE" w:color="auto" w:val="clear"/>
             <w:tcMar>
               <w:top w:type="dxa" w:w="60"/>
@@ -6814,7 +6899,7 @@
         </w:tc>
         <w:tc>
           <w:tcPr>
-            <w:tcW w:type="dxa" w:w="2536"/>
+            <w:tcW w:type="dxa" w:w="2450"/>
             <w:shd w:fill="EEEEEE" w:color="auto" w:val="clear"/>
             <w:tcMar>
               <w:top w:type="dxa" w:w="60"/>
@@ -6835,7 +6920,7 @@
         </w:tc>
         <w:tc>
           <w:tcPr>
-            <w:tcW w:type="dxa" w:w="2579"/>
+            <w:tcW w:type="dxa" w:w="2492"/>
             <w:shd w:fill="EEEEEE" w:color="auto" w:val="clear"/>
             <w:tcMar>
               <w:top w:type="dxa" w:w="60"/>
@@ -6858,7 +6943,7 @@
       <w:tr>
         <w:tc>
           <w:tcPr>
-            <w:tcW w:type="dxa" w:w="4523"/>
+            <w:tcW w:type="dxa" w:w="4696"/>
             <w:tcMar>
               <w:top w:type="dxa" w:w="60"/>
               <w:left w:type="dxa" w:w="100"/>
@@ -6874,7 +6959,7 @@
         </w:tc>
         <w:tc>
           <w:tcPr>
-            <w:tcW w:type="dxa" w:w="2536"/>
+            <w:tcW w:type="dxa" w:w="2450"/>
             <w:tcMar>
               <w:top w:type="dxa" w:w="60"/>
               <w:left w:type="dxa" w:w="100"/>
@@ -6890,7 +6975,7 @@
         </w:tc>
         <w:tc>
           <w:tcPr>
-            <w:tcW w:type="dxa" w:w="2579"/>
+            <w:tcW w:type="dxa" w:w="2492"/>
             <w:tcMar>
               <w:top w:type="dxa" w:w="60"/>
               <w:left w:type="dxa" w:w="100"/>
@@ -6904,7 +6989,7 @@
       <w:tr>
         <w:tc>
           <w:tcPr>
-            <w:tcW w:type="dxa" w:w="4523"/>
+            <w:tcW w:type="dxa" w:w="4696"/>
             <w:tcMar>
               <w:top w:type="dxa" w:w="60"/>
               <w:left w:type="dxa" w:w="100"/>
@@ -6920,7 +7005,7 @@
         </w:tc>
         <w:tc>
           <w:tcPr>
-            <w:tcW w:type="dxa" w:w="2536"/>
+            <w:tcW w:type="dxa" w:w="2450"/>
             <w:tcMar>
               <w:top w:type="dxa" w:w="60"/>
               <w:left w:type="dxa" w:w="100"/>
@@ -6936,7 +7021,7 @@
         </w:tc>
         <w:tc>
           <w:tcPr>
-            <w:tcW w:type="dxa" w:w="2579"/>
+            <w:tcW w:type="dxa" w:w="2492"/>
             <w:tcMar>
               <w:top w:type="dxa" w:w="60"/>
               <w:left w:type="dxa" w:w="100"/>
@@ -6954,23 +7039,23 @@
       <w:tr>
         <w:tc>
           <w:tcPr>
-            <w:tcW w:type="dxa" w:w="4523"/>
-            <w:tcMar>
-              <w:top w:type="dxa" w:w="60"/>
-              <w:left w:type="dxa" w:w="100"/>
-              <w:bottom w:type="dxa" w:w="60"/>
-              <w:right w:type="dxa" w:w="100"/>
-            </w:tcMar>
-          </w:tcPr>
-          <w:p>
-            <w:r>
-              <w:t xml:space="preserve">ERP</w:t>
-            </w:r>
-          </w:p>
-        </w:tc>
-        <w:tc>
-          <w:tcPr>
-            <w:tcW w:type="dxa" w:w="2536"/>
+            <w:tcW w:type="dxa" w:w="4696"/>
+            <w:tcMar>
+              <w:top w:type="dxa" w:w="60"/>
+              <w:left w:type="dxa" w:w="100"/>
+              <w:bottom w:type="dxa" w:w="60"/>
+              <w:right w:type="dxa" w:w="100"/>
+            </w:tcMar>
+          </w:tcPr>
+          <w:p>
+            <w:r>
+              <w:t xml:space="preserve">Petroshow (ERP)</w:t>
+            </w:r>
+          </w:p>
+        </w:tc>
+        <w:tc>
+          <w:tcPr>
+            <w:tcW w:type="dxa" w:w="2450"/>
             <w:tcMar>
               <w:top w:type="dxa" w:w="60"/>
               <w:left w:type="dxa" w:w="100"/>
@@ -6986,7 +7071,7 @@
         </w:tc>
         <w:tc>
           <w:tcPr>
-            <w:tcW w:type="dxa" w:w="2579"/>
+            <w:tcW w:type="dxa" w:w="2492"/>
             <w:tcMar>
               <w:top w:type="dxa" w:w="60"/>
               <w:left w:type="dxa" w:w="100"/>
@@ -7004,23 +7089,23 @@
       <w:tr>
         <w:tc>
           <w:tcPr>
-            <w:tcW w:type="dxa" w:w="4523"/>
-            <w:tcMar>
-              <w:top w:type="dxa" w:w="60"/>
-              <w:left w:type="dxa" w:w="100"/>
-              <w:bottom w:type="dxa" w:w="60"/>
-              <w:right w:type="dxa" w:w="100"/>
-            </w:tcMar>
-          </w:tcPr>
-          <w:p>
-            <w:r>
-              <w:t xml:space="preserve">Petroshow</w:t>
-            </w:r>
-          </w:p>
-        </w:tc>
-        <w:tc>
-          <w:tcPr>
-            <w:tcW w:type="dxa" w:w="2536"/>
+            <w:tcW w:type="dxa" w:w="4696"/>
+            <w:tcMar>
+              <w:top w:type="dxa" w:w="60"/>
+              <w:left w:type="dxa" w:w="100"/>
+              <w:bottom w:type="dxa" w:w="60"/>
+              <w:right w:type="dxa" w:w="100"/>
+            </w:tcMar>
+          </w:tcPr>
+          <w:p>
+            <w:r>
+              <w:t xml:space="preserve">Infinitum</w:t>
+            </w:r>
+          </w:p>
+        </w:tc>
+        <w:tc>
+          <w:tcPr>
+            <w:tcW w:type="dxa" w:w="2450"/>
             <w:tcMar>
               <w:top w:type="dxa" w:w="60"/>
               <w:left w:type="dxa" w:w="100"/>
@@ -7036,7 +7121,7 @@
         </w:tc>
         <w:tc>
           <w:tcPr>
-            <w:tcW w:type="dxa" w:w="2579"/>
+            <w:tcW w:type="dxa" w:w="2492"/>
             <w:tcMar>
               <w:top w:type="dxa" w:w="60"/>
               <w:left w:type="dxa" w:w="100"/>
@@ -7054,23 +7139,23 @@
       <w:tr>
         <w:tc>
           <w:tcPr>
-            <w:tcW w:type="dxa" w:w="4523"/>
-            <w:tcMar>
-              <w:top w:type="dxa" w:w="60"/>
-              <w:left w:type="dxa" w:w="100"/>
-              <w:bottom w:type="dxa" w:w="60"/>
-              <w:right w:type="dxa" w:w="100"/>
-            </w:tcMar>
-          </w:tcPr>
-          <w:p>
-            <w:r>
-              <w:t xml:space="preserve">Infinitum</w:t>
-            </w:r>
-          </w:p>
-        </w:tc>
-        <w:tc>
-          <w:tcPr>
-            <w:tcW w:type="dxa" w:w="2536"/>
+            <w:tcW w:type="dxa" w:w="4696"/>
+            <w:tcMar>
+              <w:top w:type="dxa" w:w="60"/>
+              <w:left w:type="dxa" w:w="100"/>
+              <w:bottom w:type="dxa" w:w="60"/>
+              <w:right w:type="dxa" w:w="100"/>
+            </w:tcMar>
+          </w:tcPr>
+          <w:p>
+            <w:r>
+              <w:t xml:space="preserve">Orion</w:t>
+            </w:r>
+          </w:p>
+        </w:tc>
+        <w:tc>
+          <w:tcPr>
+            <w:tcW w:type="dxa" w:w="2450"/>
             <w:tcMar>
               <w:top w:type="dxa" w:w="60"/>
               <w:left w:type="dxa" w:w="100"/>
@@ -7086,7 +7171,7 @@
         </w:tc>
         <w:tc>
           <w:tcPr>
-            <w:tcW w:type="dxa" w:w="2579"/>
+            <w:tcW w:type="dxa" w:w="2492"/>
             <w:tcMar>
               <w:top w:type="dxa" w:w="60"/>
               <w:left w:type="dxa" w:w="100"/>
@@ -7104,7 +7189,7 @@
       <w:tr>
         <w:tc>
           <w:tcPr>
-            <w:tcW w:type="dxa" w:w="4523"/>
+            <w:tcW w:type="dxa" w:w="4696"/>
             <w:tcMar>
               <w:top w:type="dxa" w:w="60"/>
               <w:left w:type="dxa" w:w="100"/>
@@ -7120,7 +7205,7 @@
         </w:tc>
         <w:tc>
           <w:tcPr>
-            <w:tcW w:type="dxa" w:w="2536"/>
+            <w:tcW w:type="dxa" w:w="2450"/>
             <w:tcMar>
               <w:top w:type="dxa" w:w="60"/>
               <w:left w:type="dxa" w:w="100"/>
@@ -7136,7 +7221,7 @@
         </w:tc>
         <w:tc>
           <w:tcPr>
-            <w:tcW w:type="dxa" w:w="2579"/>
+            <w:tcW w:type="dxa" w:w="2492"/>
             <w:tcMar>
               <w:top w:type="dxa" w:w="60"/>
               <w:left w:type="dxa" w:w="100"/>
@@ -7150,7 +7235,7 @@
       <w:tr>
         <w:tc>
           <w:tcPr>
-            <w:tcW w:type="dxa" w:w="4523"/>
+            <w:tcW w:type="dxa" w:w="4696"/>
             <w:tcMar>
               <w:top w:type="dxa" w:w="60"/>
               <w:left w:type="dxa" w:w="100"/>
@@ -7166,7 +7251,7 @@
         </w:tc>
         <w:tc>
           <w:tcPr>
-            <w:tcW w:type="dxa" w:w="2536"/>
+            <w:tcW w:type="dxa" w:w="2450"/>
             <w:tcMar>
               <w:top w:type="dxa" w:w="60"/>
               <w:left w:type="dxa" w:w="100"/>
@@ -7182,7 +7267,7 @@
         </w:tc>
         <w:tc>
           <w:tcPr>
-            <w:tcW w:type="dxa" w:w="2579"/>
+            <w:tcW w:type="dxa" w:w="2492"/>
             <w:tcMar>
               <w:top w:type="dxa" w:w="60"/>
               <w:left w:type="dxa" w:w="100"/>
@@ -7196,7 +7281,7 @@
       <w:tr>
         <w:tc>
           <w:tcPr>
-            <w:tcW w:type="dxa" w:w="4523"/>
+            <w:tcW w:type="dxa" w:w="4696"/>
             <w:tcMar>
               <w:top w:type="dxa" w:w="60"/>
               <w:left w:type="dxa" w:w="100"/>
@@ -7212,7 +7297,7 @@
         </w:tc>
         <w:tc>
           <w:tcPr>
-            <w:tcW w:type="dxa" w:w="2536"/>
+            <w:tcW w:type="dxa" w:w="2450"/>
             <w:tcMar>
               <w:top w:type="dxa" w:w="60"/>
               <w:left w:type="dxa" w:w="100"/>
@@ -7228,7 +7313,7 @@
         </w:tc>
         <w:tc>
           <w:tcPr>
-            <w:tcW w:type="dxa" w:w="2579"/>
+            <w:tcW w:type="dxa" w:w="2492"/>
             <w:tcMar>
               <w:top w:type="dxa" w:w="60"/>
               <w:left w:type="dxa" w:w="100"/>
@@ -7246,7 +7331,7 @@
       <w:tr>
         <w:tc>
           <w:tcPr>
-            <w:tcW w:type="dxa" w:w="4523"/>
+            <w:tcW w:type="dxa" w:w="4696"/>
             <w:tcMar>
               <w:top w:type="dxa" w:w="60"/>
               <w:left w:type="dxa" w:w="100"/>
@@ -7262,7 +7347,7 @@
         </w:tc>
         <w:tc>
           <w:tcPr>
-            <w:tcW w:type="dxa" w:w="2536"/>
+            <w:tcW w:type="dxa" w:w="2450"/>
             <w:tcMar>
               <w:top w:type="dxa" w:w="60"/>
               <w:left w:type="dxa" w:w="100"/>
@@ -7278,7 +7363,7 @@
         </w:tc>
         <w:tc>
           <w:tcPr>
-            <w:tcW w:type="dxa" w:w="2579"/>
+            <w:tcW w:type="dxa" w:w="2492"/>
             <w:tcMar>
               <w:top w:type="dxa" w:w="60"/>
               <w:left w:type="dxa" w:w="100"/>
@@ -7368,11 +7453,11 @@
         </w:tblBorders>
       </w:tblPr>
       <w:tblGrid>
-        <w:gridCol w:w="3352"/>
-        <w:gridCol w:w="1571"/>
-        <w:gridCol w:w="1571"/>
-        <w:gridCol w:w="1571"/>
-        <w:gridCol w:w="1573"/>
+        <w:gridCol w:w="3111"/>
+        <w:gridCol w:w="1631"/>
+        <w:gridCol w:w="1631"/>
+        <w:gridCol w:w="1631"/>
+        <w:gridCol w:w="1634"/>
       </w:tblGrid>
       <w:tr>
         <w:trPr>
@@ -7380,7 +7465,7 @@
         </w:trPr>
         <w:tc>
           <w:tcPr>
-            <w:tcW w:type="dxa" w:w="3352"/>
+            <w:tcW w:type="dxa" w:w="3111"/>
             <w:shd w:fill="EEEEEE" w:color="auto" w:val="clear"/>
             <w:tcMar>
               <w:top w:type="dxa" w:w="60"/>
@@ -7401,7 +7486,7 @@
         </w:tc>
         <w:tc>
           <w:tcPr>
-            <w:tcW w:type="dxa" w:w="1571"/>
+            <w:tcW w:type="dxa" w:w="1631"/>
             <w:shd w:fill="EEEEEE" w:color="auto" w:val="clear"/>
             <w:tcMar>
               <w:top w:type="dxa" w:w="60"/>
@@ -7422,7 +7507,7 @@
         </w:tc>
         <w:tc>
           <w:tcPr>
-            <w:tcW w:type="dxa" w:w="1571"/>
+            <w:tcW w:type="dxa" w:w="1631"/>
             <w:shd w:fill="EEEEEE" w:color="auto" w:val="clear"/>
             <w:tcMar>
               <w:top w:type="dxa" w:w="60"/>
@@ -7443,7 +7528,7 @@
         </w:tc>
         <w:tc>
           <w:tcPr>
-            <w:tcW w:type="dxa" w:w="1571"/>
+            <w:tcW w:type="dxa" w:w="1631"/>
             <w:shd w:fill="EEEEEE" w:color="auto" w:val="clear"/>
             <w:tcMar>
               <w:top w:type="dxa" w:w="60"/>
@@ -7464,7 +7549,7 @@
         </w:tc>
         <w:tc>
           <w:tcPr>
-            <w:tcW w:type="dxa" w:w="1573"/>
+            <w:tcW w:type="dxa" w:w="1634"/>
             <w:shd w:fill="EEEEEE" w:color="auto" w:val="clear"/>
             <w:tcMar>
               <w:top w:type="dxa" w:w="60"/>
@@ -7487,7 +7572,7 @@
       <w:tr>
         <w:tc>
           <w:tcPr>
-            <w:tcW w:type="dxa" w:w="3352"/>
+            <w:tcW w:type="dxa" w:w="3111"/>
             <w:tcMar>
               <w:top w:type="dxa" w:w="60"/>
               <w:left w:type="dxa" w:w="100"/>
@@ -7503,7 +7588,7 @@
         </w:tc>
         <w:tc>
           <w:tcPr>
-            <w:tcW w:type="dxa" w:w="1571"/>
+            <w:tcW w:type="dxa" w:w="1631"/>
             <w:tcMar>
               <w:top w:type="dxa" w:w="60"/>
               <w:left w:type="dxa" w:w="100"/>
@@ -7515,7 +7600,7 @@
         </w:tc>
         <w:tc>
           <w:tcPr>
-            <w:tcW w:type="dxa" w:w="1571"/>
+            <w:tcW w:type="dxa" w:w="1631"/>
             <w:tcMar>
               <w:top w:type="dxa" w:w="60"/>
               <w:left w:type="dxa" w:w="100"/>
@@ -7527,7 +7612,7 @@
         </w:tc>
         <w:tc>
           <w:tcPr>
-            <w:tcW w:type="dxa" w:w="1571"/>
+            <w:tcW w:type="dxa" w:w="1631"/>
             <w:tcMar>
               <w:top w:type="dxa" w:w="60"/>
               <w:left w:type="dxa" w:w="100"/>
@@ -7539,7 +7624,7 @@
         </w:tc>
         <w:tc>
           <w:tcPr>
-            <w:tcW w:type="dxa" w:w="1573"/>
+            <w:tcW w:type="dxa" w:w="1634"/>
             <w:tcMar>
               <w:top w:type="dxa" w:w="60"/>
               <w:left w:type="dxa" w:w="100"/>
@@ -7553,7 +7638,7 @@
       <w:tr>
         <w:tc>
           <w:tcPr>
-            <w:tcW w:type="dxa" w:w="3352"/>
+            <w:tcW w:type="dxa" w:w="3111"/>
             <w:tcMar>
               <w:top w:type="dxa" w:w="60"/>
               <w:left w:type="dxa" w:w="100"/>
@@ -7569,7 +7654,7 @@
         </w:tc>
         <w:tc>
           <w:tcPr>
-            <w:tcW w:type="dxa" w:w="1571"/>
+            <w:tcW w:type="dxa" w:w="1631"/>
             <w:tcMar>
               <w:top w:type="dxa" w:w="60"/>
               <w:left w:type="dxa" w:w="100"/>
@@ -7581,7 +7666,7 @@
         </w:tc>
         <w:tc>
           <w:tcPr>
-            <w:tcW w:type="dxa" w:w="1571"/>
+            <w:tcW w:type="dxa" w:w="1631"/>
             <w:tcMar>
               <w:top w:type="dxa" w:w="60"/>
               <w:left w:type="dxa" w:w="100"/>
@@ -7593,7 +7678,7 @@
         </w:tc>
         <w:tc>
           <w:tcPr>
-            <w:tcW w:type="dxa" w:w="1571"/>
+            <w:tcW w:type="dxa" w:w="1631"/>
             <w:tcMar>
               <w:top w:type="dxa" w:w="60"/>
               <w:left w:type="dxa" w:w="100"/>
@@ -7605,7 +7690,7 @@
         </w:tc>
         <w:tc>
           <w:tcPr>
-            <w:tcW w:type="dxa" w:w="1573"/>
+            <w:tcW w:type="dxa" w:w="1634"/>
             <w:tcMar>
               <w:top w:type="dxa" w:w="60"/>
               <w:left w:type="dxa" w:w="100"/>
@@ -7619,23 +7704,23 @@
       <w:tr>
         <w:tc>
           <w:tcPr>
-            <w:tcW w:type="dxa" w:w="3352"/>
-            <w:tcMar>
-              <w:top w:type="dxa" w:w="60"/>
-              <w:left w:type="dxa" w:w="100"/>
-              <w:bottom w:type="dxa" w:w="60"/>
-              <w:right w:type="dxa" w:w="100"/>
-            </w:tcMar>
-          </w:tcPr>
-          <w:p>
-            <w:r>
-              <w:t xml:space="preserve">ERP</w:t>
-            </w:r>
-          </w:p>
-        </w:tc>
-        <w:tc>
-          <w:tcPr>
-            <w:tcW w:type="dxa" w:w="1571"/>
+            <w:tcW w:type="dxa" w:w="3111"/>
+            <w:tcMar>
+              <w:top w:type="dxa" w:w="60"/>
+              <w:left w:type="dxa" w:w="100"/>
+              <w:bottom w:type="dxa" w:w="60"/>
+              <w:right w:type="dxa" w:w="100"/>
+            </w:tcMar>
+          </w:tcPr>
+          <w:p>
+            <w:r>
+              <w:t xml:space="preserve">Petroshow (ERP)</w:t>
+            </w:r>
+          </w:p>
+        </w:tc>
+        <w:tc>
+          <w:tcPr>
+            <w:tcW w:type="dxa" w:w="1631"/>
             <w:tcMar>
               <w:top w:type="dxa" w:w="60"/>
               <w:left w:type="dxa" w:w="100"/>
@@ -7647,7 +7732,7 @@
         </w:tc>
         <w:tc>
           <w:tcPr>
-            <w:tcW w:type="dxa" w:w="1571"/>
+            <w:tcW w:type="dxa" w:w="1631"/>
             <w:tcMar>
               <w:top w:type="dxa" w:w="60"/>
               <w:left w:type="dxa" w:w="100"/>
@@ -7659,7 +7744,7 @@
         </w:tc>
         <w:tc>
           <w:tcPr>
-            <w:tcW w:type="dxa" w:w="1571"/>
+            <w:tcW w:type="dxa" w:w="1631"/>
             <w:tcMar>
               <w:top w:type="dxa" w:w="60"/>
               <w:left w:type="dxa" w:w="100"/>
@@ -7671,7 +7756,7 @@
         </w:tc>
         <w:tc>
           <w:tcPr>
-            <w:tcW w:type="dxa" w:w="1573"/>
+            <w:tcW w:type="dxa" w:w="1634"/>
             <w:tcMar>
               <w:top w:type="dxa" w:w="60"/>
               <w:left w:type="dxa" w:w="100"/>
@@ -7685,23 +7770,23 @@
       <w:tr>
         <w:tc>
           <w:tcPr>
-            <w:tcW w:type="dxa" w:w="3352"/>
-            <w:tcMar>
-              <w:top w:type="dxa" w:w="60"/>
-              <w:left w:type="dxa" w:w="100"/>
-              <w:bottom w:type="dxa" w:w="60"/>
-              <w:right w:type="dxa" w:w="100"/>
-            </w:tcMar>
-          </w:tcPr>
-          <w:p>
-            <w:r>
-              <w:t xml:space="preserve">Petroshow</w:t>
-            </w:r>
-          </w:p>
-        </w:tc>
-        <w:tc>
-          <w:tcPr>
-            <w:tcW w:type="dxa" w:w="1571"/>
+            <w:tcW w:type="dxa" w:w="3111"/>
+            <w:tcMar>
+              <w:top w:type="dxa" w:w="60"/>
+              <w:left w:type="dxa" w:w="100"/>
+              <w:bottom w:type="dxa" w:w="60"/>
+              <w:right w:type="dxa" w:w="100"/>
+            </w:tcMar>
+          </w:tcPr>
+          <w:p>
+            <w:r>
+              <w:t xml:space="preserve">Infinitum</w:t>
+            </w:r>
+          </w:p>
+        </w:tc>
+        <w:tc>
+          <w:tcPr>
+            <w:tcW w:type="dxa" w:w="1631"/>
             <w:tcMar>
               <w:top w:type="dxa" w:w="60"/>
               <w:left w:type="dxa" w:w="100"/>
@@ -7713,7 +7798,7 @@
         </w:tc>
         <w:tc>
           <w:tcPr>
-            <w:tcW w:type="dxa" w:w="1571"/>
+            <w:tcW w:type="dxa" w:w="1631"/>
             <w:tcMar>
               <w:top w:type="dxa" w:w="60"/>
               <w:left w:type="dxa" w:w="100"/>
@@ -7725,7 +7810,7 @@
         </w:tc>
         <w:tc>
           <w:tcPr>
-            <w:tcW w:type="dxa" w:w="1571"/>
+            <w:tcW w:type="dxa" w:w="1631"/>
             <w:tcMar>
               <w:top w:type="dxa" w:w="60"/>
               <w:left w:type="dxa" w:w="100"/>
@@ -7737,7 +7822,7 @@
         </w:tc>
         <w:tc>
           <w:tcPr>
-            <w:tcW w:type="dxa" w:w="1573"/>
+            <w:tcW w:type="dxa" w:w="1634"/>
             <w:tcMar>
               <w:top w:type="dxa" w:w="60"/>
               <w:left w:type="dxa" w:w="100"/>
@@ -7751,23 +7836,23 @@
       <w:tr>
         <w:tc>
           <w:tcPr>
-            <w:tcW w:type="dxa" w:w="3352"/>
-            <w:tcMar>
-              <w:top w:type="dxa" w:w="60"/>
-              <w:left w:type="dxa" w:w="100"/>
-              <w:bottom w:type="dxa" w:w="60"/>
-              <w:right w:type="dxa" w:w="100"/>
-            </w:tcMar>
-          </w:tcPr>
-          <w:p>
-            <w:r>
-              <w:t xml:space="preserve">Infinitum</w:t>
-            </w:r>
-          </w:p>
-        </w:tc>
-        <w:tc>
-          <w:tcPr>
-            <w:tcW w:type="dxa" w:w="1571"/>
+            <w:tcW w:type="dxa" w:w="3111"/>
+            <w:tcMar>
+              <w:top w:type="dxa" w:w="60"/>
+              <w:left w:type="dxa" w:w="100"/>
+              <w:bottom w:type="dxa" w:w="60"/>
+              <w:right w:type="dxa" w:w="100"/>
+            </w:tcMar>
+          </w:tcPr>
+          <w:p>
+            <w:r>
+              <w:t xml:space="preserve">Orion</w:t>
+            </w:r>
+          </w:p>
+        </w:tc>
+        <w:tc>
+          <w:tcPr>
+            <w:tcW w:type="dxa" w:w="1631"/>
             <w:tcMar>
               <w:top w:type="dxa" w:w="60"/>
               <w:left w:type="dxa" w:w="100"/>
@@ -7779,7 +7864,7 @@
         </w:tc>
         <w:tc>
           <w:tcPr>
-            <w:tcW w:type="dxa" w:w="1571"/>
+            <w:tcW w:type="dxa" w:w="1631"/>
             <w:tcMar>
               <w:top w:type="dxa" w:w="60"/>
               <w:left w:type="dxa" w:w="100"/>
@@ -7791,7 +7876,7 @@
         </w:tc>
         <w:tc>
           <w:tcPr>
-            <w:tcW w:type="dxa" w:w="1571"/>
+            <w:tcW w:type="dxa" w:w="1631"/>
             <w:tcMar>
               <w:top w:type="dxa" w:w="60"/>
               <w:left w:type="dxa" w:w="100"/>
@@ -7803,7 +7888,7 @@
         </w:tc>
         <w:tc>
           <w:tcPr>
-            <w:tcW w:type="dxa" w:w="1573"/>
+            <w:tcW w:type="dxa" w:w="1634"/>
             <w:tcMar>
               <w:top w:type="dxa" w:w="60"/>
               <w:left w:type="dxa" w:w="100"/>
@@ -7817,7 +7902,7 @@
       <w:tr>
         <w:tc>
           <w:tcPr>
-            <w:tcW w:type="dxa" w:w="3352"/>
+            <w:tcW w:type="dxa" w:w="3111"/>
             <w:tcMar>
               <w:top w:type="dxa" w:w="60"/>
               <w:left w:type="dxa" w:w="100"/>
@@ -7833,7 +7918,7 @@
         </w:tc>
         <w:tc>
           <w:tcPr>
-            <w:tcW w:type="dxa" w:w="1571"/>
+            <w:tcW w:type="dxa" w:w="1631"/>
             <w:tcMar>
               <w:top w:type="dxa" w:w="60"/>
               <w:left w:type="dxa" w:w="100"/>
@@ -7845,7 +7930,7 @@
         </w:tc>
         <w:tc>
           <w:tcPr>
-            <w:tcW w:type="dxa" w:w="1571"/>
+            <w:tcW w:type="dxa" w:w="1631"/>
             <w:tcMar>
               <w:top w:type="dxa" w:w="60"/>
               <w:left w:type="dxa" w:w="100"/>
@@ -7857,7 +7942,7 @@
         </w:tc>
         <w:tc>
           <w:tcPr>
-            <w:tcW w:type="dxa" w:w="1571"/>
+            <w:tcW w:type="dxa" w:w="1631"/>
             <w:tcMar>
               <w:top w:type="dxa" w:w="60"/>
               <w:left w:type="dxa" w:w="100"/>
@@ -7869,7 +7954,7 @@
         </w:tc>
         <w:tc>
           <w:tcPr>
-            <w:tcW w:type="dxa" w:w="1573"/>
+            <w:tcW w:type="dxa" w:w="1634"/>
             <w:tcMar>
               <w:top w:type="dxa" w:w="60"/>
               <w:left w:type="dxa" w:w="100"/>
@@ -7883,7 +7968,7 @@
       <w:tr>
         <w:tc>
           <w:tcPr>
-            <w:tcW w:type="dxa" w:w="3352"/>
+            <w:tcW w:type="dxa" w:w="3111"/>
             <w:tcMar>
               <w:top w:type="dxa" w:w="60"/>
               <w:left w:type="dxa" w:w="100"/>
@@ -7899,7 +7984,7 @@
         </w:tc>
         <w:tc>
           <w:tcPr>
-            <w:tcW w:type="dxa" w:w="1571"/>
+            <w:tcW w:type="dxa" w:w="1631"/>
             <w:tcMar>
               <w:top w:type="dxa" w:w="60"/>
               <w:left w:type="dxa" w:w="100"/>
@@ -7911,7 +7996,7 @@
         </w:tc>
         <w:tc>
           <w:tcPr>
-            <w:tcW w:type="dxa" w:w="1571"/>
+            <w:tcW w:type="dxa" w:w="1631"/>
             <w:tcMar>
               <w:top w:type="dxa" w:w="60"/>
               <w:left w:type="dxa" w:w="100"/>
@@ -7923,7 +8008,7 @@
         </w:tc>
         <w:tc>
           <w:tcPr>
-            <w:tcW w:type="dxa" w:w="1571"/>
+            <w:tcW w:type="dxa" w:w="1631"/>
             <w:tcMar>
               <w:top w:type="dxa" w:w="60"/>
               <w:left w:type="dxa" w:w="100"/>
@@ -7935,7 +8020,7 @@
         </w:tc>
         <w:tc>
           <w:tcPr>
-            <w:tcW w:type="dxa" w:w="1573"/>
+            <w:tcW w:type="dxa" w:w="1634"/>
             <w:tcMar>
               <w:top w:type="dxa" w:w="60"/>
               <w:left w:type="dxa" w:w="100"/>
@@ -7949,23 +8034,23 @@
       <w:tr>
         <w:tc>
           <w:tcPr>
-            <w:tcW w:type="dxa" w:w="3352"/>
-            <w:tcMar>
-              <w:top w:type="dxa" w:w="60"/>
-              <w:left w:type="dxa" w:w="100"/>
-              <w:bottom w:type="dxa" w:w="60"/>
-              <w:right w:type="dxa" w:w="100"/>
-            </w:tcMar>
-          </w:tcPr>
-          <w:p>
-            <w:r>
-              <w:t xml:space="preserve">Senhas compartilhadas que conhece</w:t>
-            </w:r>
-          </w:p>
-        </w:tc>
-        <w:tc>
-          <w:tcPr>
-            <w:tcW w:type="dxa" w:w="1571"/>
+            <w:tcW w:type="dxa" w:w="3111"/>
+            <w:tcMar>
+              <w:top w:type="dxa" w:w="60"/>
+              <w:left w:type="dxa" w:w="100"/>
+              <w:bottom w:type="dxa" w:w="60"/>
+              <w:right w:type="dxa" w:w="100"/>
+            </w:tcMar>
+          </w:tcPr>
+          <w:p>
+            <w:r>
+              <w:t xml:space="preserve">Outro</w:t>
+            </w:r>
+          </w:p>
+        </w:tc>
+        <w:tc>
+          <w:tcPr>
+            <w:tcW w:type="dxa" w:w="1631"/>
             <w:tcMar>
               <w:top w:type="dxa" w:w="60"/>
               <w:left w:type="dxa" w:w="100"/>
@@ -7977,7 +8062,7 @@
         </w:tc>
         <w:tc>
           <w:tcPr>
-            <w:tcW w:type="dxa" w:w="1571"/>
+            <w:tcW w:type="dxa" w:w="1631"/>
             <w:tcMar>
               <w:top w:type="dxa" w:w="60"/>
               <w:left w:type="dxa" w:w="100"/>
@@ -7989,7 +8074,7 @@
         </w:tc>
         <w:tc>
           <w:tcPr>
-            <w:tcW w:type="dxa" w:w="1571"/>
+            <w:tcW w:type="dxa" w:w="1631"/>
             <w:tcMar>
               <w:top w:type="dxa" w:w="60"/>
               <w:left w:type="dxa" w:w="100"/>
@@ -8001,73 +8086,7 @@
         </w:tc>
         <w:tc>
           <w:tcPr>
-            <w:tcW w:type="dxa" w:w="1573"/>
-            <w:tcMar>
-              <w:top w:type="dxa" w:w="60"/>
-              <w:left w:type="dxa" w:w="100"/>
-              <w:bottom w:type="dxa" w:w="60"/>
-              <w:right w:type="dxa" w:w="100"/>
-            </w:tcMar>
-          </w:tcPr>
-          <w:p/>
-        </w:tc>
-      </w:tr>
-      <w:tr>
-        <w:tc>
-          <w:tcPr>
-            <w:tcW w:type="dxa" w:w="3352"/>
-            <w:tcMar>
-              <w:top w:type="dxa" w:w="60"/>
-              <w:left w:type="dxa" w:w="100"/>
-              <w:bottom w:type="dxa" w:w="60"/>
-              <w:right w:type="dxa" w:w="100"/>
-            </w:tcMar>
-          </w:tcPr>
-          <w:p>
-            <w:r>
-              <w:t xml:space="preserve">Outro</w:t>
-            </w:r>
-          </w:p>
-        </w:tc>
-        <w:tc>
-          <w:tcPr>
-            <w:tcW w:type="dxa" w:w="1571"/>
-            <w:tcMar>
-              <w:top w:type="dxa" w:w="60"/>
-              <w:left w:type="dxa" w:w="100"/>
-              <w:bottom w:type="dxa" w:w="60"/>
-              <w:right w:type="dxa" w:w="100"/>
-            </w:tcMar>
-          </w:tcPr>
-          <w:p/>
-        </w:tc>
-        <w:tc>
-          <w:tcPr>
-            <w:tcW w:type="dxa" w:w="1571"/>
-            <w:tcMar>
-              <w:top w:type="dxa" w:w="60"/>
-              <w:left w:type="dxa" w:w="100"/>
-              <w:bottom w:type="dxa" w:w="60"/>
-              <w:right w:type="dxa" w:w="100"/>
-            </w:tcMar>
-          </w:tcPr>
-          <w:p/>
-        </w:tc>
-        <w:tc>
-          <w:tcPr>
-            <w:tcW w:type="dxa" w:w="1571"/>
-            <w:tcMar>
-              <w:top w:type="dxa" w:w="60"/>
-              <w:left w:type="dxa" w:w="100"/>
-              <w:bottom w:type="dxa" w:w="60"/>
-              <w:right w:type="dxa" w:w="100"/>
-            </w:tcMar>
-          </w:tcPr>
-          <w:p/>
-        </w:tc>
-        <w:tc>
-          <w:tcPr>
-            <w:tcW w:type="dxa" w:w="1573"/>
+            <w:tcW w:type="dxa" w:w="1634"/>
             <w:tcMar>
               <w:top w:type="dxa" w:w="60"/>
               <w:left w:type="dxa" w:w="100"/>

</xml_diff>

<commit_message>
APK da empresa pelo MDM e POP-11 enxuto
- POP-TI §4.2 e POP-08 §4: APK da propria empresa permitido, so
  instalado pelo MDM, assinado com a chave da empresa, testado antes.
- POP-11 sem mudanca de funcao e afastamento; referencias e indice
  ajustados (POP-02/03/04/05, POP-TI, padrao de e-mail).
- PDFs e Word regenerados.

Co-Authored-By: Claude Opus 5.5 <noreply@anthropic.com>
</commit_message>
<xml_diff>
--- a/impressao/POPs-RH-revisao.docx
+++ b/impressao/POPs-RH-revisao.docx
@@ -2959,7 +2959,7 @@
         </w:numPr>
       </w:pPr>
       <w:r>
-        <w:t xml:space="preserve">A revisão semestral (POP-11 §4) procura contas que escaparam deste POP.</w:t>
+        <w:t xml:space="preserve">A revisão semestral (POP-11 §3) procura contas que escaparam deste POP.</w:t>
       </w:r>
     </w:p>
     <w:p>
@@ -3319,7 +3319,7 @@
         <w:t xml:space="preserve">iguais ao que a função atual precisa</w:t>
       </w:r>
       <w:r>
-        <w:t xml:space="preserve">: nem faltando, nem sobrando. Cobre quatro situações:</w:t>
+        <w:t xml:space="preserve">: nem faltando, nem sobrando. Cobre duas situações:</w:t>
       </w:r>
     </w:p>
     <w:tbl>
@@ -3335,9 +3335,9 @@
         </w:tblBorders>
       </w:tblPr>
       <w:tblGrid>
-        <w:gridCol w:w="1396"/>
-        <w:gridCol w:w="5633"/>
-        <w:gridCol w:w="2609"/>
+        <w:gridCol w:w="1376"/>
+        <w:gridCol w:w="4283"/>
+        <w:gridCol w:w="3979"/>
       </w:tblGrid>
       <w:tr>
         <w:trPr>
@@ -3345,7 +3345,7 @@
         </w:trPr>
         <w:tc>
           <w:tcPr>
-            <w:tcW w:type="dxa" w:w="1396"/>
+            <w:tcW w:type="dxa" w:w="1376"/>
             <w:shd w:fill="EEEEEE" w:color="auto" w:val="clear"/>
             <w:tcMar>
               <w:top w:type="dxa" w:w="60"/>
@@ -3366,7 +3366,7 @@
         </w:tc>
         <w:tc>
           <w:tcPr>
-            <w:tcW w:type="dxa" w:w="5633"/>
+            <w:tcW w:type="dxa" w:w="4283"/>
             <w:shd w:fill="EEEEEE" w:color="auto" w:val="clear"/>
             <w:tcMar>
               <w:top w:type="dxa" w:w="60"/>
@@ -3387,7 +3387,7 @@
         </w:tc>
         <w:tc>
           <w:tcPr>
-            <w:tcW w:type="dxa" w:w="2609"/>
+            <w:tcW w:type="dxa" w:w="3979"/>
             <w:shd w:fill="EEEEEE" w:color="auto" w:val="clear"/>
             <w:tcMar>
               <w:top w:type="dxa" w:w="60"/>
@@ -3410,7 +3410,7 @@
       <w:tr>
         <w:tc>
           <w:tcPr>
-            <w:tcW w:type="dxa" w:w="1396"/>
+            <w:tcW w:type="dxa" w:w="1376"/>
             <w:tcMar>
               <w:top w:type="dxa" w:w="60"/>
               <w:left w:type="dxa" w:w="100"/>
@@ -3426,33 +3426,33 @@
         </w:tc>
         <w:tc>
           <w:tcPr>
-            <w:tcW w:type="dxa" w:w="5633"/>
-            <w:tcMar>
-              <w:top w:type="dxa" w:w="60"/>
-              <w:left w:type="dxa" w:w="100"/>
-              <w:bottom w:type="dxa" w:w="60"/>
-              <w:right w:type="dxa" w:w="100"/>
-            </w:tcMar>
-          </w:tcPr>
-          <w:p>
-            <w:r>
-              <w:t xml:space="preserve">Mudança de função ou de posto/unidade</w:t>
-            </w:r>
-          </w:p>
-        </w:tc>
-        <w:tc>
-          <w:tcPr>
-            <w:tcW w:type="dxa" w:w="2609"/>
-            <w:tcMar>
-              <w:top w:type="dxa" w:w="60"/>
-              <w:left w:type="dxa" w:w="100"/>
-              <w:bottom w:type="dxa" w:w="60"/>
-              <w:right w:type="dxa" w:w="100"/>
-            </w:tcMar>
-          </w:tcPr>
-          <w:p>
-            <w:r>
-              <w:t xml:space="preserve">RH</w:t>
+            <w:tcW w:type="dxa" w:w="4283"/>
+            <w:tcMar>
+              <w:top w:type="dxa" w:w="60"/>
+              <w:left w:type="dxa" w:w="100"/>
+              <w:bottom w:type="dxa" w:w="60"/>
+              <w:right w:type="dxa" w:w="100"/>
+            </w:tcMar>
+          </w:tcPr>
+          <w:p>
+            <w:r>
+              <w:t xml:space="preserve">Revisão periódica de acessos</w:t>
+            </w:r>
+          </w:p>
+        </w:tc>
+        <w:tc>
+          <w:tcPr>
+            <w:tcW w:type="dxa" w:w="3979"/>
+            <w:tcMar>
+              <w:top w:type="dxa" w:w="60"/>
+              <w:left w:type="dxa" w:w="100"/>
+              <w:bottom w:type="dxa" w:w="60"/>
+              <w:right w:type="dxa" w:w="100"/>
+            </w:tcMar>
+          </w:tcPr>
+          <w:p>
+            <w:r>
+              <w:t xml:space="preserve">TI (calendário)</w:t>
             </w:r>
           </w:p>
         </w:tc>
@@ -3460,7 +3460,7 @@
       <w:tr>
         <w:tc>
           <w:tcPr>
-            <w:tcW w:type="dxa" w:w="1396"/>
+            <w:tcW w:type="dxa" w:w="1376"/>
             <w:tcMar>
               <w:top w:type="dxa" w:w="60"/>
               <w:left w:type="dxa" w:w="100"/>
@@ -3476,57 +3476,7 @@
         </w:tc>
         <w:tc>
           <w:tcPr>
-            <w:tcW w:type="dxa" w:w="5633"/>
-            <w:tcMar>
-              <w:top w:type="dxa" w:w="60"/>
-              <w:left w:type="dxa" w:w="100"/>
-              <w:bottom w:type="dxa" w:w="60"/>
-              <w:right w:type="dxa" w:w="100"/>
-            </w:tcMar>
-          </w:tcPr>
-          <w:p>
-            <w:r>
-              <w:t xml:space="preserve">Revisão periódica de acessos</w:t>
-            </w:r>
-          </w:p>
-        </w:tc>
-        <w:tc>
-          <w:tcPr>
-            <w:tcW w:type="dxa" w:w="2609"/>
-            <w:tcMar>
-              <w:top w:type="dxa" w:w="60"/>
-              <w:left w:type="dxa" w:w="100"/>
-              <w:bottom w:type="dxa" w:w="60"/>
-              <w:right w:type="dxa" w:w="100"/>
-            </w:tcMar>
-          </w:tcPr>
-          <w:p>
-            <w:r>
-              <w:t xml:space="preserve">TI (calendário)</w:t>
-            </w:r>
-          </w:p>
-        </w:tc>
-      </w:tr>
-      <w:tr>
-        <w:tc>
-          <w:tcPr>
-            <w:tcW w:type="dxa" w:w="1396"/>
-            <w:tcMar>
-              <w:top w:type="dxa" w:w="60"/>
-              <w:left w:type="dxa" w:w="100"/>
-              <w:bottom w:type="dxa" w:w="60"/>
-              <w:right w:type="dxa" w:w="100"/>
-            </w:tcMar>
-          </w:tcPr>
-          <w:p>
-            <w:r>
-              <w:t xml:space="preserve">5</w:t>
-            </w:r>
-          </w:p>
-        </w:tc>
-        <w:tc>
-          <w:tcPr>
-            <w:tcW w:type="dxa" w:w="5633"/>
+            <w:tcW w:type="dxa" w:w="4283"/>
             <w:tcMar>
               <w:top w:type="dxa" w:w="60"/>
               <w:left w:type="dxa" w:w="100"/>
@@ -3542,7 +3492,7 @@
         </w:tc>
         <w:tc>
           <w:tcPr>
-            <w:tcW w:type="dxa" w:w="2609"/>
+            <w:tcW w:type="dxa" w:w="3979"/>
             <w:tcMar>
               <w:top w:type="dxa" w:w="60"/>
               <w:left w:type="dxa" w:w="100"/>
@@ -3553,56 +3503,6 @@
           <w:p>
             <w:r>
               <w:t xml:space="preserve">Funcionário, gestor ou TI</w:t>
-            </w:r>
-          </w:p>
-        </w:tc>
-      </w:tr>
-      <w:tr>
-        <w:tc>
-          <w:tcPr>
-            <w:tcW w:type="dxa" w:w="1396"/>
-            <w:tcMar>
-              <w:top w:type="dxa" w:w="60"/>
-              <w:left w:type="dxa" w:w="100"/>
-              <w:bottom w:type="dxa" w:w="60"/>
-              <w:right w:type="dxa" w:w="100"/>
-            </w:tcMar>
-          </w:tcPr>
-          <w:p>
-            <w:r>
-              <w:t xml:space="preserve">6</w:t>
-            </w:r>
-          </w:p>
-        </w:tc>
-        <w:tc>
-          <w:tcPr>
-            <w:tcW w:type="dxa" w:w="5633"/>
-            <w:tcMar>
-              <w:top w:type="dxa" w:w="60"/>
-              <w:left w:type="dxa" w:w="100"/>
-              <w:bottom w:type="dxa" w:w="60"/>
-              <w:right w:type="dxa" w:w="100"/>
-            </w:tcMar>
-          </w:tcPr>
-          <w:p>
-            <w:r>
-              <w:t xml:space="preserve">Afastamento ou férias longas</w:t>
-            </w:r>
-          </w:p>
-        </w:tc>
-        <w:tc>
-          <w:tcPr>
-            <w:tcW w:type="dxa" w:w="2609"/>
-            <w:tcMar>
-              <w:top w:type="dxa" w:w="60"/>
-              <w:left w:type="dxa" w:w="100"/>
-              <w:bottom w:type="dxa" w:w="60"/>
-              <w:right w:type="dxa" w:w="100"/>
-            </w:tcMar>
-          </w:tcPr>
-          <w:p>
-            <w:r>
-              <w:t xml:space="preserve">RH</w:t>
             </w:r>
           </w:p>
         </w:tc>
@@ -3637,293 +3537,7 @@
         <w:pStyle w:val="Heading2"/>
       </w:pPr>
       <w:r>
-        <w:t xml:space="preserve">3. Mudança de função ou de posto/unidade</w:t>
-      </w:r>
-    </w:p>
-    <w:p>
-      <w:pPr>
-        <w:spacing w:after="120"/>
-      </w:pPr>
-      <w:r>
-        <w:rPr>
-          <w:b/>
-          <w:bCs/>
-        </w:rPr>
-        <w:t xml:space="preserve">Regra principal:</w:t>
-      </w:r>
-      <w:r>
-        <w:t xml:space="preserve"> primeiro </w:t>
-      </w:r>
-      <w:r>
-        <w:rPr>
-          <w:b/>
-          <w:bCs/>
-        </w:rPr>
-        <w:t xml:space="preserve">remove</w:t>
-      </w:r>
-      <w:r>
-        <w:t xml:space="preserve"> o que a função antiga tinha e não é mais necessário, depois </w:t>
-      </w:r>
-      <w:r>
-        <w:rPr>
-          <w:b/>
-          <w:bCs/>
-        </w:rPr>
-        <w:t xml:space="preserve">libera</w:t>
-      </w:r>
-      <w:r>
-        <w:t xml:space="preserve"> o que a função nova precisa. Ex.: gerente que vai do Posto A para o Posto B não pode continuar vendo o Posto A no Sistema VS.</w:t>
-      </w:r>
-    </w:p>
-    <w:p>
-      <w:pPr>
-        <w:tabs>
-          <w:tab w:val="left" w:pos="720"/>
-        </w:tabs>
-        <w:ind w:left="720" w:hanging="400"/>
-      </w:pPr>
-      <w:r>
-        <w:t xml:space="preserve">1.	</w:t>
-      </w:r>
-      <w:r>
-        <w:rPr>
-          <w:b/>
-          <w:bCs/>
-        </w:rPr>
-        <w:t xml:space="preserve">RH</w:t>
-      </w:r>
-      <w:r>
-        <w:t xml:space="preserve"> abre o chamado no GLPI (Formulário A) com tipo </w:t>
-      </w:r>
-      <w:r>
-        <w:rPr>
-          <w:b/>
-          <w:bCs/>
-        </w:rPr>
-        <w:t xml:space="preserve">Mudança</w:t>
-      </w:r>
-      <w:r>
-        <w:t xml:space="preserve">: função/posto antigo, função/posto novo, data da mudança, gestor novo.</w:t>
-      </w:r>
-    </w:p>
-    <w:p>
-      <w:pPr>
-        <w:tabs>
-          <w:tab w:val="left" w:pos="720"/>
-        </w:tabs>
-        <w:ind w:left="720" w:hanging="400"/>
-      </w:pPr>
-      <w:r>
-        <w:t xml:space="preserve">2.	</w:t>
-      </w:r>
-      <w:r>
-        <w:rPr>
-          <w:b/>
-          <w:bCs/>
-        </w:rPr>
-        <w:t xml:space="preserve">Gestor novo</w:t>
-      </w:r>
-      <w:r>
-        <w:t xml:space="preserve"> marca os acessos da função nova. </w:t>
-      </w:r>
-      <w:r>
-        <w:rPr>
-          <w:b/>
-          <w:bCs/>
-        </w:rPr>
-        <w:t xml:space="preserve">Gestor antigo</w:t>
-      </w:r>
-      <w:r>
-        <w:t xml:space="preserve"> confirma o que deixa de ser necessário.</w:t>
-      </w:r>
-    </w:p>
-    <w:p>
-      <w:pPr>
-        <w:tabs>
-          <w:tab w:val="left" w:pos="720"/>
-        </w:tabs>
-        <w:ind w:left="720" w:hanging="400"/>
-      </w:pPr>
-      <w:r>
-        <w:t xml:space="preserve">3.	</w:t>
-      </w:r>
-      <w:r>
-        <w:rPr>
-          <w:b/>
-          <w:bCs/>
-        </w:rPr>
-        <w:t xml:space="preserve">TI</w:t>
-      </w:r>
-      <w:r>
-        <w:t xml:space="preserve">, na data da mudança:</w:t>
-      </w:r>
-    </w:p>
-    <w:p>
-      <w:pPr>
-        <w:tabs>
-          <w:tab w:val="left" w:pos="1440"/>
-        </w:tabs>
-        <w:ind w:left="1440" w:hanging="400"/>
-      </w:pPr>
-      <w:r>
-        <w:t xml:space="preserve">1.	</w:t>
-      </w:r>
-      <w:r>
-        <w:rPr>
-          <w:b/>
-          <w:bCs/>
-        </w:rPr>
-        <w:t xml:space="preserve">Sistema VS:</w:t>
-      </w:r>
-      <w:r>
-        <w:t xml:space="preserve"> trocar perfil e postos. Conferir logando com o usuário que o posto antigo </w:t>
-      </w:r>
-      <w:r>
-        <w:rPr>
-          <w:b/>
-          <w:bCs/>
-        </w:rPr>
-        <w:t xml:space="preserve">sumiu</w:t>
-      </w:r>
-      <w:r>
-        <w:t xml:space="preserve">.</w:t>
-      </w:r>
-    </w:p>
-    <w:p>
-      <w:pPr>
-        <w:tabs>
-          <w:tab w:val="left" w:pos="1440"/>
-        </w:tabs>
-        <w:ind w:left="1440" w:hanging="400"/>
-      </w:pPr>
-      <w:r>
-        <w:t xml:space="preserve">2.	</w:t>
-      </w:r>
-      <w:r>
-        <w:rPr>
-          <w:b/>
-          <w:bCs/>
-        </w:rPr>
-        <w:t xml:space="preserve">Petroshow / Infinitum / Orion:</w:t>
-      </w:r>
-      <w:r>
-        <w:t xml:space="preserve"> ajustar perfil; remover acesso à unidade antiga.</w:t>
-      </w:r>
-    </w:p>
-    <w:p>
-      <w:pPr>
-        <w:tabs>
-          <w:tab w:val="left" w:pos="1440"/>
-        </w:tabs>
-        <w:ind w:left="1440" w:hanging="400"/>
-      </w:pPr>
-      <w:r>
-        <w:t xml:space="preserve">3.	</w:t>
-      </w:r>
-      <w:r>
-        <w:rPr>
-          <w:b/>
-          <w:bCs/>
-        </w:rPr>
-        <w:t xml:space="preserve">E-mail:</w:t>
-      </w:r>
-      <w:r>
-        <w:t xml:space="preserve"> a conta continua a mesma. O </w:t>
-      </w:r>
-      <w:r>
-        <w:rPr>
-          <w:b/>
-          <w:bCs/>
-        </w:rPr>
-        <w:t xml:space="preserve">RH refaz a imagem de rodapé</w:t>
-      </w:r>
-      <w:r>
-        <w:t xml:space="preserve"> com o cargo novo (e empresa, se mudou de empresa do grupo) e a TI troca a assinatura no mesmo dia.</w:t>
-      </w:r>
-    </w:p>
-    <w:p>
-      <w:pPr>
-        <w:tabs>
-          <w:tab w:val="left" w:pos="1440"/>
-        </w:tabs>
-        <w:ind w:left="1440" w:hanging="400"/>
-      </w:pPr>
-      <w:r>
-        <w:t xml:space="preserve">4.	</w:t>
-      </w:r>
-      <w:r>
-        <w:rPr>
-          <w:b/>
-          <w:bCs/>
-        </w:rPr>
-        <w:t xml:space="preserve">Mudou de empresa do grupo:</w:t>
-      </w:r>
-      <w:r>
-        <w:t xml:space="preserve"> criar conta no domínio novo e tratar a antiga como saída (POP-02, seção de e-mail).</w:t>
-      </w:r>
-    </w:p>
-    <w:p>
-      <w:pPr>
-        <w:tabs>
-          <w:tab w:val="left" w:pos="1440"/>
-        </w:tabs>
-        <w:ind w:left="1440" w:hanging="400"/>
-      </w:pPr>
-      <w:r>
-        <w:t xml:space="preserve">5.	</w:t>
-      </w:r>
-      <w:r>
-        <w:rPr>
-          <w:b/>
-          <w:bCs/>
-        </w:rPr>
-        <w:t xml:space="preserve">WhatsApp:</w:t>
-      </w:r>
-      <w:r>
-        <w:t xml:space="preserve"> sair dos grupos da função antiga; entrar nos da nova.</w:t>
-      </w:r>
-    </w:p>
-    <w:p>
-      <w:pPr>
-        <w:tabs>
-          <w:tab w:val="left" w:pos="1440"/>
-        </w:tabs>
-        <w:ind w:left="1440" w:hanging="400"/>
-      </w:pPr>
-      <w:r>
-        <w:t xml:space="preserve">6.	</w:t>
-      </w:r>
-      <w:r>
-        <w:rPr>
-          <w:b/>
-          <w:bCs/>
-        </w:rPr>
-        <w:t xml:space="preserve">Equipamentos:</w:t>
-      </w:r>
-      <w:r>
-        <w:t xml:space="preserve"> se mudou de unidade e o equipamento fica no local, seguir a seção 5 (troca).</w:t>
-      </w:r>
-    </w:p>
-    <w:p>
-      <w:pPr>
-        <w:tabs>
-          <w:tab w:val="left" w:pos="720"/>
-        </w:tabs>
-        <w:ind w:left="720" w:hanging="400"/>
-      </w:pPr>
-      <w:r>
-        <w:t xml:space="preserve">4.	</w:t>
-      </w:r>
-      <w:r>
-        <w:t xml:space="preserve">Atualizar no GLPI o Formulário B (checklist de acessos): o que saiu e o que entrou, com data.</w:t>
-      </w:r>
-    </w:p>
-    <w:p>
-      <w:pPr>
-        <w:pStyle w:val="Heading2"/>
-      </w:pPr>
-      <w:r>
-        <w:t xml:space="preserve">4. Revisão periódica de acessos</w:t>
+        <w:t xml:space="preserve">3. Revisão periódica de acessos</w:t>
       </w:r>
     </w:p>
     <w:p>
@@ -4120,7 +3734,7 @@
         <w:pStyle w:val="Heading2"/>
       </w:pPr>
       <w:r>
-        <w:t xml:space="preserve">5. Troca de equipamento</w:t>
+        <w:t xml:space="preserve">4. Troca de equipamento</w:t>
       </w:r>
     </w:p>
     <w:p>
@@ -4354,236 +3968,7 @@
         <w:pStyle w:val="Heading2"/>
       </w:pPr>
       <w:r>
-        <w:t xml:space="preserve">6. Afastamento ou férias longas</w:t>
-      </w:r>
-    </w:p>
-    <w:p>
-      <w:pPr>
-        <w:spacing w:after="120"/>
-      </w:pPr>
-      <w:r>
-        <w:rPr>
-          <w:b/>
-          <w:bCs/>
-        </w:rPr>
-        <w:t xml:space="preserve">Quando aplicar:</w:t>
-      </w:r>
-      <w:r>
-        <w:t xml:space="preserve"> férias ou afastamento de </w:t>
-      </w:r>
-      <w:r>
-        <w:rPr>
-          <w:b/>
-          <w:bCs/>
-        </w:rPr>
-        <w:t xml:space="preserve">15 dias ou mais</w:t>
-      </w:r>
-      <w:r>
-        <w:t xml:space="preserve"> (licença, afastamento médico, suspensão).</w:t>
-      </w:r>
-    </w:p>
-    <w:p>
-      <w:pPr>
-        <w:spacing w:after="120"/>
-      </w:pPr>
-      <w:r>
-        <w:rPr>
-          <w:b/>
-          <w:bCs/>
-        </w:rPr>
-        <w:t xml:space="preserve">Regra:</w:t>
-      </w:r>
-      <w:r>
-        <w:t xml:space="preserve"> </w:t>
-      </w:r>
-      <w:r>
-        <w:rPr>
-          <w:b/>
-          <w:bCs/>
-        </w:rPr>
-        <w:t xml:space="preserve">suspender</w:t>
-      </w:r>
-      <w:r>
-        <w:t xml:space="preserve">, nunca apagar. Na volta, reativa como estava.</w:t>
-      </w:r>
-    </w:p>
-    <w:p>
-      <w:pPr>
-        <w:tabs>
-          <w:tab w:val="left" w:pos="720"/>
-        </w:tabs>
-        <w:ind w:left="720" w:hanging="400"/>
-      </w:pPr>
-      <w:r>
-        <w:t xml:space="preserve">1.	</w:t>
-      </w:r>
-      <w:r>
-        <w:rPr>
-          <w:b/>
-          <w:bCs/>
-        </w:rPr>
-        <w:t xml:space="preserve">RH</w:t>
-      </w:r>
-      <w:r>
-        <w:t xml:space="preserve"> abre o chamado no GLPI (Formulário A), tipo </w:t>
-      </w:r>
-      <w:r>
-        <w:rPr>
-          <w:b/>
-          <w:bCs/>
-        </w:rPr>
-        <w:t xml:space="preserve">Afastamento</w:t>
-      </w:r>
-      <w:r>
-        <w:t xml:space="preserve">: data de saída e de volta prevista.</w:t>
-      </w:r>
-    </w:p>
-    <w:p>
-      <w:pPr>
-        <w:tabs>
-          <w:tab w:val="left" w:pos="720"/>
-        </w:tabs>
-        <w:ind w:left="720" w:hanging="400"/>
-      </w:pPr>
-      <w:r>
-        <w:t xml:space="preserve">2.	</w:t>
-      </w:r>
-      <w:r>
-        <w:rPr>
-          <w:b/>
-          <w:bCs/>
-        </w:rPr>
-        <w:t xml:space="preserve">TI</w:t>
-      </w:r>
-      <w:r>
-        <w:t xml:space="preserve">, no último dia antes do afastamento:</w:t>
-      </w:r>
-    </w:p>
-    <w:p>
-      <w:pPr>
-        <w:tabs>
-          <w:tab w:val="left" w:pos="1440"/>
-        </w:tabs>
-        <w:ind w:left="1440" w:hanging="400"/>
-      </w:pPr>
-      <w:r>
-        <w:t xml:space="preserve">1.	</w:t>
-      </w:r>
-      <w:r>
-        <w:rPr>
-          <w:b/>
-          <w:bCs/>
-        </w:rPr>
-        <w:t xml:space="preserve">E-mail:</w:t>
-      </w:r>
-      <w:r>
-        <w:t xml:space="preserve"> resposta automática ("ausente até dd/mm, falar com &lt;gestor/setor&gt;"). Se o gestor pedir, encaminhar cópia para o setor.</w:t>
-      </w:r>
-    </w:p>
-    <w:p>
-      <w:pPr>
-        <w:tabs>
-          <w:tab w:val="left" w:pos="1440"/>
-        </w:tabs>
-        <w:ind w:left="1440" w:hanging="400"/>
-      </w:pPr>
-      <w:r>
-        <w:t xml:space="preserve">2.	</w:t>
-      </w:r>
-      <w:r>
-        <w:rPr>
-          <w:b/>
-          <w:bCs/>
-        </w:rPr>
-        <w:t xml:space="preserve">Sistema VS / Petroshow / Infinitum / Orion:</w:t>
-      </w:r>
-      <w:r>
-        <w:t xml:space="preserve"> desativar o usuário (sem excluir).</w:t>
-      </w:r>
-    </w:p>
-    <w:p>
-      <w:pPr>
-        <w:tabs>
-          <w:tab w:val="left" w:pos="1440"/>
-        </w:tabs>
-        <w:ind w:left="1440" w:hanging="400"/>
-      </w:pPr>
-      <w:r>
-        <w:t xml:space="preserve">3.	</w:t>
-      </w:r>
-      <w:r>
-        <w:rPr>
-          <w:b/>
-          <w:bCs/>
-        </w:rPr>
-        <w:t xml:space="preserve">Celular corporativo:</w:t>
-      </w:r>
-      <w:r>
-        <w:t xml:space="preserve"> fica com a pessoa ou volta para a empresa, conforme o gestor decidir. Se ficar, continua sob as políticas do MDM.</w:t>
-      </w:r>
-    </w:p>
-    <w:p>
-      <w:pPr>
-        <w:tabs>
-          <w:tab w:val="left" w:pos="1440"/>
-        </w:tabs>
-        <w:ind w:left="1440" w:hanging="400"/>
-      </w:pPr>
-      <w:r>
-        <w:t xml:space="preserve">4.	</w:t>
-      </w:r>
-      <w:r>
-        <w:rPr>
-          <w:b/>
-          <w:bCs/>
-        </w:rPr>
-        <w:t xml:space="preserve">WhatsApp corporativo:</w:t>
-      </w:r>
-      <w:r>
-        <w:t xml:space="preserve"> se outra pessoa assumir o atendimento, o aparelho fica com ela durante o afastamento.</w:t>
-      </w:r>
-    </w:p>
-    <w:p>
-      <w:pPr>
-        <w:tabs>
-          <w:tab w:val="left" w:pos="720"/>
-        </w:tabs>
-        <w:ind w:left="720" w:hanging="400"/>
-      </w:pPr>
-      <w:r>
-        <w:t xml:space="preserve">3.	</w:t>
-      </w:r>
-      <w:r>
-        <w:rPr>
-          <w:b/>
-          <w:bCs/>
-        </w:rPr>
-        <w:t xml:space="preserve">Na volta</w:t>
-      </w:r>
-      <w:r>
-        <w:t xml:space="preserve">, com aviso do RH: reativar os usuários, tirar a resposta automática e conferir que as senhas do cofre de senhas ainda funcionam.</w:t>
-      </w:r>
-    </w:p>
-    <w:p>
-      <w:pPr>
-        <w:tabs>
-          <w:tab w:val="left" w:pos="720"/>
-        </w:tabs>
-        <w:ind w:left="720" w:hanging="400"/>
-      </w:pPr>
-      <w:r>
-        <w:t xml:space="preserve">4.	</w:t>
-      </w:r>
-      <w:r>
-        <w:t xml:space="preserve">Se a volta virar desligamento, seguir o POP-02.</w:t>
-      </w:r>
-    </w:p>
-    <w:p>
-      <w:pPr>
-        <w:pStyle w:val="Heading2"/>
-      </w:pPr>
-      <w:r>
-        <w:t xml:space="preserve">7. Registro</w:t>
+        <w:t xml:space="preserve">5. Registro</w:t>
       </w:r>
     </w:p>
     <w:p>
@@ -5595,7 +4980,7 @@
         </w:numPr>
       </w:pPr>
       <w:r>
-        <w:t xml:space="preserve">Mudou de cargo, de telefone ou de empresa: o RH refaz a imagem e a TI troca no mesmo dia (POP-11 §3).</w:t>
+        <w:t xml:space="preserve">Mudou de cargo, de telefone ou de empresa: o RH refaz a imagem e a TI troca no mesmo dia (chamado no GLPI).</w:t>
       </w:r>
     </w:p>
     <w:p>

</xml_diff>

<commit_message>
Formularios sem mudanca de funcao e afastamento
Acompanha a remocao dessas secoes do POP-11: tipos e campos tirados
dos Formularios A e D. PDFs e Word regenerados.

Co-Authored-By: Claude Opus 5.5 <noreply@anthropic.com>
</commit_message>
<xml_diff>
--- a/impressao/POPs-RH-revisao.docx
+++ b/impressao/POPs-RH-revisao.docx
@@ -5780,7 +5780,7 @@
         <w:t xml:space="preserve">Tipo:</w:t>
       </w:r>
       <w:r>
-        <w:t xml:space="preserve"> ☐ Entrada ☐ Mudança de função/posto ☐ Troca de equipamento ☐ Afastamento ☐ Saída</w:t>
+        <w:t xml:space="preserve"> ☐ Entrada ☐ Troca de equipamento ☐ Saída</w:t>
       </w:r>
     </w:p>
     <w:tbl>
@@ -5796,8 +5796,8 @@
         </w:tblBorders>
       </w:tblPr>
       <w:tblGrid>
-        <w:gridCol w:w="7744"/>
-        <w:gridCol w:w="1894"/>
+        <w:gridCol w:w="7398"/>
+        <w:gridCol w:w="2240"/>
       </w:tblGrid>
       <w:tr>
         <w:trPr>
@@ -5805,7 +5805,7 @@
         </w:trPr>
         <w:tc>
           <w:tcPr>
-            <w:tcW w:type="dxa" w:w="7744"/>
+            <w:tcW w:type="dxa" w:w="7398"/>
             <w:shd w:fill="EEEEEE" w:color="auto" w:val="clear"/>
             <w:tcMar>
               <w:top w:type="dxa" w:w="60"/>
@@ -5826,7 +5826,7 @@
         </w:tc>
         <w:tc>
           <w:tcPr>
-            <w:tcW w:type="dxa" w:w="1894"/>
+            <w:tcW w:type="dxa" w:w="2240"/>
             <w:shd w:fill="EEEEEE" w:color="auto" w:val="clear"/>
             <w:tcMar>
               <w:top w:type="dxa" w:w="60"/>
@@ -5849,7 +5849,7 @@
       <w:tr>
         <w:tc>
           <w:tcPr>
-            <w:tcW w:type="dxa" w:w="7744"/>
+            <w:tcW w:type="dxa" w:w="7398"/>
             <w:tcMar>
               <w:top w:type="dxa" w:w="60"/>
               <w:left w:type="dxa" w:w="100"/>
@@ -5865,7 +5865,7 @@
         </w:tc>
         <w:tc>
           <w:tcPr>
-            <w:tcW w:type="dxa" w:w="1894"/>
+            <w:tcW w:type="dxa" w:w="2240"/>
             <w:tcMar>
               <w:top w:type="dxa" w:w="60"/>
               <w:left w:type="dxa" w:w="100"/>
@@ -5879,7 +5879,7 @@
       <w:tr>
         <w:tc>
           <w:tcPr>
-            <w:tcW w:type="dxa" w:w="7744"/>
+            <w:tcW w:type="dxa" w:w="7398"/>
             <w:tcMar>
               <w:top w:type="dxa" w:w="60"/>
               <w:left w:type="dxa" w:w="100"/>
@@ -5895,7 +5895,7 @@
         </w:tc>
         <w:tc>
           <w:tcPr>
-            <w:tcW w:type="dxa" w:w="1894"/>
+            <w:tcW w:type="dxa" w:w="2240"/>
             <w:tcMar>
               <w:top w:type="dxa" w:w="60"/>
               <w:left w:type="dxa" w:w="100"/>
@@ -5909,7 +5909,7 @@
       <w:tr>
         <w:tc>
           <w:tcPr>
-            <w:tcW w:type="dxa" w:w="7744"/>
+            <w:tcW w:type="dxa" w:w="7398"/>
             <w:tcMar>
               <w:top w:type="dxa" w:w="60"/>
               <w:left w:type="dxa" w:w="100"/>
@@ -5925,7 +5925,7 @@
         </w:tc>
         <w:tc>
           <w:tcPr>
-            <w:tcW w:type="dxa" w:w="1894"/>
+            <w:tcW w:type="dxa" w:w="2240"/>
             <w:tcMar>
               <w:top w:type="dxa" w:w="60"/>
               <w:left w:type="dxa" w:w="100"/>
@@ -5939,7 +5939,7 @@
       <w:tr>
         <w:tc>
           <w:tcPr>
-            <w:tcW w:type="dxa" w:w="7744"/>
+            <w:tcW w:type="dxa" w:w="7398"/>
             <w:tcMar>
               <w:top w:type="dxa" w:w="60"/>
               <w:left w:type="dxa" w:w="100"/>
@@ -5955,7 +5955,7 @@
         </w:tc>
         <w:tc>
           <w:tcPr>
-            <w:tcW w:type="dxa" w:w="1894"/>
+            <w:tcW w:type="dxa" w:w="2240"/>
             <w:tcMar>
               <w:top w:type="dxa" w:w="60"/>
               <w:left w:type="dxa" w:w="100"/>
@@ -5969,7 +5969,7 @@
       <w:tr>
         <w:tc>
           <w:tcPr>
-            <w:tcW w:type="dxa" w:w="7744"/>
+            <w:tcW w:type="dxa" w:w="7398"/>
             <w:tcMar>
               <w:top w:type="dxa" w:w="60"/>
               <w:left w:type="dxa" w:w="100"/>
@@ -5985,7 +5985,7 @@
         </w:tc>
         <w:tc>
           <w:tcPr>
-            <w:tcW w:type="dxa" w:w="1894"/>
+            <w:tcW w:type="dxa" w:w="2240"/>
             <w:tcMar>
               <w:top w:type="dxa" w:w="60"/>
               <w:left w:type="dxa" w:w="100"/>
@@ -5999,23 +5999,23 @@
       <w:tr>
         <w:tc>
           <w:tcPr>
-            <w:tcW w:type="dxa" w:w="7744"/>
-            <w:tcMar>
-              <w:top w:type="dxa" w:w="60"/>
-              <w:left w:type="dxa" w:w="100"/>
-              <w:bottom w:type="dxa" w:w="60"/>
-              <w:right w:type="dxa" w:w="100"/>
-            </w:tcMar>
-          </w:tcPr>
-          <w:p>
-            <w:r>
-              <w:t xml:space="preserve">Data (início, mudança, saída ou afastamento)</w:t>
-            </w:r>
-          </w:p>
-        </w:tc>
-        <w:tc>
-          <w:tcPr>
-            <w:tcW w:type="dxa" w:w="1894"/>
+            <w:tcW w:type="dxa" w:w="7398"/>
+            <w:tcMar>
+              <w:top w:type="dxa" w:w="60"/>
+              <w:left w:type="dxa" w:w="100"/>
+              <w:bottom w:type="dxa" w:w="60"/>
+              <w:right w:type="dxa" w:w="100"/>
+            </w:tcMar>
+          </w:tcPr>
+          <w:p>
+            <w:r>
+              <w:t xml:space="preserve">Data (início ou saída)</w:t>
+            </w:r>
+          </w:p>
+        </w:tc>
+        <w:tc>
+          <w:tcPr>
+            <w:tcW w:type="dxa" w:w="2240"/>
             <w:tcMar>
               <w:top w:type="dxa" w:w="60"/>
               <w:left w:type="dxa" w:w="100"/>
@@ -6029,7 +6029,7 @@
       <w:tr>
         <w:tc>
           <w:tcPr>
-            <w:tcW w:type="dxa" w:w="7744"/>
+            <w:tcW w:type="dxa" w:w="7398"/>
             <w:tcMar>
               <w:top w:type="dxa" w:w="60"/>
               <w:left w:type="dxa" w:w="100"/>
@@ -6045,7 +6045,7 @@
         </w:tc>
         <w:tc>
           <w:tcPr>
-            <w:tcW w:type="dxa" w:w="1894"/>
+            <w:tcW w:type="dxa" w:w="2240"/>
             <w:tcMar>
               <w:top w:type="dxa" w:w="60"/>
               <w:left w:type="dxa" w:w="100"/>
@@ -6059,23 +6059,23 @@
       <w:tr>
         <w:tc>
           <w:tcPr>
-            <w:tcW w:type="dxa" w:w="7744"/>
-            <w:tcMar>
-              <w:top w:type="dxa" w:w="60"/>
-              <w:left w:type="dxa" w:w="100"/>
-              <w:bottom w:type="dxa" w:w="60"/>
-              <w:right w:type="dxa" w:w="100"/>
-            </w:tcMar>
-          </w:tcPr>
-          <w:p>
-            <w:r>
-              <w:t xml:space="preserve">Volta prevista (só para afastamento)</w:t>
-            </w:r>
-          </w:p>
-        </w:tc>
-        <w:tc>
-          <w:tcPr>
-            <w:tcW w:type="dxa" w:w="1894"/>
+            <w:tcW w:type="dxa" w:w="7398"/>
+            <w:tcMar>
+              <w:top w:type="dxa" w:w="60"/>
+              <w:left w:type="dxa" w:w="100"/>
+              <w:bottom w:type="dxa" w:w="60"/>
+              <w:right w:type="dxa" w:w="100"/>
+            </w:tcMar>
+          </w:tcPr>
+          <w:p>
+            <w:r>
+              <w:t xml:space="preserve">Saída: tipo (pedido / pela empresa / justa causa)</w:t>
+            </w:r>
+          </w:p>
+        </w:tc>
+        <w:tc>
+          <w:tcPr>
+            <w:tcW w:type="dxa" w:w="2240"/>
             <w:tcMar>
               <w:top w:type="dxa" w:w="60"/>
               <w:left w:type="dxa" w:w="100"/>
@@ -6089,40 +6089,23 @@
       <w:tr>
         <w:tc>
           <w:tcPr>
-            <w:tcW w:type="dxa" w:w="7744"/>
-            <w:tcMar>
-              <w:top w:type="dxa" w:w="60"/>
-              <w:left w:type="dxa" w:w="100"/>
-              <w:bottom w:type="dxa" w:w="60"/>
-              <w:right w:type="dxa" w:w="100"/>
-            </w:tcMar>
-          </w:tcPr>
-          <w:p>
-            <w:r>
-              <w:t xml:space="preserve">Mudança: função/posto </w:t>
-            </w:r>
-            <w:r>
-              <w:rPr>
-                <w:b/>
-                <w:bCs/>
-              </w:rPr>
-              <w:t xml:space="preserve">antigo</w:t>
-            </w:r>
-            <w:r>
-              <w:t xml:space="preserve"> → </w:t>
-            </w:r>
-            <w:r>
-              <w:rPr>
-                <w:b/>
-                <w:bCs/>
-              </w:rPr>
-              <w:t xml:space="preserve">novo</w:t>
-            </w:r>
-          </w:p>
-        </w:tc>
-        <w:tc>
-          <w:tcPr>
-            <w:tcW w:type="dxa" w:w="1894"/>
+            <w:tcW w:type="dxa" w:w="7398"/>
+            <w:tcMar>
+              <w:top w:type="dxa" w:w="60"/>
+              <w:left w:type="dxa" w:w="100"/>
+              <w:bottom w:type="dxa" w:w="60"/>
+              <w:right w:type="dxa" w:w="100"/>
+            </w:tcMar>
+          </w:tcPr>
+          <w:p>
+            <w:r>
+              <w:t xml:space="preserve">Saída: quem assume e-mail, WhatsApp e arquivos</w:t>
+            </w:r>
+          </w:p>
+        </w:tc>
+        <w:tc>
+          <w:tcPr>
+            <w:tcW w:type="dxa" w:w="2240"/>
             <w:tcMar>
               <w:top w:type="dxa" w:w="60"/>
               <w:left w:type="dxa" w:w="100"/>
@@ -6136,67 +6119,7 @@
       <w:tr>
         <w:tc>
           <w:tcPr>
-            <w:tcW w:type="dxa" w:w="7744"/>
-            <w:tcMar>
-              <w:top w:type="dxa" w:w="60"/>
-              <w:left w:type="dxa" w:w="100"/>
-              <w:bottom w:type="dxa" w:w="60"/>
-              <w:right w:type="dxa" w:w="100"/>
-            </w:tcMar>
-          </w:tcPr>
-          <w:p>
-            <w:r>
-              <w:t xml:space="preserve">Saída: tipo (pedido / pela empresa / justa causa)</w:t>
-            </w:r>
-          </w:p>
-        </w:tc>
-        <w:tc>
-          <w:tcPr>
-            <w:tcW w:type="dxa" w:w="1894"/>
-            <w:tcMar>
-              <w:top w:type="dxa" w:w="60"/>
-              <w:left w:type="dxa" w:w="100"/>
-              <w:bottom w:type="dxa" w:w="60"/>
-              <w:right w:type="dxa" w:w="100"/>
-            </w:tcMar>
-          </w:tcPr>
-          <w:p/>
-        </w:tc>
-      </w:tr>
-      <w:tr>
-        <w:tc>
-          <w:tcPr>
-            <w:tcW w:type="dxa" w:w="7744"/>
-            <w:tcMar>
-              <w:top w:type="dxa" w:w="60"/>
-              <w:left w:type="dxa" w:w="100"/>
-              <w:bottom w:type="dxa" w:w="60"/>
-              <w:right w:type="dxa" w:w="100"/>
-            </w:tcMar>
-          </w:tcPr>
-          <w:p>
-            <w:r>
-              <w:t xml:space="preserve">Saída: quem assume e-mail, WhatsApp e arquivos</w:t>
-            </w:r>
-          </w:p>
-        </w:tc>
-        <w:tc>
-          <w:tcPr>
-            <w:tcW w:type="dxa" w:w="1894"/>
-            <w:tcMar>
-              <w:top w:type="dxa" w:w="60"/>
-              <w:left w:type="dxa" w:w="100"/>
-              <w:bottom w:type="dxa" w:w="60"/>
-              <w:right w:type="dxa" w:w="100"/>
-            </w:tcMar>
-          </w:tcPr>
-          <w:p/>
-        </w:tc>
-      </w:tr>
-      <w:tr>
-        <w:tc>
-          <w:tcPr>
-            <w:tcW w:type="dxa" w:w="7744"/>
+            <w:tcW w:type="dxa" w:w="7398"/>
             <w:tcMar>
               <w:top w:type="dxa" w:w="60"/>
               <w:left w:type="dxa" w:w="100"/>
@@ -6212,7 +6135,7 @@
         </w:tc>
         <w:tc>
           <w:tcPr>
-            <w:tcW w:type="dxa" w:w="1894"/>
+            <w:tcW w:type="dxa" w:w="2240"/>
             <w:tcMar>
               <w:top w:type="dxa" w:w="60"/>
               <w:left w:type="dxa" w:w="100"/>
@@ -6237,7 +6160,7 @@
         <w:t xml:space="preserve">Acessos e equipamentos aprovados pelo gestor</w:t>
       </w:r>
       <w:r>
-        <w:t xml:space="preserve"> (entrada e mudança):</w:t>
+        <w:t xml:space="preserve"> (entrada):</w:t>
       </w:r>
     </w:p>
     <w:tbl>
@@ -7992,7 +7915,7 @@
         <w:t xml:space="preserve">Motivo:</w:t>
       </w:r>
       <w:r>
-        <w:t xml:space="preserve"> ☐ Saída ☐ Troca ☐ Afastamento ☐ Outro</w:t>
+        <w:t xml:space="preserve"> ☐ Saída ☐ Troca ☐ Outro</w:t>
       </w:r>
     </w:p>
     <w:tbl>

</xml_diff>

<commit_message>
PCs sem senha; gestor do departamento pode escolher a sua
- POP-TI v1.2 §3.1: usuário da pessoa sem senha (a tela de login não
  aceita colar senha). Exceção: o gestor de cada departamento pode ter
  senha escolhida por ele, que não vai para o cofre. Conta da TI continua
  com senha no cofre.
- POP-04 v1.2: usuário com `passwd -d` e login automático; gestor com
  senha própria, sem login automático.
- POP-05 v1.2: usuário local com senha em branco; gestor cria a sua.
- POP-01 v1.2: computador sem senha na entrega.
- Impressão regerada.

Co-Authored-By: Claude Opus 5.5 <noreply@anthropic.com>
</commit_message>
<xml_diff>
--- a/impressao/POPs-RH-revisao.docx
+++ b/impressao/POPs-RH-revisao.docx
@@ -26,7 +26,7 @@
         <w:t xml:space="preserve">Versão:</w:t>
       </w:r>
       <w:r>
-        <w:t xml:space="preserve"> 1.1 · </w:t>
+        <w:t xml:space="preserve"> 1.2 · </w:t>
       </w:r>
       <w:r>
         <w:rPr>
@@ -36,7 +36,7 @@
         <w:t xml:space="preserve">Data:</w:t>
       </w:r>
       <w:r>
-        <w:t xml:space="preserve"> 17/10/2026 · </w:t>
+        <w:t xml:space="preserve"> 20/10/2026 · </w:t>
       </w:r>
       <w:r>
         <w:rPr>
@@ -780,7 +780,17 @@
         <w:t xml:space="preserve">sem permissão de administrador</w:t>
       </w:r>
       <w:r>
-        <w:t xml:space="preserve">.</w:t>
+        <w:t xml:space="preserve"> e </w:t>
+      </w:r>
+      <w:r>
+        <w:rPr>
+          <w:b/>
+          <w:bCs/>
+        </w:rPr>
+        <w:t xml:space="preserve">sem senha</w:t>
+      </w:r>
+      <w:r>
+        <w:t xml:space="preserve"> (POP-04/05 §4.3). Exceção: o gestor do departamento pode escolher uma senha para o próprio PC.</w:t>
       </w:r>
     </w:p>
     <w:p>
@@ -1181,7 +1191,17 @@
         <w:t xml:space="preserve">não troca</w:t>
       </w:r>
       <w:r>
-        <w:t xml:space="preserve"> as senhas: se precisar trocar, pede à TI, que troca e atualiza o cofre.</w:t>
+        <w:t xml:space="preserve"> as senhas: se precisar trocar, pede à TI, que troca e atualiza o cofre. O </w:t>
+      </w:r>
+      <w:r>
+        <w:rPr>
+          <w:b/>
+          <w:bCs/>
+        </w:rPr>
+        <w:t xml:space="preserve">computador não tem senha</w:t>
+      </w:r>
+      <w:r>
+        <w:t xml:space="preserve">. Se o gestor do departamento quiser senha no próprio PC, ele digita a que escolher nesse momento, e ela não vai para o cofre.</w:t>
       </w:r>
     </w:p>
     <w:p>

</xml_diff>

<commit_message>
POPs v1.3: conta única dos funcionários, com administrador
POP-TI §3.1, POP-01, POP-04 e POP-05 §4.3: não há mais conta por
pessoa; a instalação cria a conta dos funcionários, sem senha e com
administrador. POP-08: não instalar programa vira regra, não bloqueio.
Decisão e contras em ALTERNATIVAS §1.6. Impressão regerada.

Co-Authored-By: Claude Opus 5.5 <noreply@anthropic.com>
</commit_message>
<xml_diff>
--- a/impressao/POPs-RH-revisao.docx
+++ b/impressao/POPs-RH-revisao.docx
@@ -26,7 +26,7 @@
         <w:t xml:space="preserve">Versão:</w:t>
       </w:r>
       <w:r>
-        <w:t xml:space="preserve"> 1.2 · </w:t>
+        <w:t xml:space="preserve"> 1.3 · </w:t>
       </w:r>
       <w:r>
         <w:rPr>
@@ -36,7 +36,7 @@
         <w:t xml:space="preserve">Data:</w:t>
       </w:r>
       <w:r>
-        <w:t xml:space="preserve"> 20/10/2026 · </w:t>
+        <w:t xml:space="preserve"> 23/10/2026 · </w:t>
       </w:r>
       <w:r>
         <w:rPr>
@@ -770,27 +770,17 @@
         </w:numPr>
       </w:pPr>
       <w:r>
-        <w:t xml:space="preserve">Criar o usuário local da pessoa, </w:t>
-      </w:r>
-      <w:r>
-        <w:rPr>
-          <w:b/>
-          <w:bCs/>
-        </w:rPr>
-        <w:t xml:space="preserve">sem permissão de administrador</w:t>
-      </w:r>
-      <w:r>
-        <w:t xml:space="preserve"> e </w:t>
-      </w:r>
-      <w:r>
-        <w:rPr>
-          <w:b/>
-          <w:bCs/>
-        </w:rPr>
-        <w:t xml:space="preserve">sem senha</w:t>
-      </w:r>
-      <w:r>
-        <w:t xml:space="preserve"> (POP-04/05 §4.3). Exceção: o gestor do departamento pode escolher uma senha para o próprio PC.</w:t>
+        <w:t xml:space="preserve">A instalação padrão já cria a </w:t>
+      </w:r>
+      <w:r>
+        <w:rPr>
+          <w:b/>
+          <w:bCs/>
+        </w:rPr>
+        <w:t xml:space="preserve">conta dos funcionários</w:t>
+      </w:r>
+      <w:r>
+        <w:t xml:space="preserve">, a mesma em todo PC, sem senha (POP-04/05 §4.3). Não se cria conta por pessoa. Exceção: o gestor do departamento pode escolher uma senha para o próprio PC.</w:t>
       </w:r>
     </w:p>
     <w:p>

</xml_diff>